<commit_message>
Update sociodemographic, CPOD by sex, and insurance tables
</commit_message>
<xml_diff>
--- a/tabla_2_cpod_sexo.docx
+++ b/tabla_2_cpod_sexo.docx
@@ -1,87 +1,38 @@
 
 <file path=word/document.xml><?xml version="1.0" encoding="utf-8"?>
-<w:document xmlns:wpc="http://schemas.microsoft.com/office/word/2010/wordprocessingCanvas" xmlns:cx="http://schemas.microsoft.com/office/drawing/2014/chartex" xmlns:cx1="http://schemas.microsoft.com/office/drawing/2015/9/8/chartex" xmlns:cx2="http://schemas.microsoft.com/office/drawing/2015/10/21/chartex" xmlns:cx3="http://schemas.microsoft.com/office/drawing/2016/5/9/chartex" xmlns:cx4="http://schemas.microsoft.com/office/drawing/2016/5/10/chartex" xmlns:cx5="http://schemas.microsoft.com/office/drawing/2016/5/11/chartex" xmlns:cx6="http://schemas.microsoft.com/office/drawing/2016/5/12/chartex" xmlns:cx7="http://schemas.microsoft.com/office/drawing/2016/5/13/chartex" xmlns:cx8="http://schemas.microsoft.com/office/drawing/2016/5/14/chartex" xmlns:mc="http://schemas.openxmlformats.org/markup-compatibility/2006" xmlns:aink="http://schemas.microsoft.com/office/drawing/2016/ink" xmlns:am3d="http://schemas.microsoft.com/office/drawing/2017/model3d" xmlns:o="urn:schemas-microsoft-com:office:office" xmlns:oel="http://schemas.microsoft.com/office/2019/extlst" xmlns:r="http://schemas.openxmlformats.org/officeDocument/2006/relationships" xmlns:m="http://schemas.openxmlformats.org/officeDocument/2006/math" xmlns:v="urn:schemas-microsoft-com:vml" xmlns:wp14="http://schemas.microsoft.com/office/word/2010/wordprocessingDrawing" xmlns:wp="http://schemas.openxmlformats.org/drawingml/2006/wordprocessingDrawing" xmlns:w10="urn:schemas-microsoft-com:office:word" xmlns:w="http://schemas.openxmlformats.org/wordprocessingml/2006/main" xmlns:w14="http://schemas.microsoft.com/office/word/2010/wordml" xmlns:w15="http://schemas.microsoft.com/office/word/2012/wordml" xmlns:w16cex="http://schemas.microsoft.com/office/word/2018/wordml/cex" xmlns:w16cid="http://schemas.microsoft.com/office/word/2016/wordml/cid" xmlns:w16="http://schemas.microsoft.com/office/word/2018/wordml" xmlns:w16du="http://schemas.microsoft.com/office/word/2023/wordml/word16du" xmlns:w16sdtdh="http://schemas.microsoft.com/office/word/2020/wordml/sdtdatahash" xmlns:w16sdtfl="http://schemas.microsoft.com/office/word/2024/wordml/sdtformatlock" xmlns:w16se="http://schemas.microsoft.com/office/word/2015/wordml/symex" xmlns:wpg="http://schemas.microsoft.com/office/word/2010/wordprocessingGroup" xmlns:wpi="http://schemas.microsoft.com/office/word/2010/wordprocessingInk" xmlns:wne="http://schemas.microsoft.com/office/word/2006/wordml" xmlns:wps="http://schemas.microsoft.com/office/word/2010/wordprocessingShape" mc:Ignorable="w14 w15 w16se w16cid w16 w16cex w16sdtdh w16sdtfl w16du wp14">
+<w:document xmlns:wpc="http://schemas.microsoft.com/office/word/2010/wordprocessingCanvas" xmlns:cx="http://schemas.microsoft.com/office/drawing/2014/chartex" xmlns:cx1="http://schemas.microsoft.com/office/drawing/2015/9/8/chartex" xmlns:cx2="http://schemas.microsoft.com/office/drawing/2015/10/21/chartex" xmlns:cx3="http://schemas.microsoft.com/office/drawing/2016/5/9/chartex" xmlns:cx4="http://schemas.microsoft.com/office/drawing/2016/5/10/chartex" xmlns:cx5="http://schemas.microsoft.com/office/drawing/2016/5/11/chartex" xmlns:cx6="http://schemas.microsoft.com/office/drawing/2016/5/12/chartex" xmlns:cx7="http://schemas.microsoft.com/office/drawing/2016/5/13/chartex" xmlns:cx8="http://schemas.microsoft.com/office/drawing/2016/5/14/chartex" xmlns:mc="http://schemas.openxmlformats.org/markup-compatibility/2006" xmlns:aink="http://schemas.microsoft.com/office/drawing/2016/ink" xmlns:am3d="http://schemas.microsoft.com/office/drawing/2017/model3d" xmlns:o="urn:schemas-microsoft-com:office:office" xmlns:r="http://schemas.openxmlformats.org/officeDocument/2006/relationships" xmlns:m="http://schemas.openxmlformats.org/officeDocument/2006/math" xmlns:v="urn:schemas-microsoft-com:vml" xmlns:wp14="http://schemas.microsoft.com/office/word/2010/wordprocessingDrawing" xmlns:wp="http://schemas.openxmlformats.org/drawingml/2006/wordprocessingDrawing" xmlns:w10="urn:schemas-microsoft-com:office:word" xmlns:w="http://schemas.openxmlformats.org/wordprocessingml/2006/main" xmlns:w14="http://schemas.microsoft.com/office/word/2010/wordml" xmlns:w15="http://schemas.microsoft.com/office/word/2012/wordml" xmlns:w16cex="http://schemas.microsoft.com/office/word/2018/wordml/cex" xmlns:w16cid="http://schemas.microsoft.com/office/word/2016/wordml/cid" xmlns:w16="http://schemas.microsoft.com/office/word/2018/wordml" xmlns:w16se="http://schemas.microsoft.com/office/word/2015/wordml/symex" xmlns:wpg="http://schemas.microsoft.com/office/word/2010/wordprocessingGroup" xmlns:wpi="http://schemas.microsoft.com/office/word/2010/wordprocessingInk" xmlns:wne="http://schemas.microsoft.com/office/word/2006/wordml" xmlns:wps="http://schemas.microsoft.com/office/word/2010/wordprocessingShape" mc:Ignorable="w14 w15 w16se w16cid w16 w16cex wp14">
   <w:body>
-    <w:p/>
+    <w:p>
+      <w:pPr>
+        <w:pStyle w:val="Normal"/>
+      </w:pPr>
+      <w:r>
+        <w:t xml:space="preserve"/>
+      </w:r>
+    </w:p>
     <w:p>
       <w:pPr>
         <w:pStyle w:val="TableCaption"/>
+        <w:jc w:val="center"/>
         <w:keepNext/>
         <w:pBdr>
+          <w:bottom w:val="none" w:sz="0" w:space="0" w:color="000000"/>
           <w:top w:val="none" w:sz="0" w:space="0" w:color="000000"/>
           <w:left w:val="none" w:sz="0" w:space="0" w:color="000000"/>
-          <w:bottom w:val="none" w:sz="0" w:space="0" w:color="000000"/>
           <w:right w:val="none" w:sz="0" w:space="0" w:color="000000"/>
         </w:pBdr>
-        <w:spacing w:before="60" w:after="60"/>
-        <w:ind w:left="60" w:right="60"/>
+        <w:spacing w:after="60" w:before="60" w:line="240"/>
+        <w:ind w:left="60" w:right="60" w:firstLine="0" w:firstLineChars="0"/>
       </w:pPr>
       <w:r>
-        <w:t>**</w:t>
-      </w:r>
-      <w:proofErr w:type="spellStart"/>
-      <w:r>
-        <w:t>Tabla</w:t>
-      </w:r>
-      <w:proofErr w:type="spellEnd"/>
-      <w:r>
-        <w:t xml:space="preserve"> 2. </w:t>
-      </w:r>
-      <w:proofErr w:type="spellStart"/>
-      <w:r>
-        <w:t>Índice</w:t>
-      </w:r>
-      <w:proofErr w:type="spellEnd"/>
-      <w:r>
-        <w:t xml:space="preserve"> CPO-D y </w:t>
-      </w:r>
-      <w:proofErr w:type="spellStart"/>
-      <w:r>
-        <w:t>estado</w:t>
-      </w:r>
-      <w:proofErr w:type="spellEnd"/>
-      <w:r>
-        <w:t xml:space="preserve"> de </w:t>
-      </w:r>
-      <w:proofErr w:type="spellStart"/>
-      <w:r>
-        <w:t>salud</w:t>
-      </w:r>
-      <w:proofErr w:type="spellEnd"/>
-      <w:r>
-        <w:t xml:space="preserve"> </w:t>
-      </w:r>
-      <w:proofErr w:type="spellStart"/>
-      <w:r>
-        <w:t>bucal</w:t>
-      </w:r>
-      <w:proofErr w:type="spellEnd"/>
-      <w:r>
-        <w:t xml:space="preserve"> </w:t>
-      </w:r>
-      <w:proofErr w:type="spellStart"/>
-      <w:r>
-        <w:t>según</w:t>
-      </w:r>
-      <w:proofErr w:type="spellEnd"/>
-      <w:r>
-        <w:t xml:space="preserve"> </w:t>
-      </w:r>
-      <w:proofErr w:type="spellStart"/>
-      <w:r>
-        <w:t>sexo</w:t>
-      </w:r>
-      <w:proofErr w:type="spellEnd"/>
-      <w:r>
-        <w:t>**</w:t>
+        <w:t xml:space="preserve">**Tabla 2. Índice CPO-D y estado de salud bucal según sexo**</w:t>
       </w:r>
     </w:p>
-    <w:tbl>
+    <w:tbl xmlns:a="http://schemas.openxmlformats.org/drawingml/2006/main" xmlns:pic="http://schemas.openxmlformats.org/drawingml/2006/picture">
       <w:tblPr>
-        <w:tblW w:w="0" w:type="auto"/>
+        <w:tblLayout w:type="fixed"/>
         <w:jc w:val="center"/>
-        <w:tblLayout w:type="fixed"/>
-        <w:tblLook w:val="0420" w:firstRow="1" w:lastRow="0" w:firstColumn="0" w:lastColumn="0" w:noHBand="0" w:noVBand="1"/>
+        <w:tblLook w:firstRow="1" w:lastRow="0" w:firstColumn="0" w:lastColumn="0" w:noHBand="0" w:noVBand="1"/>
       </w:tblPr>
       <w:tblGrid>
         <w:gridCol w:w="2576"/>
@@ -91,1858 +42,2090 @@
       </w:tblGrid>
       <w:tr>
         <w:trPr>
+          <w:trHeight w:val="769" w:hRule="auto"/>
           <w:tblHeader/>
-          <w:jc w:val="center"/>
         </w:trPr>
         <w:tc>
           <w:tcPr>
-            <w:tcW w:w="2576" w:type="dxa"/>
             <w:tcBorders>
+              <w:bottom w:val="single" w:sz="8" w:space="0" w:color="000000"/>
               <w:top w:val="single" w:sz="8" w:space="0" w:color="000000"/>
               <w:left w:val="none" w:sz="0" w:space="0" w:color="000000"/>
-              <w:bottom w:val="single" w:sz="8" w:space="0" w:color="000000"/>
               <w:right w:val="none" w:sz="0" w:space="0" w:color="000000"/>
             </w:tcBorders>
             <w:shd w:val="clear" w:color="auto" w:fill="FFFFFF"/>
             <w:tcMar>
               <w:top w:w="0" w:type="dxa"/>
+              <w:bottom w:w="0" w:type="dxa"/>
               <w:left w:w="0" w:type="dxa"/>
-              <w:bottom w:w="0" w:type="dxa"/>
               <w:right w:w="0" w:type="dxa"/>
             </w:tcMar>
             <w:vAlign w:val="center"/>
           </w:tcPr>
           <w:p>
             <w:pPr>
+              <w:pStyle w:val="Normal"/>
+              <w:jc w:val="left"/>
               <w:pBdr>
+                <w:bottom w:val="none" w:sz="0" w:space="0" w:color="000000"/>
                 <w:top w:val="none" w:sz="0" w:space="0" w:color="000000"/>
                 <w:left w:val="none" w:sz="0" w:space="0" w:color="000000"/>
-                <w:bottom w:val="none" w:sz="0" w:space="0" w:color="000000"/>
                 <w:right w:val="none" w:sz="0" w:space="0" w:color="000000"/>
               </w:pBdr>
-              <w:spacing w:before="40" w:after="40"/>
-              <w:ind w:left="100" w:right="100"/>
-              <w:rPr>
-                <w:rFonts w:ascii="Helvetica" w:eastAsia="Helvetica" w:hAnsi="Helvetica" w:cs="Helvetica"/>
-                <w:color w:val="000000"/>
-                <w:sz w:val="22"/>
-                <w:szCs w:val="22"/>
+              <w:spacing w:after="40" w:before="40" w:line="240"/>
+              <w:ind w:left="100" w:right="100" w:firstLine="0" w:firstLineChars="0"/>
+              <w:rPr>
+                <w:rFonts w:ascii="Helvetica" w:hAnsi="Helvetica" w:eastAsia="Helvetica" w:cs="Helvetica"/>
+                <w:i w:val="false"/>
+                <w:b w:val="false"/>
+                <w:u w:val="none"/>
+                <w:strike w:val="false"/>
+                <w:sz w:val="22"/>
+                <w:szCs w:val="22"/>
+                <w:color w:val="000000"/>
               </w:rPr>
             </w:pPr>
             <w:r>
               <w:rPr>
-                <w:rFonts w:ascii="Helvetica" w:eastAsia="Helvetica" w:hAnsi="Helvetica" w:cs="Helvetica"/>
-                <w:b/>
-                <w:color w:val="000000"/>
-                <w:sz w:val="22"/>
-                <w:szCs w:val="22"/>
-              </w:rPr>
-              <w:t>Characteristic</w:t>
-            </w:r>
-            <w:r>
-              <w:rPr>
-                <w:rFonts w:ascii="Helvetica" w:eastAsia="Helvetica" w:hAnsi="Helvetica" w:cs="Helvetica"/>
-                <w:color w:val="000000"/>
-                <w:sz w:val="22"/>
-                <w:szCs w:val="22"/>
+                <w:rFonts w:ascii="Helvetica" w:hAnsi="Helvetica" w:eastAsia="Helvetica" w:cs="Helvetica"/>
+                <w:i w:val="false"/>
+                <w:b w:val="true"/>
+                <w:u w:val="none"/>
+                <w:strike w:val="false"/>
+                <w:sz w:val="22"/>
+                <w:szCs w:val="22"/>
+                <w:color w:val="000000"/>
+              </w:rPr>
+              <w:t xml:space="preserve">Characteristic</w:t>
+            </w:r>
+            <w:r>
+              <w:rPr>
+                <w:rFonts w:ascii="Helvetica" w:hAnsi="Helvetica" w:eastAsia="Helvetica" w:cs="Helvetica"/>
+                <w:i w:val="false"/>
+                <w:b w:val="false"/>
+                <w:u w:val="none"/>
+                <w:strike w:val="false"/>
                 <w:vertAlign w:val="superscript"/>
-              </w:rPr>
-              <w:t>1</w:t>
+                <w:sz w:val="22"/>
+                <w:szCs w:val="22"/>
+                <w:color w:val="000000"/>
+              </w:rPr>
+              <w:t xml:space="preserve">1</w:t>
             </w:r>
           </w:p>
         </w:tc>
         <w:tc>
           <w:tcPr>
-            <w:tcW w:w="3088" w:type="dxa"/>
             <w:tcBorders>
+              <w:bottom w:val="single" w:sz="8" w:space="0" w:color="000000"/>
               <w:top w:val="single" w:sz="8" w:space="0" w:color="000000"/>
               <w:left w:val="none" w:sz="0" w:space="0" w:color="000000"/>
-              <w:bottom w:val="single" w:sz="8" w:space="0" w:color="000000"/>
               <w:right w:val="none" w:sz="0" w:space="0" w:color="000000"/>
             </w:tcBorders>
             <w:shd w:val="clear" w:color="auto" w:fill="FFFFFF"/>
             <w:tcMar>
               <w:top w:w="0" w:type="dxa"/>
+              <w:bottom w:w="0" w:type="dxa"/>
               <w:left w:w="0" w:type="dxa"/>
-              <w:bottom w:w="0" w:type="dxa"/>
               <w:right w:w="0" w:type="dxa"/>
             </w:tcMar>
             <w:vAlign w:val="center"/>
           </w:tcPr>
           <w:p>
             <w:pPr>
+              <w:pStyle w:val="Normal"/>
+              <w:jc w:val="center"/>
               <w:pBdr>
+                <w:bottom w:val="none" w:sz="0" w:space="0" w:color="000000"/>
                 <w:top w:val="none" w:sz="0" w:space="0" w:color="000000"/>
                 <w:left w:val="none" w:sz="0" w:space="0" w:color="000000"/>
-                <w:bottom w:val="none" w:sz="0" w:space="0" w:color="000000"/>
                 <w:right w:val="none" w:sz="0" w:space="0" w:color="000000"/>
               </w:pBdr>
-              <w:spacing w:before="40" w:after="40"/>
-              <w:ind w:left="100" w:right="100"/>
-              <w:jc w:val="center"/>
-              <w:rPr>
-                <w:rFonts w:ascii="Helvetica" w:eastAsia="Helvetica" w:hAnsi="Helvetica" w:cs="Helvetica"/>
-                <w:color w:val="000000"/>
-                <w:sz w:val="22"/>
-                <w:szCs w:val="22"/>
+              <w:spacing w:after="40" w:before="40" w:line="240"/>
+              <w:ind w:left="100" w:right="100" w:firstLine="0" w:firstLineChars="0"/>
+              <w:rPr>
+                <w:rFonts w:ascii="Helvetica" w:hAnsi="Helvetica" w:eastAsia="Helvetica" w:cs="Helvetica"/>
+                <w:i w:val="false"/>
+                <w:b w:val="false"/>
+                <w:u w:val="none"/>
+                <w:strike w:val="false"/>
+                <w:sz w:val="22"/>
+                <w:szCs w:val="22"/>
+                <w:color w:val="000000"/>
               </w:rPr>
             </w:pPr>
             <w:r>
               <w:rPr>
-                <w:rFonts w:ascii="Helvetica" w:eastAsia="Helvetica" w:hAnsi="Helvetica" w:cs="Helvetica"/>
-                <w:b/>
-                <w:color w:val="000000"/>
-                <w:sz w:val="22"/>
-                <w:szCs w:val="22"/>
-              </w:rPr>
-              <w:t>Overall</w:t>
-            </w:r>
-            <w:r>
-              <w:rPr>
-                <w:rFonts w:ascii="Helvetica" w:eastAsia="Helvetica" w:hAnsi="Helvetica" w:cs="Helvetica"/>
-                <w:color w:val="000000"/>
-                <w:sz w:val="22"/>
-                <w:szCs w:val="22"/>
+                <w:rFonts w:ascii="Helvetica" w:hAnsi="Helvetica" w:eastAsia="Helvetica" w:cs="Helvetica"/>
+                <w:i w:val="false"/>
+                <w:b w:val="true"/>
+                <w:u w:val="none"/>
+                <w:strike w:val="false"/>
+                <w:sz w:val="22"/>
+                <w:szCs w:val="22"/>
+                <w:color w:val="000000"/>
+              </w:rPr>
+              <w:t xml:space="preserve">Overall</w:t>
+            </w:r>
+            <w:r>
+              <w:rPr>
+                <w:rFonts w:ascii="Helvetica" w:hAnsi="Helvetica" w:eastAsia="Helvetica" w:cs="Helvetica"/>
+                <w:i w:val="false"/>
+                <w:b w:val="false"/>
+                <w:u w:val="none"/>
+                <w:strike w:val="false"/>
+                <w:sz w:val="22"/>
+                <w:szCs w:val="22"/>
+                <w:color w:val="000000"/>
               </w:rPr>
               <w:t xml:space="preserve">  </w:t>
             </w:r>
             <w:r>
               <w:rPr>
-                <w:rFonts w:ascii="Helvetica" w:eastAsia="Helvetica" w:hAnsi="Helvetica" w:cs="Helvetica"/>
-                <w:color w:val="000000"/>
-                <w:sz w:val="22"/>
-                <w:szCs w:val="22"/>
+                <w:rFonts w:ascii="Helvetica" w:hAnsi="Helvetica" w:eastAsia="Helvetica" w:cs="Helvetica"/>
+                <w:i w:val="false"/>
+                <w:b w:val="false"/>
+                <w:u w:val="none"/>
+                <w:strike w:val="false"/>
+                <w:sz w:val="22"/>
+                <w:szCs w:val="22"/>
+                <w:color w:val="000000"/>
               </w:rPr>
               <w:br/>
-              <w:t>N = 69,840</w:t>
-            </w:r>
-            <w:r>
-              <w:rPr>
-                <w:rFonts w:ascii="Helvetica" w:eastAsia="Helvetica" w:hAnsi="Helvetica" w:cs="Helvetica"/>
-                <w:color w:val="000000"/>
-                <w:sz w:val="22"/>
-                <w:szCs w:val="22"/>
+            </w:r>
+            <w:r>
+              <w:rPr>
+                <w:rFonts w:ascii="Helvetica" w:hAnsi="Helvetica" w:eastAsia="Helvetica" w:cs="Helvetica"/>
+                <w:i w:val="false"/>
+                <w:b w:val="false"/>
+                <w:u w:val="none"/>
+                <w:strike w:val="false"/>
+                <w:sz w:val="22"/>
+                <w:szCs w:val="22"/>
+                <w:color w:val="000000"/>
+              </w:rPr>
+              <w:t xml:space="preserve">N = 69,840</w:t>
+            </w:r>
+            <w:r>
+              <w:rPr>
+                <w:rFonts w:ascii="Helvetica" w:hAnsi="Helvetica" w:eastAsia="Helvetica" w:cs="Helvetica"/>
+                <w:i w:val="false"/>
+                <w:b w:val="false"/>
+                <w:u w:val="none"/>
+                <w:strike w:val="false"/>
                 <w:vertAlign w:val="superscript"/>
-              </w:rPr>
-              <w:t>1</w:t>
+                <w:sz w:val="22"/>
+                <w:szCs w:val="22"/>
+                <w:color w:val="000000"/>
+              </w:rPr>
+              <w:t xml:space="preserve">1</w:t>
             </w:r>
           </w:p>
         </w:tc>
         <w:tc>
           <w:tcPr>
-            <w:tcW w:w="3088" w:type="dxa"/>
             <w:tcBorders>
+              <w:bottom w:val="single" w:sz="8" w:space="0" w:color="000000"/>
               <w:top w:val="single" w:sz="8" w:space="0" w:color="000000"/>
               <w:left w:val="none" w:sz="0" w:space="0" w:color="000000"/>
-              <w:bottom w:val="single" w:sz="8" w:space="0" w:color="000000"/>
               <w:right w:val="none" w:sz="0" w:space="0" w:color="000000"/>
             </w:tcBorders>
             <w:shd w:val="clear" w:color="auto" w:fill="FFFFFF"/>
             <w:tcMar>
               <w:top w:w="0" w:type="dxa"/>
+              <w:bottom w:w="0" w:type="dxa"/>
               <w:left w:w="0" w:type="dxa"/>
-              <w:bottom w:w="0" w:type="dxa"/>
               <w:right w:w="0" w:type="dxa"/>
             </w:tcMar>
             <w:vAlign w:val="center"/>
           </w:tcPr>
           <w:p>
             <w:pPr>
+              <w:pStyle w:val="Normal"/>
+              <w:jc w:val="center"/>
               <w:pBdr>
+                <w:bottom w:val="none" w:sz="0" w:space="0" w:color="000000"/>
                 <w:top w:val="none" w:sz="0" w:space="0" w:color="000000"/>
                 <w:left w:val="none" w:sz="0" w:space="0" w:color="000000"/>
-                <w:bottom w:val="none" w:sz="0" w:space="0" w:color="000000"/>
                 <w:right w:val="none" w:sz="0" w:space="0" w:color="000000"/>
               </w:pBdr>
-              <w:spacing w:before="40" w:after="40"/>
-              <w:ind w:left="100" w:right="100"/>
-              <w:jc w:val="center"/>
-              <w:rPr>
-                <w:rFonts w:ascii="Helvetica" w:eastAsia="Helvetica" w:hAnsi="Helvetica" w:cs="Helvetica"/>
-                <w:color w:val="000000"/>
-                <w:sz w:val="22"/>
-                <w:szCs w:val="22"/>
+              <w:spacing w:after="40" w:before="40" w:line="240"/>
+              <w:ind w:left="100" w:right="100" w:firstLine="0" w:firstLineChars="0"/>
+              <w:rPr>
+                <w:rFonts w:ascii="Helvetica" w:hAnsi="Helvetica" w:eastAsia="Helvetica" w:cs="Helvetica"/>
+                <w:i w:val="false"/>
+                <w:b w:val="false"/>
+                <w:u w:val="none"/>
+                <w:strike w:val="false"/>
+                <w:sz w:val="22"/>
+                <w:szCs w:val="22"/>
+                <w:color w:val="000000"/>
               </w:rPr>
             </w:pPr>
-            <w:proofErr w:type="spellStart"/>
-            <w:r>
-              <w:rPr>
-                <w:rFonts w:ascii="Helvetica" w:eastAsia="Helvetica" w:hAnsi="Helvetica" w:cs="Helvetica"/>
-                <w:b/>
-                <w:color w:val="000000"/>
-                <w:sz w:val="22"/>
-                <w:szCs w:val="22"/>
-              </w:rPr>
-              <w:t>femenino</w:t>
-            </w:r>
-            <w:proofErr w:type="spellEnd"/>
-            <w:r>
-              <w:rPr>
-                <w:rFonts w:ascii="Helvetica" w:eastAsia="Helvetica" w:hAnsi="Helvetica" w:cs="Helvetica"/>
-                <w:color w:val="000000"/>
-                <w:sz w:val="22"/>
-                <w:szCs w:val="22"/>
+            <w:r>
+              <w:rPr>
+                <w:rFonts w:ascii="Helvetica" w:hAnsi="Helvetica" w:eastAsia="Helvetica" w:cs="Helvetica"/>
+                <w:i w:val="false"/>
+                <w:b w:val="true"/>
+                <w:u w:val="none"/>
+                <w:strike w:val="false"/>
+                <w:sz w:val="22"/>
+                <w:szCs w:val="22"/>
+                <w:color w:val="000000"/>
+              </w:rPr>
+              <w:t xml:space="preserve">femenino</w:t>
+            </w:r>
+            <w:r>
+              <w:rPr>
+                <w:rFonts w:ascii="Helvetica" w:hAnsi="Helvetica" w:eastAsia="Helvetica" w:cs="Helvetica"/>
+                <w:i w:val="false"/>
+                <w:b w:val="false"/>
+                <w:u w:val="none"/>
+                <w:strike w:val="false"/>
+                <w:sz w:val="22"/>
+                <w:szCs w:val="22"/>
+                <w:color w:val="000000"/>
               </w:rPr>
               <w:t xml:space="preserve">  </w:t>
             </w:r>
             <w:r>
               <w:rPr>
-                <w:rFonts w:ascii="Helvetica" w:eastAsia="Helvetica" w:hAnsi="Helvetica" w:cs="Helvetica"/>
-                <w:color w:val="000000"/>
-                <w:sz w:val="22"/>
-                <w:szCs w:val="22"/>
+                <w:rFonts w:ascii="Helvetica" w:hAnsi="Helvetica" w:eastAsia="Helvetica" w:cs="Helvetica"/>
+                <w:i w:val="false"/>
+                <w:b w:val="false"/>
+                <w:u w:val="none"/>
+                <w:strike w:val="false"/>
+                <w:sz w:val="22"/>
+                <w:szCs w:val="22"/>
+                <w:color w:val="000000"/>
               </w:rPr>
               <w:br/>
-              <w:t>N = 44,431</w:t>
-            </w:r>
-            <w:r>
-              <w:rPr>
-                <w:rFonts w:ascii="Helvetica" w:eastAsia="Helvetica" w:hAnsi="Helvetica" w:cs="Helvetica"/>
-                <w:color w:val="000000"/>
-                <w:sz w:val="22"/>
-                <w:szCs w:val="22"/>
+            </w:r>
+            <w:r>
+              <w:rPr>
+                <w:rFonts w:ascii="Helvetica" w:hAnsi="Helvetica" w:eastAsia="Helvetica" w:cs="Helvetica"/>
+                <w:i w:val="false"/>
+                <w:b w:val="false"/>
+                <w:u w:val="none"/>
+                <w:strike w:val="false"/>
+                <w:sz w:val="22"/>
+                <w:szCs w:val="22"/>
+                <w:color w:val="000000"/>
+              </w:rPr>
+              <w:t xml:space="preserve">N = 44,431</w:t>
+            </w:r>
+            <w:r>
+              <w:rPr>
+                <w:rFonts w:ascii="Helvetica" w:hAnsi="Helvetica" w:eastAsia="Helvetica" w:cs="Helvetica"/>
+                <w:i w:val="false"/>
+                <w:b w:val="false"/>
+                <w:u w:val="none"/>
+                <w:strike w:val="false"/>
                 <w:vertAlign w:val="superscript"/>
-              </w:rPr>
-              <w:t>1</w:t>
+                <w:sz w:val="22"/>
+                <w:szCs w:val="22"/>
+                <w:color w:val="000000"/>
+              </w:rPr>
+              <w:t xml:space="preserve">1</w:t>
             </w:r>
           </w:p>
         </w:tc>
         <w:tc>
           <w:tcPr>
-            <w:tcW w:w="3088" w:type="dxa"/>
             <w:tcBorders>
+              <w:bottom w:val="single" w:sz="8" w:space="0" w:color="000000"/>
               <w:top w:val="single" w:sz="8" w:space="0" w:color="000000"/>
               <w:left w:val="none" w:sz="0" w:space="0" w:color="000000"/>
-              <w:bottom w:val="single" w:sz="8" w:space="0" w:color="000000"/>
               <w:right w:val="none" w:sz="0" w:space="0" w:color="000000"/>
             </w:tcBorders>
             <w:shd w:val="clear" w:color="auto" w:fill="FFFFFF"/>
             <w:tcMar>
               <w:top w:w="0" w:type="dxa"/>
+              <w:bottom w:w="0" w:type="dxa"/>
               <w:left w:w="0" w:type="dxa"/>
-              <w:bottom w:w="0" w:type="dxa"/>
               <w:right w:w="0" w:type="dxa"/>
             </w:tcMar>
             <w:vAlign w:val="center"/>
           </w:tcPr>
           <w:p>
             <w:pPr>
+              <w:pStyle w:val="Normal"/>
+              <w:jc w:val="center"/>
               <w:pBdr>
+                <w:bottom w:val="none" w:sz="0" w:space="0" w:color="000000"/>
                 <w:top w:val="none" w:sz="0" w:space="0" w:color="000000"/>
                 <w:left w:val="none" w:sz="0" w:space="0" w:color="000000"/>
-                <w:bottom w:val="none" w:sz="0" w:space="0" w:color="000000"/>
                 <w:right w:val="none" w:sz="0" w:space="0" w:color="000000"/>
               </w:pBdr>
-              <w:spacing w:before="40" w:after="40"/>
-              <w:ind w:left="100" w:right="100"/>
-              <w:jc w:val="center"/>
-              <w:rPr>
-                <w:rFonts w:ascii="Helvetica" w:eastAsia="Helvetica" w:hAnsi="Helvetica" w:cs="Helvetica"/>
-                <w:color w:val="000000"/>
-                <w:sz w:val="22"/>
-                <w:szCs w:val="22"/>
+              <w:spacing w:after="40" w:before="40" w:line="240"/>
+              <w:ind w:left="100" w:right="100" w:firstLine="0" w:firstLineChars="0"/>
+              <w:rPr>
+                <w:rFonts w:ascii="Helvetica" w:hAnsi="Helvetica" w:eastAsia="Helvetica" w:cs="Helvetica"/>
+                <w:i w:val="false"/>
+                <w:b w:val="false"/>
+                <w:u w:val="none"/>
+                <w:strike w:val="false"/>
+                <w:sz w:val="22"/>
+                <w:szCs w:val="22"/>
+                <w:color w:val="000000"/>
               </w:rPr>
             </w:pPr>
-            <w:proofErr w:type="spellStart"/>
-            <w:r>
-              <w:rPr>
-                <w:rFonts w:ascii="Helvetica" w:eastAsia="Helvetica" w:hAnsi="Helvetica" w:cs="Helvetica"/>
-                <w:b/>
-                <w:color w:val="000000"/>
-                <w:sz w:val="22"/>
-                <w:szCs w:val="22"/>
-              </w:rPr>
-              <w:t>masculino</w:t>
-            </w:r>
-            <w:proofErr w:type="spellEnd"/>
-            <w:r>
-              <w:rPr>
-                <w:rFonts w:ascii="Helvetica" w:eastAsia="Helvetica" w:hAnsi="Helvetica" w:cs="Helvetica"/>
-                <w:color w:val="000000"/>
-                <w:sz w:val="22"/>
-                <w:szCs w:val="22"/>
+            <w:r>
+              <w:rPr>
+                <w:rFonts w:ascii="Helvetica" w:hAnsi="Helvetica" w:eastAsia="Helvetica" w:cs="Helvetica"/>
+                <w:i w:val="false"/>
+                <w:b w:val="true"/>
+                <w:u w:val="none"/>
+                <w:strike w:val="false"/>
+                <w:sz w:val="22"/>
+                <w:szCs w:val="22"/>
+                <w:color w:val="000000"/>
+              </w:rPr>
+              <w:t xml:space="preserve">masculino</w:t>
+            </w:r>
+            <w:r>
+              <w:rPr>
+                <w:rFonts w:ascii="Helvetica" w:hAnsi="Helvetica" w:eastAsia="Helvetica" w:cs="Helvetica"/>
+                <w:i w:val="false"/>
+                <w:b w:val="false"/>
+                <w:u w:val="none"/>
+                <w:strike w:val="false"/>
+                <w:sz w:val="22"/>
+                <w:szCs w:val="22"/>
+                <w:color w:val="000000"/>
               </w:rPr>
               <w:t xml:space="preserve">  </w:t>
             </w:r>
             <w:r>
               <w:rPr>
-                <w:rFonts w:ascii="Helvetica" w:eastAsia="Helvetica" w:hAnsi="Helvetica" w:cs="Helvetica"/>
-                <w:color w:val="000000"/>
-                <w:sz w:val="22"/>
-                <w:szCs w:val="22"/>
+                <w:rFonts w:ascii="Helvetica" w:hAnsi="Helvetica" w:eastAsia="Helvetica" w:cs="Helvetica"/>
+                <w:i w:val="false"/>
+                <w:b w:val="false"/>
+                <w:u w:val="none"/>
+                <w:strike w:val="false"/>
+                <w:sz w:val="22"/>
+                <w:szCs w:val="22"/>
+                <w:color w:val="000000"/>
               </w:rPr>
               <w:br/>
-              <w:t>N = 25,409</w:t>
-            </w:r>
-            <w:r>
-              <w:rPr>
-                <w:rFonts w:ascii="Helvetica" w:eastAsia="Helvetica" w:hAnsi="Helvetica" w:cs="Helvetica"/>
-                <w:color w:val="000000"/>
-                <w:sz w:val="22"/>
-                <w:szCs w:val="22"/>
+            </w:r>
+            <w:r>
+              <w:rPr>
+                <w:rFonts w:ascii="Helvetica" w:hAnsi="Helvetica" w:eastAsia="Helvetica" w:cs="Helvetica"/>
+                <w:i w:val="false"/>
+                <w:b w:val="false"/>
+                <w:u w:val="none"/>
+                <w:strike w:val="false"/>
+                <w:sz w:val="22"/>
+                <w:szCs w:val="22"/>
+                <w:color w:val="000000"/>
+              </w:rPr>
+              <w:t xml:space="preserve">N = 25,409</w:t>
+            </w:r>
+            <w:r>
+              <w:rPr>
+                <w:rFonts w:ascii="Helvetica" w:hAnsi="Helvetica" w:eastAsia="Helvetica" w:cs="Helvetica"/>
+                <w:i w:val="false"/>
+                <w:b w:val="false"/>
+                <w:u w:val="none"/>
+                <w:strike w:val="false"/>
                 <w:vertAlign w:val="superscript"/>
-              </w:rPr>
-              <w:t>1</w:t>
+                <w:sz w:val="22"/>
+                <w:szCs w:val="22"/>
+                <w:color w:val="000000"/>
+              </w:rPr>
+              <w:t xml:space="preserve">1</w:t>
             </w:r>
           </w:p>
         </w:tc>
       </w:tr>
       <w:tr>
         <w:trPr>
-          <w:jc w:val="center"/>
+          <w:trHeight w:val="620" w:hRule="auto"/>
         </w:trPr>
         <w:tc>
           <w:tcPr>
-            <w:tcW w:w="2576" w:type="dxa"/>
             <w:tcBorders>
+              <w:bottom w:val="none" w:sz="0" w:space="0" w:color="000000"/>
               <w:top w:val="single" w:sz="8" w:space="0" w:color="000000"/>
               <w:left w:val="none" w:sz="0" w:space="0" w:color="000000"/>
-              <w:bottom w:val="none" w:sz="0" w:space="0" w:color="000000"/>
               <w:right w:val="none" w:sz="0" w:space="0" w:color="000000"/>
             </w:tcBorders>
             <w:shd w:val="clear" w:color="auto" w:fill="FFFFFF"/>
             <w:tcMar>
               <w:top w:w="0" w:type="dxa"/>
+              <w:bottom w:w="0" w:type="dxa"/>
               <w:left w:w="0" w:type="dxa"/>
-              <w:bottom w:w="0" w:type="dxa"/>
               <w:right w:w="0" w:type="dxa"/>
             </w:tcMar>
+            <w:vAlign w:val="top"/>
           </w:tcPr>
           <w:p>
             <w:pPr>
+              <w:pStyle w:val="Normal"/>
+              <w:jc w:val="left"/>
               <w:pBdr>
+                <w:bottom w:val="none" w:sz="0" w:space="0" w:color="000000"/>
                 <w:top w:val="none" w:sz="0" w:space="0" w:color="000000"/>
                 <w:left w:val="none" w:sz="0" w:space="0" w:color="000000"/>
-                <w:bottom w:val="none" w:sz="0" w:space="0" w:color="000000"/>
                 <w:right w:val="none" w:sz="0" w:space="0" w:color="000000"/>
               </w:pBdr>
-              <w:spacing w:before="100" w:after="100"/>
-              <w:ind w:left="100" w:right="100"/>
-              <w:rPr>
-                <w:rFonts w:ascii="Helvetica" w:eastAsia="Helvetica" w:hAnsi="Helvetica" w:cs="Helvetica"/>
-                <w:b/>
-                <w:color w:val="000000"/>
-                <w:sz w:val="22"/>
-                <w:szCs w:val="22"/>
+              <w:spacing w:after="100" w:before="100" w:line="240"/>
+              <w:ind w:left="100" w:right="100" w:firstLine="0" w:firstLineChars="0"/>
+              <w:rPr>
+                <w:rFonts w:ascii="Helvetica" w:hAnsi="Helvetica" w:eastAsia="Helvetica" w:cs="Helvetica"/>
+                <w:i w:val="false"/>
+                <w:b w:val="true"/>
+                <w:u w:val="none"/>
+                <w:strike w:val="false"/>
+                <w:sz w:val="22"/>
+                <w:szCs w:val="22"/>
+                <w:color w:val="000000"/>
               </w:rPr>
             </w:pPr>
-            <w:proofErr w:type="spellStart"/>
-            <w:r>
-              <w:rPr>
-                <w:rFonts w:ascii="Helvetica" w:eastAsia="Helvetica" w:hAnsi="Helvetica" w:cs="Helvetica"/>
-                <w:b/>
-                <w:color w:val="000000"/>
-                <w:sz w:val="22"/>
-                <w:szCs w:val="22"/>
-              </w:rPr>
-              <w:t>Índice</w:t>
-            </w:r>
-            <w:proofErr w:type="spellEnd"/>
-            <w:r>
-              <w:rPr>
-                <w:rFonts w:ascii="Helvetica" w:eastAsia="Helvetica" w:hAnsi="Helvetica" w:cs="Helvetica"/>
-                <w:b/>
-                <w:color w:val="000000"/>
-                <w:sz w:val="22"/>
-                <w:szCs w:val="22"/>
-              </w:rPr>
-              <w:t xml:space="preserve"> CPO-D</w:t>
+            <w:r>
+              <w:rPr>
+                <w:rFonts w:ascii="Helvetica" w:hAnsi="Helvetica" w:eastAsia="Helvetica" w:cs="Helvetica"/>
+                <w:i w:val="false"/>
+                <w:b w:val="true"/>
+                <w:u w:val="none"/>
+                <w:strike w:val="false"/>
+                <w:sz w:val="22"/>
+                <w:szCs w:val="22"/>
+                <w:color w:val="000000"/>
+              </w:rPr>
+              <w:t xml:space="preserve">Índice CPO-D</w:t>
             </w:r>
           </w:p>
         </w:tc>
         <w:tc>
           <w:tcPr>
-            <w:tcW w:w="3088" w:type="dxa"/>
             <w:tcBorders>
+              <w:bottom w:val="none" w:sz="0" w:space="0" w:color="000000"/>
               <w:top w:val="single" w:sz="8" w:space="0" w:color="000000"/>
               <w:left w:val="none" w:sz="0" w:space="0" w:color="000000"/>
-              <w:bottom w:val="none" w:sz="0" w:space="0" w:color="000000"/>
               <w:right w:val="none" w:sz="0" w:space="0" w:color="000000"/>
             </w:tcBorders>
             <w:shd w:val="clear" w:color="auto" w:fill="FFFFFF"/>
             <w:tcMar>
               <w:top w:w="0" w:type="dxa"/>
+              <w:bottom w:w="0" w:type="dxa"/>
               <w:left w:w="0" w:type="dxa"/>
-              <w:bottom w:w="0" w:type="dxa"/>
               <w:right w:w="0" w:type="dxa"/>
             </w:tcMar>
+            <w:vAlign w:val="top"/>
           </w:tcPr>
           <w:p>
             <w:pPr>
+              <w:pStyle w:val="Normal"/>
+              <w:jc w:val="center"/>
               <w:pBdr>
+                <w:bottom w:val="none" w:sz="0" w:space="0" w:color="000000"/>
                 <w:top w:val="none" w:sz="0" w:space="0" w:color="000000"/>
                 <w:left w:val="none" w:sz="0" w:space="0" w:color="000000"/>
-                <w:bottom w:val="none" w:sz="0" w:space="0" w:color="000000"/>
                 <w:right w:val="none" w:sz="0" w:space="0" w:color="000000"/>
               </w:pBdr>
-              <w:spacing w:before="100" w:after="100"/>
-              <w:ind w:left="100" w:right="100"/>
-              <w:jc w:val="center"/>
-              <w:rPr>
-                <w:rFonts w:ascii="Helvetica" w:eastAsia="Helvetica" w:hAnsi="Helvetica" w:cs="Helvetica"/>
-                <w:color w:val="000000"/>
-                <w:sz w:val="22"/>
-                <w:szCs w:val="22"/>
+              <w:spacing w:after="100" w:before="100" w:line="240"/>
+              <w:ind w:left="100" w:right="100" w:firstLine="0" w:firstLineChars="0"/>
+              <w:rPr>
+                <w:rFonts w:ascii="Helvetica" w:hAnsi="Helvetica" w:eastAsia="Helvetica" w:cs="Helvetica"/>
+                <w:i w:val="false"/>
+                <w:b w:val="false"/>
+                <w:u w:val="none"/>
+                <w:strike w:val="false"/>
+                <w:sz w:val="22"/>
+                <w:szCs w:val="22"/>
+                <w:color w:val="000000"/>
               </w:rPr>
             </w:pPr>
             <w:r>
               <w:rPr>
-                <w:rFonts w:ascii="Helvetica" w:eastAsia="Helvetica" w:hAnsi="Helvetica" w:cs="Helvetica"/>
-                <w:color w:val="000000"/>
-                <w:sz w:val="22"/>
-                <w:szCs w:val="22"/>
-              </w:rPr>
-              <w:t>14.9 ± 7.5 (</w:t>
-            </w:r>
-            <w:proofErr w:type="spellStart"/>
-            <w:r>
-              <w:rPr>
-                <w:rFonts w:ascii="Helvetica" w:eastAsia="Helvetica" w:hAnsi="Helvetica" w:cs="Helvetica"/>
-                <w:color w:val="000000"/>
-                <w:sz w:val="22"/>
-                <w:szCs w:val="22"/>
-              </w:rPr>
-              <w:t>rango</w:t>
-            </w:r>
-            <w:proofErr w:type="spellEnd"/>
-            <w:r>
-              <w:rPr>
-                <w:rFonts w:ascii="Helvetica" w:eastAsia="Helvetica" w:hAnsi="Helvetica" w:cs="Helvetica"/>
-                <w:color w:val="000000"/>
-                <w:sz w:val="22"/>
-                <w:szCs w:val="22"/>
-              </w:rPr>
-              <w:t>: 0.0-32.0)</w:t>
+                <w:rFonts w:ascii="Helvetica" w:hAnsi="Helvetica" w:eastAsia="Helvetica" w:cs="Helvetica"/>
+                <w:i w:val="false"/>
+                <w:b w:val="false"/>
+                <w:u w:val="none"/>
+                <w:strike w:val="false"/>
+                <w:sz w:val="22"/>
+                <w:szCs w:val="22"/>
+                <w:color w:val="000000"/>
+              </w:rPr>
+              <w:t xml:space="preserve">14.9 ± 7.5 (rango: 0.0-32.0)</w:t>
             </w:r>
           </w:p>
         </w:tc>
         <w:tc>
           <w:tcPr>
-            <w:tcW w:w="3088" w:type="dxa"/>
             <w:tcBorders>
+              <w:bottom w:val="none" w:sz="0" w:space="0" w:color="000000"/>
               <w:top w:val="single" w:sz="8" w:space="0" w:color="000000"/>
               <w:left w:val="none" w:sz="0" w:space="0" w:color="000000"/>
-              <w:bottom w:val="none" w:sz="0" w:space="0" w:color="000000"/>
               <w:right w:val="none" w:sz="0" w:space="0" w:color="000000"/>
             </w:tcBorders>
             <w:shd w:val="clear" w:color="auto" w:fill="FFFFFF"/>
             <w:tcMar>
               <w:top w:w="0" w:type="dxa"/>
+              <w:bottom w:w="0" w:type="dxa"/>
               <w:left w:w="0" w:type="dxa"/>
-              <w:bottom w:w="0" w:type="dxa"/>
               <w:right w:w="0" w:type="dxa"/>
             </w:tcMar>
+            <w:vAlign w:val="top"/>
           </w:tcPr>
           <w:p>
             <w:pPr>
+              <w:pStyle w:val="Normal"/>
+              <w:jc w:val="center"/>
               <w:pBdr>
+                <w:bottom w:val="none" w:sz="0" w:space="0" w:color="000000"/>
                 <w:top w:val="none" w:sz="0" w:space="0" w:color="000000"/>
                 <w:left w:val="none" w:sz="0" w:space="0" w:color="000000"/>
-                <w:bottom w:val="none" w:sz="0" w:space="0" w:color="000000"/>
                 <w:right w:val="none" w:sz="0" w:space="0" w:color="000000"/>
               </w:pBdr>
-              <w:spacing w:before="100" w:after="100"/>
-              <w:ind w:left="100" w:right="100"/>
-              <w:jc w:val="center"/>
-              <w:rPr>
-                <w:rFonts w:ascii="Helvetica" w:eastAsia="Helvetica" w:hAnsi="Helvetica" w:cs="Helvetica"/>
-                <w:color w:val="000000"/>
-                <w:sz w:val="22"/>
-                <w:szCs w:val="22"/>
+              <w:spacing w:after="100" w:before="100" w:line="240"/>
+              <w:ind w:left="100" w:right="100" w:firstLine="0" w:firstLineChars="0"/>
+              <w:rPr>
+                <w:rFonts w:ascii="Helvetica" w:hAnsi="Helvetica" w:eastAsia="Helvetica" w:cs="Helvetica"/>
+                <w:i w:val="false"/>
+                <w:b w:val="false"/>
+                <w:u w:val="none"/>
+                <w:strike w:val="false"/>
+                <w:sz w:val="22"/>
+                <w:szCs w:val="22"/>
+                <w:color w:val="000000"/>
               </w:rPr>
             </w:pPr>
             <w:r>
               <w:rPr>
-                <w:rFonts w:ascii="Helvetica" w:eastAsia="Helvetica" w:hAnsi="Helvetica" w:cs="Helvetica"/>
-                <w:color w:val="000000"/>
-                <w:sz w:val="22"/>
-                <w:szCs w:val="22"/>
-              </w:rPr>
-              <w:t>15.3 ± 7.3 (</w:t>
-            </w:r>
-            <w:proofErr w:type="spellStart"/>
-            <w:r>
-              <w:rPr>
-                <w:rFonts w:ascii="Helvetica" w:eastAsia="Helvetica" w:hAnsi="Helvetica" w:cs="Helvetica"/>
-                <w:color w:val="000000"/>
-                <w:sz w:val="22"/>
-                <w:szCs w:val="22"/>
-              </w:rPr>
-              <w:t>rango</w:t>
-            </w:r>
-            <w:proofErr w:type="spellEnd"/>
-            <w:r>
-              <w:rPr>
-                <w:rFonts w:ascii="Helvetica" w:eastAsia="Helvetica" w:hAnsi="Helvetica" w:cs="Helvetica"/>
-                <w:color w:val="000000"/>
-                <w:sz w:val="22"/>
-                <w:szCs w:val="22"/>
-              </w:rPr>
-              <w:t>: 0.0-32.0)</w:t>
+                <w:rFonts w:ascii="Helvetica" w:hAnsi="Helvetica" w:eastAsia="Helvetica" w:cs="Helvetica"/>
+                <w:i w:val="false"/>
+                <w:b w:val="false"/>
+                <w:u w:val="none"/>
+                <w:strike w:val="false"/>
+                <w:sz w:val="22"/>
+                <w:szCs w:val="22"/>
+                <w:color w:val="000000"/>
+              </w:rPr>
+              <w:t xml:space="preserve">15.3 ± 7.3 (rango: 0.0-32.0)</w:t>
             </w:r>
           </w:p>
         </w:tc>
         <w:tc>
           <w:tcPr>
-            <w:tcW w:w="3088" w:type="dxa"/>
             <w:tcBorders>
+              <w:bottom w:val="none" w:sz="0" w:space="0" w:color="000000"/>
               <w:top w:val="single" w:sz="8" w:space="0" w:color="000000"/>
               <w:left w:val="none" w:sz="0" w:space="0" w:color="000000"/>
-              <w:bottom w:val="none" w:sz="0" w:space="0" w:color="000000"/>
               <w:right w:val="none" w:sz="0" w:space="0" w:color="000000"/>
             </w:tcBorders>
             <w:shd w:val="clear" w:color="auto" w:fill="FFFFFF"/>
             <w:tcMar>
               <w:top w:w="0" w:type="dxa"/>
+              <w:bottom w:w="0" w:type="dxa"/>
               <w:left w:w="0" w:type="dxa"/>
-              <w:bottom w:w="0" w:type="dxa"/>
               <w:right w:w="0" w:type="dxa"/>
             </w:tcMar>
+            <w:vAlign w:val="top"/>
           </w:tcPr>
           <w:p>
             <w:pPr>
+              <w:pStyle w:val="Normal"/>
+              <w:jc w:val="center"/>
               <w:pBdr>
+                <w:bottom w:val="none" w:sz="0" w:space="0" w:color="000000"/>
                 <w:top w:val="none" w:sz="0" w:space="0" w:color="000000"/>
                 <w:left w:val="none" w:sz="0" w:space="0" w:color="000000"/>
-                <w:bottom w:val="none" w:sz="0" w:space="0" w:color="000000"/>
                 <w:right w:val="none" w:sz="0" w:space="0" w:color="000000"/>
               </w:pBdr>
-              <w:spacing w:before="100" w:after="100"/>
-              <w:ind w:left="100" w:right="100"/>
-              <w:jc w:val="center"/>
-              <w:rPr>
-                <w:rFonts w:ascii="Helvetica" w:eastAsia="Helvetica" w:hAnsi="Helvetica" w:cs="Helvetica"/>
-                <w:color w:val="000000"/>
-                <w:sz w:val="22"/>
-                <w:szCs w:val="22"/>
+              <w:spacing w:after="100" w:before="100" w:line="240"/>
+              <w:ind w:left="100" w:right="100" w:firstLine="0" w:firstLineChars="0"/>
+              <w:rPr>
+                <w:rFonts w:ascii="Helvetica" w:hAnsi="Helvetica" w:eastAsia="Helvetica" w:cs="Helvetica"/>
+                <w:i w:val="false"/>
+                <w:b w:val="false"/>
+                <w:u w:val="none"/>
+                <w:strike w:val="false"/>
+                <w:sz w:val="22"/>
+                <w:szCs w:val="22"/>
+                <w:color w:val="000000"/>
               </w:rPr>
             </w:pPr>
             <w:r>
               <w:rPr>
-                <w:rFonts w:ascii="Helvetica" w:eastAsia="Helvetica" w:hAnsi="Helvetica" w:cs="Helvetica"/>
-                <w:color w:val="000000"/>
-                <w:sz w:val="22"/>
-                <w:szCs w:val="22"/>
-              </w:rPr>
-              <w:t>14.1 ± 7.8 (</w:t>
-            </w:r>
-            <w:proofErr w:type="spellStart"/>
-            <w:r>
-              <w:rPr>
-                <w:rFonts w:ascii="Helvetica" w:eastAsia="Helvetica" w:hAnsi="Helvetica" w:cs="Helvetica"/>
-                <w:color w:val="000000"/>
-                <w:sz w:val="22"/>
-                <w:szCs w:val="22"/>
-              </w:rPr>
-              <w:t>rango</w:t>
-            </w:r>
-            <w:proofErr w:type="spellEnd"/>
-            <w:r>
-              <w:rPr>
-                <w:rFonts w:ascii="Helvetica" w:eastAsia="Helvetica" w:hAnsi="Helvetica" w:cs="Helvetica"/>
-                <w:color w:val="000000"/>
-                <w:sz w:val="22"/>
-                <w:szCs w:val="22"/>
-              </w:rPr>
-              <w:t>: 0.0-32.0)</w:t>
+                <w:rFonts w:ascii="Helvetica" w:hAnsi="Helvetica" w:eastAsia="Helvetica" w:cs="Helvetica"/>
+                <w:i w:val="false"/>
+                <w:b w:val="false"/>
+                <w:u w:val="none"/>
+                <w:strike w:val="false"/>
+                <w:sz w:val="22"/>
+                <w:szCs w:val="22"/>
+                <w:color w:val="000000"/>
+              </w:rPr>
+              <w:t xml:space="preserve">14.1 ± 7.8 (rango: 0.0-32.0)</w:t>
             </w:r>
           </w:p>
         </w:tc>
       </w:tr>
       <w:tr>
         <w:trPr>
-          <w:jc w:val="center"/>
+          <w:trHeight w:val="573" w:hRule="auto"/>
         </w:trPr>
         <w:tc>
           <w:tcPr>
-            <w:tcW w:w="2576" w:type="dxa"/>
             <w:tcBorders>
+              <w:bottom w:val="none" w:sz="0" w:space="0" w:color="000000"/>
               <w:top w:val="none" w:sz="0" w:space="0" w:color="000000"/>
               <w:left w:val="none" w:sz="0" w:space="0" w:color="000000"/>
-              <w:bottom w:val="none" w:sz="0" w:space="0" w:color="000000"/>
               <w:right w:val="none" w:sz="0" w:space="0" w:color="000000"/>
             </w:tcBorders>
             <w:shd w:val="clear" w:color="auto" w:fill="FFFFFF"/>
             <w:tcMar>
               <w:top w:w="0" w:type="dxa"/>
+              <w:bottom w:w="0" w:type="dxa"/>
               <w:left w:w="0" w:type="dxa"/>
-              <w:bottom w:w="0" w:type="dxa"/>
               <w:right w:w="0" w:type="dxa"/>
             </w:tcMar>
+            <w:vAlign w:val="top"/>
           </w:tcPr>
           <w:p>
             <w:pPr>
+              <w:pStyle w:val="Normal"/>
+              <w:jc w:val="left"/>
               <w:pBdr>
+                <w:bottom w:val="none" w:sz="0" w:space="0" w:color="000000"/>
                 <w:top w:val="none" w:sz="0" w:space="0" w:color="000000"/>
                 <w:left w:val="none" w:sz="0" w:space="0" w:color="000000"/>
-                <w:bottom w:val="none" w:sz="0" w:space="0" w:color="000000"/>
                 <w:right w:val="none" w:sz="0" w:space="0" w:color="000000"/>
               </w:pBdr>
-              <w:spacing w:before="100" w:after="100"/>
-              <w:ind w:left="100" w:right="100"/>
-              <w:rPr>
-                <w:rFonts w:ascii="Helvetica" w:eastAsia="Helvetica" w:hAnsi="Helvetica" w:cs="Helvetica"/>
-                <w:b/>
-                <w:color w:val="000000"/>
-                <w:sz w:val="22"/>
-                <w:szCs w:val="22"/>
+              <w:spacing w:after="100" w:before="100" w:line="240"/>
+              <w:ind w:left="100" w:right="100" w:firstLine="0" w:firstLineChars="0"/>
+              <w:rPr>
+                <w:rFonts w:ascii="Helvetica" w:hAnsi="Helvetica" w:eastAsia="Helvetica" w:cs="Helvetica"/>
+                <w:i w:val="false"/>
+                <w:b w:val="true"/>
+                <w:u w:val="none"/>
+                <w:strike w:val="false"/>
+                <w:sz w:val="22"/>
+                <w:szCs w:val="22"/>
+                <w:color w:val="000000"/>
               </w:rPr>
             </w:pPr>
             <w:r>
               <w:rPr>
-                <w:rFonts w:ascii="Helvetica" w:eastAsia="Helvetica" w:hAnsi="Helvetica" w:cs="Helvetica"/>
-                <w:b/>
-                <w:color w:val="000000"/>
-                <w:sz w:val="22"/>
-                <w:szCs w:val="22"/>
-              </w:rPr>
-              <w:t xml:space="preserve">Estado de </w:t>
-            </w:r>
-            <w:proofErr w:type="spellStart"/>
-            <w:r>
-              <w:rPr>
-                <w:rFonts w:ascii="Helvetica" w:eastAsia="Helvetica" w:hAnsi="Helvetica" w:cs="Helvetica"/>
-                <w:b/>
-                <w:color w:val="000000"/>
-                <w:sz w:val="22"/>
-                <w:szCs w:val="22"/>
-              </w:rPr>
-              <w:t>salud</w:t>
-            </w:r>
-            <w:proofErr w:type="spellEnd"/>
-            <w:r>
-              <w:rPr>
-                <w:rFonts w:ascii="Helvetica" w:eastAsia="Helvetica" w:hAnsi="Helvetica" w:cs="Helvetica"/>
-                <w:b/>
-                <w:color w:val="000000"/>
-                <w:sz w:val="22"/>
-                <w:szCs w:val="22"/>
-              </w:rPr>
-              <w:t xml:space="preserve"> </w:t>
-            </w:r>
-            <w:proofErr w:type="spellStart"/>
-            <w:r>
-              <w:rPr>
-                <w:rFonts w:ascii="Helvetica" w:eastAsia="Helvetica" w:hAnsi="Helvetica" w:cs="Helvetica"/>
-                <w:b/>
-                <w:color w:val="000000"/>
-                <w:sz w:val="22"/>
-                <w:szCs w:val="22"/>
-              </w:rPr>
-              <w:t>bucal</w:t>
-            </w:r>
-            <w:proofErr w:type="spellEnd"/>
+                <w:rFonts w:ascii="Helvetica" w:hAnsi="Helvetica" w:eastAsia="Helvetica" w:cs="Helvetica"/>
+                <w:i w:val="false"/>
+                <w:b w:val="true"/>
+                <w:u w:val="none"/>
+                <w:strike w:val="false"/>
+                <w:sz w:val="22"/>
+                <w:szCs w:val="22"/>
+                <w:color w:val="000000"/>
+              </w:rPr>
+              <w:t xml:space="preserve">Estado de salud bucal</w:t>
+            </w:r>
           </w:p>
         </w:tc>
         <w:tc>
           <w:tcPr>
-            <w:tcW w:w="3088" w:type="dxa"/>
             <w:tcBorders>
+              <w:bottom w:val="none" w:sz="0" w:space="0" w:color="000000"/>
               <w:top w:val="none" w:sz="0" w:space="0" w:color="000000"/>
               <w:left w:val="none" w:sz="0" w:space="0" w:color="000000"/>
-              <w:bottom w:val="none" w:sz="0" w:space="0" w:color="000000"/>
               <w:right w:val="none" w:sz="0" w:space="0" w:color="000000"/>
             </w:tcBorders>
             <w:shd w:val="clear" w:color="auto" w:fill="FFFFFF"/>
             <w:tcMar>
               <w:top w:w="0" w:type="dxa"/>
+              <w:bottom w:w="0" w:type="dxa"/>
               <w:left w:w="0" w:type="dxa"/>
-              <w:bottom w:w="0" w:type="dxa"/>
               <w:right w:w="0" w:type="dxa"/>
             </w:tcMar>
+            <w:vAlign w:val="top"/>
           </w:tcPr>
           <w:p>
             <w:pPr>
+              <w:pStyle w:val="Normal"/>
+              <w:jc w:val="center"/>
               <w:pBdr>
+                <w:bottom w:val="none" w:sz="0" w:space="0" w:color="000000"/>
                 <w:top w:val="none" w:sz="0" w:space="0" w:color="000000"/>
                 <w:left w:val="none" w:sz="0" w:space="0" w:color="000000"/>
-                <w:bottom w:val="none" w:sz="0" w:space="0" w:color="000000"/>
                 <w:right w:val="none" w:sz="0" w:space="0" w:color="000000"/>
               </w:pBdr>
-              <w:spacing w:before="100" w:after="100"/>
-              <w:ind w:left="100" w:right="100"/>
-              <w:jc w:val="center"/>
-              <w:rPr>
-                <w:rFonts w:ascii="Helvetica" w:eastAsia="Helvetica" w:hAnsi="Helvetica" w:cs="Helvetica"/>
-                <w:color w:val="000000"/>
-                <w:sz w:val="22"/>
-                <w:szCs w:val="22"/>
+              <w:spacing w:after="100" w:before="100" w:line="240"/>
+              <w:ind w:left="100" w:right="100" w:firstLine="0" w:firstLineChars="0"/>
+              <w:rPr>
+                <w:rFonts w:ascii="Helvetica" w:hAnsi="Helvetica" w:eastAsia="Helvetica" w:cs="Helvetica"/>
+                <w:i w:val="false"/>
+                <w:b w:val="false"/>
+                <w:u w:val="none"/>
+                <w:strike w:val="false"/>
+                <w:sz w:val="22"/>
+                <w:szCs w:val="22"/>
+                <w:color w:val="000000"/>
               </w:rPr>
             </w:pPr>
+            <w:r>
+              <w:rPr>
+                <w:rFonts w:ascii="Helvetica" w:hAnsi="Helvetica" w:eastAsia="Helvetica" w:cs="Helvetica"/>
+                <w:i w:val="false"/>
+                <w:b w:val="false"/>
+                <w:u w:val="none"/>
+                <w:strike w:val="false"/>
+                <w:sz w:val="22"/>
+                <w:szCs w:val="22"/>
+                <w:color w:val="000000"/>
+              </w:rPr>
+              <w:t xml:space="preserve"/>
+            </w:r>
           </w:p>
         </w:tc>
         <w:tc>
           <w:tcPr>
-            <w:tcW w:w="3088" w:type="dxa"/>
             <w:tcBorders>
+              <w:bottom w:val="none" w:sz="0" w:space="0" w:color="000000"/>
               <w:top w:val="none" w:sz="0" w:space="0" w:color="000000"/>
               <w:left w:val="none" w:sz="0" w:space="0" w:color="000000"/>
-              <w:bottom w:val="none" w:sz="0" w:space="0" w:color="000000"/>
               <w:right w:val="none" w:sz="0" w:space="0" w:color="000000"/>
             </w:tcBorders>
             <w:shd w:val="clear" w:color="auto" w:fill="FFFFFF"/>
             <w:tcMar>
               <w:top w:w="0" w:type="dxa"/>
+              <w:bottom w:w="0" w:type="dxa"/>
               <w:left w:w="0" w:type="dxa"/>
-              <w:bottom w:w="0" w:type="dxa"/>
               <w:right w:w="0" w:type="dxa"/>
             </w:tcMar>
+            <w:vAlign w:val="top"/>
           </w:tcPr>
           <w:p>
             <w:pPr>
+              <w:pStyle w:val="Normal"/>
+              <w:jc w:val="center"/>
               <w:pBdr>
+                <w:bottom w:val="none" w:sz="0" w:space="0" w:color="000000"/>
                 <w:top w:val="none" w:sz="0" w:space="0" w:color="000000"/>
                 <w:left w:val="none" w:sz="0" w:space="0" w:color="000000"/>
-                <w:bottom w:val="none" w:sz="0" w:space="0" w:color="000000"/>
                 <w:right w:val="none" w:sz="0" w:space="0" w:color="000000"/>
               </w:pBdr>
-              <w:spacing w:before="100" w:after="100"/>
-              <w:ind w:left="100" w:right="100"/>
-              <w:jc w:val="center"/>
-              <w:rPr>
-                <w:rFonts w:ascii="Helvetica" w:eastAsia="Helvetica" w:hAnsi="Helvetica" w:cs="Helvetica"/>
-                <w:color w:val="000000"/>
-                <w:sz w:val="22"/>
-                <w:szCs w:val="22"/>
+              <w:spacing w:after="100" w:before="100" w:line="240"/>
+              <w:ind w:left="100" w:right="100" w:firstLine="0" w:firstLineChars="0"/>
+              <w:rPr>
+                <w:rFonts w:ascii="Helvetica" w:hAnsi="Helvetica" w:eastAsia="Helvetica" w:cs="Helvetica"/>
+                <w:i w:val="false"/>
+                <w:b w:val="false"/>
+                <w:u w:val="none"/>
+                <w:strike w:val="false"/>
+                <w:sz w:val="22"/>
+                <w:szCs w:val="22"/>
+                <w:color w:val="000000"/>
               </w:rPr>
             </w:pPr>
+            <w:r>
+              <w:rPr>
+                <w:rFonts w:ascii="Helvetica" w:hAnsi="Helvetica" w:eastAsia="Helvetica" w:cs="Helvetica"/>
+                <w:i w:val="false"/>
+                <w:b w:val="false"/>
+                <w:u w:val="none"/>
+                <w:strike w:val="false"/>
+                <w:sz w:val="22"/>
+                <w:szCs w:val="22"/>
+                <w:color w:val="000000"/>
+              </w:rPr>
+              <w:t xml:space="preserve"/>
+            </w:r>
           </w:p>
         </w:tc>
         <w:tc>
           <w:tcPr>
-            <w:tcW w:w="3088" w:type="dxa"/>
             <w:tcBorders>
+              <w:bottom w:val="none" w:sz="0" w:space="0" w:color="000000"/>
               <w:top w:val="none" w:sz="0" w:space="0" w:color="000000"/>
               <w:left w:val="none" w:sz="0" w:space="0" w:color="000000"/>
-              <w:bottom w:val="none" w:sz="0" w:space="0" w:color="000000"/>
               <w:right w:val="none" w:sz="0" w:space="0" w:color="000000"/>
             </w:tcBorders>
             <w:shd w:val="clear" w:color="auto" w:fill="FFFFFF"/>
             <w:tcMar>
               <w:top w:w="0" w:type="dxa"/>
+              <w:bottom w:w="0" w:type="dxa"/>
               <w:left w:w="0" w:type="dxa"/>
-              <w:bottom w:w="0" w:type="dxa"/>
               <w:right w:w="0" w:type="dxa"/>
             </w:tcMar>
+            <w:vAlign w:val="top"/>
           </w:tcPr>
           <w:p>
             <w:pPr>
+              <w:pStyle w:val="Normal"/>
+              <w:jc w:val="center"/>
               <w:pBdr>
+                <w:bottom w:val="none" w:sz="0" w:space="0" w:color="000000"/>
                 <w:top w:val="none" w:sz="0" w:space="0" w:color="000000"/>
                 <w:left w:val="none" w:sz="0" w:space="0" w:color="000000"/>
-                <w:bottom w:val="none" w:sz="0" w:space="0" w:color="000000"/>
                 <w:right w:val="none" w:sz="0" w:space="0" w:color="000000"/>
               </w:pBdr>
-              <w:spacing w:before="100" w:after="100"/>
-              <w:ind w:left="100" w:right="100"/>
-              <w:jc w:val="center"/>
-              <w:rPr>
-                <w:rFonts w:ascii="Helvetica" w:eastAsia="Helvetica" w:hAnsi="Helvetica" w:cs="Helvetica"/>
-                <w:color w:val="000000"/>
-                <w:sz w:val="22"/>
-                <w:szCs w:val="22"/>
+              <w:spacing w:after="100" w:before="100" w:line="240"/>
+              <w:ind w:left="100" w:right="100" w:firstLine="0" w:firstLineChars="0"/>
+              <w:rPr>
+                <w:rFonts w:ascii="Helvetica" w:hAnsi="Helvetica" w:eastAsia="Helvetica" w:cs="Helvetica"/>
+                <w:i w:val="false"/>
+                <w:b w:val="false"/>
+                <w:u w:val="none"/>
+                <w:strike w:val="false"/>
+                <w:sz w:val="22"/>
+                <w:szCs w:val="22"/>
+                <w:color w:val="000000"/>
               </w:rPr>
             </w:pPr>
+            <w:r>
+              <w:rPr>
+                <w:rFonts w:ascii="Helvetica" w:hAnsi="Helvetica" w:eastAsia="Helvetica" w:cs="Helvetica"/>
+                <w:i w:val="false"/>
+                <w:b w:val="false"/>
+                <w:u w:val="none"/>
+                <w:strike w:val="false"/>
+                <w:sz w:val="22"/>
+                <w:szCs w:val="22"/>
+                <w:color w:val="000000"/>
+              </w:rPr>
+              <w:t xml:space="preserve"/>
+            </w:r>
           </w:p>
         </w:tc>
       </w:tr>
       <w:tr>
         <w:trPr>
-          <w:jc w:val="center"/>
+          <w:trHeight w:val="616" w:hRule="auto"/>
         </w:trPr>
         <w:tc>
           <w:tcPr>
-            <w:tcW w:w="2576" w:type="dxa"/>
             <w:tcBorders>
+              <w:bottom w:val="none" w:sz="0" w:space="0" w:color="000000"/>
               <w:top w:val="none" w:sz="0" w:space="0" w:color="000000"/>
               <w:left w:val="none" w:sz="0" w:space="0" w:color="000000"/>
-              <w:bottom w:val="none" w:sz="0" w:space="0" w:color="000000"/>
               <w:right w:val="none" w:sz="0" w:space="0" w:color="000000"/>
             </w:tcBorders>
             <w:shd w:val="clear" w:color="auto" w:fill="FFFFFF"/>
             <w:tcMar>
               <w:top w:w="0" w:type="dxa"/>
+              <w:bottom w:w="0" w:type="dxa"/>
               <w:left w:w="0" w:type="dxa"/>
-              <w:bottom w:w="0" w:type="dxa"/>
               <w:right w:w="0" w:type="dxa"/>
             </w:tcMar>
+            <w:vAlign w:val="top"/>
           </w:tcPr>
           <w:p>
             <w:pPr>
+              <w:pStyle w:val="Normal"/>
+              <w:jc w:val="left"/>
               <w:pBdr>
+                <w:bottom w:val="none" w:sz="0" w:space="0" w:color="000000"/>
                 <w:top w:val="none" w:sz="0" w:space="0" w:color="000000"/>
                 <w:left w:val="none" w:sz="0" w:space="0" w:color="000000"/>
-                <w:bottom w:val="none" w:sz="0" w:space="0" w:color="000000"/>
                 <w:right w:val="none" w:sz="0" w:space="0" w:color="000000"/>
               </w:pBdr>
-              <w:spacing w:before="100" w:after="100"/>
-              <w:ind w:left="300" w:right="100"/>
-              <w:rPr>
-                <w:rFonts w:ascii="Helvetica" w:eastAsia="Helvetica" w:hAnsi="Helvetica" w:cs="Helvetica"/>
-                <w:color w:val="000000"/>
-                <w:sz w:val="22"/>
-                <w:szCs w:val="22"/>
+              <w:spacing w:after="100" w:before="100" w:line="240"/>
+              <w:ind w:left="300" w:right="100" w:firstLine="0" w:firstLineChars="0"/>
+              <w:rPr>
+                <w:rFonts w:ascii="Helvetica" w:hAnsi="Helvetica" w:eastAsia="Helvetica" w:cs="Helvetica"/>
+                <w:i w:val="false"/>
+                <w:b w:val="false"/>
+                <w:u w:val="none"/>
+                <w:strike w:val="false"/>
+                <w:sz w:val="22"/>
+                <w:szCs w:val="22"/>
+                <w:color w:val="000000"/>
               </w:rPr>
             </w:pPr>
             <w:r>
               <w:rPr>
-                <w:rFonts w:ascii="Helvetica" w:eastAsia="Helvetica" w:hAnsi="Helvetica" w:cs="Helvetica"/>
-                <w:color w:val="000000"/>
-                <w:sz w:val="22"/>
-                <w:szCs w:val="22"/>
-              </w:rPr>
-              <w:t>MUY BAJO</w:t>
+                <w:rFonts w:ascii="Helvetica" w:hAnsi="Helvetica" w:eastAsia="Helvetica" w:cs="Helvetica"/>
+                <w:i w:val="false"/>
+                <w:b w:val="false"/>
+                <w:u w:val="none"/>
+                <w:strike w:val="false"/>
+                <w:sz w:val="22"/>
+                <w:szCs w:val="22"/>
+                <w:color w:val="000000"/>
+              </w:rPr>
+              <w:t xml:space="preserve">MUY BAJO</w:t>
             </w:r>
           </w:p>
         </w:tc>
         <w:tc>
           <w:tcPr>
-            <w:tcW w:w="3088" w:type="dxa"/>
             <w:tcBorders>
+              <w:bottom w:val="none" w:sz="0" w:space="0" w:color="000000"/>
               <w:top w:val="none" w:sz="0" w:space="0" w:color="000000"/>
               <w:left w:val="none" w:sz="0" w:space="0" w:color="000000"/>
-              <w:bottom w:val="none" w:sz="0" w:space="0" w:color="000000"/>
               <w:right w:val="none" w:sz="0" w:space="0" w:color="000000"/>
             </w:tcBorders>
             <w:shd w:val="clear" w:color="auto" w:fill="FFFFFF"/>
             <w:tcMar>
               <w:top w:w="0" w:type="dxa"/>
+              <w:bottom w:w="0" w:type="dxa"/>
               <w:left w:w="0" w:type="dxa"/>
-              <w:bottom w:w="0" w:type="dxa"/>
               <w:right w:w="0" w:type="dxa"/>
             </w:tcMar>
+            <w:vAlign w:val="top"/>
           </w:tcPr>
           <w:p>
             <w:pPr>
+              <w:pStyle w:val="Normal"/>
+              <w:jc w:val="center"/>
               <w:pBdr>
+                <w:bottom w:val="none" w:sz="0" w:space="0" w:color="000000"/>
                 <w:top w:val="none" w:sz="0" w:space="0" w:color="000000"/>
                 <w:left w:val="none" w:sz="0" w:space="0" w:color="000000"/>
-                <w:bottom w:val="none" w:sz="0" w:space="0" w:color="000000"/>
                 <w:right w:val="none" w:sz="0" w:space="0" w:color="000000"/>
               </w:pBdr>
-              <w:spacing w:before="100" w:after="100"/>
-              <w:ind w:left="100" w:right="100"/>
-              <w:jc w:val="center"/>
-              <w:rPr>
-                <w:rFonts w:ascii="Helvetica" w:eastAsia="Helvetica" w:hAnsi="Helvetica" w:cs="Helvetica"/>
-                <w:color w:val="000000"/>
-                <w:sz w:val="22"/>
-                <w:szCs w:val="22"/>
+              <w:spacing w:after="100" w:before="100" w:line="240"/>
+              <w:ind w:left="100" w:right="100" w:firstLine="0" w:firstLineChars="0"/>
+              <w:rPr>
+                <w:rFonts w:ascii="Helvetica" w:hAnsi="Helvetica" w:eastAsia="Helvetica" w:cs="Helvetica"/>
+                <w:i w:val="false"/>
+                <w:b w:val="false"/>
+                <w:u w:val="none"/>
+                <w:strike w:val="false"/>
+                <w:sz w:val="22"/>
+                <w:szCs w:val="22"/>
+                <w:color w:val="000000"/>
               </w:rPr>
             </w:pPr>
             <w:r>
               <w:rPr>
-                <w:rFonts w:ascii="Helvetica" w:eastAsia="Helvetica" w:hAnsi="Helvetica" w:cs="Helvetica"/>
-                <w:color w:val="000000"/>
-                <w:sz w:val="22"/>
-                <w:szCs w:val="22"/>
-              </w:rPr>
-              <w:t>16,038 (23.0%)</w:t>
+                <w:rFonts w:ascii="Helvetica" w:hAnsi="Helvetica" w:eastAsia="Helvetica" w:cs="Helvetica"/>
+                <w:i w:val="false"/>
+                <w:b w:val="false"/>
+                <w:u w:val="none"/>
+                <w:strike w:val="false"/>
+                <w:sz w:val="22"/>
+                <w:szCs w:val="22"/>
+                <w:color w:val="000000"/>
+              </w:rPr>
+              <w:t xml:space="preserve">16,038 (23.0%)</w:t>
             </w:r>
           </w:p>
         </w:tc>
         <w:tc>
           <w:tcPr>
-            <w:tcW w:w="3088" w:type="dxa"/>
             <w:tcBorders>
+              <w:bottom w:val="none" w:sz="0" w:space="0" w:color="000000"/>
               <w:top w:val="none" w:sz="0" w:space="0" w:color="000000"/>
               <w:left w:val="none" w:sz="0" w:space="0" w:color="000000"/>
-              <w:bottom w:val="none" w:sz="0" w:space="0" w:color="000000"/>
               <w:right w:val="none" w:sz="0" w:space="0" w:color="000000"/>
             </w:tcBorders>
             <w:shd w:val="clear" w:color="auto" w:fill="FFFFFF"/>
             <w:tcMar>
               <w:top w:w="0" w:type="dxa"/>
+              <w:bottom w:w="0" w:type="dxa"/>
               <w:left w:w="0" w:type="dxa"/>
-              <w:bottom w:w="0" w:type="dxa"/>
               <w:right w:w="0" w:type="dxa"/>
             </w:tcMar>
+            <w:vAlign w:val="top"/>
           </w:tcPr>
           <w:p>
             <w:pPr>
+              <w:pStyle w:val="Normal"/>
+              <w:jc w:val="center"/>
               <w:pBdr>
+                <w:bottom w:val="none" w:sz="0" w:space="0" w:color="000000"/>
                 <w:top w:val="none" w:sz="0" w:space="0" w:color="000000"/>
                 <w:left w:val="none" w:sz="0" w:space="0" w:color="000000"/>
-                <w:bottom w:val="none" w:sz="0" w:space="0" w:color="000000"/>
                 <w:right w:val="none" w:sz="0" w:space="0" w:color="000000"/>
               </w:pBdr>
-              <w:spacing w:before="100" w:after="100"/>
-              <w:ind w:left="100" w:right="100"/>
-              <w:jc w:val="center"/>
-              <w:rPr>
-                <w:rFonts w:ascii="Helvetica" w:eastAsia="Helvetica" w:hAnsi="Helvetica" w:cs="Helvetica"/>
-                <w:color w:val="000000"/>
-                <w:sz w:val="22"/>
-                <w:szCs w:val="22"/>
+              <w:spacing w:after="100" w:before="100" w:line="240"/>
+              <w:ind w:left="100" w:right="100" w:firstLine="0" w:firstLineChars="0"/>
+              <w:rPr>
+                <w:rFonts w:ascii="Helvetica" w:hAnsi="Helvetica" w:eastAsia="Helvetica" w:cs="Helvetica"/>
+                <w:i w:val="false"/>
+                <w:b w:val="false"/>
+                <w:u w:val="none"/>
+                <w:strike w:val="false"/>
+                <w:sz w:val="22"/>
+                <w:szCs w:val="22"/>
+                <w:color w:val="000000"/>
               </w:rPr>
             </w:pPr>
             <w:r>
               <w:rPr>
-                <w:rFonts w:ascii="Helvetica" w:eastAsia="Helvetica" w:hAnsi="Helvetica" w:cs="Helvetica"/>
-                <w:color w:val="000000"/>
-                <w:sz w:val="22"/>
-                <w:szCs w:val="22"/>
-              </w:rPr>
-              <w:t>9,210 (20.7%)</w:t>
+                <w:rFonts w:ascii="Helvetica" w:hAnsi="Helvetica" w:eastAsia="Helvetica" w:cs="Helvetica"/>
+                <w:i w:val="false"/>
+                <w:b w:val="false"/>
+                <w:u w:val="none"/>
+                <w:strike w:val="false"/>
+                <w:sz w:val="22"/>
+                <w:szCs w:val="22"/>
+                <w:color w:val="000000"/>
+              </w:rPr>
+              <w:t xml:space="preserve">9,210 (20.7%)</w:t>
             </w:r>
           </w:p>
         </w:tc>
         <w:tc>
           <w:tcPr>
-            <w:tcW w:w="3088" w:type="dxa"/>
             <w:tcBorders>
+              <w:bottom w:val="none" w:sz="0" w:space="0" w:color="000000"/>
               <w:top w:val="none" w:sz="0" w:space="0" w:color="000000"/>
               <w:left w:val="none" w:sz="0" w:space="0" w:color="000000"/>
-              <w:bottom w:val="none" w:sz="0" w:space="0" w:color="000000"/>
               <w:right w:val="none" w:sz="0" w:space="0" w:color="000000"/>
             </w:tcBorders>
             <w:shd w:val="clear" w:color="auto" w:fill="FFFFFF"/>
             <w:tcMar>
               <w:top w:w="0" w:type="dxa"/>
+              <w:bottom w:w="0" w:type="dxa"/>
               <w:left w:w="0" w:type="dxa"/>
-              <w:bottom w:w="0" w:type="dxa"/>
               <w:right w:w="0" w:type="dxa"/>
             </w:tcMar>
+            <w:vAlign w:val="top"/>
           </w:tcPr>
           <w:p>
             <w:pPr>
+              <w:pStyle w:val="Normal"/>
+              <w:jc w:val="center"/>
               <w:pBdr>
+                <w:bottom w:val="none" w:sz="0" w:space="0" w:color="000000"/>
                 <w:top w:val="none" w:sz="0" w:space="0" w:color="000000"/>
                 <w:left w:val="none" w:sz="0" w:space="0" w:color="000000"/>
-                <w:bottom w:val="none" w:sz="0" w:space="0" w:color="000000"/>
                 <w:right w:val="none" w:sz="0" w:space="0" w:color="000000"/>
               </w:pBdr>
-              <w:spacing w:before="100" w:after="100"/>
-              <w:ind w:left="100" w:right="100"/>
-              <w:jc w:val="center"/>
-              <w:rPr>
-                <w:rFonts w:ascii="Helvetica" w:eastAsia="Helvetica" w:hAnsi="Helvetica" w:cs="Helvetica"/>
-                <w:color w:val="000000"/>
-                <w:sz w:val="22"/>
-                <w:szCs w:val="22"/>
+              <w:spacing w:after="100" w:before="100" w:line="240"/>
+              <w:ind w:left="100" w:right="100" w:firstLine="0" w:firstLineChars="0"/>
+              <w:rPr>
+                <w:rFonts w:ascii="Helvetica" w:hAnsi="Helvetica" w:eastAsia="Helvetica" w:cs="Helvetica"/>
+                <w:i w:val="false"/>
+                <w:b w:val="false"/>
+                <w:u w:val="none"/>
+                <w:strike w:val="false"/>
+                <w:sz w:val="22"/>
+                <w:szCs w:val="22"/>
+                <w:color w:val="000000"/>
               </w:rPr>
             </w:pPr>
             <w:r>
               <w:rPr>
-                <w:rFonts w:ascii="Helvetica" w:eastAsia="Helvetica" w:hAnsi="Helvetica" w:cs="Helvetica"/>
-                <w:color w:val="000000"/>
-                <w:sz w:val="22"/>
-                <w:szCs w:val="22"/>
-              </w:rPr>
-              <w:t>6,828 (26.9%)</w:t>
+                <w:rFonts w:ascii="Helvetica" w:hAnsi="Helvetica" w:eastAsia="Helvetica" w:cs="Helvetica"/>
+                <w:i w:val="false"/>
+                <w:b w:val="false"/>
+                <w:u w:val="none"/>
+                <w:strike w:val="false"/>
+                <w:sz w:val="22"/>
+                <w:szCs w:val="22"/>
+                <w:color w:val="000000"/>
+              </w:rPr>
+              <w:t xml:space="preserve">6,828 (26.9%)</w:t>
             </w:r>
           </w:p>
         </w:tc>
       </w:tr>
       <w:tr>
         <w:trPr>
-          <w:jc w:val="center"/>
+          <w:trHeight w:val="616" w:hRule="auto"/>
         </w:trPr>
         <w:tc>
           <w:tcPr>
-            <w:tcW w:w="2576" w:type="dxa"/>
             <w:tcBorders>
+              <w:bottom w:val="none" w:sz="0" w:space="0" w:color="000000"/>
               <w:top w:val="none" w:sz="0" w:space="0" w:color="000000"/>
               <w:left w:val="none" w:sz="0" w:space="0" w:color="000000"/>
-              <w:bottom w:val="none" w:sz="0" w:space="0" w:color="000000"/>
               <w:right w:val="none" w:sz="0" w:space="0" w:color="000000"/>
             </w:tcBorders>
             <w:shd w:val="clear" w:color="auto" w:fill="FFFFFF"/>
             <w:tcMar>
               <w:top w:w="0" w:type="dxa"/>
+              <w:bottom w:w="0" w:type="dxa"/>
               <w:left w:w="0" w:type="dxa"/>
-              <w:bottom w:w="0" w:type="dxa"/>
               <w:right w:w="0" w:type="dxa"/>
             </w:tcMar>
+            <w:vAlign w:val="top"/>
           </w:tcPr>
           <w:p>
             <w:pPr>
+              <w:pStyle w:val="Normal"/>
+              <w:jc w:val="left"/>
               <w:pBdr>
+                <w:bottom w:val="none" w:sz="0" w:space="0" w:color="000000"/>
                 <w:top w:val="none" w:sz="0" w:space="0" w:color="000000"/>
                 <w:left w:val="none" w:sz="0" w:space="0" w:color="000000"/>
-                <w:bottom w:val="none" w:sz="0" w:space="0" w:color="000000"/>
                 <w:right w:val="none" w:sz="0" w:space="0" w:color="000000"/>
               </w:pBdr>
-              <w:spacing w:before="100" w:after="100"/>
-              <w:ind w:left="300" w:right="100"/>
-              <w:rPr>
-                <w:rFonts w:ascii="Helvetica" w:eastAsia="Helvetica" w:hAnsi="Helvetica" w:cs="Helvetica"/>
-                <w:color w:val="000000"/>
-                <w:sz w:val="22"/>
-                <w:szCs w:val="22"/>
+              <w:spacing w:after="100" w:before="100" w:line="240"/>
+              <w:ind w:left="300" w:right="100" w:firstLine="0" w:firstLineChars="0"/>
+              <w:rPr>
+                <w:rFonts w:ascii="Helvetica" w:hAnsi="Helvetica" w:eastAsia="Helvetica" w:cs="Helvetica"/>
+                <w:i w:val="false"/>
+                <w:b w:val="false"/>
+                <w:u w:val="none"/>
+                <w:strike w:val="false"/>
+                <w:sz w:val="22"/>
+                <w:szCs w:val="22"/>
+                <w:color w:val="000000"/>
               </w:rPr>
             </w:pPr>
             <w:r>
               <w:rPr>
-                <w:rFonts w:ascii="Helvetica" w:eastAsia="Helvetica" w:hAnsi="Helvetica" w:cs="Helvetica"/>
-                <w:color w:val="000000"/>
-                <w:sz w:val="22"/>
-                <w:szCs w:val="22"/>
-              </w:rPr>
-              <w:t>BAJO</w:t>
+                <w:rFonts w:ascii="Helvetica" w:hAnsi="Helvetica" w:eastAsia="Helvetica" w:cs="Helvetica"/>
+                <w:i w:val="false"/>
+                <w:b w:val="false"/>
+                <w:u w:val="none"/>
+                <w:strike w:val="false"/>
+                <w:sz w:val="22"/>
+                <w:szCs w:val="22"/>
+                <w:color w:val="000000"/>
+              </w:rPr>
+              <w:t xml:space="preserve">BAJO</w:t>
             </w:r>
           </w:p>
         </w:tc>
         <w:tc>
           <w:tcPr>
-            <w:tcW w:w="3088" w:type="dxa"/>
             <w:tcBorders>
+              <w:bottom w:val="none" w:sz="0" w:space="0" w:color="000000"/>
               <w:top w:val="none" w:sz="0" w:space="0" w:color="000000"/>
               <w:left w:val="none" w:sz="0" w:space="0" w:color="000000"/>
-              <w:bottom w:val="none" w:sz="0" w:space="0" w:color="000000"/>
               <w:right w:val="none" w:sz="0" w:space="0" w:color="000000"/>
             </w:tcBorders>
             <w:shd w:val="clear" w:color="auto" w:fill="FFFFFF"/>
             <w:tcMar>
               <w:top w:w="0" w:type="dxa"/>
+              <w:bottom w:w="0" w:type="dxa"/>
               <w:left w:w="0" w:type="dxa"/>
-              <w:bottom w:w="0" w:type="dxa"/>
               <w:right w:w="0" w:type="dxa"/>
             </w:tcMar>
+            <w:vAlign w:val="top"/>
           </w:tcPr>
           <w:p>
             <w:pPr>
+              <w:pStyle w:val="Normal"/>
+              <w:jc w:val="center"/>
               <w:pBdr>
+                <w:bottom w:val="none" w:sz="0" w:space="0" w:color="000000"/>
                 <w:top w:val="none" w:sz="0" w:space="0" w:color="000000"/>
                 <w:left w:val="none" w:sz="0" w:space="0" w:color="000000"/>
-                <w:bottom w:val="none" w:sz="0" w:space="0" w:color="000000"/>
                 <w:right w:val="none" w:sz="0" w:space="0" w:color="000000"/>
               </w:pBdr>
-              <w:spacing w:before="100" w:after="100"/>
-              <w:ind w:left="100" w:right="100"/>
-              <w:jc w:val="center"/>
-              <w:rPr>
-                <w:rFonts w:ascii="Helvetica" w:eastAsia="Helvetica" w:hAnsi="Helvetica" w:cs="Helvetica"/>
-                <w:color w:val="000000"/>
-                <w:sz w:val="22"/>
-                <w:szCs w:val="22"/>
+              <w:spacing w:after="100" w:before="100" w:line="240"/>
+              <w:ind w:left="100" w:right="100" w:firstLine="0" w:firstLineChars="0"/>
+              <w:rPr>
+                <w:rFonts w:ascii="Helvetica" w:hAnsi="Helvetica" w:eastAsia="Helvetica" w:cs="Helvetica"/>
+                <w:i w:val="false"/>
+                <w:b w:val="false"/>
+                <w:u w:val="none"/>
+                <w:strike w:val="false"/>
+                <w:sz w:val="22"/>
+                <w:szCs w:val="22"/>
+                <w:color w:val="000000"/>
               </w:rPr>
             </w:pPr>
             <w:r>
               <w:rPr>
-                <w:rFonts w:ascii="Helvetica" w:eastAsia="Helvetica" w:hAnsi="Helvetica" w:cs="Helvetica"/>
-                <w:color w:val="000000"/>
-                <w:sz w:val="22"/>
-                <w:szCs w:val="22"/>
-              </w:rPr>
-              <w:t>13,508 (19.3%)</w:t>
+                <w:rFonts w:ascii="Helvetica" w:hAnsi="Helvetica" w:eastAsia="Helvetica" w:cs="Helvetica"/>
+                <w:i w:val="false"/>
+                <w:b w:val="false"/>
+                <w:u w:val="none"/>
+                <w:strike w:val="false"/>
+                <w:sz w:val="22"/>
+                <w:szCs w:val="22"/>
+                <w:color w:val="000000"/>
+              </w:rPr>
+              <w:t xml:space="preserve">13,508 (19.3%)</w:t>
             </w:r>
           </w:p>
         </w:tc>
         <w:tc>
           <w:tcPr>
-            <w:tcW w:w="3088" w:type="dxa"/>
             <w:tcBorders>
+              <w:bottom w:val="none" w:sz="0" w:space="0" w:color="000000"/>
               <w:top w:val="none" w:sz="0" w:space="0" w:color="000000"/>
               <w:left w:val="none" w:sz="0" w:space="0" w:color="000000"/>
-              <w:bottom w:val="none" w:sz="0" w:space="0" w:color="000000"/>
               <w:right w:val="none" w:sz="0" w:space="0" w:color="000000"/>
             </w:tcBorders>
             <w:shd w:val="clear" w:color="auto" w:fill="FFFFFF"/>
             <w:tcMar>
               <w:top w:w="0" w:type="dxa"/>
+              <w:bottom w:w="0" w:type="dxa"/>
               <w:left w:w="0" w:type="dxa"/>
-              <w:bottom w:w="0" w:type="dxa"/>
               <w:right w:w="0" w:type="dxa"/>
             </w:tcMar>
+            <w:vAlign w:val="top"/>
           </w:tcPr>
           <w:p>
             <w:pPr>
+              <w:pStyle w:val="Normal"/>
+              <w:jc w:val="center"/>
               <w:pBdr>
+                <w:bottom w:val="none" w:sz="0" w:space="0" w:color="000000"/>
                 <w:top w:val="none" w:sz="0" w:space="0" w:color="000000"/>
                 <w:left w:val="none" w:sz="0" w:space="0" w:color="000000"/>
-                <w:bottom w:val="none" w:sz="0" w:space="0" w:color="000000"/>
                 <w:right w:val="none" w:sz="0" w:space="0" w:color="000000"/>
               </w:pBdr>
-              <w:spacing w:before="100" w:after="100"/>
-              <w:ind w:left="100" w:right="100"/>
-              <w:jc w:val="center"/>
-              <w:rPr>
-                <w:rFonts w:ascii="Helvetica" w:eastAsia="Helvetica" w:hAnsi="Helvetica" w:cs="Helvetica"/>
-                <w:color w:val="000000"/>
-                <w:sz w:val="22"/>
-                <w:szCs w:val="22"/>
+              <w:spacing w:after="100" w:before="100" w:line="240"/>
+              <w:ind w:left="100" w:right="100" w:firstLine="0" w:firstLineChars="0"/>
+              <w:rPr>
+                <w:rFonts w:ascii="Helvetica" w:hAnsi="Helvetica" w:eastAsia="Helvetica" w:cs="Helvetica"/>
+                <w:i w:val="false"/>
+                <w:b w:val="false"/>
+                <w:u w:val="none"/>
+                <w:strike w:val="false"/>
+                <w:sz w:val="22"/>
+                <w:szCs w:val="22"/>
+                <w:color w:val="000000"/>
               </w:rPr>
             </w:pPr>
             <w:r>
               <w:rPr>
-                <w:rFonts w:ascii="Helvetica" w:eastAsia="Helvetica" w:hAnsi="Helvetica" w:cs="Helvetica"/>
-                <w:color w:val="000000"/>
-                <w:sz w:val="22"/>
-                <w:szCs w:val="22"/>
-              </w:rPr>
-              <w:t>8,450 (19.0%)</w:t>
+                <w:rFonts w:ascii="Helvetica" w:hAnsi="Helvetica" w:eastAsia="Helvetica" w:cs="Helvetica"/>
+                <w:i w:val="false"/>
+                <w:b w:val="false"/>
+                <w:u w:val="none"/>
+                <w:strike w:val="false"/>
+                <w:sz w:val="22"/>
+                <w:szCs w:val="22"/>
+                <w:color w:val="000000"/>
+              </w:rPr>
+              <w:t xml:space="preserve">8,450 (19.0%)</w:t>
             </w:r>
           </w:p>
         </w:tc>
         <w:tc>
           <w:tcPr>
-            <w:tcW w:w="3088" w:type="dxa"/>
             <w:tcBorders>
+              <w:bottom w:val="none" w:sz="0" w:space="0" w:color="000000"/>
               <w:top w:val="none" w:sz="0" w:space="0" w:color="000000"/>
               <w:left w:val="none" w:sz="0" w:space="0" w:color="000000"/>
-              <w:bottom w:val="none" w:sz="0" w:space="0" w:color="000000"/>
               <w:right w:val="none" w:sz="0" w:space="0" w:color="000000"/>
             </w:tcBorders>
             <w:shd w:val="clear" w:color="auto" w:fill="FFFFFF"/>
             <w:tcMar>
               <w:top w:w="0" w:type="dxa"/>
+              <w:bottom w:w="0" w:type="dxa"/>
               <w:left w:w="0" w:type="dxa"/>
-              <w:bottom w:w="0" w:type="dxa"/>
               <w:right w:w="0" w:type="dxa"/>
             </w:tcMar>
+            <w:vAlign w:val="top"/>
           </w:tcPr>
           <w:p>
             <w:pPr>
+              <w:pStyle w:val="Normal"/>
+              <w:jc w:val="center"/>
               <w:pBdr>
+                <w:bottom w:val="none" w:sz="0" w:space="0" w:color="000000"/>
                 <w:top w:val="none" w:sz="0" w:space="0" w:color="000000"/>
                 <w:left w:val="none" w:sz="0" w:space="0" w:color="000000"/>
-                <w:bottom w:val="none" w:sz="0" w:space="0" w:color="000000"/>
                 <w:right w:val="none" w:sz="0" w:space="0" w:color="000000"/>
               </w:pBdr>
-              <w:spacing w:before="100" w:after="100"/>
-              <w:ind w:left="100" w:right="100"/>
-              <w:jc w:val="center"/>
-              <w:rPr>
-                <w:rFonts w:ascii="Helvetica" w:eastAsia="Helvetica" w:hAnsi="Helvetica" w:cs="Helvetica"/>
-                <w:color w:val="000000"/>
-                <w:sz w:val="22"/>
-                <w:szCs w:val="22"/>
+              <w:spacing w:after="100" w:before="100" w:line="240"/>
+              <w:ind w:left="100" w:right="100" w:firstLine="0" w:firstLineChars="0"/>
+              <w:rPr>
+                <w:rFonts w:ascii="Helvetica" w:hAnsi="Helvetica" w:eastAsia="Helvetica" w:cs="Helvetica"/>
+                <w:i w:val="false"/>
+                <w:b w:val="false"/>
+                <w:u w:val="none"/>
+                <w:strike w:val="false"/>
+                <w:sz w:val="22"/>
+                <w:szCs w:val="22"/>
+                <w:color w:val="000000"/>
               </w:rPr>
             </w:pPr>
             <w:r>
               <w:rPr>
-                <w:rFonts w:ascii="Helvetica" w:eastAsia="Helvetica" w:hAnsi="Helvetica" w:cs="Helvetica"/>
-                <w:color w:val="000000"/>
-                <w:sz w:val="22"/>
-                <w:szCs w:val="22"/>
-              </w:rPr>
-              <w:t>5,058 (19.9%)</w:t>
+                <w:rFonts w:ascii="Helvetica" w:hAnsi="Helvetica" w:eastAsia="Helvetica" w:cs="Helvetica"/>
+                <w:i w:val="false"/>
+                <w:b w:val="false"/>
+                <w:u w:val="none"/>
+                <w:strike w:val="false"/>
+                <w:sz w:val="22"/>
+                <w:szCs w:val="22"/>
+                <w:color w:val="000000"/>
+              </w:rPr>
+              <w:t xml:space="preserve">5,058 (19.9%)</w:t>
             </w:r>
           </w:p>
         </w:tc>
       </w:tr>
       <w:tr>
         <w:trPr>
-          <w:jc w:val="center"/>
+          <w:trHeight w:val="616" w:hRule="auto"/>
         </w:trPr>
         <w:tc>
           <w:tcPr>
-            <w:tcW w:w="2576" w:type="dxa"/>
             <w:tcBorders>
+              <w:bottom w:val="none" w:sz="0" w:space="0" w:color="000000"/>
               <w:top w:val="none" w:sz="0" w:space="0" w:color="000000"/>
               <w:left w:val="none" w:sz="0" w:space="0" w:color="000000"/>
-              <w:bottom w:val="none" w:sz="0" w:space="0" w:color="000000"/>
               <w:right w:val="none" w:sz="0" w:space="0" w:color="000000"/>
             </w:tcBorders>
             <w:shd w:val="clear" w:color="auto" w:fill="FFFFFF"/>
             <w:tcMar>
               <w:top w:w="0" w:type="dxa"/>
+              <w:bottom w:w="0" w:type="dxa"/>
               <w:left w:w="0" w:type="dxa"/>
-              <w:bottom w:w="0" w:type="dxa"/>
               <w:right w:w="0" w:type="dxa"/>
             </w:tcMar>
+            <w:vAlign w:val="top"/>
           </w:tcPr>
           <w:p>
             <w:pPr>
+              <w:pStyle w:val="Normal"/>
+              <w:jc w:val="left"/>
               <w:pBdr>
+                <w:bottom w:val="none" w:sz="0" w:space="0" w:color="000000"/>
                 <w:top w:val="none" w:sz="0" w:space="0" w:color="000000"/>
                 <w:left w:val="none" w:sz="0" w:space="0" w:color="000000"/>
-                <w:bottom w:val="none" w:sz="0" w:space="0" w:color="000000"/>
                 <w:right w:val="none" w:sz="0" w:space="0" w:color="000000"/>
               </w:pBdr>
-              <w:spacing w:before="100" w:after="100"/>
-              <w:ind w:left="300" w:right="100"/>
-              <w:rPr>
-                <w:rFonts w:ascii="Helvetica" w:eastAsia="Helvetica" w:hAnsi="Helvetica" w:cs="Helvetica"/>
-                <w:color w:val="000000"/>
-                <w:sz w:val="22"/>
-                <w:szCs w:val="22"/>
+              <w:spacing w:after="100" w:before="100" w:line="240"/>
+              <w:ind w:left="300" w:right="100" w:firstLine="0" w:firstLineChars="0"/>
+              <w:rPr>
+                <w:rFonts w:ascii="Helvetica" w:hAnsi="Helvetica" w:eastAsia="Helvetica" w:cs="Helvetica"/>
+                <w:i w:val="false"/>
+                <w:b w:val="false"/>
+                <w:u w:val="none"/>
+                <w:strike w:val="false"/>
+                <w:sz w:val="22"/>
+                <w:szCs w:val="22"/>
+                <w:color w:val="000000"/>
               </w:rPr>
             </w:pPr>
             <w:r>
               <w:rPr>
-                <w:rFonts w:ascii="Helvetica" w:eastAsia="Helvetica" w:hAnsi="Helvetica" w:cs="Helvetica"/>
-                <w:color w:val="000000"/>
-                <w:sz w:val="22"/>
-                <w:szCs w:val="22"/>
-              </w:rPr>
-              <w:t>MODERADO</w:t>
+                <w:rFonts w:ascii="Helvetica" w:hAnsi="Helvetica" w:eastAsia="Helvetica" w:cs="Helvetica"/>
+                <w:i w:val="false"/>
+                <w:b w:val="false"/>
+                <w:u w:val="none"/>
+                <w:strike w:val="false"/>
+                <w:sz w:val="22"/>
+                <w:szCs w:val="22"/>
+                <w:color w:val="000000"/>
+              </w:rPr>
+              <w:t xml:space="preserve">MODERADO</w:t>
             </w:r>
           </w:p>
         </w:tc>
         <w:tc>
           <w:tcPr>
-            <w:tcW w:w="3088" w:type="dxa"/>
             <w:tcBorders>
+              <w:bottom w:val="none" w:sz="0" w:space="0" w:color="000000"/>
               <w:top w:val="none" w:sz="0" w:space="0" w:color="000000"/>
               <w:left w:val="none" w:sz="0" w:space="0" w:color="000000"/>
-              <w:bottom w:val="none" w:sz="0" w:space="0" w:color="000000"/>
               <w:right w:val="none" w:sz="0" w:space="0" w:color="000000"/>
             </w:tcBorders>
             <w:shd w:val="clear" w:color="auto" w:fill="FFFFFF"/>
             <w:tcMar>
               <w:top w:w="0" w:type="dxa"/>
+              <w:bottom w:w="0" w:type="dxa"/>
               <w:left w:w="0" w:type="dxa"/>
-              <w:bottom w:w="0" w:type="dxa"/>
               <w:right w:w="0" w:type="dxa"/>
             </w:tcMar>
+            <w:vAlign w:val="top"/>
           </w:tcPr>
           <w:p>
             <w:pPr>
+              <w:pStyle w:val="Normal"/>
+              <w:jc w:val="center"/>
               <w:pBdr>
+                <w:bottom w:val="none" w:sz="0" w:space="0" w:color="000000"/>
                 <w:top w:val="none" w:sz="0" w:space="0" w:color="000000"/>
                 <w:left w:val="none" w:sz="0" w:space="0" w:color="000000"/>
-                <w:bottom w:val="none" w:sz="0" w:space="0" w:color="000000"/>
                 <w:right w:val="none" w:sz="0" w:space="0" w:color="000000"/>
               </w:pBdr>
-              <w:spacing w:before="100" w:after="100"/>
-              <w:ind w:left="100" w:right="100"/>
-              <w:jc w:val="center"/>
-              <w:rPr>
-                <w:rFonts w:ascii="Helvetica" w:eastAsia="Helvetica" w:hAnsi="Helvetica" w:cs="Helvetica"/>
-                <w:color w:val="000000"/>
-                <w:sz w:val="22"/>
-                <w:szCs w:val="22"/>
+              <w:spacing w:after="100" w:before="100" w:line="240"/>
+              <w:ind w:left="100" w:right="100" w:firstLine="0" w:firstLineChars="0"/>
+              <w:rPr>
+                <w:rFonts w:ascii="Helvetica" w:hAnsi="Helvetica" w:eastAsia="Helvetica" w:cs="Helvetica"/>
+                <w:i w:val="false"/>
+                <w:b w:val="false"/>
+                <w:u w:val="none"/>
+                <w:strike w:val="false"/>
+                <w:sz w:val="22"/>
+                <w:szCs w:val="22"/>
+                <w:color w:val="000000"/>
               </w:rPr>
             </w:pPr>
             <w:r>
               <w:rPr>
-                <w:rFonts w:ascii="Helvetica" w:eastAsia="Helvetica" w:hAnsi="Helvetica" w:cs="Helvetica"/>
-                <w:color w:val="000000"/>
-                <w:sz w:val="22"/>
-                <w:szCs w:val="22"/>
-              </w:rPr>
-              <w:t>14,204 (20.3%)</w:t>
+                <w:rFonts w:ascii="Helvetica" w:hAnsi="Helvetica" w:eastAsia="Helvetica" w:cs="Helvetica"/>
+                <w:i w:val="false"/>
+                <w:b w:val="false"/>
+                <w:u w:val="none"/>
+                <w:strike w:val="false"/>
+                <w:sz w:val="22"/>
+                <w:szCs w:val="22"/>
+                <w:color w:val="000000"/>
+              </w:rPr>
+              <w:t xml:space="preserve">14,204 (20.3%)</w:t>
             </w:r>
           </w:p>
         </w:tc>
         <w:tc>
           <w:tcPr>
-            <w:tcW w:w="3088" w:type="dxa"/>
             <w:tcBorders>
+              <w:bottom w:val="none" w:sz="0" w:space="0" w:color="000000"/>
               <w:top w:val="none" w:sz="0" w:space="0" w:color="000000"/>
               <w:left w:val="none" w:sz="0" w:space="0" w:color="000000"/>
-              <w:bottom w:val="none" w:sz="0" w:space="0" w:color="000000"/>
               <w:right w:val="none" w:sz="0" w:space="0" w:color="000000"/>
             </w:tcBorders>
             <w:shd w:val="clear" w:color="auto" w:fill="FFFFFF"/>
             <w:tcMar>
               <w:top w:w="0" w:type="dxa"/>
+              <w:bottom w:w="0" w:type="dxa"/>
               <w:left w:w="0" w:type="dxa"/>
-              <w:bottom w:w="0" w:type="dxa"/>
               <w:right w:w="0" w:type="dxa"/>
             </w:tcMar>
+            <w:vAlign w:val="top"/>
           </w:tcPr>
           <w:p>
             <w:pPr>
+              <w:pStyle w:val="Normal"/>
+              <w:jc w:val="center"/>
               <w:pBdr>
+                <w:bottom w:val="none" w:sz="0" w:space="0" w:color="000000"/>
                 <w:top w:val="none" w:sz="0" w:space="0" w:color="000000"/>
                 <w:left w:val="none" w:sz="0" w:space="0" w:color="000000"/>
-                <w:bottom w:val="none" w:sz="0" w:space="0" w:color="000000"/>
                 <w:right w:val="none" w:sz="0" w:space="0" w:color="000000"/>
               </w:pBdr>
-              <w:spacing w:before="100" w:after="100"/>
-              <w:ind w:left="100" w:right="100"/>
-              <w:jc w:val="center"/>
-              <w:rPr>
-                <w:rFonts w:ascii="Helvetica" w:eastAsia="Helvetica" w:hAnsi="Helvetica" w:cs="Helvetica"/>
-                <w:color w:val="000000"/>
-                <w:sz w:val="22"/>
-                <w:szCs w:val="22"/>
+              <w:spacing w:after="100" w:before="100" w:line="240"/>
+              <w:ind w:left="100" w:right="100" w:firstLine="0" w:firstLineChars="0"/>
+              <w:rPr>
+                <w:rFonts w:ascii="Helvetica" w:hAnsi="Helvetica" w:eastAsia="Helvetica" w:cs="Helvetica"/>
+                <w:i w:val="false"/>
+                <w:b w:val="false"/>
+                <w:u w:val="none"/>
+                <w:strike w:val="false"/>
+                <w:sz w:val="22"/>
+                <w:szCs w:val="22"/>
+                <w:color w:val="000000"/>
               </w:rPr>
             </w:pPr>
             <w:r>
               <w:rPr>
-                <w:rFonts w:ascii="Helvetica" w:eastAsia="Helvetica" w:hAnsi="Helvetica" w:cs="Helvetica"/>
-                <w:color w:val="000000"/>
-                <w:sz w:val="22"/>
-                <w:szCs w:val="22"/>
-              </w:rPr>
-              <w:t>9,308 (20.9%)</w:t>
+                <w:rFonts w:ascii="Helvetica" w:hAnsi="Helvetica" w:eastAsia="Helvetica" w:cs="Helvetica"/>
+                <w:i w:val="false"/>
+                <w:b w:val="false"/>
+                <w:u w:val="none"/>
+                <w:strike w:val="false"/>
+                <w:sz w:val="22"/>
+                <w:szCs w:val="22"/>
+                <w:color w:val="000000"/>
+              </w:rPr>
+              <w:t xml:space="preserve">9,308 (20.9%)</w:t>
             </w:r>
           </w:p>
         </w:tc>
         <w:tc>
           <w:tcPr>
-            <w:tcW w:w="3088" w:type="dxa"/>
             <w:tcBorders>
+              <w:bottom w:val="none" w:sz="0" w:space="0" w:color="000000"/>
               <w:top w:val="none" w:sz="0" w:space="0" w:color="000000"/>
               <w:left w:val="none" w:sz="0" w:space="0" w:color="000000"/>
-              <w:bottom w:val="none" w:sz="0" w:space="0" w:color="000000"/>
               <w:right w:val="none" w:sz="0" w:space="0" w:color="000000"/>
             </w:tcBorders>
             <w:shd w:val="clear" w:color="auto" w:fill="FFFFFF"/>
             <w:tcMar>
               <w:top w:w="0" w:type="dxa"/>
+              <w:bottom w:w="0" w:type="dxa"/>
               <w:left w:w="0" w:type="dxa"/>
-              <w:bottom w:w="0" w:type="dxa"/>
               <w:right w:w="0" w:type="dxa"/>
             </w:tcMar>
+            <w:vAlign w:val="top"/>
           </w:tcPr>
           <w:p>
             <w:pPr>
+              <w:pStyle w:val="Normal"/>
+              <w:jc w:val="center"/>
               <w:pBdr>
+                <w:bottom w:val="none" w:sz="0" w:space="0" w:color="000000"/>
                 <w:top w:val="none" w:sz="0" w:space="0" w:color="000000"/>
                 <w:left w:val="none" w:sz="0" w:space="0" w:color="000000"/>
-                <w:bottom w:val="none" w:sz="0" w:space="0" w:color="000000"/>
                 <w:right w:val="none" w:sz="0" w:space="0" w:color="000000"/>
               </w:pBdr>
-              <w:spacing w:before="100" w:after="100"/>
-              <w:ind w:left="100" w:right="100"/>
-              <w:jc w:val="center"/>
-              <w:rPr>
-                <w:rFonts w:ascii="Helvetica" w:eastAsia="Helvetica" w:hAnsi="Helvetica" w:cs="Helvetica"/>
-                <w:color w:val="000000"/>
-                <w:sz w:val="22"/>
-                <w:szCs w:val="22"/>
+              <w:spacing w:after="100" w:before="100" w:line="240"/>
+              <w:ind w:left="100" w:right="100" w:firstLine="0" w:firstLineChars="0"/>
+              <w:rPr>
+                <w:rFonts w:ascii="Helvetica" w:hAnsi="Helvetica" w:eastAsia="Helvetica" w:cs="Helvetica"/>
+                <w:i w:val="false"/>
+                <w:b w:val="false"/>
+                <w:u w:val="none"/>
+                <w:strike w:val="false"/>
+                <w:sz w:val="22"/>
+                <w:szCs w:val="22"/>
+                <w:color w:val="000000"/>
               </w:rPr>
             </w:pPr>
             <w:r>
               <w:rPr>
-                <w:rFonts w:ascii="Helvetica" w:eastAsia="Helvetica" w:hAnsi="Helvetica" w:cs="Helvetica"/>
-                <w:color w:val="000000"/>
-                <w:sz w:val="22"/>
-                <w:szCs w:val="22"/>
-              </w:rPr>
-              <w:t>4,896 (19.3%)</w:t>
+                <w:rFonts w:ascii="Helvetica" w:hAnsi="Helvetica" w:eastAsia="Helvetica" w:cs="Helvetica"/>
+                <w:i w:val="false"/>
+                <w:b w:val="false"/>
+                <w:u w:val="none"/>
+                <w:strike w:val="false"/>
+                <w:sz w:val="22"/>
+                <w:szCs w:val="22"/>
+                <w:color w:val="000000"/>
+              </w:rPr>
+              <w:t xml:space="preserve">4,896 (19.3%)</w:t>
             </w:r>
           </w:p>
         </w:tc>
       </w:tr>
       <w:tr>
         <w:trPr>
-          <w:jc w:val="center"/>
+          <w:trHeight w:val="616" w:hRule="auto"/>
         </w:trPr>
         <w:tc>
           <w:tcPr>
-            <w:tcW w:w="2576" w:type="dxa"/>
             <w:tcBorders>
+              <w:bottom w:val="none" w:sz="0" w:space="0" w:color="000000"/>
               <w:top w:val="none" w:sz="0" w:space="0" w:color="000000"/>
               <w:left w:val="none" w:sz="0" w:space="0" w:color="000000"/>
-              <w:bottom w:val="none" w:sz="0" w:space="0" w:color="000000"/>
               <w:right w:val="none" w:sz="0" w:space="0" w:color="000000"/>
             </w:tcBorders>
             <w:shd w:val="clear" w:color="auto" w:fill="FFFFFF"/>
             <w:tcMar>
               <w:top w:w="0" w:type="dxa"/>
+              <w:bottom w:w="0" w:type="dxa"/>
               <w:left w:w="0" w:type="dxa"/>
-              <w:bottom w:w="0" w:type="dxa"/>
               <w:right w:w="0" w:type="dxa"/>
             </w:tcMar>
+            <w:vAlign w:val="top"/>
           </w:tcPr>
           <w:p>
             <w:pPr>
+              <w:pStyle w:val="Normal"/>
+              <w:jc w:val="left"/>
               <w:pBdr>
+                <w:bottom w:val="none" w:sz="0" w:space="0" w:color="000000"/>
                 <w:top w:val="none" w:sz="0" w:space="0" w:color="000000"/>
                 <w:left w:val="none" w:sz="0" w:space="0" w:color="000000"/>
-                <w:bottom w:val="none" w:sz="0" w:space="0" w:color="000000"/>
                 <w:right w:val="none" w:sz="0" w:space="0" w:color="000000"/>
               </w:pBdr>
-              <w:spacing w:before="100" w:after="100"/>
-              <w:ind w:left="300" w:right="100"/>
-              <w:rPr>
-                <w:rFonts w:ascii="Helvetica" w:eastAsia="Helvetica" w:hAnsi="Helvetica" w:cs="Helvetica"/>
-                <w:color w:val="000000"/>
-                <w:sz w:val="22"/>
-                <w:szCs w:val="22"/>
+              <w:spacing w:after="100" w:before="100" w:line="240"/>
+              <w:ind w:left="300" w:right="100" w:firstLine="0" w:firstLineChars="0"/>
+              <w:rPr>
+                <w:rFonts w:ascii="Helvetica" w:hAnsi="Helvetica" w:eastAsia="Helvetica" w:cs="Helvetica"/>
+                <w:i w:val="false"/>
+                <w:b w:val="false"/>
+                <w:u w:val="none"/>
+                <w:strike w:val="false"/>
+                <w:sz w:val="22"/>
+                <w:szCs w:val="22"/>
+                <w:color w:val="000000"/>
               </w:rPr>
             </w:pPr>
             <w:r>
               <w:rPr>
-                <w:rFonts w:ascii="Helvetica" w:eastAsia="Helvetica" w:hAnsi="Helvetica" w:cs="Helvetica"/>
-                <w:color w:val="000000"/>
-                <w:sz w:val="22"/>
-                <w:szCs w:val="22"/>
-              </w:rPr>
-              <w:t>ALTO</w:t>
+                <w:rFonts w:ascii="Helvetica" w:hAnsi="Helvetica" w:eastAsia="Helvetica" w:cs="Helvetica"/>
+                <w:i w:val="false"/>
+                <w:b w:val="false"/>
+                <w:u w:val="none"/>
+                <w:strike w:val="false"/>
+                <w:sz w:val="22"/>
+                <w:szCs w:val="22"/>
+                <w:color w:val="000000"/>
+              </w:rPr>
+              <w:t xml:space="preserve">ALTO</w:t>
             </w:r>
           </w:p>
         </w:tc>
         <w:tc>
           <w:tcPr>
-            <w:tcW w:w="3088" w:type="dxa"/>
             <w:tcBorders>
+              <w:bottom w:val="none" w:sz="0" w:space="0" w:color="000000"/>
               <w:top w:val="none" w:sz="0" w:space="0" w:color="000000"/>
               <w:left w:val="none" w:sz="0" w:space="0" w:color="000000"/>
-              <w:bottom w:val="none" w:sz="0" w:space="0" w:color="000000"/>
               <w:right w:val="none" w:sz="0" w:space="0" w:color="000000"/>
             </w:tcBorders>
             <w:shd w:val="clear" w:color="auto" w:fill="FFFFFF"/>
             <w:tcMar>
               <w:top w:w="0" w:type="dxa"/>
+              <w:bottom w:w="0" w:type="dxa"/>
               <w:left w:w="0" w:type="dxa"/>
-              <w:bottom w:w="0" w:type="dxa"/>
               <w:right w:w="0" w:type="dxa"/>
             </w:tcMar>
+            <w:vAlign w:val="top"/>
           </w:tcPr>
           <w:p>
             <w:pPr>
+              <w:pStyle w:val="Normal"/>
+              <w:jc w:val="center"/>
               <w:pBdr>
+                <w:bottom w:val="none" w:sz="0" w:space="0" w:color="000000"/>
                 <w:top w:val="none" w:sz="0" w:space="0" w:color="000000"/>
                 <w:left w:val="none" w:sz="0" w:space="0" w:color="000000"/>
-                <w:bottom w:val="none" w:sz="0" w:space="0" w:color="000000"/>
                 <w:right w:val="none" w:sz="0" w:space="0" w:color="000000"/>
               </w:pBdr>
-              <w:spacing w:before="100" w:after="100"/>
-              <w:ind w:left="100" w:right="100"/>
-              <w:jc w:val="center"/>
-              <w:rPr>
-                <w:rFonts w:ascii="Helvetica" w:eastAsia="Helvetica" w:hAnsi="Helvetica" w:cs="Helvetica"/>
-                <w:color w:val="000000"/>
-                <w:sz w:val="22"/>
-                <w:szCs w:val="22"/>
+              <w:spacing w:after="100" w:before="100" w:line="240"/>
+              <w:ind w:left="100" w:right="100" w:firstLine="0" w:firstLineChars="0"/>
+              <w:rPr>
+                <w:rFonts w:ascii="Helvetica" w:hAnsi="Helvetica" w:eastAsia="Helvetica" w:cs="Helvetica"/>
+                <w:i w:val="false"/>
+                <w:b w:val="false"/>
+                <w:u w:val="none"/>
+                <w:strike w:val="false"/>
+                <w:sz w:val="22"/>
+                <w:szCs w:val="22"/>
+                <w:color w:val="000000"/>
               </w:rPr>
             </w:pPr>
             <w:r>
               <w:rPr>
-                <w:rFonts w:ascii="Helvetica" w:eastAsia="Helvetica" w:hAnsi="Helvetica" w:cs="Helvetica"/>
-                <w:color w:val="000000"/>
-                <w:sz w:val="22"/>
-                <w:szCs w:val="22"/>
-              </w:rPr>
-              <w:t>13,409 (19.2%)</w:t>
+                <w:rFonts w:ascii="Helvetica" w:hAnsi="Helvetica" w:eastAsia="Helvetica" w:cs="Helvetica"/>
+                <w:i w:val="false"/>
+                <w:b w:val="false"/>
+                <w:u w:val="none"/>
+                <w:strike w:val="false"/>
+                <w:sz w:val="22"/>
+                <w:szCs w:val="22"/>
+                <w:color w:val="000000"/>
+              </w:rPr>
+              <w:t xml:space="preserve">13,409 (19.2%)</w:t>
             </w:r>
           </w:p>
         </w:tc>
         <w:tc>
           <w:tcPr>
-            <w:tcW w:w="3088" w:type="dxa"/>
             <w:tcBorders>
+              <w:bottom w:val="none" w:sz="0" w:space="0" w:color="000000"/>
               <w:top w:val="none" w:sz="0" w:space="0" w:color="000000"/>
               <w:left w:val="none" w:sz="0" w:space="0" w:color="000000"/>
-              <w:bottom w:val="none" w:sz="0" w:space="0" w:color="000000"/>
               <w:right w:val="none" w:sz="0" w:space="0" w:color="000000"/>
             </w:tcBorders>
             <w:shd w:val="clear" w:color="auto" w:fill="FFFFFF"/>
             <w:tcMar>
               <w:top w:w="0" w:type="dxa"/>
+              <w:bottom w:w="0" w:type="dxa"/>
               <w:left w:w="0" w:type="dxa"/>
-              <w:bottom w:w="0" w:type="dxa"/>
               <w:right w:w="0" w:type="dxa"/>
             </w:tcMar>
+            <w:vAlign w:val="top"/>
           </w:tcPr>
           <w:p>
             <w:pPr>
+              <w:pStyle w:val="Normal"/>
+              <w:jc w:val="center"/>
               <w:pBdr>
+                <w:bottom w:val="none" w:sz="0" w:space="0" w:color="000000"/>
                 <w:top w:val="none" w:sz="0" w:space="0" w:color="000000"/>
                 <w:left w:val="none" w:sz="0" w:space="0" w:color="000000"/>
-                <w:bottom w:val="none" w:sz="0" w:space="0" w:color="000000"/>
                 <w:right w:val="none" w:sz="0" w:space="0" w:color="000000"/>
               </w:pBdr>
-              <w:spacing w:before="100" w:after="100"/>
-              <w:ind w:left="100" w:right="100"/>
-              <w:jc w:val="center"/>
-              <w:rPr>
-                <w:rFonts w:ascii="Helvetica" w:eastAsia="Helvetica" w:hAnsi="Helvetica" w:cs="Helvetica"/>
-                <w:color w:val="000000"/>
-                <w:sz w:val="22"/>
-                <w:szCs w:val="22"/>
+              <w:spacing w:after="100" w:before="100" w:line="240"/>
+              <w:ind w:left="100" w:right="100" w:firstLine="0" w:firstLineChars="0"/>
+              <w:rPr>
+                <w:rFonts w:ascii="Helvetica" w:hAnsi="Helvetica" w:eastAsia="Helvetica" w:cs="Helvetica"/>
+                <w:i w:val="false"/>
+                <w:b w:val="false"/>
+                <w:u w:val="none"/>
+                <w:strike w:val="false"/>
+                <w:sz w:val="22"/>
+                <w:szCs w:val="22"/>
+                <w:color w:val="000000"/>
               </w:rPr>
             </w:pPr>
             <w:r>
               <w:rPr>
-                <w:rFonts w:ascii="Helvetica" w:eastAsia="Helvetica" w:hAnsi="Helvetica" w:cs="Helvetica"/>
-                <w:color w:val="000000"/>
-                <w:sz w:val="22"/>
-                <w:szCs w:val="22"/>
-              </w:rPr>
-              <w:t>9,073 (20.4%)</w:t>
+                <w:rFonts w:ascii="Helvetica" w:hAnsi="Helvetica" w:eastAsia="Helvetica" w:cs="Helvetica"/>
+                <w:i w:val="false"/>
+                <w:b w:val="false"/>
+                <w:u w:val="none"/>
+                <w:strike w:val="false"/>
+                <w:sz w:val="22"/>
+                <w:szCs w:val="22"/>
+                <w:color w:val="000000"/>
+              </w:rPr>
+              <w:t xml:space="preserve">9,073 (20.4%)</w:t>
             </w:r>
           </w:p>
         </w:tc>
         <w:tc>
           <w:tcPr>
-            <w:tcW w:w="3088" w:type="dxa"/>
             <w:tcBorders>
+              <w:bottom w:val="none" w:sz="0" w:space="0" w:color="000000"/>
               <w:top w:val="none" w:sz="0" w:space="0" w:color="000000"/>
               <w:left w:val="none" w:sz="0" w:space="0" w:color="000000"/>
-              <w:bottom w:val="none" w:sz="0" w:space="0" w:color="000000"/>
               <w:right w:val="none" w:sz="0" w:space="0" w:color="000000"/>
             </w:tcBorders>
             <w:shd w:val="clear" w:color="auto" w:fill="FFFFFF"/>
             <w:tcMar>
               <w:top w:w="0" w:type="dxa"/>
+              <w:bottom w:w="0" w:type="dxa"/>
               <w:left w:w="0" w:type="dxa"/>
-              <w:bottom w:w="0" w:type="dxa"/>
               <w:right w:w="0" w:type="dxa"/>
             </w:tcMar>
+            <w:vAlign w:val="top"/>
           </w:tcPr>
           <w:p>
             <w:pPr>
+              <w:pStyle w:val="Normal"/>
+              <w:jc w:val="center"/>
               <w:pBdr>
+                <w:bottom w:val="none" w:sz="0" w:space="0" w:color="000000"/>
                 <w:top w:val="none" w:sz="0" w:space="0" w:color="000000"/>
                 <w:left w:val="none" w:sz="0" w:space="0" w:color="000000"/>
-                <w:bottom w:val="none" w:sz="0" w:space="0" w:color="000000"/>
                 <w:right w:val="none" w:sz="0" w:space="0" w:color="000000"/>
               </w:pBdr>
-              <w:spacing w:before="100" w:after="100"/>
-              <w:ind w:left="100" w:right="100"/>
-              <w:jc w:val="center"/>
-              <w:rPr>
-                <w:rFonts w:ascii="Helvetica" w:eastAsia="Helvetica" w:hAnsi="Helvetica" w:cs="Helvetica"/>
-                <w:color w:val="000000"/>
-                <w:sz w:val="22"/>
-                <w:szCs w:val="22"/>
+              <w:spacing w:after="100" w:before="100" w:line="240"/>
+              <w:ind w:left="100" w:right="100" w:firstLine="0" w:firstLineChars="0"/>
+              <w:rPr>
+                <w:rFonts w:ascii="Helvetica" w:hAnsi="Helvetica" w:eastAsia="Helvetica" w:cs="Helvetica"/>
+                <w:i w:val="false"/>
+                <w:b w:val="false"/>
+                <w:u w:val="none"/>
+                <w:strike w:val="false"/>
+                <w:sz w:val="22"/>
+                <w:szCs w:val="22"/>
+                <w:color w:val="000000"/>
               </w:rPr>
             </w:pPr>
             <w:r>
               <w:rPr>
-                <w:rFonts w:ascii="Helvetica" w:eastAsia="Helvetica" w:hAnsi="Helvetica" w:cs="Helvetica"/>
-                <w:color w:val="000000"/>
-                <w:sz w:val="22"/>
-                <w:szCs w:val="22"/>
-              </w:rPr>
-              <w:t>4,336 (17.1%)</w:t>
+                <w:rFonts w:ascii="Helvetica" w:hAnsi="Helvetica" w:eastAsia="Helvetica" w:cs="Helvetica"/>
+                <w:i w:val="false"/>
+                <w:b w:val="false"/>
+                <w:u w:val="none"/>
+                <w:strike w:val="false"/>
+                <w:sz w:val="22"/>
+                <w:szCs w:val="22"/>
+                <w:color w:val="000000"/>
+              </w:rPr>
+              <w:t xml:space="preserve">4,336 (17.1%)</w:t>
             </w:r>
           </w:p>
         </w:tc>
       </w:tr>
       <w:tr>
         <w:trPr>
-          <w:jc w:val="center"/>
+          <w:trHeight w:val="616" w:hRule="auto"/>
         </w:trPr>
         <w:tc>
           <w:tcPr>
-            <w:tcW w:w="2576" w:type="dxa"/>
             <w:tcBorders>
+              <w:bottom w:val="single" w:sz="8" w:space="0" w:color="000000"/>
               <w:top w:val="none" w:sz="0" w:space="0" w:color="000000"/>
               <w:left w:val="none" w:sz="0" w:space="0" w:color="000000"/>
-              <w:bottom w:val="single" w:sz="8" w:space="0" w:color="000000"/>
               <w:right w:val="none" w:sz="0" w:space="0" w:color="000000"/>
             </w:tcBorders>
             <w:shd w:val="clear" w:color="auto" w:fill="FFFFFF"/>
             <w:tcMar>
               <w:top w:w="0" w:type="dxa"/>
+              <w:bottom w:w="0" w:type="dxa"/>
               <w:left w:w="0" w:type="dxa"/>
-              <w:bottom w:w="0" w:type="dxa"/>
               <w:right w:w="0" w:type="dxa"/>
             </w:tcMar>
+            <w:vAlign w:val="top"/>
           </w:tcPr>
           <w:p>
             <w:pPr>
+              <w:pStyle w:val="Normal"/>
+              <w:jc w:val="left"/>
               <w:pBdr>
+                <w:bottom w:val="none" w:sz="0" w:space="0" w:color="000000"/>
                 <w:top w:val="none" w:sz="0" w:space="0" w:color="000000"/>
                 <w:left w:val="none" w:sz="0" w:space="0" w:color="000000"/>
-                <w:bottom w:val="none" w:sz="0" w:space="0" w:color="000000"/>
                 <w:right w:val="none" w:sz="0" w:space="0" w:color="000000"/>
               </w:pBdr>
-              <w:spacing w:before="100" w:after="100"/>
-              <w:ind w:left="300" w:right="100"/>
-              <w:rPr>
-                <w:rFonts w:ascii="Helvetica" w:eastAsia="Helvetica" w:hAnsi="Helvetica" w:cs="Helvetica"/>
-                <w:color w:val="000000"/>
-                <w:sz w:val="22"/>
-                <w:szCs w:val="22"/>
+              <w:spacing w:after="100" w:before="100" w:line="240"/>
+              <w:ind w:left="300" w:right="100" w:firstLine="0" w:firstLineChars="0"/>
+              <w:rPr>
+                <w:rFonts w:ascii="Helvetica" w:hAnsi="Helvetica" w:eastAsia="Helvetica" w:cs="Helvetica"/>
+                <w:i w:val="false"/>
+                <w:b w:val="false"/>
+                <w:u w:val="none"/>
+                <w:strike w:val="false"/>
+                <w:sz w:val="22"/>
+                <w:szCs w:val="22"/>
+                <w:color w:val="000000"/>
               </w:rPr>
             </w:pPr>
             <w:r>
               <w:rPr>
-                <w:rFonts w:ascii="Helvetica" w:eastAsia="Helvetica" w:hAnsi="Helvetica" w:cs="Helvetica"/>
-                <w:color w:val="000000"/>
-                <w:sz w:val="22"/>
-                <w:szCs w:val="22"/>
-              </w:rPr>
-              <w:t>MUY ALTO</w:t>
+                <w:rFonts w:ascii="Helvetica" w:hAnsi="Helvetica" w:eastAsia="Helvetica" w:cs="Helvetica"/>
+                <w:i w:val="false"/>
+                <w:b w:val="false"/>
+                <w:u w:val="none"/>
+                <w:strike w:val="false"/>
+                <w:sz w:val="22"/>
+                <w:szCs w:val="22"/>
+                <w:color w:val="000000"/>
+              </w:rPr>
+              <w:t xml:space="preserve">MUY ALTO</w:t>
             </w:r>
           </w:p>
         </w:tc>
         <w:tc>
           <w:tcPr>
-            <w:tcW w:w="3088" w:type="dxa"/>
             <w:tcBorders>
+              <w:bottom w:val="single" w:sz="8" w:space="0" w:color="000000"/>
               <w:top w:val="none" w:sz="0" w:space="0" w:color="000000"/>
               <w:left w:val="none" w:sz="0" w:space="0" w:color="000000"/>
-              <w:bottom w:val="single" w:sz="8" w:space="0" w:color="000000"/>
               <w:right w:val="none" w:sz="0" w:space="0" w:color="000000"/>
             </w:tcBorders>
             <w:shd w:val="clear" w:color="auto" w:fill="FFFFFF"/>
             <w:tcMar>
               <w:top w:w="0" w:type="dxa"/>
+              <w:bottom w:w="0" w:type="dxa"/>
               <w:left w:w="0" w:type="dxa"/>
-              <w:bottom w:w="0" w:type="dxa"/>
               <w:right w:w="0" w:type="dxa"/>
             </w:tcMar>
+            <w:vAlign w:val="top"/>
           </w:tcPr>
           <w:p>
             <w:pPr>
+              <w:pStyle w:val="Normal"/>
+              <w:jc w:val="center"/>
               <w:pBdr>
+                <w:bottom w:val="none" w:sz="0" w:space="0" w:color="000000"/>
                 <w:top w:val="none" w:sz="0" w:space="0" w:color="000000"/>
                 <w:left w:val="none" w:sz="0" w:space="0" w:color="000000"/>
-                <w:bottom w:val="none" w:sz="0" w:space="0" w:color="000000"/>
                 <w:right w:val="none" w:sz="0" w:space="0" w:color="000000"/>
               </w:pBdr>
-              <w:spacing w:before="100" w:after="100"/>
-              <w:ind w:left="100" w:right="100"/>
-              <w:jc w:val="center"/>
-              <w:rPr>
-                <w:rFonts w:ascii="Helvetica" w:eastAsia="Helvetica" w:hAnsi="Helvetica" w:cs="Helvetica"/>
-                <w:color w:val="000000"/>
-                <w:sz w:val="22"/>
-                <w:szCs w:val="22"/>
+              <w:spacing w:after="100" w:before="100" w:line="240"/>
+              <w:ind w:left="100" w:right="100" w:firstLine="0" w:firstLineChars="0"/>
+              <w:rPr>
+                <w:rFonts w:ascii="Helvetica" w:hAnsi="Helvetica" w:eastAsia="Helvetica" w:cs="Helvetica"/>
+                <w:i w:val="false"/>
+                <w:b w:val="false"/>
+                <w:u w:val="none"/>
+                <w:strike w:val="false"/>
+                <w:sz w:val="22"/>
+                <w:szCs w:val="22"/>
+                <w:color w:val="000000"/>
               </w:rPr>
             </w:pPr>
             <w:r>
               <w:rPr>
-                <w:rFonts w:ascii="Helvetica" w:eastAsia="Helvetica" w:hAnsi="Helvetica" w:cs="Helvetica"/>
-                <w:color w:val="000000"/>
-                <w:sz w:val="22"/>
-                <w:szCs w:val="22"/>
-              </w:rPr>
-              <w:t>12,681 (18.2%)</w:t>
+                <w:rFonts w:ascii="Helvetica" w:hAnsi="Helvetica" w:eastAsia="Helvetica" w:cs="Helvetica"/>
+                <w:i w:val="false"/>
+                <w:b w:val="false"/>
+                <w:u w:val="none"/>
+                <w:strike w:val="false"/>
+                <w:sz w:val="22"/>
+                <w:szCs w:val="22"/>
+                <w:color w:val="000000"/>
+              </w:rPr>
+              <w:t xml:space="preserve">12,681 (18.2%)</w:t>
             </w:r>
           </w:p>
         </w:tc>
         <w:tc>
           <w:tcPr>
-            <w:tcW w:w="3088" w:type="dxa"/>
             <w:tcBorders>
+              <w:bottom w:val="single" w:sz="8" w:space="0" w:color="000000"/>
               <w:top w:val="none" w:sz="0" w:space="0" w:color="000000"/>
               <w:left w:val="none" w:sz="0" w:space="0" w:color="000000"/>
-              <w:bottom w:val="single" w:sz="8" w:space="0" w:color="000000"/>
               <w:right w:val="none" w:sz="0" w:space="0" w:color="000000"/>
             </w:tcBorders>
             <w:shd w:val="clear" w:color="auto" w:fill="FFFFFF"/>
             <w:tcMar>
               <w:top w:w="0" w:type="dxa"/>
+              <w:bottom w:w="0" w:type="dxa"/>
               <w:left w:w="0" w:type="dxa"/>
-              <w:bottom w:w="0" w:type="dxa"/>
               <w:right w:w="0" w:type="dxa"/>
             </w:tcMar>
+            <w:vAlign w:val="top"/>
           </w:tcPr>
           <w:p>
             <w:pPr>
+              <w:pStyle w:val="Normal"/>
+              <w:jc w:val="center"/>
               <w:pBdr>
+                <w:bottom w:val="none" w:sz="0" w:space="0" w:color="000000"/>
                 <w:top w:val="none" w:sz="0" w:space="0" w:color="000000"/>
                 <w:left w:val="none" w:sz="0" w:space="0" w:color="000000"/>
-                <w:bottom w:val="none" w:sz="0" w:space="0" w:color="000000"/>
                 <w:right w:val="none" w:sz="0" w:space="0" w:color="000000"/>
               </w:pBdr>
-              <w:spacing w:before="100" w:after="100"/>
-              <w:ind w:left="100" w:right="100"/>
-              <w:jc w:val="center"/>
-              <w:rPr>
-                <w:rFonts w:ascii="Helvetica" w:eastAsia="Helvetica" w:hAnsi="Helvetica" w:cs="Helvetica"/>
-                <w:color w:val="000000"/>
-                <w:sz w:val="22"/>
-                <w:szCs w:val="22"/>
+              <w:spacing w:after="100" w:before="100" w:line="240"/>
+              <w:ind w:left="100" w:right="100" w:firstLine="0" w:firstLineChars="0"/>
+              <w:rPr>
+                <w:rFonts w:ascii="Helvetica" w:hAnsi="Helvetica" w:eastAsia="Helvetica" w:cs="Helvetica"/>
+                <w:i w:val="false"/>
+                <w:b w:val="false"/>
+                <w:u w:val="none"/>
+                <w:strike w:val="false"/>
+                <w:sz w:val="22"/>
+                <w:szCs w:val="22"/>
+                <w:color w:val="000000"/>
               </w:rPr>
             </w:pPr>
             <w:r>
               <w:rPr>
-                <w:rFonts w:ascii="Helvetica" w:eastAsia="Helvetica" w:hAnsi="Helvetica" w:cs="Helvetica"/>
-                <w:color w:val="000000"/>
-                <w:sz w:val="22"/>
-                <w:szCs w:val="22"/>
-              </w:rPr>
-              <w:t>8,390 (18.9%)</w:t>
+                <w:rFonts w:ascii="Helvetica" w:hAnsi="Helvetica" w:eastAsia="Helvetica" w:cs="Helvetica"/>
+                <w:i w:val="false"/>
+                <w:b w:val="false"/>
+                <w:u w:val="none"/>
+                <w:strike w:val="false"/>
+                <w:sz w:val="22"/>
+                <w:szCs w:val="22"/>
+                <w:color w:val="000000"/>
+              </w:rPr>
+              <w:t xml:space="preserve">8,390 (18.9%)</w:t>
             </w:r>
           </w:p>
         </w:tc>
         <w:tc>
           <w:tcPr>
-            <w:tcW w:w="3088" w:type="dxa"/>
             <w:tcBorders>
+              <w:bottom w:val="single" w:sz="8" w:space="0" w:color="000000"/>
               <w:top w:val="none" w:sz="0" w:space="0" w:color="000000"/>
               <w:left w:val="none" w:sz="0" w:space="0" w:color="000000"/>
-              <w:bottom w:val="single" w:sz="8" w:space="0" w:color="000000"/>
               <w:right w:val="none" w:sz="0" w:space="0" w:color="000000"/>
             </w:tcBorders>
             <w:shd w:val="clear" w:color="auto" w:fill="FFFFFF"/>
             <w:tcMar>
               <w:top w:w="0" w:type="dxa"/>
+              <w:bottom w:w="0" w:type="dxa"/>
               <w:left w:w="0" w:type="dxa"/>
-              <w:bottom w:w="0" w:type="dxa"/>
               <w:right w:w="0" w:type="dxa"/>
             </w:tcMar>
+            <w:vAlign w:val="top"/>
           </w:tcPr>
           <w:p>
             <w:pPr>
+              <w:pStyle w:val="Normal"/>
+              <w:jc w:val="center"/>
               <w:pBdr>
+                <w:bottom w:val="none" w:sz="0" w:space="0" w:color="000000"/>
                 <w:top w:val="none" w:sz="0" w:space="0" w:color="000000"/>
                 <w:left w:val="none" w:sz="0" w:space="0" w:color="000000"/>
-                <w:bottom w:val="none" w:sz="0" w:space="0" w:color="000000"/>
                 <w:right w:val="none" w:sz="0" w:space="0" w:color="000000"/>
               </w:pBdr>
-              <w:spacing w:before="100" w:after="100"/>
-              <w:ind w:left="100" w:right="100"/>
-              <w:jc w:val="center"/>
-              <w:rPr>
-                <w:rFonts w:ascii="Helvetica" w:eastAsia="Helvetica" w:hAnsi="Helvetica" w:cs="Helvetica"/>
-                <w:color w:val="000000"/>
-                <w:sz w:val="22"/>
-                <w:szCs w:val="22"/>
+              <w:spacing w:after="100" w:before="100" w:line="240"/>
+              <w:ind w:left="100" w:right="100" w:firstLine="0" w:firstLineChars="0"/>
+              <w:rPr>
+                <w:rFonts w:ascii="Helvetica" w:hAnsi="Helvetica" w:eastAsia="Helvetica" w:cs="Helvetica"/>
+                <w:i w:val="false"/>
+                <w:b w:val="false"/>
+                <w:u w:val="none"/>
+                <w:strike w:val="false"/>
+                <w:sz w:val="22"/>
+                <w:szCs w:val="22"/>
+                <w:color w:val="000000"/>
               </w:rPr>
             </w:pPr>
             <w:r>
               <w:rPr>
-                <w:rFonts w:ascii="Helvetica" w:eastAsia="Helvetica" w:hAnsi="Helvetica" w:cs="Helvetica"/>
-                <w:color w:val="000000"/>
-                <w:sz w:val="22"/>
-                <w:szCs w:val="22"/>
-              </w:rPr>
-              <w:t>4,291 (16.9%)</w:t>
+                <w:rFonts w:ascii="Helvetica" w:hAnsi="Helvetica" w:eastAsia="Helvetica" w:cs="Helvetica"/>
+                <w:i w:val="false"/>
+                <w:b w:val="false"/>
+                <w:u w:val="none"/>
+                <w:strike w:val="false"/>
+                <w:sz w:val="22"/>
+                <w:szCs w:val="22"/>
+                <w:color w:val="000000"/>
+              </w:rPr>
+              <w:t xml:space="preserve">4,291 (16.9%)</w:t>
             </w:r>
           </w:p>
         </w:tc>
       </w:tr>
       <w:tr>
         <w:trPr>
-          <w:jc w:val="center"/>
+          <w:trHeight w:val="360" w:hRule="auto"/>
         </w:trPr>
         <w:tc>
           <w:tcPr>
-            <w:tcW w:w="11840" w:type="dxa"/>
             <w:gridSpan w:val="4"/>
             <w:tcBorders>
+              <w:bottom w:val="none" w:sz="0" w:space="0" w:color="FFFFFF"/>
               <w:top w:val="single" w:sz="8" w:space="0" w:color="000000"/>
               <w:left w:val="none" w:sz="0" w:space="0" w:color="FFFFFF"/>
-              <w:bottom w:val="none" w:sz="0" w:space="0" w:color="FFFFFF"/>
               <w:right w:val="none" w:sz="0" w:space="0" w:color="FFFFFF"/>
             </w:tcBorders>
             <w:shd w:val="clear" w:color="auto" w:fill="FFFFFF"/>
             <w:tcMar>
               <w:top w:w="0" w:type="dxa"/>
+              <w:bottom w:w="0" w:type="dxa"/>
               <w:left w:w="0" w:type="dxa"/>
-              <w:bottom w:w="0" w:type="dxa"/>
               <w:right w:w="0" w:type="dxa"/>
             </w:tcMar>
             <w:vAlign w:val="center"/>
           </w:tcPr>
           <w:p>
             <w:pPr>
+              <w:pStyle w:val="Normal"/>
+              <w:jc w:val="left"/>
               <w:pBdr>
+                <w:bottom w:val="none" w:sz="0" w:space="0" w:color="000000"/>
                 <w:top w:val="none" w:sz="0" w:space="0" w:color="000000"/>
                 <w:left w:val="none" w:sz="0" w:space="0" w:color="000000"/>
-                <w:bottom w:val="none" w:sz="0" w:space="0" w:color="000000"/>
                 <w:right w:val="none" w:sz="0" w:space="0" w:color="000000"/>
               </w:pBdr>
-              <w:spacing w:before="100" w:after="100"/>
-              <w:ind w:left="100" w:right="100"/>
-              <w:rPr>
-                <w:rFonts w:ascii="Helvetica" w:eastAsia="Helvetica" w:hAnsi="Helvetica" w:cs="Helvetica"/>
-                <w:color w:val="000000"/>
-                <w:sz w:val="22"/>
-                <w:szCs w:val="22"/>
+              <w:spacing w:after="100" w:before="100" w:line="240"/>
+              <w:ind w:left="100" w:right="100" w:firstLine="0" w:firstLineChars="0"/>
+              <w:rPr>
+                <w:rFonts w:ascii="Helvetica" w:hAnsi="Helvetica" w:eastAsia="Helvetica" w:cs="Helvetica"/>
+                <w:i w:val="false"/>
+                <w:b w:val="false"/>
+                <w:u w:val="none"/>
+                <w:strike w:val="false"/>
+                <w:sz w:val="22"/>
+                <w:szCs w:val="22"/>
+                <w:color w:val="000000"/>
               </w:rPr>
             </w:pPr>
             <w:r>
               <w:rPr>
-                <w:rFonts w:ascii="Helvetica" w:eastAsia="Helvetica" w:hAnsi="Helvetica" w:cs="Helvetica"/>
-                <w:color w:val="000000"/>
-                <w:sz w:val="22"/>
-                <w:szCs w:val="22"/>
+                <w:rFonts w:ascii="Helvetica" w:hAnsi="Helvetica" w:eastAsia="Helvetica" w:cs="Helvetica"/>
+                <w:i w:val="false"/>
+                <w:b w:val="false"/>
+                <w:u w:val="none"/>
+                <w:strike w:val="false"/>
                 <w:vertAlign w:val="superscript"/>
-              </w:rPr>
-              <w:t>1</w:t>
-            </w:r>
-            <w:r>
-              <w:rPr>
-                <w:rFonts w:ascii="Helvetica" w:eastAsia="Helvetica" w:hAnsi="Helvetica" w:cs="Helvetica"/>
-                <w:color w:val="000000"/>
-                <w:sz w:val="22"/>
-                <w:szCs w:val="22"/>
-              </w:rPr>
-              <w:t xml:space="preserve">n (%); Media ± DE. CPO-D: </w:t>
-            </w:r>
-            <w:proofErr w:type="spellStart"/>
-            <w:r>
-              <w:rPr>
-                <w:rFonts w:ascii="Helvetica" w:eastAsia="Helvetica" w:hAnsi="Helvetica" w:cs="Helvetica"/>
-                <w:color w:val="000000"/>
-                <w:sz w:val="22"/>
-                <w:szCs w:val="22"/>
-              </w:rPr>
-              <w:t>Cariados</w:t>
-            </w:r>
-            <w:proofErr w:type="spellEnd"/>
-            <w:r>
-              <w:rPr>
-                <w:rFonts w:ascii="Helvetica" w:eastAsia="Helvetica" w:hAnsi="Helvetica" w:cs="Helvetica"/>
-                <w:color w:val="000000"/>
-                <w:sz w:val="22"/>
-                <w:szCs w:val="22"/>
-              </w:rPr>
-              <w:t xml:space="preserve">, </w:t>
-            </w:r>
-            <w:proofErr w:type="spellStart"/>
-            <w:r>
-              <w:rPr>
-                <w:rFonts w:ascii="Helvetica" w:eastAsia="Helvetica" w:hAnsi="Helvetica" w:cs="Helvetica"/>
-                <w:color w:val="000000"/>
-                <w:sz w:val="22"/>
-                <w:szCs w:val="22"/>
-              </w:rPr>
-              <w:t>Perdidos</w:t>
-            </w:r>
-            <w:proofErr w:type="spellEnd"/>
-            <w:r>
-              <w:rPr>
-                <w:rFonts w:ascii="Helvetica" w:eastAsia="Helvetica" w:hAnsi="Helvetica" w:cs="Helvetica"/>
-                <w:color w:val="000000"/>
-                <w:sz w:val="22"/>
-                <w:szCs w:val="22"/>
-              </w:rPr>
-              <w:t xml:space="preserve">, </w:t>
-            </w:r>
-            <w:proofErr w:type="spellStart"/>
-            <w:r>
-              <w:rPr>
-                <w:rFonts w:ascii="Helvetica" w:eastAsia="Helvetica" w:hAnsi="Helvetica" w:cs="Helvetica"/>
-                <w:color w:val="000000"/>
-                <w:sz w:val="22"/>
-                <w:szCs w:val="22"/>
-              </w:rPr>
-              <w:t>Obturados</w:t>
-            </w:r>
-            <w:proofErr w:type="spellEnd"/>
-            <w:r>
-              <w:rPr>
-                <w:rFonts w:ascii="Helvetica" w:eastAsia="Helvetica" w:hAnsi="Helvetica" w:cs="Helvetica"/>
-                <w:color w:val="000000"/>
-                <w:sz w:val="22"/>
-                <w:szCs w:val="22"/>
-              </w:rPr>
-              <w:t xml:space="preserve"> - </w:t>
-            </w:r>
-            <w:proofErr w:type="spellStart"/>
-            <w:r>
-              <w:rPr>
-                <w:rFonts w:ascii="Helvetica" w:eastAsia="Helvetica" w:hAnsi="Helvetica" w:cs="Helvetica"/>
-                <w:color w:val="000000"/>
-                <w:sz w:val="22"/>
-                <w:szCs w:val="22"/>
-              </w:rPr>
-              <w:t>Dientes</w:t>
-            </w:r>
-            <w:proofErr w:type="spellEnd"/>
-            <w:r>
-              <w:rPr>
-                <w:rFonts w:ascii="Helvetica" w:eastAsia="Helvetica" w:hAnsi="Helvetica" w:cs="Helvetica"/>
-                <w:color w:val="000000"/>
-                <w:sz w:val="22"/>
-                <w:szCs w:val="22"/>
-              </w:rPr>
-              <w:t>.</w:t>
+                <w:sz w:val="22"/>
+                <w:szCs w:val="22"/>
+                <w:color w:val="000000"/>
+              </w:rPr>
+              <w:t xml:space="preserve">1</w:t>
+            </w:r>
+            <w:r>
+              <w:rPr>
+                <w:rFonts w:ascii="Helvetica" w:hAnsi="Helvetica" w:eastAsia="Helvetica" w:cs="Helvetica"/>
+                <w:i w:val="false"/>
+                <w:b w:val="false"/>
+                <w:u w:val="none"/>
+                <w:strike w:val="false"/>
+                <w:sz w:val="22"/>
+                <w:szCs w:val="22"/>
+                <w:color w:val="000000"/>
+              </w:rPr>
+              <w:t xml:space="preserve">n (%); Media ± DE. CPO-D: Cariados, Perdidos, Obturados - Dientes.</w:t>
             </w:r>
           </w:p>
         </w:tc>
       </w:tr>
     </w:tbl>
-    <w:p/>
     <w:sectPr>
+      <w:pgMar w:header="708" w:bottom="1417" w:top="1417" w:right="1417" w:left="1417" w:footer="708" w:gutter="0"/>
+      <w:pgSz w:h="16838" w:w="11906" w:orient="portrait"/>
       <w:type w:val="continuous"/>
-      <w:pgSz w:w="16838" w:h="11906" w:orient="landscape"/>
-      <w:pgMar w:top="1417" w:right="1417" w:bottom="1417" w:left="1417" w:header="708" w:footer="708" w:gutter="0"/>
-      <w:cols w:space="720"/>
-      <w:docGrid w:linePitch="326"/>
+      <w:cols/>
     </w:sectPr>
   </w:body>
 </w:document>
 </file>
 
+<file path=word/comments.xml><?xml version="1.0" encoding="utf-8"?>
+<w:comments xmlns:wpc="http://schemas.microsoft.com/office/word/2010/wordprocessingCanvas" xmlns:mo="http://schemas.microsoft.com/office/mac/office/2008/main" xmlns:mc="http://schemas.openxmlformats.org/markup-compatibility/2006" xmlns:mv="urn:schemas-microsoft-com:mac:vml" xmlns:o="urn:schemas-microsoft-com:office:office" xmlns:r="http://schemas.openxmlformats.org/officeDocument/2006/relationships" xmlns:m="http://schemas.openxmlformats.org/officeDocument/2006/math" xmlns:v="urn:schemas-microsoft-com:vml" xmlns:wp14="http://schemas.microsoft.com/office/word/2010/wordprocessingDrawing" xmlns:wp="http://schemas.openxmlformats.org/drawingml/2006/wordprocessingDrawing" xmlns:w10="urn:schemas-microsoft-com:office:word" xmlns:w="http://schemas.openxmlformats.org/wordprocessingml/2006/main" xmlns:w14="http://schemas.microsoft.com/office/word/2010/wordml" xmlns:wpg="http://schemas.microsoft.com/office/word/2010/wordprocessingGroup" xmlns:wpi="http://schemas.microsoft.com/office/word/2010/wordprocessingInk" xmlns:wne="http://schemas.microsoft.com/office/word/2006/wordml" xmlns:wps="http://schemas.microsoft.com/office/word/2010/wordprocessingShape" mc:Ignorable="w14 wp14">
+</w:comments>
+</file>
+
+<file path=word/footnotes.xml><?xml version="1.0" encoding="utf-8"?>
+<w:footnotes xmlns:wpc="http://schemas.microsoft.com/office/word/2010/wordprocessingCanvas" xmlns:mo="http://schemas.microsoft.com/office/mac/office/2008/main" xmlns:mc="http://schemas.openxmlformats.org/markup-compatibility/2006" xmlns:mv="urn:schemas-microsoft-com:mac:vml" xmlns:o="urn:schemas-microsoft-com:office:office" xmlns:r="http://schemas.openxmlformats.org/officeDocument/2006/relationships" xmlns:m="http://schemas.openxmlformats.org/officeDocument/2006/math" xmlns:v="urn:schemas-microsoft-com:vml" xmlns:wp14="http://schemas.microsoft.com/office/word/2010/wordprocessingDrawing" xmlns:wp="http://schemas.openxmlformats.org/drawingml/2006/wordprocessingDrawing" xmlns:w10="urn:schemas-microsoft-com:office:word" xmlns:w="http://schemas.openxmlformats.org/wordprocessingml/2006/main" xmlns:w14="http://schemas.microsoft.com/office/word/2010/wordml" xmlns:wpg="http://schemas.microsoft.com/office/word/2010/wordprocessingGroup" xmlns:wpi="http://schemas.microsoft.com/office/word/2010/wordprocessingInk" xmlns:wne="http://schemas.microsoft.com/office/word/2006/wordml" xmlns:wps="http://schemas.microsoft.com/office/word/2010/wordprocessingShape" mc:Ignorable="w14 wp14">
+  <w:footnote w:type="separator" w:id="-1">
+    <w:p>
+      <w:r>
+        <w:separator/>
+      </w:r>
+    </w:p>
+  </w:footnote>
+  <w:footnote w:type="continuationSeparator" w:id="0">
+    <w:p>
+      <w:r>
+        <w:continuationSeparator/>
+      </w:r>
+    </w:p>
+  </w:footnote>
+</w:footnotes>
+</file>
+
 <file path=word/numbering.xml><?xml version="1.0" encoding="utf-8"?>
-<w:numbering xmlns:wpc="http://schemas.microsoft.com/office/word/2010/wordprocessingCanvas" xmlns:cx="http://schemas.microsoft.com/office/drawing/2014/chartex" xmlns:cx1="http://schemas.microsoft.com/office/drawing/2015/9/8/chartex" xmlns:cx2="http://schemas.microsoft.com/office/drawing/2015/10/21/chartex" xmlns:cx3="http://schemas.microsoft.com/office/drawing/2016/5/9/chartex" xmlns:cx4="http://schemas.microsoft.com/office/drawing/2016/5/10/chartex" xmlns:cx5="http://schemas.microsoft.com/office/drawing/2016/5/11/chartex" xmlns:cx6="http://schemas.microsoft.com/office/drawing/2016/5/12/chartex" xmlns:cx7="http://schemas.microsoft.com/office/drawing/2016/5/13/chartex" xmlns:cx8="http://schemas.microsoft.com/office/drawing/2016/5/14/chartex" xmlns:mc="http://schemas.openxmlformats.org/markup-compatibility/2006" xmlns:aink="http://schemas.microsoft.com/office/drawing/2016/ink" xmlns:am3d="http://schemas.microsoft.com/office/drawing/2017/model3d" xmlns:o="urn:schemas-microsoft-com:office:office" xmlns:oel="http://schemas.microsoft.com/office/2019/extlst" xmlns:r="http://schemas.openxmlformats.org/officeDocument/2006/relationships" xmlns:m="http://schemas.openxmlformats.org/officeDocument/2006/math" xmlns:v="urn:schemas-microsoft-com:vml" xmlns:wp14="http://schemas.microsoft.com/office/word/2010/wordprocessingDrawing" xmlns:wp="http://schemas.openxmlformats.org/drawingml/2006/wordprocessingDrawing" xmlns:w10="urn:schemas-microsoft-com:office:word" xmlns:w="http://schemas.openxmlformats.org/wordprocessingml/2006/main" xmlns:w14="http://schemas.microsoft.com/office/word/2010/wordml" xmlns:w15="http://schemas.microsoft.com/office/word/2012/wordml" xmlns:w16cex="http://schemas.microsoft.com/office/word/2018/wordml/cex" xmlns:w16cid="http://schemas.microsoft.com/office/word/2016/wordml/cid" xmlns:w16="http://schemas.microsoft.com/office/word/2018/wordml" xmlns:w16du="http://schemas.microsoft.com/office/word/2023/wordml/word16du" xmlns:w16sdtdh="http://schemas.microsoft.com/office/word/2020/wordml/sdtdatahash" xmlns:w16sdtfl="http://schemas.microsoft.com/office/word/2024/wordml/sdtformatlock" xmlns:w16se="http://schemas.microsoft.com/office/word/2015/wordml/symex" xmlns:wpg="http://schemas.microsoft.com/office/word/2010/wordprocessingGroup" xmlns:wpi="http://schemas.microsoft.com/office/word/2010/wordprocessingInk" xmlns:wne="http://schemas.microsoft.com/office/word/2006/wordml" xmlns:wps="http://schemas.microsoft.com/office/word/2010/wordprocessingShape" mc:Ignorable="w14 w15 w16se w16cid w16 w16cex w16sdtdh w16sdtfl w16du wp14">
+<w:numbering xmlns:wpc="http://schemas.microsoft.com/office/word/2010/wordprocessingCanvas" xmlns:cx="http://schemas.microsoft.com/office/drawing/2014/chartex" xmlns:cx1="http://schemas.microsoft.com/office/drawing/2015/9/8/chartex" xmlns:cx2="http://schemas.microsoft.com/office/drawing/2015/10/21/chartex" xmlns:cx3="http://schemas.microsoft.com/office/drawing/2016/5/9/chartex" xmlns:cx4="http://schemas.microsoft.com/office/drawing/2016/5/10/chartex" xmlns:cx5="http://schemas.microsoft.com/office/drawing/2016/5/11/chartex" xmlns:cx6="http://schemas.microsoft.com/office/drawing/2016/5/12/chartex" xmlns:cx7="http://schemas.microsoft.com/office/drawing/2016/5/13/chartex" xmlns:cx8="http://schemas.microsoft.com/office/drawing/2016/5/14/chartex" xmlns:mc="http://schemas.openxmlformats.org/markup-compatibility/2006" xmlns:aink="http://schemas.microsoft.com/office/drawing/2016/ink" xmlns:am3d="http://schemas.microsoft.com/office/drawing/2017/model3d" xmlns:o="urn:schemas-microsoft-com:office:office" xmlns:r="http://schemas.openxmlformats.org/officeDocument/2006/relationships" xmlns:m="http://schemas.openxmlformats.org/officeDocument/2006/math" xmlns:v="urn:schemas-microsoft-com:vml" xmlns:wp14="http://schemas.microsoft.com/office/word/2010/wordprocessingDrawing" xmlns:wp="http://schemas.openxmlformats.org/drawingml/2006/wordprocessingDrawing" xmlns:w10="urn:schemas-microsoft-com:office:word" xmlns:w="http://schemas.openxmlformats.org/wordprocessingml/2006/main" xmlns:w14="http://schemas.microsoft.com/office/word/2010/wordml" xmlns:w15="http://schemas.microsoft.com/office/word/2012/wordml" xmlns:w16cex="http://schemas.microsoft.com/office/word/2018/wordml/cex" xmlns:w16cid="http://schemas.microsoft.com/office/word/2016/wordml/cid" xmlns:w16="http://schemas.microsoft.com/office/word/2018/wordml" xmlns:w16se="http://schemas.microsoft.com/office/word/2015/wordml/symex" xmlns:wpg="http://schemas.microsoft.com/office/word/2010/wordprocessingGroup" xmlns:wpi="http://schemas.microsoft.com/office/word/2010/wordprocessingInk" xmlns:wne="http://schemas.microsoft.com/office/word/2006/wordml" xmlns:wps="http://schemas.microsoft.com/office/word/2010/wordprocessingShape" mc:Ignorable="w14 w15 w16se w16cid w16 w16cex wp14">
   <w:abstractNum w:abstractNumId="0" w15:restartNumberingAfterBreak="0">
     <w:nsid w:val="07E925FD"/>
     <w:multiLevelType w:val="multilevel"/>
@@ -1950,7 +2133,7 @@
     <w:lvl w:ilvl="0">
       <w:start w:val="1"/>
       <w:numFmt w:val="decimal"/>
-      <w:pStyle w:val="Ttulo1"/>
+      <w:pStyle w:val="Titre1"/>
       <w:lvlText w:val="%1."/>
       <w:lvlJc w:val="left"/>
       <w:pPr>
@@ -1960,7 +2143,7 @@
     <w:lvl w:ilvl="1">
       <w:start w:val="1"/>
       <w:numFmt w:val="decimal"/>
-      <w:pStyle w:val="Ttulo2"/>
+      <w:pStyle w:val="Titre2"/>
       <w:lvlText w:val="%1.%2."/>
       <w:lvlJc w:val="left"/>
       <w:pPr>
@@ -1970,7 +2153,7 @@
     <w:lvl w:ilvl="2">
       <w:start w:val="1"/>
       <w:numFmt w:val="decimal"/>
-      <w:pStyle w:val="Ttulo3"/>
+      <w:pStyle w:val="Titre3"/>
       <w:lvlText w:val="%1.%2.%3."/>
       <w:lvlJc w:val="left"/>
       <w:pPr>
@@ -2204,20 +2387,20 @@
       </w:pPr>
     </w:lvl>
   </w:abstractNum>
-  <w:num w:numId="1" w16cid:durableId="1852720665">
+  <w:num w:numId="1">
     <w:abstractNumId w:val="1"/>
   </w:num>
-  <w:num w:numId="2" w16cid:durableId="464851532">
+  <w:num w:numId="2">
     <w:abstractNumId w:val="2"/>
   </w:num>
-  <w:num w:numId="3" w16cid:durableId="483818515">
+  <w:num w:numId="3">
     <w:abstractNumId w:val="0"/>
   </w:num>
 </w:numbering>
 </file>
 
 <file path=word/styles.xml><?xml version="1.0" encoding="utf-8"?>
-<w:styles xmlns:mc="http://schemas.openxmlformats.org/markup-compatibility/2006" xmlns:r="http://schemas.openxmlformats.org/officeDocument/2006/relationships" xmlns:w="http://schemas.openxmlformats.org/wordprocessingml/2006/main" xmlns:w14="http://schemas.microsoft.com/office/word/2010/wordml" xmlns:w15="http://schemas.microsoft.com/office/word/2012/wordml" xmlns:w16cex="http://schemas.microsoft.com/office/word/2018/wordml/cex" xmlns:w16cid="http://schemas.microsoft.com/office/word/2016/wordml/cid" xmlns:w16="http://schemas.microsoft.com/office/word/2018/wordml" xmlns:w16du="http://schemas.microsoft.com/office/word/2023/wordml/word16du" xmlns:w16sdtdh="http://schemas.microsoft.com/office/word/2020/wordml/sdtdatahash" xmlns:w16sdtfl="http://schemas.microsoft.com/office/word/2024/wordml/sdtformatlock" xmlns:w16se="http://schemas.microsoft.com/office/word/2015/wordml/symex" mc:Ignorable="w14 w15 w16se w16cid w16 w16cex w16sdtdh w16sdtfl w16du">
+<w:styles xmlns:mc="http://schemas.openxmlformats.org/markup-compatibility/2006" xmlns:r="http://schemas.openxmlformats.org/officeDocument/2006/relationships" xmlns:w="http://schemas.openxmlformats.org/wordprocessingml/2006/main" xmlns:w14="http://schemas.microsoft.com/office/word/2010/wordml" xmlns:w15="http://schemas.microsoft.com/office/word/2012/wordml" xmlns:w16cex="http://schemas.microsoft.com/office/word/2018/wordml/cex" xmlns:w16cid="http://schemas.microsoft.com/office/word/2016/wordml/cid" xmlns:w16="http://schemas.microsoft.com/office/word/2018/wordml" xmlns:w16se="http://schemas.microsoft.com/office/word/2015/wordml/symex" mc:Ignorable="w14 w15 w16se w16cid w16 w16cex">
   <w:docDefaults>
     <w:rPrDefault>
       <w:rPr>
@@ -2602,11 +2785,11 @@
     <w:name w:val="Normal"/>
     <w:qFormat/>
   </w:style>
-  <w:style w:type="paragraph" w:styleId="Ttulo1">
+  <w:style w:type="paragraph" w:styleId="Titre1">
     <w:name w:val="heading 1"/>
     <w:basedOn w:val="Normal"/>
     <w:next w:val="Normal"/>
-    <w:link w:val="Ttulo1Car"/>
+    <w:link w:val="Titre1Car"/>
     <w:uiPriority w:val="9"/>
     <w:qFormat/>
     <w:rsid w:val="00362E65"/>
@@ -2630,11 +2813,11 @@
       <w:szCs w:val="32"/>
     </w:rPr>
   </w:style>
-  <w:style w:type="paragraph" w:styleId="Ttulo2">
+  <w:style w:type="paragraph" w:styleId="Titre2">
     <w:name w:val="heading 2"/>
     <w:basedOn w:val="Normal"/>
     <w:next w:val="Normal"/>
-    <w:link w:val="Ttulo2Car"/>
+    <w:link w:val="Titre2Car"/>
     <w:uiPriority w:val="9"/>
     <w:semiHidden/>
     <w:unhideWhenUsed/>
@@ -2658,11 +2841,11 @@
       <w:szCs w:val="26"/>
     </w:rPr>
   </w:style>
-  <w:style w:type="paragraph" w:styleId="Ttulo3">
+  <w:style w:type="paragraph" w:styleId="Titre3">
     <w:name w:val="heading 3"/>
     <w:basedOn w:val="Normal"/>
     <w:next w:val="Normal"/>
-    <w:link w:val="Ttulo3Car"/>
+    <w:link w:val="Titre3Car"/>
     <w:uiPriority w:val="9"/>
     <w:semiHidden/>
     <w:unhideWhenUsed/>
@@ -2684,13 +2867,13 @@
       <w:bCs/>
     </w:rPr>
   </w:style>
-  <w:style w:type="character" w:default="1" w:styleId="Fuentedeprrafopredeter">
+  <w:style w:type="character" w:default="1" w:styleId="Policepardfaut">
     <w:name w:val="Default Paragraph Font"/>
     <w:uiPriority w:val="1"/>
     <w:semiHidden/>
     <w:unhideWhenUsed/>
   </w:style>
-  <w:style w:type="table" w:default="1" w:styleId="Tablanormal">
+  <w:style w:type="table" w:default="1" w:styleId="TableauNormal">
     <w:name w:val="Normal Table"/>
     <w:uiPriority w:val="99"/>
     <w:semiHidden/>
@@ -2705,15 +2888,15 @@
       </w:tblCellMar>
     </w:tblPr>
   </w:style>
-  <w:style w:type="numbering" w:default="1" w:styleId="Sinlista">
+  <w:style w:type="numbering" w:default="1" w:styleId="Aucuneliste">
     <w:name w:val="No List"/>
     <w:uiPriority w:val="99"/>
     <w:semiHidden/>
     <w:unhideWhenUsed/>
   </w:style>
-  <w:style w:type="character" w:customStyle="1" w:styleId="Fuerte1">
-    <w:name w:val="Fuerte1"/>
-    <w:basedOn w:val="Fuentedeprrafopredeter"/>
+  <w:style w:type="character" w:customStyle="1" w:styleId="strong">
+    <w:name w:val="strong"/>
+    <w:basedOn w:val="Policepardfaut"/>
     <w:uiPriority w:val="1"/>
     <w:qFormat/>
     <w:rsid w:val="007B3E96"/>
@@ -2732,7 +2915,7 @@
   </w:style>
   <w:style w:type="table" w:customStyle="1" w:styleId="tabletemplate">
     <w:name w:val="table_template"/>
-    <w:basedOn w:val="Tablanormal"/>
+    <w:basedOn w:val="TableauNormal"/>
     <w:uiPriority w:val="59"/>
     <w:rsid w:val="00F12158"/>
     <w:pPr>
@@ -2768,9 +2951,9 @@
       </w:tcPr>
     </w:tblStylePr>
   </w:style>
-  <w:style w:type="table" w:styleId="Listaclara-nfasis2">
+  <w:style w:type="table" w:styleId="Listeclaire-Accent2">
     <w:name w:val="Light List Accent 2"/>
-    <w:basedOn w:val="Tablanormal"/>
+    <w:basedOn w:val="TableauNormal"/>
     <w:uiPriority w:val="61"/>
     <w:rsid w:val="00FC557F"/>
     <w:tblPr>
@@ -2850,10 +3033,10 @@
       </w:tcPr>
     </w:tblStylePr>
   </w:style>
-  <w:style w:type="character" w:customStyle="1" w:styleId="Ttulo1Car">
-    <w:name w:val="Título 1 Car"/>
-    <w:basedOn w:val="Fuentedeprrafopredeter"/>
-    <w:link w:val="Ttulo1"/>
+  <w:style w:type="character" w:customStyle="1" w:styleId="Titre1Car">
+    <w:name w:val="Titre 1 Car"/>
+    <w:basedOn w:val="Policepardfaut"/>
+    <w:link w:val="Titre1"/>
     <w:uiPriority w:val="9"/>
     <w:rsid w:val="00362E65"/>
     <w:rPr>
@@ -2864,10 +3047,10 @@
       <w:szCs w:val="32"/>
     </w:rPr>
   </w:style>
-  <w:style w:type="character" w:customStyle="1" w:styleId="Ttulo2Car">
-    <w:name w:val="Título 2 Car"/>
-    <w:basedOn w:val="Fuentedeprrafopredeter"/>
-    <w:link w:val="Ttulo2"/>
+  <w:style w:type="character" w:customStyle="1" w:styleId="Titre2Car">
+    <w:name w:val="Titre 2 Car"/>
+    <w:basedOn w:val="Policepardfaut"/>
+    <w:link w:val="Titre2"/>
     <w:uiPriority w:val="9"/>
     <w:semiHidden/>
     <w:rsid w:val="00362E65"/>
@@ -2879,10 +3062,10 @@
       <w:szCs w:val="26"/>
     </w:rPr>
   </w:style>
-  <w:style w:type="character" w:customStyle="1" w:styleId="Ttulo3Car">
-    <w:name w:val="Título 3 Car"/>
-    <w:basedOn w:val="Fuentedeprrafopredeter"/>
-    <w:link w:val="Ttulo3"/>
+  <w:style w:type="character" w:customStyle="1" w:styleId="Titre3Car">
+    <w:name w:val="Titre 3 Car"/>
+    <w:basedOn w:val="Policepardfaut"/>
+    <w:link w:val="Titre3"/>
     <w:uiPriority w:val="9"/>
     <w:semiHidden/>
     <w:rsid w:val="00362E65"/>
@@ -2911,9 +3094,9 @@
     <w:qFormat/>
     <w:rsid w:val="00AE18EF"/>
   </w:style>
-  <w:style w:type="table" w:styleId="Tablaprofesional">
+  <w:style w:type="table" w:styleId="Tableauprofessionnel">
     <w:name w:val="Table Professional"/>
-    <w:basedOn w:val="Tablanormal"/>
+    <w:basedOn w:val="TableauNormal"/>
     <w:uiPriority w:val="99"/>
     <w:semiHidden/>
     <w:unhideWhenUsed/>
@@ -2943,7 +3126,7 @@
       </w:tcPr>
     </w:tblStylePr>
   </w:style>
-  <w:style w:type="paragraph" w:styleId="TDC1">
+  <w:style w:type="paragraph" w:styleId="TM1">
     <w:name w:val="toc 1"/>
     <w:basedOn w:val="Normal"/>
     <w:next w:val="Normal"/>
@@ -2955,7 +3138,7 @@
       <w:spacing w:after="100"/>
     </w:pPr>
   </w:style>
-  <w:style w:type="paragraph" w:styleId="TDC2">
+  <w:style w:type="paragraph" w:styleId="TM2">
     <w:name w:val="toc 2"/>
     <w:basedOn w:val="Normal"/>
     <w:next w:val="Normal"/>
@@ -2968,10 +3151,10 @@
       <w:ind w:left="240"/>
     </w:pPr>
   </w:style>
-  <w:style w:type="paragraph" w:styleId="Textodeglobo">
+  <w:style w:type="paragraph" w:styleId="Textedebulles">
     <w:name w:val="Balloon Text"/>
     <w:basedOn w:val="Normal"/>
-    <w:link w:val="TextodegloboCar"/>
+    <w:link w:val="TextedebullesCar"/>
     <w:uiPriority w:val="99"/>
     <w:semiHidden/>
     <w:unhideWhenUsed/>
@@ -2982,10 +3165,10 @@
       <w:szCs w:val="18"/>
     </w:rPr>
   </w:style>
-  <w:style w:type="character" w:customStyle="1" w:styleId="TextodegloboCar">
-    <w:name w:val="Texto de globo Car"/>
-    <w:basedOn w:val="Fuentedeprrafopredeter"/>
-    <w:link w:val="Textodeglobo"/>
+  <w:style w:type="character" w:customStyle="1" w:styleId="TextedebullesCar">
+    <w:name w:val="Texte de bulles Car"/>
+    <w:basedOn w:val="Policepardfaut"/>
+    <w:link w:val="Textedebulles"/>
     <w:uiPriority w:val="99"/>
     <w:semiHidden/>
     <w:rsid w:val="00FB63E7"/>
@@ -2997,7 +3180,7 @@
   </w:style>
   <w:style w:type="character" w:customStyle="1" w:styleId="referenceid">
     <w:name w:val="reference_id"/>
-    <w:basedOn w:val="Fuentedeprrafopredeter"/>
+    <w:basedOn w:val="Policepardfaut"/>
     <w:uiPriority w:val="1"/>
     <w:rsid w:val="00457CF1"/>
     <w:rPr>

</xml_diff>

<commit_message>
Update date to April 16 and regenerate output tables
</commit_message>
<xml_diff>
--- a/tabla_2_cpod_sexo.docx
+++ b/tabla_2_cpod_sexo.docx
@@ -1,87 +1,38 @@
 
 <file path=word/document.xml><?xml version="1.0" encoding="utf-8"?>
-<w:document xmlns:wpc="http://schemas.microsoft.com/office/word/2010/wordprocessingCanvas" xmlns:cx="http://schemas.microsoft.com/office/drawing/2014/chartex" xmlns:cx1="http://schemas.microsoft.com/office/drawing/2015/9/8/chartex" xmlns:cx2="http://schemas.microsoft.com/office/drawing/2015/10/21/chartex" xmlns:cx3="http://schemas.microsoft.com/office/drawing/2016/5/9/chartex" xmlns:cx4="http://schemas.microsoft.com/office/drawing/2016/5/10/chartex" xmlns:cx5="http://schemas.microsoft.com/office/drawing/2016/5/11/chartex" xmlns:cx6="http://schemas.microsoft.com/office/drawing/2016/5/12/chartex" xmlns:cx7="http://schemas.microsoft.com/office/drawing/2016/5/13/chartex" xmlns:cx8="http://schemas.microsoft.com/office/drawing/2016/5/14/chartex" xmlns:mc="http://schemas.openxmlformats.org/markup-compatibility/2006" xmlns:aink="http://schemas.microsoft.com/office/drawing/2016/ink" xmlns:am3d="http://schemas.microsoft.com/office/drawing/2017/model3d" xmlns:o="urn:schemas-microsoft-com:office:office" xmlns:oel="http://schemas.microsoft.com/office/2019/extlst" xmlns:r="http://schemas.openxmlformats.org/officeDocument/2006/relationships" xmlns:m="http://schemas.openxmlformats.org/officeDocument/2006/math" xmlns:v="urn:schemas-microsoft-com:vml" xmlns:wp14="http://schemas.microsoft.com/office/word/2010/wordprocessingDrawing" xmlns:wp="http://schemas.openxmlformats.org/drawingml/2006/wordprocessingDrawing" xmlns:w10="urn:schemas-microsoft-com:office:word" xmlns:w="http://schemas.openxmlformats.org/wordprocessingml/2006/main" xmlns:w14="http://schemas.microsoft.com/office/word/2010/wordml" xmlns:w15="http://schemas.microsoft.com/office/word/2012/wordml" xmlns:w16cex="http://schemas.microsoft.com/office/word/2018/wordml/cex" xmlns:w16cid="http://schemas.microsoft.com/office/word/2016/wordml/cid" xmlns:w16="http://schemas.microsoft.com/office/word/2018/wordml" xmlns:w16du="http://schemas.microsoft.com/office/word/2023/wordml/word16du" xmlns:w16sdtdh="http://schemas.microsoft.com/office/word/2020/wordml/sdtdatahash" xmlns:w16sdtfl="http://schemas.microsoft.com/office/word/2024/wordml/sdtformatlock" xmlns:w16se="http://schemas.microsoft.com/office/word/2015/wordml/symex" xmlns:wpg="http://schemas.microsoft.com/office/word/2010/wordprocessingGroup" xmlns:wpi="http://schemas.microsoft.com/office/word/2010/wordprocessingInk" xmlns:wne="http://schemas.microsoft.com/office/word/2006/wordml" xmlns:wps="http://schemas.microsoft.com/office/word/2010/wordprocessingShape" mc:Ignorable="w14 w15 w16se w16cid w16 w16cex w16sdtdh w16sdtfl w16du wp14">
+<w:document xmlns:wpc="http://schemas.microsoft.com/office/word/2010/wordprocessingCanvas" xmlns:cx="http://schemas.microsoft.com/office/drawing/2014/chartex" xmlns:cx1="http://schemas.microsoft.com/office/drawing/2015/9/8/chartex" xmlns:cx2="http://schemas.microsoft.com/office/drawing/2015/10/21/chartex" xmlns:cx3="http://schemas.microsoft.com/office/drawing/2016/5/9/chartex" xmlns:cx4="http://schemas.microsoft.com/office/drawing/2016/5/10/chartex" xmlns:cx5="http://schemas.microsoft.com/office/drawing/2016/5/11/chartex" xmlns:cx6="http://schemas.microsoft.com/office/drawing/2016/5/12/chartex" xmlns:cx7="http://schemas.microsoft.com/office/drawing/2016/5/13/chartex" xmlns:cx8="http://schemas.microsoft.com/office/drawing/2016/5/14/chartex" xmlns:mc="http://schemas.openxmlformats.org/markup-compatibility/2006" xmlns:aink="http://schemas.microsoft.com/office/drawing/2016/ink" xmlns:am3d="http://schemas.microsoft.com/office/drawing/2017/model3d" xmlns:o="urn:schemas-microsoft-com:office:office" xmlns:r="http://schemas.openxmlformats.org/officeDocument/2006/relationships" xmlns:m="http://schemas.openxmlformats.org/officeDocument/2006/math" xmlns:v="urn:schemas-microsoft-com:vml" xmlns:wp14="http://schemas.microsoft.com/office/word/2010/wordprocessingDrawing" xmlns:wp="http://schemas.openxmlformats.org/drawingml/2006/wordprocessingDrawing" xmlns:w10="urn:schemas-microsoft-com:office:word" xmlns:w="http://schemas.openxmlformats.org/wordprocessingml/2006/main" xmlns:w14="http://schemas.microsoft.com/office/word/2010/wordml" xmlns:w15="http://schemas.microsoft.com/office/word/2012/wordml" xmlns:w16cex="http://schemas.microsoft.com/office/word/2018/wordml/cex" xmlns:w16cid="http://schemas.microsoft.com/office/word/2016/wordml/cid" xmlns:w16="http://schemas.microsoft.com/office/word/2018/wordml" xmlns:w16se="http://schemas.microsoft.com/office/word/2015/wordml/symex" xmlns:wpg="http://schemas.microsoft.com/office/word/2010/wordprocessingGroup" xmlns:wpi="http://schemas.microsoft.com/office/word/2010/wordprocessingInk" xmlns:wne="http://schemas.microsoft.com/office/word/2006/wordml" xmlns:wps="http://schemas.microsoft.com/office/word/2010/wordprocessingShape" mc:Ignorable="w14 w15 w16se w16cid w16 w16cex wp14">
   <w:body>
-    <w:p/>
+    <w:p>
+      <w:pPr>
+        <w:pStyle w:val="Normal"/>
+      </w:pPr>
+      <w:r>
+        <w:t xml:space="preserve"/>
+      </w:r>
+    </w:p>
     <w:p>
       <w:pPr>
         <w:pStyle w:val="TableCaption"/>
+        <w:jc w:val="center"/>
         <w:keepNext/>
         <w:pBdr>
+          <w:bottom w:val="none" w:sz="0" w:space="0" w:color="000000"/>
           <w:top w:val="none" w:sz="0" w:space="0" w:color="000000"/>
           <w:left w:val="none" w:sz="0" w:space="0" w:color="000000"/>
-          <w:bottom w:val="none" w:sz="0" w:space="0" w:color="000000"/>
           <w:right w:val="none" w:sz="0" w:space="0" w:color="000000"/>
         </w:pBdr>
-        <w:spacing w:before="60" w:after="60"/>
-        <w:ind w:left="60" w:right="60"/>
+        <w:spacing w:after="60" w:before="60" w:line="240"/>
+        <w:ind w:left="60" w:right="60" w:firstLine="0" w:firstLineChars="0"/>
       </w:pPr>
       <w:r>
-        <w:t>**</w:t>
-      </w:r>
-      <w:proofErr w:type="spellStart"/>
-      <w:r>
-        <w:t>Tabla</w:t>
-      </w:r>
-      <w:proofErr w:type="spellEnd"/>
-      <w:r>
-        <w:t xml:space="preserve"> 2. </w:t>
-      </w:r>
-      <w:proofErr w:type="spellStart"/>
-      <w:r>
-        <w:t>Índice</w:t>
-      </w:r>
-      <w:proofErr w:type="spellEnd"/>
-      <w:r>
-        <w:t xml:space="preserve"> CPO-D y </w:t>
-      </w:r>
-      <w:proofErr w:type="spellStart"/>
-      <w:r>
-        <w:t>estado</w:t>
-      </w:r>
-      <w:proofErr w:type="spellEnd"/>
-      <w:r>
-        <w:t xml:space="preserve"> de </w:t>
-      </w:r>
-      <w:proofErr w:type="spellStart"/>
-      <w:r>
-        <w:t>salud</w:t>
-      </w:r>
-      <w:proofErr w:type="spellEnd"/>
-      <w:r>
-        <w:t xml:space="preserve"> </w:t>
-      </w:r>
-      <w:proofErr w:type="spellStart"/>
-      <w:r>
-        <w:t>bucal</w:t>
-      </w:r>
-      <w:proofErr w:type="spellEnd"/>
-      <w:r>
-        <w:t xml:space="preserve"> </w:t>
-      </w:r>
-      <w:proofErr w:type="spellStart"/>
-      <w:r>
-        <w:t>según</w:t>
-      </w:r>
-      <w:proofErr w:type="spellEnd"/>
-      <w:r>
-        <w:t xml:space="preserve"> </w:t>
-      </w:r>
-      <w:proofErr w:type="spellStart"/>
-      <w:r>
-        <w:t>sexo</w:t>
-      </w:r>
-      <w:proofErr w:type="spellEnd"/>
-      <w:r>
-        <w:t>**</w:t>
+        <w:t xml:space="preserve">**Tabla 2. Índice CPO-D y estado de salud bucal según sexo**</w:t>
       </w:r>
     </w:p>
-    <w:tbl>
+    <w:tbl xmlns:a="http://schemas.openxmlformats.org/drawingml/2006/main" xmlns:pic="http://schemas.openxmlformats.org/drawingml/2006/picture">
       <w:tblPr>
-        <w:tblW w:w="0" w:type="auto"/>
+        <w:tblLayout w:type="fixed"/>
         <w:jc w:val="center"/>
-        <w:tblLayout w:type="fixed"/>
-        <w:tblLook w:val="0420" w:firstRow="1" w:lastRow="0" w:firstColumn="0" w:lastColumn="0" w:noHBand="0" w:noVBand="1"/>
+        <w:tblLook w:firstRow="1" w:lastRow="0" w:firstColumn="0" w:lastColumn="0" w:noHBand="0" w:noVBand="1"/>
       </w:tblPr>
       <w:tblGrid>
         <w:gridCol w:w="2576"/>
@@ -91,1858 +42,2090 @@
       </w:tblGrid>
       <w:tr>
         <w:trPr>
+          <w:trHeight w:val="769" w:hRule="auto"/>
           <w:tblHeader/>
-          <w:jc w:val="center"/>
         </w:trPr>
         <w:tc>
           <w:tcPr>
-            <w:tcW w:w="2576" w:type="dxa"/>
             <w:tcBorders>
+              <w:bottom w:val="single" w:sz="8" w:space="0" w:color="000000"/>
               <w:top w:val="single" w:sz="8" w:space="0" w:color="000000"/>
               <w:left w:val="none" w:sz="0" w:space="0" w:color="000000"/>
-              <w:bottom w:val="single" w:sz="8" w:space="0" w:color="000000"/>
               <w:right w:val="none" w:sz="0" w:space="0" w:color="000000"/>
             </w:tcBorders>
             <w:shd w:val="clear" w:color="auto" w:fill="FFFFFF"/>
             <w:tcMar>
               <w:top w:w="0" w:type="dxa"/>
+              <w:bottom w:w="0" w:type="dxa"/>
               <w:left w:w="0" w:type="dxa"/>
-              <w:bottom w:w="0" w:type="dxa"/>
               <w:right w:w="0" w:type="dxa"/>
             </w:tcMar>
             <w:vAlign w:val="center"/>
           </w:tcPr>
           <w:p>
             <w:pPr>
+              <w:pStyle w:val="Normal"/>
+              <w:jc w:val="left"/>
               <w:pBdr>
+                <w:bottom w:val="none" w:sz="0" w:space="0" w:color="000000"/>
                 <w:top w:val="none" w:sz="0" w:space="0" w:color="000000"/>
                 <w:left w:val="none" w:sz="0" w:space="0" w:color="000000"/>
-                <w:bottom w:val="none" w:sz="0" w:space="0" w:color="000000"/>
                 <w:right w:val="none" w:sz="0" w:space="0" w:color="000000"/>
               </w:pBdr>
-              <w:spacing w:before="40" w:after="40"/>
-              <w:ind w:left="100" w:right="100"/>
-              <w:rPr>
-                <w:rFonts w:ascii="Helvetica" w:eastAsia="Helvetica" w:hAnsi="Helvetica" w:cs="Helvetica"/>
-                <w:color w:val="000000"/>
-                <w:sz w:val="22"/>
-                <w:szCs w:val="22"/>
+              <w:spacing w:after="40" w:before="40" w:line="240"/>
+              <w:ind w:left="100" w:right="100" w:firstLine="0" w:firstLineChars="0"/>
+              <w:rPr>
+                <w:rFonts w:ascii="Helvetica" w:hAnsi="Helvetica" w:eastAsia="Helvetica" w:cs="Helvetica"/>
+                <w:i w:val="false"/>
+                <w:b w:val="false"/>
+                <w:u w:val="none"/>
+                <w:strike w:val="false"/>
+                <w:sz w:val="22"/>
+                <w:szCs w:val="22"/>
+                <w:color w:val="000000"/>
               </w:rPr>
             </w:pPr>
             <w:r>
               <w:rPr>
-                <w:rFonts w:ascii="Helvetica" w:eastAsia="Helvetica" w:hAnsi="Helvetica" w:cs="Helvetica"/>
-                <w:b/>
-                <w:color w:val="000000"/>
-                <w:sz w:val="22"/>
-                <w:szCs w:val="22"/>
-              </w:rPr>
-              <w:t>Characteristic</w:t>
-            </w:r>
-            <w:r>
-              <w:rPr>
-                <w:rFonts w:ascii="Helvetica" w:eastAsia="Helvetica" w:hAnsi="Helvetica" w:cs="Helvetica"/>
-                <w:color w:val="000000"/>
-                <w:sz w:val="22"/>
-                <w:szCs w:val="22"/>
+                <w:rFonts w:ascii="Helvetica" w:hAnsi="Helvetica" w:eastAsia="Helvetica" w:cs="Helvetica"/>
+                <w:i w:val="false"/>
+                <w:b w:val="true"/>
+                <w:u w:val="none"/>
+                <w:strike w:val="false"/>
+                <w:sz w:val="22"/>
+                <w:szCs w:val="22"/>
+                <w:color w:val="000000"/>
+              </w:rPr>
+              <w:t xml:space="preserve">Characteristic</w:t>
+            </w:r>
+            <w:r>
+              <w:rPr>
+                <w:rFonts w:ascii="Helvetica" w:hAnsi="Helvetica" w:eastAsia="Helvetica" w:cs="Helvetica"/>
+                <w:i w:val="false"/>
+                <w:b w:val="false"/>
+                <w:u w:val="none"/>
+                <w:strike w:val="false"/>
                 <w:vertAlign w:val="superscript"/>
-              </w:rPr>
-              <w:t>1</w:t>
+                <w:sz w:val="22"/>
+                <w:szCs w:val="22"/>
+                <w:color w:val="000000"/>
+              </w:rPr>
+              <w:t xml:space="preserve">1</w:t>
             </w:r>
           </w:p>
         </w:tc>
         <w:tc>
           <w:tcPr>
-            <w:tcW w:w="3088" w:type="dxa"/>
             <w:tcBorders>
+              <w:bottom w:val="single" w:sz="8" w:space="0" w:color="000000"/>
               <w:top w:val="single" w:sz="8" w:space="0" w:color="000000"/>
               <w:left w:val="none" w:sz="0" w:space="0" w:color="000000"/>
-              <w:bottom w:val="single" w:sz="8" w:space="0" w:color="000000"/>
               <w:right w:val="none" w:sz="0" w:space="0" w:color="000000"/>
             </w:tcBorders>
             <w:shd w:val="clear" w:color="auto" w:fill="FFFFFF"/>
             <w:tcMar>
               <w:top w:w="0" w:type="dxa"/>
+              <w:bottom w:w="0" w:type="dxa"/>
               <w:left w:w="0" w:type="dxa"/>
-              <w:bottom w:w="0" w:type="dxa"/>
               <w:right w:w="0" w:type="dxa"/>
             </w:tcMar>
             <w:vAlign w:val="center"/>
           </w:tcPr>
           <w:p>
             <w:pPr>
+              <w:pStyle w:val="Normal"/>
+              <w:jc w:val="center"/>
               <w:pBdr>
+                <w:bottom w:val="none" w:sz="0" w:space="0" w:color="000000"/>
                 <w:top w:val="none" w:sz="0" w:space="0" w:color="000000"/>
                 <w:left w:val="none" w:sz="0" w:space="0" w:color="000000"/>
-                <w:bottom w:val="none" w:sz="0" w:space="0" w:color="000000"/>
                 <w:right w:val="none" w:sz="0" w:space="0" w:color="000000"/>
               </w:pBdr>
-              <w:spacing w:before="40" w:after="40"/>
-              <w:ind w:left="100" w:right="100"/>
-              <w:jc w:val="center"/>
-              <w:rPr>
-                <w:rFonts w:ascii="Helvetica" w:eastAsia="Helvetica" w:hAnsi="Helvetica" w:cs="Helvetica"/>
-                <w:color w:val="000000"/>
-                <w:sz w:val="22"/>
-                <w:szCs w:val="22"/>
+              <w:spacing w:after="40" w:before="40" w:line="240"/>
+              <w:ind w:left="100" w:right="100" w:firstLine="0" w:firstLineChars="0"/>
+              <w:rPr>
+                <w:rFonts w:ascii="Helvetica" w:hAnsi="Helvetica" w:eastAsia="Helvetica" w:cs="Helvetica"/>
+                <w:i w:val="false"/>
+                <w:b w:val="false"/>
+                <w:u w:val="none"/>
+                <w:strike w:val="false"/>
+                <w:sz w:val="22"/>
+                <w:szCs w:val="22"/>
+                <w:color w:val="000000"/>
               </w:rPr>
             </w:pPr>
             <w:r>
               <w:rPr>
-                <w:rFonts w:ascii="Helvetica" w:eastAsia="Helvetica" w:hAnsi="Helvetica" w:cs="Helvetica"/>
-                <w:b/>
-                <w:color w:val="000000"/>
-                <w:sz w:val="22"/>
-                <w:szCs w:val="22"/>
-              </w:rPr>
-              <w:t>Overall</w:t>
-            </w:r>
-            <w:r>
-              <w:rPr>
-                <w:rFonts w:ascii="Helvetica" w:eastAsia="Helvetica" w:hAnsi="Helvetica" w:cs="Helvetica"/>
-                <w:color w:val="000000"/>
-                <w:sz w:val="22"/>
-                <w:szCs w:val="22"/>
+                <w:rFonts w:ascii="Helvetica" w:hAnsi="Helvetica" w:eastAsia="Helvetica" w:cs="Helvetica"/>
+                <w:i w:val="false"/>
+                <w:b w:val="true"/>
+                <w:u w:val="none"/>
+                <w:strike w:val="false"/>
+                <w:sz w:val="22"/>
+                <w:szCs w:val="22"/>
+                <w:color w:val="000000"/>
+              </w:rPr>
+              <w:t xml:space="preserve">Overall</w:t>
+            </w:r>
+            <w:r>
+              <w:rPr>
+                <w:rFonts w:ascii="Helvetica" w:hAnsi="Helvetica" w:eastAsia="Helvetica" w:cs="Helvetica"/>
+                <w:i w:val="false"/>
+                <w:b w:val="false"/>
+                <w:u w:val="none"/>
+                <w:strike w:val="false"/>
+                <w:sz w:val="22"/>
+                <w:szCs w:val="22"/>
+                <w:color w:val="000000"/>
               </w:rPr>
               <w:t xml:space="preserve">  </w:t>
             </w:r>
             <w:r>
               <w:rPr>
-                <w:rFonts w:ascii="Helvetica" w:eastAsia="Helvetica" w:hAnsi="Helvetica" w:cs="Helvetica"/>
-                <w:color w:val="000000"/>
-                <w:sz w:val="22"/>
-                <w:szCs w:val="22"/>
+                <w:rFonts w:ascii="Helvetica" w:hAnsi="Helvetica" w:eastAsia="Helvetica" w:cs="Helvetica"/>
+                <w:i w:val="false"/>
+                <w:b w:val="false"/>
+                <w:u w:val="none"/>
+                <w:strike w:val="false"/>
+                <w:sz w:val="22"/>
+                <w:szCs w:val="22"/>
+                <w:color w:val="000000"/>
               </w:rPr>
               <w:br/>
-              <w:t>N = 69,840</w:t>
-            </w:r>
-            <w:r>
-              <w:rPr>
-                <w:rFonts w:ascii="Helvetica" w:eastAsia="Helvetica" w:hAnsi="Helvetica" w:cs="Helvetica"/>
-                <w:color w:val="000000"/>
-                <w:sz w:val="22"/>
-                <w:szCs w:val="22"/>
+            </w:r>
+            <w:r>
+              <w:rPr>
+                <w:rFonts w:ascii="Helvetica" w:hAnsi="Helvetica" w:eastAsia="Helvetica" w:cs="Helvetica"/>
+                <w:i w:val="false"/>
+                <w:b w:val="false"/>
+                <w:u w:val="none"/>
+                <w:strike w:val="false"/>
+                <w:sz w:val="22"/>
+                <w:szCs w:val="22"/>
+                <w:color w:val="000000"/>
+              </w:rPr>
+              <w:t xml:space="preserve">N = 69,840</w:t>
+            </w:r>
+            <w:r>
+              <w:rPr>
+                <w:rFonts w:ascii="Helvetica" w:hAnsi="Helvetica" w:eastAsia="Helvetica" w:cs="Helvetica"/>
+                <w:i w:val="false"/>
+                <w:b w:val="false"/>
+                <w:u w:val="none"/>
+                <w:strike w:val="false"/>
                 <w:vertAlign w:val="superscript"/>
-              </w:rPr>
-              <w:t>1</w:t>
+                <w:sz w:val="22"/>
+                <w:szCs w:val="22"/>
+                <w:color w:val="000000"/>
+              </w:rPr>
+              <w:t xml:space="preserve">1</w:t>
             </w:r>
           </w:p>
         </w:tc>
         <w:tc>
           <w:tcPr>
-            <w:tcW w:w="3088" w:type="dxa"/>
             <w:tcBorders>
+              <w:bottom w:val="single" w:sz="8" w:space="0" w:color="000000"/>
               <w:top w:val="single" w:sz="8" w:space="0" w:color="000000"/>
               <w:left w:val="none" w:sz="0" w:space="0" w:color="000000"/>
-              <w:bottom w:val="single" w:sz="8" w:space="0" w:color="000000"/>
               <w:right w:val="none" w:sz="0" w:space="0" w:color="000000"/>
             </w:tcBorders>
             <w:shd w:val="clear" w:color="auto" w:fill="FFFFFF"/>
             <w:tcMar>
               <w:top w:w="0" w:type="dxa"/>
+              <w:bottom w:w="0" w:type="dxa"/>
               <w:left w:w="0" w:type="dxa"/>
-              <w:bottom w:w="0" w:type="dxa"/>
               <w:right w:w="0" w:type="dxa"/>
             </w:tcMar>
             <w:vAlign w:val="center"/>
           </w:tcPr>
           <w:p>
             <w:pPr>
+              <w:pStyle w:val="Normal"/>
+              <w:jc w:val="center"/>
               <w:pBdr>
+                <w:bottom w:val="none" w:sz="0" w:space="0" w:color="000000"/>
                 <w:top w:val="none" w:sz="0" w:space="0" w:color="000000"/>
                 <w:left w:val="none" w:sz="0" w:space="0" w:color="000000"/>
-                <w:bottom w:val="none" w:sz="0" w:space="0" w:color="000000"/>
                 <w:right w:val="none" w:sz="0" w:space="0" w:color="000000"/>
               </w:pBdr>
-              <w:spacing w:before="40" w:after="40"/>
-              <w:ind w:left="100" w:right="100"/>
-              <w:jc w:val="center"/>
-              <w:rPr>
-                <w:rFonts w:ascii="Helvetica" w:eastAsia="Helvetica" w:hAnsi="Helvetica" w:cs="Helvetica"/>
-                <w:color w:val="000000"/>
-                <w:sz w:val="22"/>
-                <w:szCs w:val="22"/>
+              <w:spacing w:after="40" w:before="40" w:line="240"/>
+              <w:ind w:left="100" w:right="100" w:firstLine="0" w:firstLineChars="0"/>
+              <w:rPr>
+                <w:rFonts w:ascii="Helvetica" w:hAnsi="Helvetica" w:eastAsia="Helvetica" w:cs="Helvetica"/>
+                <w:i w:val="false"/>
+                <w:b w:val="false"/>
+                <w:u w:val="none"/>
+                <w:strike w:val="false"/>
+                <w:sz w:val="22"/>
+                <w:szCs w:val="22"/>
+                <w:color w:val="000000"/>
               </w:rPr>
             </w:pPr>
-            <w:proofErr w:type="spellStart"/>
-            <w:r>
-              <w:rPr>
-                <w:rFonts w:ascii="Helvetica" w:eastAsia="Helvetica" w:hAnsi="Helvetica" w:cs="Helvetica"/>
-                <w:b/>
-                <w:color w:val="000000"/>
-                <w:sz w:val="22"/>
-                <w:szCs w:val="22"/>
-              </w:rPr>
-              <w:t>femenino</w:t>
-            </w:r>
-            <w:proofErr w:type="spellEnd"/>
-            <w:r>
-              <w:rPr>
-                <w:rFonts w:ascii="Helvetica" w:eastAsia="Helvetica" w:hAnsi="Helvetica" w:cs="Helvetica"/>
-                <w:color w:val="000000"/>
-                <w:sz w:val="22"/>
-                <w:szCs w:val="22"/>
+            <w:r>
+              <w:rPr>
+                <w:rFonts w:ascii="Helvetica" w:hAnsi="Helvetica" w:eastAsia="Helvetica" w:cs="Helvetica"/>
+                <w:i w:val="false"/>
+                <w:b w:val="true"/>
+                <w:u w:val="none"/>
+                <w:strike w:val="false"/>
+                <w:sz w:val="22"/>
+                <w:szCs w:val="22"/>
+                <w:color w:val="000000"/>
+              </w:rPr>
+              <w:t xml:space="preserve">femenino</w:t>
+            </w:r>
+            <w:r>
+              <w:rPr>
+                <w:rFonts w:ascii="Helvetica" w:hAnsi="Helvetica" w:eastAsia="Helvetica" w:cs="Helvetica"/>
+                <w:i w:val="false"/>
+                <w:b w:val="false"/>
+                <w:u w:val="none"/>
+                <w:strike w:val="false"/>
+                <w:sz w:val="22"/>
+                <w:szCs w:val="22"/>
+                <w:color w:val="000000"/>
               </w:rPr>
               <w:t xml:space="preserve">  </w:t>
             </w:r>
             <w:r>
               <w:rPr>
-                <w:rFonts w:ascii="Helvetica" w:eastAsia="Helvetica" w:hAnsi="Helvetica" w:cs="Helvetica"/>
-                <w:color w:val="000000"/>
-                <w:sz w:val="22"/>
-                <w:szCs w:val="22"/>
+                <w:rFonts w:ascii="Helvetica" w:hAnsi="Helvetica" w:eastAsia="Helvetica" w:cs="Helvetica"/>
+                <w:i w:val="false"/>
+                <w:b w:val="false"/>
+                <w:u w:val="none"/>
+                <w:strike w:val="false"/>
+                <w:sz w:val="22"/>
+                <w:szCs w:val="22"/>
+                <w:color w:val="000000"/>
               </w:rPr>
               <w:br/>
-              <w:t>N = 44,431</w:t>
-            </w:r>
-            <w:r>
-              <w:rPr>
-                <w:rFonts w:ascii="Helvetica" w:eastAsia="Helvetica" w:hAnsi="Helvetica" w:cs="Helvetica"/>
-                <w:color w:val="000000"/>
-                <w:sz w:val="22"/>
-                <w:szCs w:val="22"/>
+            </w:r>
+            <w:r>
+              <w:rPr>
+                <w:rFonts w:ascii="Helvetica" w:hAnsi="Helvetica" w:eastAsia="Helvetica" w:cs="Helvetica"/>
+                <w:i w:val="false"/>
+                <w:b w:val="false"/>
+                <w:u w:val="none"/>
+                <w:strike w:val="false"/>
+                <w:sz w:val="22"/>
+                <w:szCs w:val="22"/>
+                <w:color w:val="000000"/>
+              </w:rPr>
+              <w:t xml:space="preserve">N = 44,431</w:t>
+            </w:r>
+            <w:r>
+              <w:rPr>
+                <w:rFonts w:ascii="Helvetica" w:hAnsi="Helvetica" w:eastAsia="Helvetica" w:cs="Helvetica"/>
+                <w:i w:val="false"/>
+                <w:b w:val="false"/>
+                <w:u w:val="none"/>
+                <w:strike w:val="false"/>
                 <w:vertAlign w:val="superscript"/>
-              </w:rPr>
-              <w:t>1</w:t>
+                <w:sz w:val="22"/>
+                <w:szCs w:val="22"/>
+                <w:color w:val="000000"/>
+              </w:rPr>
+              <w:t xml:space="preserve">1</w:t>
             </w:r>
           </w:p>
         </w:tc>
         <w:tc>
           <w:tcPr>
-            <w:tcW w:w="3088" w:type="dxa"/>
             <w:tcBorders>
+              <w:bottom w:val="single" w:sz="8" w:space="0" w:color="000000"/>
               <w:top w:val="single" w:sz="8" w:space="0" w:color="000000"/>
               <w:left w:val="none" w:sz="0" w:space="0" w:color="000000"/>
-              <w:bottom w:val="single" w:sz="8" w:space="0" w:color="000000"/>
               <w:right w:val="none" w:sz="0" w:space="0" w:color="000000"/>
             </w:tcBorders>
             <w:shd w:val="clear" w:color="auto" w:fill="FFFFFF"/>
             <w:tcMar>
               <w:top w:w="0" w:type="dxa"/>
+              <w:bottom w:w="0" w:type="dxa"/>
               <w:left w:w="0" w:type="dxa"/>
-              <w:bottom w:w="0" w:type="dxa"/>
               <w:right w:w="0" w:type="dxa"/>
             </w:tcMar>
             <w:vAlign w:val="center"/>
           </w:tcPr>
           <w:p>
             <w:pPr>
+              <w:pStyle w:val="Normal"/>
+              <w:jc w:val="center"/>
               <w:pBdr>
+                <w:bottom w:val="none" w:sz="0" w:space="0" w:color="000000"/>
                 <w:top w:val="none" w:sz="0" w:space="0" w:color="000000"/>
                 <w:left w:val="none" w:sz="0" w:space="0" w:color="000000"/>
-                <w:bottom w:val="none" w:sz="0" w:space="0" w:color="000000"/>
                 <w:right w:val="none" w:sz="0" w:space="0" w:color="000000"/>
               </w:pBdr>
-              <w:spacing w:before="40" w:after="40"/>
-              <w:ind w:left="100" w:right="100"/>
-              <w:jc w:val="center"/>
-              <w:rPr>
-                <w:rFonts w:ascii="Helvetica" w:eastAsia="Helvetica" w:hAnsi="Helvetica" w:cs="Helvetica"/>
-                <w:color w:val="000000"/>
-                <w:sz w:val="22"/>
-                <w:szCs w:val="22"/>
+              <w:spacing w:after="40" w:before="40" w:line="240"/>
+              <w:ind w:left="100" w:right="100" w:firstLine="0" w:firstLineChars="0"/>
+              <w:rPr>
+                <w:rFonts w:ascii="Helvetica" w:hAnsi="Helvetica" w:eastAsia="Helvetica" w:cs="Helvetica"/>
+                <w:i w:val="false"/>
+                <w:b w:val="false"/>
+                <w:u w:val="none"/>
+                <w:strike w:val="false"/>
+                <w:sz w:val="22"/>
+                <w:szCs w:val="22"/>
+                <w:color w:val="000000"/>
               </w:rPr>
             </w:pPr>
-            <w:proofErr w:type="spellStart"/>
-            <w:r>
-              <w:rPr>
-                <w:rFonts w:ascii="Helvetica" w:eastAsia="Helvetica" w:hAnsi="Helvetica" w:cs="Helvetica"/>
-                <w:b/>
-                <w:color w:val="000000"/>
-                <w:sz w:val="22"/>
-                <w:szCs w:val="22"/>
-              </w:rPr>
-              <w:t>masculino</w:t>
-            </w:r>
-            <w:proofErr w:type="spellEnd"/>
-            <w:r>
-              <w:rPr>
-                <w:rFonts w:ascii="Helvetica" w:eastAsia="Helvetica" w:hAnsi="Helvetica" w:cs="Helvetica"/>
-                <w:color w:val="000000"/>
-                <w:sz w:val="22"/>
-                <w:szCs w:val="22"/>
+            <w:r>
+              <w:rPr>
+                <w:rFonts w:ascii="Helvetica" w:hAnsi="Helvetica" w:eastAsia="Helvetica" w:cs="Helvetica"/>
+                <w:i w:val="false"/>
+                <w:b w:val="true"/>
+                <w:u w:val="none"/>
+                <w:strike w:val="false"/>
+                <w:sz w:val="22"/>
+                <w:szCs w:val="22"/>
+                <w:color w:val="000000"/>
+              </w:rPr>
+              <w:t xml:space="preserve">masculino</w:t>
+            </w:r>
+            <w:r>
+              <w:rPr>
+                <w:rFonts w:ascii="Helvetica" w:hAnsi="Helvetica" w:eastAsia="Helvetica" w:cs="Helvetica"/>
+                <w:i w:val="false"/>
+                <w:b w:val="false"/>
+                <w:u w:val="none"/>
+                <w:strike w:val="false"/>
+                <w:sz w:val="22"/>
+                <w:szCs w:val="22"/>
+                <w:color w:val="000000"/>
               </w:rPr>
               <w:t xml:space="preserve">  </w:t>
             </w:r>
             <w:r>
               <w:rPr>
-                <w:rFonts w:ascii="Helvetica" w:eastAsia="Helvetica" w:hAnsi="Helvetica" w:cs="Helvetica"/>
-                <w:color w:val="000000"/>
-                <w:sz w:val="22"/>
-                <w:szCs w:val="22"/>
+                <w:rFonts w:ascii="Helvetica" w:hAnsi="Helvetica" w:eastAsia="Helvetica" w:cs="Helvetica"/>
+                <w:i w:val="false"/>
+                <w:b w:val="false"/>
+                <w:u w:val="none"/>
+                <w:strike w:val="false"/>
+                <w:sz w:val="22"/>
+                <w:szCs w:val="22"/>
+                <w:color w:val="000000"/>
               </w:rPr>
               <w:br/>
-              <w:t>N = 25,409</w:t>
-            </w:r>
-            <w:r>
-              <w:rPr>
-                <w:rFonts w:ascii="Helvetica" w:eastAsia="Helvetica" w:hAnsi="Helvetica" w:cs="Helvetica"/>
-                <w:color w:val="000000"/>
-                <w:sz w:val="22"/>
-                <w:szCs w:val="22"/>
+            </w:r>
+            <w:r>
+              <w:rPr>
+                <w:rFonts w:ascii="Helvetica" w:hAnsi="Helvetica" w:eastAsia="Helvetica" w:cs="Helvetica"/>
+                <w:i w:val="false"/>
+                <w:b w:val="false"/>
+                <w:u w:val="none"/>
+                <w:strike w:val="false"/>
+                <w:sz w:val="22"/>
+                <w:szCs w:val="22"/>
+                <w:color w:val="000000"/>
+              </w:rPr>
+              <w:t xml:space="preserve">N = 25,409</w:t>
+            </w:r>
+            <w:r>
+              <w:rPr>
+                <w:rFonts w:ascii="Helvetica" w:hAnsi="Helvetica" w:eastAsia="Helvetica" w:cs="Helvetica"/>
+                <w:i w:val="false"/>
+                <w:b w:val="false"/>
+                <w:u w:val="none"/>
+                <w:strike w:val="false"/>
                 <w:vertAlign w:val="superscript"/>
-              </w:rPr>
-              <w:t>1</w:t>
+                <w:sz w:val="22"/>
+                <w:szCs w:val="22"/>
+                <w:color w:val="000000"/>
+              </w:rPr>
+              <w:t xml:space="preserve">1</w:t>
             </w:r>
           </w:p>
         </w:tc>
       </w:tr>
       <w:tr>
         <w:trPr>
-          <w:jc w:val="center"/>
+          <w:trHeight w:val="620" w:hRule="auto"/>
         </w:trPr>
         <w:tc>
           <w:tcPr>
-            <w:tcW w:w="2576" w:type="dxa"/>
             <w:tcBorders>
+              <w:bottom w:val="none" w:sz="0" w:space="0" w:color="000000"/>
               <w:top w:val="single" w:sz="8" w:space="0" w:color="000000"/>
               <w:left w:val="none" w:sz="0" w:space="0" w:color="000000"/>
-              <w:bottom w:val="none" w:sz="0" w:space="0" w:color="000000"/>
               <w:right w:val="none" w:sz="0" w:space="0" w:color="000000"/>
             </w:tcBorders>
             <w:shd w:val="clear" w:color="auto" w:fill="FFFFFF"/>
             <w:tcMar>
               <w:top w:w="0" w:type="dxa"/>
+              <w:bottom w:w="0" w:type="dxa"/>
               <w:left w:w="0" w:type="dxa"/>
-              <w:bottom w:w="0" w:type="dxa"/>
               <w:right w:w="0" w:type="dxa"/>
             </w:tcMar>
+            <w:vAlign w:val="top"/>
           </w:tcPr>
           <w:p>
             <w:pPr>
+              <w:pStyle w:val="Normal"/>
+              <w:jc w:val="left"/>
               <w:pBdr>
+                <w:bottom w:val="none" w:sz="0" w:space="0" w:color="000000"/>
                 <w:top w:val="none" w:sz="0" w:space="0" w:color="000000"/>
                 <w:left w:val="none" w:sz="0" w:space="0" w:color="000000"/>
-                <w:bottom w:val="none" w:sz="0" w:space="0" w:color="000000"/>
                 <w:right w:val="none" w:sz="0" w:space="0" w:color="000000"/>
               </w:pBdr>
-              <w:spacing w:before="100" w:after="100"/>
-              <w:ind w:left="100" w:right="100"/>
-              <w:rPr>
-                <w:rFonts w:ascii="Helvetica" w:eastAsia="Helvetica" w:hAnsi="Helvetica" w:cs="Helvetica"/>
-                <w:b/>
-                <w:color w:val="000000"/>
-                <w:sz w:val="22"/>
-                <w:szCs w:val="22"/>
+              <w:spacing w:after="100" w:before="100" w:line="240"/>
+              <w:ind w:left="100" w:right="100" w:firstLine="0" w:firstLineChars="0"/>
+              <w:rPr>
+                <w:rFonts w:ascii="Helvetica" w:hAnsi="Helvetica" w:eastAsia="Helvetica" w:cs="Helvetica"/>
+                <w:i w:val="false"/>
+                <w:b w:val="true"/>
+                <w:u w:val="none"/>
+                <w:strike w:val="false"/>
+                <w:sz w:val="22"/>
+                <w:szCs w:val="22"/>
+                <w:color w:val="000000"/>
               </w:rPr>
             </w:pPr>
-            <w:proofErr w:type="spellStart"/>
-            <w:r>
-              <w:rPr>
-                <w:rFonts w:ascii="Helvetica" w:eastAsia="Helvetica" w:hAnsi="Helvetica" w:cs="Helvetica"/>
-                <w:b/>
-                <w:color w:val="000000"/>
-                <w:sz w:val="22"/>
-                <w:szCs w:val="22"/>
-              </w:rPr>
-              <w:t>Índice</w:t>
-            </w:r>
-            <w:proofErr w:type="spellEnd"/>
-            <w:r>
-              <w:rPr>
-                <w:rFonts w:ascii="Helvetica" w:eastAsia="Helvetica" w:hAnsi="Helvetica" w:cs="Helvetica"/>
-                <w:b/>
-                <w:color w:val="000000"/>
-                <w:sz w:val="22"/>
-                <w:szCs w:val="22"/>
-              </w:rPr>
-              <w:t xml:space="preserve"> CPO-D</w:t>
+            <w:r>
+              <w:rPr>
+                <w:rFonts w:ascii="Helvetica" w:hAnsi="Helvetica" w:eastAsia="Helvetica" w:cs="Helvetica"/>
+                <w:i w:val="false"/>
+                <w:b w:val="true"/>
+                <w:u w:val="none"/>
+                <w:strike w:val="false"/>
+                <w:sz w:val="22"/>
+                <w:szCs w:val="22"/>
+                <w:color w:val="000000"/>
+              </w:rPr>
+              <w:t xml:space="preserve">Índice CPO-D</w:t>
             </w:r>
           </w:p>
         </w:tc>
         <w:tc>
           <w:tcPr>
-            <w:tcW w:w="3088" w:type="dxa"/>
             <w:tcBorders>
+              <w:bottom w:val="none" w:sz="0" w:space="0" w:color="000000"/>
               <w:top w:val="single" w:sz="8" w:space="0" w:color="000000"/>
               <w:left w:val="none" w:sz="0" w:space="0" w:color="000000"/>
-              <w:bottom w:val="none" w:sz="0" w:space="0" w:color="000000"/>
               <w:right w:val="none" w:sz="0" w:space="0" w:color="000000"/>
             </w:tcBorders>
             <w:shd w:val="clear" w:color="auto" w:fill="FFFFFF"/>
             <w:tcMar>
               <w:top w:w="0" w:type="dxa"/>
+              <w:bottom w:w="0" w:type="dxa"/>
               <w:left w:w="0" w:type="dxa"/>
-              <w:bottom w:w="0" w:type="dxa"/>
               <w:right w:w="0" w:type="dxa"/>
             </w:tcMar>
+            <w:vAlign w:val="top"/>
           </w:tcPr>
           <w:p>
             <w:pPr>
+              <w:pStyle w:val="Normal"/>
+              <w:jc w:val="center"/>
               <w:pBdr>
+                <w:bottom w:val="none" w:sz="0" w:space="0" w:color="000000"/>
                 <w:top w:val="none" w:sz="0" w:space="0" w:color="000000"/>
                 <w:left w:val="none" w:sz="0" w:space="0" w:color="000000"/>
-                <w:bottom w:val="none" w:sz="0" w:space="0" w:color="000000"/>
                 <w:right w:val="none" w:sz="0" w:space="0" w:color="000000"/>
               </w:pBdr>
-              <w:spacing w:before="100" w:after="100"/>
-              <w:ind w:left="100" w:right="100"/>
-              <w:jc w:val="center"/>
-              <w:rPr>
-                <w:rFonts w:ascii="Helvetica" w:eastAsia="Helvetica" w:hAnsi="Helvetica" w:cs="Helvetica"/>
-                <w:color w:val="000000"/>
-                <w:sz w:val="22"/>
-                <w:szCs w:val="22"/>
+              <w:spacing w:after="100" w:before="100" w:line="240"/>
+              <w:ind w:left="100" w:right="100" w:firstLine="0" w:firstLineChars="0"/>
+              <w:rPr>
+                <w:rFonts w:ascii="Helvetica" w:hAnsi="Helvetica" w:eastAsia="Helvetica" w:cs="Helvetica"/>
+                <w:i w:val="false"/>
+                <w:b w:val="false"/>
+                <w:u w:val="none"/>
+                <w:strike w:val="false"/>
+                <w:sz w:val="22"/>
+                <w:szCs w:val="22"/>
+                <w:color w:val="000000"/>
               </w:rPr>
             </w:pPr>
             <w:r>
               <w:rPr>
-                <w:rFonts w:ascii="Helvetica" w:eastAsia="Helvetica" w:hAnsi="Helvetica" w:cs="Helvetica"/>
-                <w:color w:val="000000"/>
-                <w:sz w:val="22"/>
-                <w:szCs w:val="22"/>
-              </w:rPr>
-              <w:t>14.9 ± 7.5 (</w:t>
-            </w:r>
-            <w:proofErr w:type="spellStart"/>
-            <w:r>
-              <w:rPr>
-                <w:rFonts w:ascii="Helvetica" w:eastAsia="Helvetica" w:hAnsi="Helvetica" w:cs="Helvetica"/>
-                <w:color w:val="000000"/>
-                <w:sz w:val="22"/>
-                <w:szCs w:val="22"/>
-              </w:rPr>
-              <w:t>rango</w:t>
-            </w:r>
-            <w:proofErr w:type="spellEnd"/>
-            <w:r>
-              <w:rPr>
-                <w:rFonts w:ascii="Helvetica" w:eastAsia="Helvetica" w:hAnsi="Helvetica" w:cs="Helvetica"/>
-                <w:color w:val="000000"/>
-                <w:sz w:val="22"/>
-                <w:szCs w:val="22"/>
-              </w:rPr>
-              <w:t>: 0.0-32.0)</w:t>
+                <w:rFonts w:ascii="Helvetica" w:hAnsi="Helvetica" w:eastAsia="Helvetica" w:cs="Helvetica"/>
+                <w:i w:val="false"/>
+                <w:b w:val="false"/>
+                <w:u w:val="none"/>
+                <w:strike w:val="false"/>
+                <w:sz w:val="22"/>
+                <w:szCs w:val="22"/>
+                <w:color w:val="000000"/>
+              </w:rPr>
+              <w:t xml:space="preserve">14.9 ± 7.5 (rango: 0.0-32.0)</w:t>
             </w:r>
           </w:p>
         </w:tc>
         <w:tc>
           <w:tcPr>
-            <w:tcW w:w="3088" w:type="dxa"/>
             <w:tcBorders>
+              <w:bottom w:val="none" w:sz="0" w:space="0" w:color="000000"/>
               <w:top w:val="single" w:sz="8" w:space="0" w:color="000000"/>
               <w:left w:val="none" w:sz="0" w:space="0" w:color="000000"/>
-              <w:bottom w:val="none" w:sz="0" w:space="0" w:color="000000"/>
               <w:right w:val="none" w:sz="0" w:space="0" w:color="000000"/>
             </w:tcBorders>
             <w:shd w:val="clear" w:color="auto" w:fill="FFFFFF"/>
             <w:tcMar>
               <w:top w:w="0" w:type="dxa"/>
+              <w:bottom w:w="0" w:type="dxa"/>
               <w:left w:w="0" w:type="dxa"/>
-              <w:bottom w:w="0" w:type="dxa"/>
               <w:right w:w="0" w:type="dxa"/>
             </w:tcMar>
+            <w:vAlign w:val="top"/>
           </w:tcPr>
           <w:p>
             <w:pPr>
+              <w:pStyle w:val="Normal"/>
+              <w:jc w:val="center"/>
               <w:pBdr>
+                <w:bottom w:val="none" w:sz="0" w:space="0" w:color="000000"/>
                 <w:top w:val="none" w:sz="0" w:space="0" w:color="000000"/>
                 <w:left w:val="none" w:sz="0" w:space="0" w:color="000000"/>
-                <w:bottom w:val="none" w:sz="0" w:space="0" w:color="000000"/>
                 <w:right w:val="none" w:sz="0" w:space="0" w:color="000000"/>
               </w:pBdr>
-              <w:spacing w:before="100" w:after="100"/>
-              <w:ind w:left="100" w:right="100"/>
-              <w:jc w:val="center"/>
-              <w:rPr>
-                <w:rFonts w:ascii="Helvetica" w:eastAsia="Helvetica" w:hAnsi="Helvetica" w:cs="Helvetica"/>
-                <w:color w:val="000000"/>
-                <w:sz w:val="22"/>
-                <w:szCs w:val="22"/>
+              <w:spacing w:after="100" w:before="100" w:line="240"/>
+              <w:ind w:left="100" w:right="100" w:firstLine="0" w:firstLineChars="0"/>
+              <w:rPr>
+                <w:rFonts w:ascii="Helvetica" w:hAnsi="Helvetica" w:eastAsia="Helvetica" w:cs="Helvetica"/>
+                <w:i w:val="false"/>
+                <w:b w:val="false"/>
+                <w:u w:val="none"/>
+                <w:strike w:val="false"/>
+                <w:sz w:val="22"/>
+                <w:szCs w:val="22"/>
+                <w:color w:val="000000"/>
               </w:rPr>
             </w:pPr>
             <w:r>
               <w:rPr>
-                <w:rFonts w:ascii="Helvetica" w:eastAsia="Helvetica" w:hAnsi="Helvetica" w:cs="Helvetica"/>
-                <w:color w:val="000000"/>
-                <w:sz w:val="22"/>
-                <w:szCs w:val="22"/>
-              </w:rPr>
-              <w:t>15.3 ± 7.3 (</w:t>
-            </w:r>
-            <w:proofErr w:type="spellStart"/>
-            <w:r>
-              <w:rPr>
-                <w:rFonts w:ascii="Helvetica" w:eastAsia="Helvetica" w:hAnsi="Helvetica" w:cs="Helvetica"/>
-                <w:color w:val="000000"/>
-                <w:sz w:val="22"/>
-                <w:szCs w:val="22"/>
-              </w:rPr>
-              <w:t>rango</w:t>
-            </w:r>
-            <w:proofErr w:type="spellEnd"/>
-            <w:r>
-              <w:rPr>
-                <w:rFonts w:ascii="Helvetica" w:eastAsia="Helvetica" w:hAnsi="Helvetica" w:cs="Helvetica"/>
-                <w:color w:val="000000"/>
-                <w:sz w:val="22"/>
-                <w:szCs w:val="22"/>
-              </w:rPr>
-              <w:t>: 0.0-32.0)</w:t>
+                <w:rFonts w:ascii="Helvetica" w:hAnsi="Helvetica" w:eastAsia="Helvetica" w:cs="Helvetica"/>
+                <w:i w:val="false"/>
+                <w:b w:val="false"/>
+                <w:u w:val="none"/>
+                <w:strike w:val="false"/>
+                <w:sz w:val="22"/>
+                <w:szCs w:val="22"/>
+                <w:color w:val="000000"/>
+              </w:rPr>
+              <w:t xml:space="preserve">15.3 ± 7.3 (rango: 0.0-32.0)</w:t>
             </w:r>
           </w:p>
         </w:tc>
         <w:tc>
           <w:tcPr>
-            <w:tcW w:w="3088" w:type="dxa"/>
             <w:tcBorders>
+              <w:bottom w:val="none" w:sz="0" w:space="0" w:color="000000"/>
               <w:top w:val="single" w:sz="8" w:space="0" w:color="000000"/>
               <w:left w:val="none" w:sz="0" w:space="0" w:color="000000"/>
-              <w:bottom w:val="none" w:sz="0" w:space="0" w:color="000000"/>
               <w:right w:val="none" w:sz="0" w:space="0" w:color="000000"/>
             </w:tcBorders>
             <w:shd w:val="clear" w:color="auto" w:fill="FFFFFF"/>
             <w:tcMar>
               <w:top w:w="0" w:type="dxa"/>
+              <w:bottom w:w="0" w:type="dxa"/>
               <w:left w:w="0" w:type="dxa"/>
-              <w:bottom w:w="0" w:type="dxa"/>
               <w:right w:w="0" w:type="dxa"/>
             </w:tcMar>
+            <w:vAlign w:val="top"/>
           </w:tcPr>
           <w:p>
             <w:pPr>
+              <w:pStyle w:val="Normal"/>
+              <w:jc w:val="center"/>
               <w:pBdr>
+                <w:bottom w:val="none" w:sz="0" w:space="0" w:color="000000"/>
                 <w:top w:val="none" w:sz="0" w:space="0" w:color="000000"/>
                 <w:left w:val="none" w:sz="0" w:space="0" w:color="000000"/>
-                <w:bottom w:val="none" w:sz="0" w:space="0" w:color="000000"/>
                 <w:right w:val="none" w:sz="0" w:space="0" w:color="000000"/>
               </w:pBdr>
-              <w:spacing w:before="100" w:after="100"/>
-              <w:ind w:left="100" w:right="100"/>
-              <w:jc w:val="center"/>
-              <w:rPr>
-                <w:rFonts w:ascii="Helvetica" w:eastAsia="Helvetica" w:hAnsi="Helvetica" w:cs="Helvetica"/>
-                <w:color w:val="000000"/>
-                <w:sz w:val="22"/>
-                <w:szCs w:val="22"/>
+              <w:spacing w:after="100" w:before="100" w:line="240"/>
+              <w:ind w:left="100" w:right="100" w:firstLine="0" w:firstLineChars="0"/>
+              <w:rPr>
+                <w:rFonts w:ascii="Helvetica" w:hAnsi="Helvetica" w:eastAsia="Helvetica" w:cs="Helvetica"/>
+                <w:i w:val="false"/>
+                <w:b w:val="false"/>
+                <w:u w:val="none"/>
+                <w:strike w:val="false"/>
+                <w:sz w:val="22"/>
+                <w:szCs w:val="22"/>
+                <w:color w:val="000000"/>
               </w:rPr>
             </w:pPr>
             <w:r>
               <w:rPr>
-                <w:rFonts w:ascii="Helvetica" w:eastAsia="Helvetica" w:hAnsi="Helvetica" w:cs="Helvetica"/>
-                <w:color w:val="000000"/>
-                <w:sz w:val="22"/>
-                <w:szCs w:val="22"/>
-              </w:rPr>
-              <w:t>14.1 ± 7.8 (</w:t>
-            </w:r>
-            <w:proofErr w:type="spellStart"/>
-            <w:r>
-              <w:rPr>
-                <w:rFonts w:ascii="Helvetica" w:eastAsia="Helvetica" w:hAnsi="Helvetica" w:cs="Helvetica"/>
-                <w:color w:val="000000"/>
-                <w:sz w:val="22"/>
-                <w:szCs w:val="22"/>
-              </w:rPr>
-              <w:t>rango</w:t>
-            </w:r>
-            <w:proofErr w:type="spellEnd"/>
-            <w:r>
-              <w:rPr>
-                <w:rFonts w:ascii="Helvetica" w:eastAsia="Helvetica" w:hAnsi="Helvetica" w:cs="Helvetica"/>
-                <w:color w:val="000000"/>
-                <w:sz w:val="22"/>
-                <w:szCs w:val="22"/>
-              </w:rPr>
-              <w:t>: 0.0-32.0)</w:t>
+                <w:rFonts w:ascii="Helvetica" w:hAnsi="Helvetica" w:eastAsia="Helvetica" w:cs="Helvetica"/>
+                <w:i w:val="false"/>
+                <w:b w:val="false"/>
+                <w:u w:val="none"/>
+                <w:strike w:val="false"/>
+                <w:sz w:val="22"/>
+                <w:szCs w:val="22"/>
+                <w:color w:val="000000"/>
+              </w:rPr>
+              <w:t xml:space="preserve">14.1 ± 7.8 (rango: 0.0-32.0)</w:t>
             </w:r>
           </w:p>
         </w:tc>
       </w:tr>
       <w:tr>
         <w:trPr>
-          <w:jc w:val="center"/>
+          <w:trHeight w:val="573" w:hRule="auto"/>
         </w:trPr>
         <w:tc>
           <w:tcPr>
-            <w:tcW w:w="2576" w:type="dxa"/>
             <w:tcBorders>
+              <w:bottom w:val="none" w:sz="0" w:space="0" w:color="000000"/>
               <w:top w:val="none" w:sz="0" w:space="0" w:color="000000"/>
               <w:left w:val="none" w:sz="0" w:space="0" w:color="000000"/>
-              <w:bottom w:val="none" w:sz="0" w:space="0" w:color="000000"/>
               <w:right w:val="none" w:sz="0" w:space="0" w:color="000000"/>
             </w:tcBorders>
             <w:shd w:val="clear" w:color="auto" w:fill="FFFFFF"/>
             <w:tcMar>
               <w:top w:w="0" w:type="dxa"/>
+              <w:bottom w:w="0" w:type="dxa"/>
               <w:left w:w="0" w:type="dxa"/>
-              <w:bottom w:w="0" w:type="dxa"/>
               <w:right w:w="0" w:type="dxa"/>
             </w:tcMar>
+            <w:vAlign w:val="top"/>
           </w:tcPr>
           <w:p>
             <w:pPr>
+              <w:pStyle w:val="Normal"/>
+              <w:jc w:val="left"/>
               <w:pBdr>
+                <w:bottom w:val="none" w:sz="0" w:space="0" w:color="000000"/>
                 <w:top w:val="none" w:sz="0" w:space="0" w:color="000000"/>
                 <w:left w:val="none" w:sz="0" w:space="0" w:color="000000"/>
-                <w:bottom w:val="none" w:sz="0" w:space="0" w:color="000000"/>
                 <w:right w:val="none" w:sz="0" w:space="0" w:color="000000"/>
               </w:pBdr>
-              <w:spacing w:before="100" w:after="100"/>
-              <w:ind w:left="100" w:right="100"/>
-              <w:rPr>
-                <w:rFonts w:ascii="Helvetica" w:eastAsia="Helvetica" w:hAnsi="Helvetica" w:cs="Helvetica"/>
-                <w:b/>
-                <w:color w:val="000000"/>
-                <w:sz w:val="22"/>
-                <w:szCs w:val="22"/>
+              <w:spacing w:after="100" w:before="100" w:line="240"/>
+              <w:ind w:left="100" w:right="100" w:firstLine="0" w:firstLineChars="0"/>
+              <w:rPr>
+                <w:rFonts w:ascii="Helvetica" w:hAnsi="Helvetica" w:eastAsia="Helvetica" w:cs="Helvetica"/>
+                <w:i w:val="false"/>
+                <w:b w:val="true"/>
+                <w:u w:val="none"/>
+                <w:strike w:val="false"/>
+                <w:sz w:val="22"/>
+                <w:szCs w:val="22"/>
+                <w:color w:val="000000"/>
               </w:rPr>
             </w:pPr>
             <w:r>
               <w:rPr>
-                <w:rFonts w:ascii="Helvetica" w:eastAsia="Helvetica" w:hAnsi="Helvetica" w:cs="Helvetica"/>
-                <w:b/>
-                <w:color w:val="000000"/>
-                <w:sz w:val="22"/>
-                <w:szCs w:val="22"/>
-              </w:rPr>
-              <w:t xml:space="preserve">Estado de </w:t>
-            </w:r>
-            <w:proofErr w:type="spellStart"/>
-            <w:r>
-              <w:rPr>
-                <w:rFonts w:ascii="Helvetica" w:eastAsia="Helvetica" w:hAnsi="Helvetica" w:cs="Helvetica"/>
-                <w:b/>
-                <w:color w:val="000000"/>
-                <w:sz w:val="22"/>
-                <w:szCs w:val="22"/>
-              </w:rPr>
-              <w:t>salud</w:t>
-            </w:r>
-            <w:proofErr w:type="spellEnd"/>
-            <w:r>
-              <w:rPr>
-                <w:rFonts w:ascii="Helvetica" w:eastAsia="Helvetica" w:hAnsi="Helvetica" w:cs="Helvetica"/>
-                <w:b/>
-                <w:color w:val="000000"/>
-                <w:sz w:val="22"/>
-                <w:szCs w:val="22"/>
-              </w:rPr>
-              <w:t xml:space="preserve"> </w:t>
-            </w:r>
-            <w:proofErr w:type="spellStart"/>
-            <w:r>
-              <w:rPr>
-                <w:rFonts w:ascii="Helvetica" w:eastAsia="Helvetica" w:hAnsi="Helvetica" w:cs="Helvetica"/>
-                <w:b/>
-                <w:color w:val="000000"/>
-                <w:sz w:val="22"/>
-                <w:szCs w:val="22"/>
-              </w:rPr>
-              <w:t>bucal</w:t>
-            </w:r>
-            <w:proofErr w:type="spellEnd"/>
+                <w:rFonts w:ascii="Helvetica" w:hAnsi="Helvetica" w:eastAsia="Helvetica" w:cs="Helvetica"/>
+                <w:i w:val="false"/>
+                <w:b w:val="true"/>
+                <w:u w:val="none"/>
+                <w:strike w:val="false"/>
+                <w:sz w:val="22"/>
+                <w:szCs w:val="22"/>
+                <w:color w:val="000000"/>
+              </w:rPr>
+              <w:t xml:space="preserve">Estado de salud bucal</w:t>
+            </w:r>
           </w:p>
         </w:tc>
         <w:tc>
           <w:tcPr>
-            <w:tcW w:w="3088" w:type="dxa"/>
             <w:tcBorders>
+              <w:bottom w:val="none" w:sz="0" w:space="0" w:color="000000"/>
               <w:top w:val="none" w:sz="0" w:space="0" w:color="000000"/>
               <w:left w:val="none" w:sz="0" w:space="0" w:color="000000"/>
-              <w:bottom w:val="none" w:sz="0" w:space="0" w:color="000000"/>
               <w:right w:val="none" w:sz="0" w:space="0" w:color="000000"/>
             </w:tcBorders>
             <w:shd w:val="clear" w:color="auto" w:fill="FFFFFF"/>
             <w:tcMar>
               <w:top w:w="0" w:type="dxa"/>
+              <w:bottom w:w="0" w:type="dxa"/>
               <w:left w:w="0" w:type="dxa"/>
-              <w:bottom w:w="0" w:type="dxa"/>
               <w:right w:w="0" w:type="dxa"/>
             </w:tcMar>
+            <w:vAlign w:val="top"/>
           </w:tcPr>
           <w:p>
             <w:pPr>
+              <w:pStyle w:val="Normal"/>
+              <w:jc w:val="center"/>
               <w:pBdr>
+                <w:bottom w:val="none" w:sz="0" w:space="0" w:color="000000"/>
                 <w:top w:val="none" w:sz="0" w:space="0" w:color="000000"/>
                 <w:left w:val="none" w:sz="0" w:space="0" w:color="000000"/>
-                <w:bottom w:val="none" w:sz="0" w:space="0" w:color="000000"/>
                 <w:right w:val="none" w:sz="0" w:space="0" w:color="000000"/>
               </w:pBdr>
-              <w:spacing w:before="100" w:after="100"/>
-              <w:ind w:left="100" w:right="100"/>
-              <w:jc w:val="center"/>
-              <w:rPr>
-                <w:rFonts w:ascii="Helvetica" w:eastAsia="Helvetica" w:hAnsi="Helvetica" w:cs="Helvetica"/>
-                <w:color w:val="000000"/>
-                <w:sz w:val="22"/>
-                <w:szCs w:val="22"/>
+              <w:spacing w:after="100" w:before="100" w:line="240"/>
+              <w:ind w:left="100" w:right="100" w:firstLine="0" w:firstLineChars="0"/>
+              <w:rPr>
+                <w:rFonts w:ascii="Helvetica" w:hAnsi="Helvetica" w:eastAsia="Helvetica" w:cs="Helvetica"/>
+                <w:i w:val="false"/>
+                <w:b w:val="false"/>
+                <w:u w:val="none"/>
+                <w:strike w:val="false"/>
+                <w:sz w:val="22"/>
+                <w:szCs w:val="22"/>
+                <w:color w:val="000000"/>
               </w:rPr>
             </w:pPr>
+            <w:r>
+              <w:rPr>
+                <w:rFonts w:ascii="Helvetica" w:hAnsi="Helvetica" w:eastAsia="Helvetica" w:cs="Helvetica"/>
+                <w:i w:val="false"/>
+                <w:b w:val="false"/>
+                <w:u w:val="none"/>
+                <w:strike w:val="false"/>
+                <w:sz w:val="22"/>
+                <w:szCs w:val="22"/>
+                <w:color w:val="000000"/>
+              </w:rPr>
+              <w:t xml:space="preserve"/>
+            </w:r>
           </w:p>
         </w:tc>
         <w:tc>
           <w:tcPr>
-            <w:tcW w:w="3088" w:type="dxa"/>
             <w:tcBorders>
+              <w:bottom w:val="none" w:sz="0" w:space="0" w:color="000000"/>
               <w:top w:val="none" w:sz="0" w:space="0" w:color="000000"/>
               <w:left w:val="none" w:sz="0" w:space="0" w:color="000000"/>
-              <w:bottom w:val="none" w:sz="0" w:space="0" w:color="000000"/>
               <w:right w:val="none" w:sz="0" w:space="0" w:color="000000"/>
             </w:tcBorders>
             <w:shd w:val="clear" w:color="auto" w:fill="FFFFFF"/>
             <w:tcMar>
               <w:top w:w="0" w:type="dxa"/>
+              <w:bottom w:w="0" w:type="dxa"/>
               <w:left w:w="0" w:type="dxa"/>
-              <w:bottom w:w="0" w:type="dxa"/>
               <w:right w:w="0" w:type="dxa"/>
             </w:tcMar>
+            <w:vAlign w:val="top"/>
           </w:tcPr>
           <w:p>
             <w:pPr>
+              <w:pStyle w:val="Normal"/>
+              <w:jc w:val="center"/>
               <w:pBdr>
+                <w:bottom w:val="none" w:sz="0" w:space="0" w:color="000000"/>
                 <w:top w:val="none" w:sz="0" w:space="0" w:color="000000"/>
                 <w:left w:val="none" w:sz="0" w:space="0" w:color="000000"/>
-                <w:bottom w:val="none" w:sz="0" w:space="0" w:color="000000"/>
                 <w:right w:val="none" w:sz="0" w:space="0" w:color="000000"/>
               </w:pBdr>
-              <w:spacing w:before="100" w:after="100"/>
-              <w:ind w:left="100" w:right="100"/>
-              <w:jc w:val="center"/>
-              <w:rPr>
-                <w:rFonts w:ascii="Helvetica" w:eastAsia="Helvetica" w:hAnsi="Helvetica" w:cs="Helvetica"/>
-                <w:color w:val="000000"/>
-                <w:sz w:val="22"/>
-                <w:szCs w:val="22"/>
+              <w:spacing w:after="100" w:before="100" w:line="240"/>
+              <w:ind w:left="100" w:right="100" w:firstLine="0" w:firstLineChars="0"/>
+              <w:rPr>
+                <w:rFonts w:ascii="Helvetica" w:hAnsi="Helvetica" w:eastAsia="Helvetica" w:cs="Helvetica"/>
+                <w:i w:val="false"/>
+                <w:b w:val="false"/>
+                <w:u w:val="none"/>
+                <w:strike w:val="false"/>
+                <w:sz w:val="22"/>
+                <w:szCs w:val="22"/>
+                <w:color w:val="000000"/>
               </w:rPr>
             </w:pPr>
+            <w:r>
+              <w:rPr>
+                <w:rFonts w:ascii="Helvetica" w:hAnsi="Helvetica" w:eastAsia="Helvetica" w:cs="Helvetica"/>
+                <w:i w:val="false"/>
+                <w:b w:val="false"/>
+                <w:u w:val="none"/>
+                <w:strike w:val="false"/>
+                <w:sz w:val="22"/>
+                <w:szCs w:val="22"/>
+                <w:color w:val="000000"/>
+              </w:rPr>
+              <w:t xml:space="preserve"/>
+            </w:r>
           </w:p>
         </w:tc>
         <w:tc>
           <w:tcPr>
-            <w:tcW w:w="3088" w:type="dxa"/>
             <w:tcBorders>
+              <w:bottom w:val="none" w:sz="0" w:space="0" w:color="000000"/>
               <w:top w:val="none" w:sz="0" w:space="0" w:color="000000"/>
               <w:left w:val="none" w:sz="0" w:space="0" w:color="000000"/>
-              <w:bottom w:val="none" w:sz="0" w:space="0" w:color="000000"/>
               <w:right w:val="none" w:sz="0" w:space="0" w:color="000000"/>
             </w:tcBorders>
             <w:shd w:val="clear" w:color="auto" w:fill="FFFFFF"/>
             <w:tcMar>
               <w:top w:w="0" w:type="dxa"/>
+              <w:bottom w:w="0" w:type="dxa"/>
               <w:left w:w="0" w:type="dxa"/>
-              <w:bottom w:w="0" w:type="dxa"/>
               <w:right w:w="0" w:type="dxa"/>
             </w:tcMar>
+            <w:vAlign w:val="top"/>
           </w:tcPr>
           <w:p>
             <w:pPr>
+              <w:pStyle w:val="Normal"/>
+              <w:jc w:val="center"/>
               <w:pBdr>
+                <w:bottom w:val="none" w:sz="0" w:space="0" w:color="000000"/>
                 <w:top w:val="none" w:sz="0" w:space="0" w:color="000000"/>
                 <w:left w:val="none" w:sz="0" w:space="0" w:color="000000"/>
-                <w:bottom w:val="none" w:sz="0" w:space="0" w:color="000000"/>
                 <w:right w:val="none" w:sz="0" w:space="0" w:color="000000"/>
               </w:pBdr>
-              <w:spacing w:before="100" w:after="100"/>
-              <w:ind w:left="100" w:right="100"/>
-              <w:jc w:val="center"/>
-              <w:rPr>
-                <w:rFonts w:ascii="Helvetica" w:eastAsia="Helvetica" w:hAnsi="Helvetica" w:cs="Helvetica"/>
-                <w:color w:val="000000"/>
-                <w:sz w:val="22"/>
-                <w:szCs w:val="22"/>
+              <w:spacing w:after="100" w:before="100" w:line="240"/>
+              <w:ind w:left="100" w:right="100" w:firstLine="0" w:firstLineChars="0"/>
+              <w:rPr>
+                <w:rFonts w:ascii="Helvetica" w:hAnsi="Helvetica" w:eastAsia="Helvetica" w:cs="Helvetica"/>
+                <w:i w:val="false"/>
+                <w:b w:val="false"/>
+                <w:u w:val="none"/>
+                <w:strike w:val="false"/>
+                <w:sz w:val="22"/>
+                <w:szCs w:val="22"/>
+                <w:color w:val="000000"/>
               </w:rPr>
             </w:pPr>
+            <w:r>
+              <w:rPr>
+                <w:rFonts w:ascii="Helvetica" w:hAnsi="Helvetica" w:eastAsia="Helvetica" w:cs="Helvetica"/>
+                <w:i w:val="false"/>
+                <w:b w:val="false"/>
+                <w:u w:val="none"/>
+                <w:strike w:val="false"/>
+                <w:sz w:val="22"/>
+                <w:szCs w:val="22"/>
+                <w:color w:val="000000"/>
+              </w:rPr>
+              <w:t xml:space="preserve"/>
+            </w:r>
           </w:p>
         </w:tc>
       </w:tr>
       <w:tr>
         <w:trPr>
-          <w:jc w:val="center"/>
+          <w:trHeight w:val="616" w:hRule="auto"/>
         </w:trPr>
         <w:tc>
           <w:tcPr>
-            <w:tcW w:w="2576" w:type="dxa"/>
             <w:tcBorders>
+              <w:bottom w:val="none" w:sz="0" w:space="0" w:color="000000"/>
               <w:top w:val="none" w:sz="0" w:space="0" w:color="000000"/>
               <w:left w:val="none" w:sz="0" w:space="0" w:color="000000"/>
-              <w:bottom w:val="none" w:sz="0" w:space="0" w:color="000000"/>
               <w:right w:val="none" w:sz="0" w:space="0" w:color="000000"/>
             </w:tcBorders>
             <w:shd w:val="clear" w:color="auto" w:fill="FFFFFF"/>
             <w:tcMar>
               <w:top w:w="0" w:type="dxa"/>
+              <w:bottom w:w="0" w:type="dxa"/>
               <w:left w:w="0" w:type="dxa"/>
-              <w:bottom w:w="0" w:type="dxa"/>
               <w:right w:w="0" w:type="dxa"/>
             </w:tcMar>
+            <w:vAlign w:val="top"/>
           </w:tcPr>
           <w:p>
             <w:pPr>
+              <w:pStyle w:val="Normal"/>
+              <w:jc w:val="left"/>
               <w:pBdr>
+                <w:bottom w:val="none" w:sz="0" w:space="0" w:color="000000"/>
                 <w:top w:val="none" w:sz="0" w:space="0" w:color="000000"/>
                 <w:left w:val="none" w:sz="0" w:space="0" w:color="000000"/>
-                <w:bottom w:val="none" w:sz="0" w:space="0" w:color="000000"/>
                 <w:right w:val="none" w:sz="0" w:space="0" w:color="000000"/>
               </w:pBdr>
-              <w:spacing w:before="100" w:after="100"/>
-              <w:ind w:left="300" w:right="100"/>
-              <w:rPr>
-                <w:rFonts w:ascii="Helvetica" w:eastAsia="Helvetica" w:hAnsi="Helvetica" w:cs="Helvetica"/>
-                <w:color w:val="000000"/>
-                <w:sz w:val="22"/>
-                <w:szCs w:val="22"/>
+              <w:spacing w:after="100" w:before="100" w:line="240"/>
+              <w:ind w:left="300" w:right="100" w:firstLine="0" w:firstLineChars="0"/>
+              <w:rPr>
+                <w:rFonts w:ascii="Helvetica" w:hAnsi="Helvetica" w:eastAsia="Helvetica" w:cs="Helvetica"/>
+                <w:i w:val="false"/>
+                <w:b w:val="false"/>
+                <w:u w:val="none"/>
+                <w:strike w:val="false"/>
+                <w:sz w:val="22"/>
+                <w:szCs w:val="22"/>
+                <w:color w:val="000000"/>
               </w:rPr>
             </w:pPr>
             <w:r>
               <w:rPr>
-                <w:rFonts w:ascii="Helvetica" w:eastAsia="Helvetica" w:hAnsi="Helvetica" w:cs="Helvetica"/>
-                <w:color w:val="000000"/>
-                <w:sz w:val="22"/>
-                <w:szCs w:val="22"/>
-              </w:rPr>
-              <w:t>MUY BAJO</w:t>
+                <w:rFonts w:ascii="Helvetica" w:hAnsi="Helvetica" w:eastAsia="Helvetica" w:cs="Helvetica"/>
+                <w:i w:val="false"/>
+                <w:b w:val="false"/>
+                <w:u w:val="none"/>
+                <w:strike w:val="false"/>
+                <w:sz w:val="22"/>
+                <w:szCs w:val="22"/>
+                <w:color w:val="000000"/>
+              </w:rPr>
+              <w:t xml:space="preserve">MUY BAJO</w:t>
             </w:r>
           </w:p>
         </w:tc>
         <w:tc>
           <w:tcPr>
-            <w:tcW w:w="3088" w:type="dxa"/>
             <w:tcBorders>
+              <w:bottom w:val="none" w:sz="0" w:space="0" w:color="000000"/>
               <w:top w:val="none" w:sz="0" w:space="0" w:color="000000"/>
               <w:left w:val="none" w:sz="0" w:space="0" w:color="000000"/>
-              <w:bottom w:val="none" w:sz="0" w:space="0" w:color="000000"/>
               <w:right w:val="none" w:sz="0" w:space="0" w:color="000000"/>
             </w:tcBorders>
             <w:shd w:val="clear" w:color="auto" w:fill="FFFFFF"/>
             <w:tcMar>
               <w:top w:w="0" w:type="dxa"/>
+              <w:bottom w:w="0" w:type="dxa"/>
               <w:left w:w="0" w:type="dxa"/>
-              <w:bottom w:w="0" w:type="dxa"/>
               <w:right w:w="0" w:type="dxa"/>
             </w:tcMar>
+            <w:vAlign w:val="top"/>
           </w:tcPr>
           <w:p>
             <w:pPr>
+              <w:pStyle w:val="Normal"/>
+              <w:jc w:val="center"/>
               <w:pBdr>
+                <w:bottom w:val="none" w:sz="0" w:space="0" w:color="000000"/>
                 <w:top w:val="none" w:sz="0" w:space="0" w:color="000000"/>
                 <w:left w:val="none" w:sz="0" w:space="0" w:color="000000"/>
-                <w:bottom w:val="none" w:sz="0" w:space="0" w:color="000000"/>
                 <w:right w:val="none" w:sz="0" w:space="0" w:color="000000"/>
               </w:pBdr>
-              <w:spacing w:before="100" w:after="100"/>
-              <w:ind w:left="100" w:right="100"/>
-              <w:jc w:val="center"/>
-              <w:rPr>
-                <w:rFonts w:ascii="Helvetica" w:eastAsia="Helvetica" w:hAnsi="Helvetica" w:cs="Helvetica"/>
-                <w:color w:val="000000"/>
-                <w:sz w:val="22"/>
-                <w:szCs w:val="22"/>
+              <w:spacing w:after="100" w:before="100" w:line="240"/>
+              <w:ind w:left="100" w:right="100" w:firstLine="0" w:firstLineChars="0"/>
+              <w:rPr>
+                <w:rFonts w:ascii="Helvetica" w:hAnsi="Helvetica" w:eastAsia="Helvetica" w:cs="Helvetica"/>
+                <w:i w:val="false"/>
+                <w:b w:val="false"/>
+                <w:u w:val="none"/>
+                <w:strike w:val="false"/>
+                <w:sz w:val="22"/>
+                <w:szCs w:val="22"/>
+                <w:color w:val="000000"/>
               </w:rPr>
             </w:pPr>
             <w:r>
               <w:rPr>
-                <w:rFonts w:ascii="Helvetica" w:eastAsia="Helvetica" w:hAnsi="Helvetica" w:cs="Helvetica"/>
-                <w:color w:val="000000"/>
-                <w:sz w:val="22"/>
-                <w:szCs w:val="22"/>
-              </w:rPr>
-              <w:t>16,038 (23.0%)</w:t>
+                <w:rFonts w:ascii="Helvetica" w:hAnsi="Helvetica" w:eastAsia="Helvetica" w:cs="Helvetica"/>
+                <w:i w:val="false"/>
+                <w:b w:val="false"/>
+                <w:u w:val="none"/>
+                <w:strike w:val="false"/>
+                <w:sz w:val="22"/>
+                <w:szCs w:val="22"/>
+                <w:color w:val="000000"/>
+              </w:rPr>
+              <w:t xml:space="preserve">16,038 (23.0%)</w:t>
             </w:r>
           </w:p>
         </w:tc>
         <w:tc>
           <w:tcPr>
-            <w:tcW w:w="3088" w:type="dxa"/>
             <w:tcBorders>
+              <w:bottom w:val="none" w:sz="0" w:space="0" w:color="000000"/>
               <w:top w:val="none" w:sz="0" w:space="0" w:color="000000"/>
               <w:left w:val="none" w:sz="0" w:space="0" w:color="000000"/>
-              <w:bottom w:val="none" w:sz="0" w:space="0" w:color="000000"/>
               <w:right w:val="none" w:sz="0" w:space="0" w:color="000000"/>
             </w:tcBorders>
             <w:shd w:val="clear" w:color="auto" w:fill="FFFFFF"/>
             <w:tcMar>
               <w:top w:w="0" w:type="dxa"/>
+              <w:bottom w:w="0" w:type="dxa"/>
               <w:left w:w="0" w:type="dxa"/>
-              <w:bottom w:w="0" w:type="dxa"/>
               <w:right w:w="0" w:type="dxa"/>
             </w:tcMar>
+            <w:vAlign w:val="top"/>
           </w:tcPr>
           <w:p>
             <w:pPr>
+              <w:pStyle w:val="Normal"/>
+              <w:jc w:val="center"/>
               <w:pBdr>
+                <w:bottom w:val="none" w:sz="0" w:space="0" w:color="000000"/>
                 <w:top w:val="none" w:sz="0" w:space="0" w:color="000000"/>
                 <w:left w:val="none" w:sz="0" w:space="0" w:color="000000"/>
-                <w:bottom w:val="none" w:sz="0" w:space="0" w:color="000000"/>
                 <w:right w:val="none" w:sz="0" w:space="0" w:color="000000"/>
               </w:pBdr>
-              <w:spacing w:before="100" w:after="100"/>
-              <w:ind w:left="100" w:right="100"/>
-              <w:jc w:val="center"/>
-              <w:rPr>
-                <w:rFonts w:ascii="Helvetica" w:eastAsia="Helvetica" w:hAnsi="Helvetica" w:cs="Helvetica"/>
-                <w:color w:val="000000"/>
-                <w:sz w:val="22"/>
-                <w:szCs w:val="22"/>
+              <w:spacing w:after="100" w:before="100" w:line="240"/>
+              <w:ind w:left="100" w:right="100" w:firstLine="0" w:firstLineChars="0"/>
+              <w:rPr>
+                <w:rFonts w:ascii="Helvetica" w:hAnsi="Helvetica" w:eastAsia="Helvetica" w:cs="Helvetica"/>
+                <w:i w:val="false"/>
+                <w:b w:val="false"/>
+                <w:u w:val="none"/>
+                <w:strike w:val="false"/>
+                <w:sz w:val="22"/>
+                <w:szCs w:val="22"/>
+                <w:color w:val="000000"/>
               </w:rPr>
             </w:pPr>
             <w:r>
               <w:rPr>
-                <w:rFonts w:ascii="Helvetica" w:eastAsia="Helvetica" w:hAnsi="Helvetica" w:cs="Helvetica"/>
-                <w:color w:val="000000"/>
-                <w:sz w:val="22"/>
-                <w:szCs w:val="22"/>
-              </w:rPr>
-              <w:t>9,210 (20.7%)</w:t>
+                <w:rFonts w:ascii="Helvetica" w:hAnsi="Helvetica" w:eastAsia="Helvetica" w:cs="Helvetica"/>
+                <w:i w:val="false"/>
+                <w:b w:val="false"/>
+                <w:u w:val="none"/>
+                <w:strike w:val="false"/>
+                <w:sz w:val="22"/>
+                <w:szCs w:val="22"/>
+                <w:color w:val="000000"/>
+              </w:rPr>
+              <w:t xml:space="preserve">9,210 (20.7%)</w:t>
             </w:r>
           </w:p>
         </w:tc>
         <w:tc>
           <w:tcPr>
-            <w:tcW w:w="3088" w:type="dxa"/>
             <w:tcBorders>
+              <w:bottom w:val="none" w:sz="0" w:space="0" w:color="000000"/>
               <w:top w:val="none" w:sz="0" w:space="0" w:color="000000"/>
               <w:left w:val="none" w:sz="0" w:space="0" w:color="000000"/>
-              <w:bottom w:val="none" w:sz="0" w:space="0" w:color="000000"/>
               <w:right w:val="none" w:sz="0" w:space="0" w:color="000000"/>
             </w:tcBorders>
             <w:shd w:val="clear" w:color="auto" w:fill="FFFFFF"/>
             <w:tcMar>
               <w:top w:w="0" w:type="dxa"/>
+              <w:bottom w:w="0" w:type="dxa"/>
               <w:left w:w="0" w:type="dxa"/>
-              <w:bottom w:w="0" w:type="dxa"/>
               <w:right w:w="0" w:type="dxa"/>
             </w:tcMar>
+            <w:vAlign w:val="top"/>
           </w:tcPr>
           <w:p>
             <w:pPr>
+              <w:pStyle w:val="Normal"/>
+              <w:jc w:val="center"/>
               <w:pBdr>
+                <w:bottom w:val="none" w:sz="0" w:space="0" w:color="000000"/>
                 <w:top w:val="none" w:sz="0" w:space="0" w:color="000000"/>
                 <w:left w:val="none" w:sz="0" w:space="0" w:color="000000"/>
-                <w:bottom w:val="none" w:sz="0" w:space="0" w:color="000000"/>
                 <w:right w:val="none" w:sz="0" w:space="0" w:color="000000"/>
               </w:pBdr>
-              <w:spacing w:before="100" w:after="100"/>
-              <w:ind w:left="100" w:right="100"/>
-              <w:jc w:val="center"/>
-              <w:rPr>
-                <w:rFonts w:ascii="Helvetica" w:eastAsia="Helvetica" w:hAnsi="Helvetica" w:cs="Helvetica"/>
-                <w:color w:val="000000"/>
-                <w:sz w:val="22"/>
-                <w:szCs w:val="22"/>
+              <w:spacing w:after="100" w:before="100" w:line="240"/>
+              <w:ind w:left="100" w:right="100" w:firstLine="0" w:firstLineChars="0"/>
+              <w:rPr>
+                <w:rFonts w:ascii="Helvetica" w:hAnsi="Helvetica" w:eastAsia="Helvetica" w:cs="Helvetica"/>
+                <w:i w:val="false"/>
+                <w:b w:val="false"/>
+                <w:u w:val="none"/>
+                <w:strike w:val="false"/>
+                <w:sz w:val="22"/>
+                <w:szCs w:val="22"/>
+                <w:color w:val="000000"/>
               </w:rPr>
             </w:pPr>
             <w:r>
               <w:rPr>
-                <w:rFonts w:ascii="Helvetica" w:eastAsia="Helvetica" w:hAnsi="Helvetica" w:cs="Helvetica"/>
-                <w:color w:val="000000"/>
-                <w:sz w:val="22"/>
-                <w:szCs w:val="22"/>
-              </w:rPr>
-              <w:t>6,828 (26.9%)</w:t>
+                <w:rFonts w:ascii="Helvetica" w:hAnsi="Helvetica" w:eastAsia="Helvetica" w:cs="Helvetica"/>
+                <w:i w:val="false"/>
+                <w:b w:val="false"/>
+                <w:u w:val="none"/>
+                <w:strike w:val="false"/>
+                <w:sz w:val="22"/>
+                <w:szCs w:val="22"/>
+                <w:color w:val="000000"/>
+              </w:rPr>
+              <w:t xml:space="preserve">6,828 (26.9%)</w:t>
             </w:r>
           </w:p>
         </w:tc>
       </w:tr>
       <w:tr>
         <w:trPr>
-          <w:jc w:val="center"/>
+          <w:trHeight w:val="616" w:hRule="auto"/>
         </w:trPr>
         <w:tc>
           <w:tcPr>
-            <w:tcW w:w="2576" w:type="dxa"/>
             <w:tcBorders>
+              <w:bottom w:val="none" w:sz="0" w:space="0" w:color="000000"/>
               <w:top w:val="none" w:sz="0" w:space="0" w:color="000000"/>
               <w:left w:val="none" w:sz="0" w:space="0" w:color="000000"/>
-              <w:bottom w:val="none" w:sz="0" w:space="0" w:color="000000"/>
               <w:right w:val="none" w:sz="0" w:space="0" w:color="000000"/>
             </w:tcBorders>
             <w:shd w:val="clear" w:color="auto" w:fill="FFFFFF"/>
             <w:tcMar>
               <w:top w:w="0" w:type="dxa"/>
+              <w:bottom w:w="0" w:type="dxa"/>
               <w:left w:w="0" w:type="dxa"/>
-              <w:bottom w:w="0" w:type="dxa"/>
               <w:right w:w="0" w:type="dxa"/>
             </w:tcMar>
+            <w:vAlign w:val="top"/>
           </w:tcPr>
           <w:p>
             <w:pPr>
+              <w:pStyle w:val="Normal"/>
+              <w:jc w:val="left"/>
               <w:pBdr>
+                <w:bottom w:val="none" w:sz="0" w:space="0" w:color="000000"/>
                 <w:top w:val="none" w:sz="0" w:space="0" w:color="000000"/>
                 <w:left w:val="none" w:sz="0" w:space="0" w:color="000000"/>
-                <w:bottom w:val="none" w:sz="0" w:space="0" w:color="000000"/>
                 <w:right w:val="none" w:sz="0" w:space="0" w:color="000000"/>
               </w:pBdr>
-              <w:spacing w:before="100" w:after="100"/>
-              <w:ind w:left="300" w:right="100"/>
-              <w:rPr>
-                <w:rFonts w:ascii="Helvetica" w:eastAsia="Helvetica" w:hAnsi="Helvetica" w:cs="Helvetica"/>
-                <w:color w:val="000000"/>
-                <w:sz w:val="22"/>
-                <w:szCs w:val="22"/>
+              <w:spacing w:after="100" w:before="100" w:line="240"/>
+              <w:ind w:left="300" w:right="100" w:firstLine="0" w:firstLineChars="0"/>
+              <w:rPr>
+                <w:rFonts w:ascii="Helvetica" w:hAnsi="Helvetica" w:eastAsia="Helvetica" w:cs="Helvetica"/>
+                <w:i w:val="false"/>
+                <w:b w:val="false"/>
+                <w:u w:val="none"/>
+                <w:strike w:val="false"/>
+                <w:sz w:val="22"/>
+                <w:szCs w:val="22"/>
+                <w:color w:val="000000"/>
               </w:rPr>
             </w:pPr>
             <w:r>
               <w:rPr>
-                <w:rFonts w:ascii="Helvetica" w:eastAsia="Helvetica" w:hAnsi="Helvetica" w:cs="Helvetica"/>
-                <w:color w:val="000000"/>
-                <w:sz w:val="22"/>
-                <w:szCs w:val="22"/>
-              </w:rPr>
-              <w:t>BAJO</w:t>
+                <w:rFonts w:ascii="Helvetica" w:hAnsi="Helvetica" w:eastAsia="Helvetica" w:cs="Helvetica"/>
+                <w:i w:val="false"/>
+                <w:b w:val="false"/>
+                <w:u w:val="none"/>
+                <w:strike w:val="false"/>
+                <w:sz w:val="22"/>
+                <w:szCs w:val="22"/>
+                <w:color w:val="000000"/>
+              </w:rPr>
+              <w:t xml:space="preserve">BAJO</w:t>
             </w:r>
           </w:p>
         </w:tc>
         <w:tc>
           <w:tcPr>
-            <w:tcW w:w="3088" w:type="dxa"/>
             <w:tcBorders>
+              <w:bottom w:val="none" w:sz="0" w:space="0" w:color="000000"/>
               <w:top w:val="none" w:sz="0" w:space="0" w:color="000000"/>
               <w:left w:val="none" w:sz="0" w:space="0" w:color="000000"/>
-              <w:bottom w:val="none" w:sz="0" w:space="0" w:color="000000"/>
               <w:right w:val="none" w:sz="0" w:space="0" w:color="000000"/>
             </w:tcBorders>
             <w:shd w:val="clear" w:color="auto" w:fill="FFFFFF"/>
             <w:tcMar>
               <w:top w:w="0" w:type="dxa"/>
+              <w:bottom w:w="0" w:type="dxa"/>
               <w:left w:w="0" w:type="dxa"/>
-              <w:bottom w:w="0" w:type="dxa"/>
               <w:right w:w="0" w:type="dxa"/>
             </w:tcMar>
+            <w:vAlign w:val="top"/>
           </w:tcPr>
           <w:p>
             <w:pPr>
+              <w:pStyle w:val="Normal"/>
+              <w:jc w:val="center"/>
               <w:pBdr>
+                <w:bottom w:val="none" w:sz="0" w:space="0" w:color="000000"/>
                 <w:top w:val="none" w:sz="0" w:space="0" w:color="000000"/>
                 <w:left w:val="none" w:sz="0" w:space="0" w:color="000000"/>
-                <w:bottom w:val="none" w:sz="0" w:space="0" w:color="000000"/>
                 <w:right w:val="none" w:sz="0" w:space="0" w:color="000000"/>
               </w:pBdr>
-              <w:spacing w:before="100" w:after="100"/>
-              <w:ind w:left="100" w:right="100"/>
-              <w:jc w:val="center"/>
-              <w:rPr>
-                <w:rFonts w:ascii="Helvetica" w:eastAsia="Helvetica" w:hAnsi="Helvetica" w:cs="Helvetica"/>
-                <w:color w:val="000000"/>
-                <w:sz w:val="22"/>
-                <w:szCs w:val="22"/>
+              <w:spacing w:after="100" w:before="100" w:line="240"/>
+              <w:ind w:left="100" w:right="100" w:firstLine="0" w:firstLineChars="0"/>
+              <w:rPr>
+                <w:rFonts w:ascii="Helvetica" w:hAnsi="Helvetica" w:eastAsia="Helvetica" w:cs="Helvetica"/>
+                <w:i w:val="false"/>
+                <w:b w:val="false"/>
+                <w:u w:val="none"/>
+                <w:strike w:val="false"/>
+                <w:sz w:val="22"/>
+                <w:szCs w:val="22"/>
+                <w:color w:val="000000"/>
               </w:rPr>
             </w:pPr>
             <w:r>
               <w:rPr>
-                <w:rFonts w:ascii="Helvetica" w:eastAsia="Helvetica" w:hAnsi="Helvetica" w:cs="Helvetica"/>
-                <w:color w:val="000000"/>
-                <w:sz w:val="22"/>
-                <w:szCs w:val="22"/>
-              </w:rPr>
-              <w:t>13,508 (19.3%)</w:t>
+                <w:rFonts w:ascii="Helvetica" w:hAnsi="Helvetica" w:eastAsia="Helvetica" w:cs="Helvetica"/>
+                <w:i w:val="false"/>
+                <w:b w:val="false"/>
+                <w:u w:val="none"/>
+                <w:strike w:val="false"/>
+                <w:sz w:val="22"/>
+                <w:szCs w:val="22"/>
+                <w:color w:val="000000"/>
+              </w:rPr>
+              <w:t xml:space="preserve">13,508 (19.3%)</w:t>
             </w:r>
           </w:p>
         </w:tc>
         <w:tc>
           <w:tcPr>
-            <w:tcW w:w="3088" w:type="dxa"/>
             <w:tcBorders>
+              <w:bottom w:val="none" w:sz="0" w:space="0" w:color="000000"/>
               <w:top w:val="none" w:sz="0" w:space="0" w:color="000000"/>
               <w:left w:val="none" w:sz="0" w:space="0" w:color="000000"/>
-              <w:bottom w:val="none" w:sz="0" w:space="0" w:color="000000"/>
               <w:right w:val="none" w:sz="0" w:space="0" w:color="000000"/>
             </w:tcBorders>
             <w:shd w:val="clear" w:color="auto" w:fill="FFFFFF"/>
             <w:tcMar>
               <w:top w:w="0" w:type="dxa"/>
+              <w:bottom w:w="0" w:type="dxa"/>
               <w:left w:w="0" w:type="dxa"/>
-              <w:bottom w:w="0" w:type="dxa"/>
               <w:right w:w="0" w:type="dxa"/>
             </w:tcMar>
+            <w:vAlign w:val="top"/>
           </w:tcPr>
           <w:p>
             <w:pPr>
+              <w:pStyle w:val="Normal"/>
+              <w:jc w:val="center"/>
               <w:pBdr>
+                <w:bottom w:val="none" w:sz="0" w:space="0" w:color="000000"/>
                 <w:top w:val="none" w:sz="0" w:space="0" w:color="000000"/>
                 <w:left w:val="none" w:sz="0" w:space="0" w:color="000000"/>
-                <w:bottom w:val="none" w:sz="0" w:space="0" w:color="000000"/>
                 <w:right w:val="none" w:sz="0" w:space="0" w:color="000000"/>
               </w:pBdr>
-              <w:spacing w:before="100" w:after="100"/>
-              <w:ind w:left="100" w:right="100"/>
-              <w:jc w:val="center"/>
-              <w:rPr>
-                <w:rFonts w:ascii="Helvetica" w:eastAsia="Helvetica" w:hAnsi="Helvetica" w:cs="Helvetica"/>
-                <w:color w:val="000000"/>
-                <w:sz w:val="22"/>
-                <w:szCs w:val="22"/>
+              <w:spacing w:after="100" w:before="100" w:line="240"/>
+              <w:ind w:left="100" w:right="100" w:firstLine="0" w:firstLineChars="0"/>
+              <w:rPr>
+                <w:rFonts w:ascii="Helvetica" w:hAnsi="Helvetica" w:eastAsia="Helvetica" w:cs="Helvetica"/>
+                <w:i w:val="false"/>
+                <w:b w:val="false"/>
+                <w:u w:val="none"/>
+                <w:strike w:val="false"/>
+                <w:sz w:val="22"/>
+                <w:szCs w:val="22"/>
+                <w:color w:val="000000"/>
               </w:rPr>
             </w:pPr>
             <w:r>
               <w:rPr>
-                <w:rFonts w:ascii="Helvetica" w:eastAsia="Helvetica" w:hAnsi="Helvetica" w:cs="Helvetica"/>
-                <w:color w:val="000000"/>
-                <w:sz w:val="22"/>
-                <w:szCs w:val="22"/>
-              </w:rPr>
-              <w:t>8,450 (19.0%)</w:t>
+                <w:rFonts w:ascii="Helvetica" w:hAnsi="Helvetica" w:eastAsia="Helvetica" w:cs="Helvetica"/>
+                <w:i w:val="false"/>
+                <w:b w:val="false"/>
+                <w:u w:val="none"/>
+                <w:strike w:val="false"/>
+                <w:sz w:val="22"/>
+                <w:szCs w:val="22"/>
+                <w:color w:val="000000"/>
+              </w:rPr>
+              <w:t xml:space="preserve">8,450 (19.0%)</w:t>
             </w:r>
           </w:p>
         </w:tc>
         <w:tc>
           <w:tcPr>
-            <w:tcW w:w="3088" w:type="dxa"/>
             <w:tcBorders>
+              <w:bottom w:val="none" w:sz="0" w:space="0" w:color="000000"/>
               <w:top w:val="none" w:sz="0" w:space="0" w:color="000000"/>
               <w:left w:val="none" w:sz="0" w:space="0" w:color="000000"/>
-              <w:bottom w:val="none" w:sz="0" w:space="0" w:color="000000"/>
               <w:right w:val="none" w:sz="0" w:space="0" w:color="000000"/>
             </w:tcBorders>
             <w:shd w:val="clear" w:color="auto" w:fill="FFFFFF"/>
             <w:tcMar>
               <w:top w:w="0" w:type="dxa"/>
+              <w:bottom w:w="0" w:type="dxa"/>
               <w:left w:w="0" w:type="dxa"/>
-              <w:bottom w:w="0" w:type="dxa"/>
               <w:right w:w="0" w:type="dxa"/>
             </w:tcMar>
+            <w:vAlign w:val="top"/>
           </w:tcPr>
           <w:p>
             <w:pPr>
+              <w:pStyle w:val="Normal"/>
+              <w:jc w:val="center"/>
               <w:pBdr>
+                <w:bottom w:val="none" w:sz="0" w:space="0" w:color="000000"/>
                 <w:top w:val="none" w:sz="0" w:space="0" w:color="000000"/>
                 <w:left w:val="none" w:sz="0" w:space="0" w:color="000000"/>
-                <w:bottom w:val="none" w:sz="0" w:space="0" w:color="000000"/>
                 <w:right w:val="none" w:sz="0" w:space="0" w:color="000000"/>
               </w:pBdr>
-              <w:spacing w:before="100" w:after="100"/>
-              <w:ind w:left="100" w:right="100"/>
-              <w:jc w:val="center"/>
-              <w:rPr>
-                <w:rFonts w:ascii="Helvetica" w:eastAsia="Helvetica" w:hAnsi="Helvetica" w:cs="Helvetica"/>
-                <w:color w:val="000000"/>
-                <w:sz w:val="22"/>
-                <w:szCs w:val="22"/>
+              <w:spacing w:after="100" w:before="100" w:line="240"/>
+              <w:ind w:left="100" w:right="100" w:firstLine="0" w:firstLineChars="0"/>
+              <w:rPr>
+                <w:rFonts w:ascii="Helvetica" w:hAnsi="Helvetica" w:eastAsia="Helvetica" w:cs="Helvetica"/>
+                <w:i w:val="false"/>
+                <w:b w:val="false"/>
+                <w:u w:val="none"/>
+                <w:strike w:val="false"/>
+                <w:sz w:val="22"/>
+                <w:szCs w:val="22"/>
+                <w:color w:val="000000"/>
               </w:rPr>
             </w:pPr>
             <w:r>
               <w:rPr>
-                <w:rFonts w:ascii="Helvetica" w:eastAsia="Helvetica" w:hAnsi="Helvetica" w:cs="Helvetica"/>
-                <w:color w:val="000000"/>
-                <w:sz w:val="22"/>
-                <w:szCs w:val="22"/>
-              </w:rPr>
-              <w:t>5,058 (19.9%)</w:t>
+                <w:rFonts w:ascii="Helvetica" w:hAnsi="Helvetica" w:eastAsia="Helvetica" w:cs="Helvetica"/>
+                <w:i w:val="false"/>
+                <w:b w:val="false"/>
+                <w:u w:val="none"/>
+                <w:strike w:val="false"/>
+                <w:sz w:val="22"/>
+                <w:szCs w:val="22"/>
+                <w:color w:val="000000"/>
+              </w:rPr>
+              <w:t xml:space="preserve">5,058 (19.9%)</w:t>
             </w:r>
           </w:p>
         </w:tc>
       </w:tr>
       <w:tr>
         <w:trPr>
-          <w:jc w:val="center"/>
+          <w:trHeight w:val="616" w:hRule="auto"/>
         </w:trPr>
         <w:tc>
           <w:tcPr>
-            <w:tcW w:w="2576" w:type="dxa"/>
             <w:tcBorders>
+              <w:bottom w:val="none" w:sz="0" w:space="0" w:color="000000"/>
               <w:top w:val="none" w:sz="0" w:space="0" w:color="000000"/>
               <w:left w:val="none" w:sz="0" w:space="0" w:color="000000"/>
-              <w:bottom w:val="none" w:sz="0" w:space="0" w:color="000000"/>
               <w:right w:val="none" w:sz="0" w:space="0" w:color="000000"/>
             </w:tcBorders>
             <w:shd w:val="clear" w:color="auto" w:fill="FFFFFF"/>
             <w:tcMar>
               <w:top w:w="0" w:type="dxa"/>
+              <w:bottom w:w="0" w:type="dxa"/>
               <w:left w:w="0" w:type="dxa"/>
-              <w:bottom w:w="0" w:type="dxa"/>
               <w:right w:w="0" w:type="dxa"/>
             </w:tcMar>
+            <w:vAlign w:val="top"/>
           </w:tcPr>
           <w:p>
             <w:pPr>
+              <w:pStyle w:val="Normal"/>
+              <w:jc w:val="left"/>
               <w:pBdr>
+                <w:bottom w:val="none" w:sz="0" w:space="0" w:color="000000"/>
                 <w:top w:val="none" w:sz="0" w:space="0" w:color="000000"/>
                 <w:left w:val="none" w:sz="0" w:space="0" w:color="000000"/>
-                <w:bottom w:val="none" w:sz="0" w:space="0" w:color="000000"/>
                 <w:right w:val="none" w:sz="0" w:space="0" w:color="000000"/>
               </w:pBdr>
-              <w:spacing w:before="100" w:after="100"/>
-              <w:ind w:left="300" w:right="100"/>
-              <w:rPr>
-                <w:rFonts w:ascii="Helvetica" w:eastAsia="Helvetica" w:hAnsi="Helvetica" w:cs="Helvetica"/>
-                <w:color w:val="000000"/>
-                <w:sz w:val="22"/>
-                <w:szCs w:val="22"/>
+              <w:spacing w:after="100" w:before="100" w:line="240"/>
+              <w:ind w:left="300" w:right="100" w:firstLine="0" w:firstLineChars="0"/>
+              <w:rPr>
+                <w:rFonts w:ascii="Helvetica" w:hAnsi="Helvetica" w:eastAsia="Helvetica" w:cs="Helvetica"/>
+                <w:i w:val="false"/>
+                <w:b w:val="false"/>
+                <w:u w:val="none"/>
+                <w:strike w:val="false"/>
+                <w:sz w:val="22"/>
+                <w:szCs w:val="22"/>
+                <w:color w:val="000000"/>
               </w:rPr>
             </w:pPr>
             <w:r>
               <w:rPr>
-                <w:rFonts w:ascii="Helvetica" w:eastAsia="Helvetica" w:hAnsi="Helvetica" w:cs="Helvetica"/>
-                <w:color w:val="000000"/>
-                <w:sz w:val="22"/>
-                <w:szCs w:val="22"/>
-              </w:rPr>
-              <w:t>MODERADO</w:t>
+                <w:rFonts w:ascii="Helvetica" w:hAnsi="Helvetica" w:eastAsia="Helvetica" w:cs="Helvetica"/>
+                <w:i w:val="false"/>
+                <w:b w:val="false"/>
+                <w:u w:val="none"/>
+                <w:strike w:val="false"/>
+                <w:sz w:val="22"/>
+                <w:szCs w:val="22"/>
+                <w:color w:val="000000"/>
+              </w:rPr>
+              <w:t xml:space="preserve">MODERADO</w:t>
             </w:r>
           </w:p>
         </w:tc>
         <w:tc>
           <w:tcPr>
-            <w:tcW w:w="3088" w:type="dxa"/>
             <w:tcBorders>
+              <w:bottom w:val="none" w:sz="0" w:space="0" w:color="000000"/>
               <w:top w:val="none" w:sz="0" w:space="0" w:color="000000"/>
               <w:left w:val="none" w:sz="0" w:space="0" w:color="000000"/>
-              <w:bottom w:val="none" w:sz="0" w:space="0" w:color="000000"/>
               <w:right w:val="none" w:sz="0" w:space="0" w:color="000000"/>
             </w:tcBorders>
             <w:shd w:val="clear" w:color="auto" w:fill="FFFFFF"/>
             <w:tcMar>
               <w:top w:w="0" w:type="dxa"/>
+              <w:bottom w:w="0" w:type="dxa"/>
               <w:left w:w="0" w:type="dxa"/>
-              <w:bottom w:w="0" w:type="dxa"/>
               <w:right w:w="0" w:type="dxa"/>
             </w:tcMar>
+            <w:vAlign w:val="top"/>
           </w:tcPr>
           <w:p>
             <w:pPr>
+              <w:pStyle w:val="Normal"/>
+              <w:jc w:val="center"/>
               <w:pBdr>
+                <w:bottom w:val="none" w:sz="0" w:space="0" w:color="000000"/>
                 <w:top w:val="none" w:sz="0" w:space="0" w:color="000000"/>
                 <w:left w:val="none" w:sz="0" w:space="0" w:color="000000"/>
-                <w:bottom w:val="none" w:sz="0" w:space="0" w:color="000000"/>
                 <w:right w:val="none" w:sz="0" w:space="0" w:color="000000"/>
               </w:pBdr>
-              <w:spacing w:before="100" w:after="100"/>
-              <w:ind w:left="100" w:right="100"/>
-              <w:jc w:val="center"/>
-              <w:rPr>
-                <w:rFonts w:ascii="Helvetica" w:eastAsia="Helvetica" w:hAnsi="Helvetica" w:cs="Helvetica"/>
-                <w:color w:val="000000"/>
-                <w:sz w:val="22"/>
-                <w:szCs w:val="22"/>
+              <w:spacing w:after="100" w:before="100" w:line="240"/>
+              <w:ind w:left="100" w:right="100" w:firstLine="0" w:firstLineChars="0"/>
+              <w:rPr>
+                <w:rFonts w:ascii="Helvetica" w:hAnsi="Helvetica" w:eastAsia="Helvetica" w:cs="Helvetica"/>
+                <w:i w:val="false"/>
+                <w:b w:val="false"/>
+                <w:u w:val="none"/>
+                <w:strike w:val="false"/>
+                <w:sz w:val="22"/>
+                <w:szCs w:val="22"/>
+                <w:color w:val="000000"/>
               </w:rPr>
             </w:pPr>
             <w:r>
               <w:rPr>
-                <w:rFonts w:ascii="Helvetica" w:eastAsia="Helvetica" w:hAnsi="Helvetica" w:cs="Helvetica"/>
-                <w:color w:val="000000"/>
-                <w:sz w:val="22"/>
-                <w:szCs w:val="22"/>
-              </w:rPr>
-              <w:t>14,204 (20.3%)</w:t>
+                <w:rFonts w:ascii="Helvetica" w:hAnsi="Helvetica" w:eastAsia="Helvetica" w:cs="Helvetica"/>
+                <w:i w:val="false"/>
+                <w:b w:val="false"/>
+                <w:u w:val="none"/>
+                <w:strike w:val="false"/>
+                <w:sz w:val="22"/>
+                <w:szCs w:val="22"/>
+                <w:color w:val="000000"/>
+              </w:rPr>
+              <w:t xml:space="preserve">14,204 (20.3%)</w:t>
             </w:r>
           </w:p>
         </w:tc>
         <w:tc>
           <w:tcPr>
-            <w:tcW w:w="3088" w:type="dxa"/>
             <w:tcBorders>
+              <w:bottom w:val="none" w:sz="0" w:space="0" w:color="000000"/>
               <w:top w:val="none" w:sz="0" w:space="0" w:color="000000"/>
               <w:left w:val="none" w:sz="0" w:space="0" w:color="000000"/>
-              <w:bottom w:val="none" w:sz="0" w:space="0" w:color="000000"/>
               <w:right w:val="none" w:sz="0" w:space="0" w:color="000000"/>
             </w:tcBorders>
             <w:shd w:val="clear" w:color="auto" w:fill="FFFFFF"/>
             <w:tcMar>
               <w:top w:w="0" w:type="dxa"/>
+              <w:bottom w:w="0" w:type="dxa"/>
               <w:left w:w="0" w:type="dxa"/>
-              <w:bottom w:w="0" w:type="dxa"/>
               <w:right w:w="0" w:type="dxa"/>
             </w:tcMar>
+            <w:vAlign w:val="top"/>
           </w:tcPr>
           <w:p>
             <w:pPr>
+              <w:pStyle w:val="Normal"/>
+              <w:jc w:val="center"/>
               <w:pBdr>
+                <w:bottom w:val="none" w:sz="0" w:space="0" w:color="000000"/>
                 <w:top w:val="none" w:sz="0" w:space="0" w:color="000000"/>
                 <w:left w:val="none" w:sz="0" w:space="0" w:color="000000"/>
-                <w:bottom w:val="none" w:sz="0" w:space="0" w:color="000000"/>
                 <w:right w:val="none" w:sz="0" w:space="0" w:color="000000"/>
               </w:pBdr>
-              <w:spacing w:before="100" w:after="100"/>
-              <w:ind w:left="100" w:right="100"/>
-              <w:jc w:val="center"/>
-              <w:rPr>
-                <w:rFonts w:ascii="Helvetica" w:eastAsia="Helvetica" w:hAnsi="Helvetica" w:cs="Helvetica"/>
-                <w:color w:val="000000"/>
-                <w:sz w:val="22"/>
-                <w:szCs w:val="22"/>
+              <w:spacing w:after="100" w:before="100" w:line="240"/>
+              <w:ind w:left="100" w:right="100" w:firstLine="0" w:firstLineChars="0"/>
+              <w:rPr>
+                <w:rFonts w:ascii="Helvetica" w:hAnsi="Helvetica" w:eastAsia="Helvetica" w:cs="Helvetica"/>
+                <w:i w:val="false"/>
+                <w:b w:val="false"/>
+                <w:u w:val="none"/>
+                <w:strike w:val="false"/>
+                <w:sz w:val="22"/>
+                <w:szCs w:val="22"/>
+                <w:color w:val="000000"/>
               </w:rPr>
             </w:pPr>
             <w:r>
               <w:rPr>
-                <w:rFonts w:ascii="Helvetica" w:eastAsia="Helvetica" w:hAnsi="Helvetica" w:cs="Helvetica"/>
-                <w:color w:val="000000"/>
-                <w:sz w:val="22"/>
-                <w:szCs w:val="22"/>
-              </w:rPr>
-              <w:t>9,308 (20.9%)</w:t>
+                <w:rFonts w:ascii="Helvetica" w:hAnsi="Helvetica" w:eastAsia="Helvetica" w:cs="Helvetica"/>
+                <w:i w:val="false"/>
+                <w:b w:val="false"/>
+                <w:u w:val="none"/>
+                <w:strike w:val="false"/>
+                <w:sz w:val="22"/>
+                <w:szCs w:val="22"/>
+                <w:color w:val="000000"/>
+              </w:rPr>
+              <w:t xml:space="preserve">9,308 (20.9%)</w:t>
             </w:r>
           </w:p>
         </w:tc>
         <w:tc>
           <w:tcPr>
-            <w:tcW w:w="3088" w:type="dxa"/>
             <w:tcBorders>
+              <w:bottom w:val="none" w:sz="0" w:space="0" w:color="000000"/>
               <w:top w:val="none" w:sz="0" w:space="0" w:color="000000"/>
               <w:left w:val="none" w:sz="0" w:space="0" w:color="000000"/>
-              <w:bottom w:val="none" w:sz="0" w:space="0" w:color="000000"/>
               <w:right w:val="none" w:sz="0" w:space="0" w:color="000000"/>
             </w:tcBorders>
             <w:shd w:val="clear" w:color="auto" w:fill="FFFFFF"/>
             <w:tcMar>
               <w:top w:w="0" w:type="dxa"/>
+              <w:bottom w:w="0" w:type="dxa"/>
               <w:left w:w="0" w:type="dxa"/>
-              <w:bottom w:w="0" w:type="dxa"/>
               <w:right w:w="0" w:type="dxa"/>
             </w:tcMar>
+            <w:vAlign w:val="top"/>
           </w:tcPr>
           <w:p>
             <w:pPr>
+              <w:pStyle w:val="Normal"/>
+              <w:jc w:val="center"/>
               <w:pBdr>
+                <w:bottom w:val="none" w:sz="0" w:space="0" w:color="000000"/>
                 <w:top w:val="none" w:sz="0" w:space="0" w:color="000000"/>
                 <w:left w:val="none" w:sz="0" w:space="0" w:color="000000"/>
-                <w:bottom w:val="none" w:sz="0" w:space="0" w:color="000000"/>
                 <w:right w:val="none" w:sz="0" w:space="0" w:color="000000"/>
               </w:pBdr>
-              <w:spacing w:before="100" w:after="100"/>
-              <w:ind w:left="100" w:right="100"/>
-              <w:jc w:val="center"/>
-              <w:rPr>
-                <w:rFonts w:ascii="Helvetica" w:eastAsia="Helvetica" w:hAnsi="Helvetica" w:cs="Helvetica"/>
-                <w:color w:val="000000"/>
-                <w:sz w:val="22"/>
-                <w:szCs w:val="22"/>
+              <w:spacing w:after="100" w:before="100" w:line="240"/>
+              <w:ind w:left="100" w:right="100" w:firstLine="0" w:firstLineChars="0"/>
+              <w:rPr>
+                <w:rFonts w:ascii="Helvetica" w:hAnsi="Helvetica" w:eastAsia="Helvetica" w:cs="Helvetica"/>
+                <w:i w:val="false"/>
+                <w:b w:val="false"/>
+                <w:u w:val="none"/>
+                <w:strike w:val="false"/>
+                <w:sz w:val="22"/>
+                <w:szCs w:val="22"/>
+                <w:color w:val="000000"/>
               </w:rPr>
             </w:pPr>
             <w:r>
               <w:rPr>
-                <w:rFonts w:ascii="Helvetica" w:eastAsia="Helvetica" w:hAnsi="Helvetica" w:cs="Helvetica"/>
-                <w:color w:val="000000"/>
-                <w:sz w:val="22"/>
-                <w:szCs w:val="22"/>
-              </w:rPr>
-              <w:t>4,896 (19.3%)</w:t>
+                <w:rFonts w:ascii="Helvetica" w:hAnsi="Helvetica" w:eastAsia="Helvetica" w:cs="Helvetica"/>
+                <w:i w:val="false"/>
+                <w:b w:val="false"/>
+                <w:u w:val="none"/>
+                <w:strike w:val="false"/>
+                <w:sz w:val="22"/>
+                <w:szCs w:val="22"/>
+                <w:color w:val="000000"/>
+              </w:rPr>
+              <w:t xml:space="preserve">4,896 (19.3%)</w:t>
             </w:r>
           </w:p>
         </w:tc>
       </w:tr>
       <w:tr>
         <w:trPr>
-          <w:jc w:val="center"/>
+          <w:trHeight w:val="616" w:hRule="auto"/>
         </w:trPr>
         <w:tc>
           <w:tcPr>
-            <w:tcW w:w="2576" w:type="dxa"/>
             <w:tcBorders>
+              <w:bottom w:val="none" w:sz="0" w:space="0" w:color="000000"/>
               <w:top w:val="none" w:sz="0" w:space="0" w:color="000000"/>
               <w:left w:val="none" w:sz="0" w:space="0" w:color="000000"/>
-              <w:bottom w:val="none" w:sz="0" w:space="0" w:color="000000"/>
               <w:right w:val="none" w:sz="0" w:space="0" w:color="000000"/>
             </w:tcBorders>
             <w:shd w:val="clear" w:color="auto" w:fill="FFFFFF"/>
             <w:tcMar>
               <w:top w:w="0" w:type="dxa"/>
+              <w:bottom w:w="0" w:type="dxa"/>
               <w:left w:w="0" w:type="dxa"/>
-              <w:bottom w:w="0" w:type="dxa"/>
               <w:right w:w="0" w:type="dxa"/>
             </w:tcMar>
+            <w:vAlign w:val="top"/>
           </w:tcPr>
           <w:p>
             <w:pPr>
+              <w:pStyle w:val="Normal"/>
+              <w:jc w:val="left"/>
               <w:pBdr>
+                <w:bottom w:val="none" w:sz="0" w:space="0" w:color="000000"/>
                 <w:top w:val="none" w:sz="0" w:space="0" w:color="000000"/>
                 <w:left w:val="none" w:sz="0" w:space="0" w:color="000000"/>
-                <w:bottom w:val="none" w:sz="0" w:space="0" w:color="000000"/>
                 <w:right w:val="none" w:sz="0" w:space="0" w:color="000000"/>
               </w:pBdr>
-              <w:spacing w:before="100" w:after="100"/>
-              <w:ind w:left="300" w:right="100"/>
-              <w:rPr>
-                <w:rFonts w:ascii="Helvetica" w:eastAsia="Helvetica" w:hAnsi="Helvetica" w:cs="Helvetica"/>
-                <w:color w:val="000000"/>
-                <w:sz w:val="22"/>
-                <w:szCs w:val="22"/>
+              <w:spacing w:after="100" w:before="100" w:line="240"/>
+              <w:ind w:left="300" w:right="100" w:firstLine="0" w:firstLineChars="0"/>
+              <w:rPr>
+                <w:rFonts w:ascii="Helvetica" w:hAnsi="Helvetica" w:eastAsia="Helvetica" w:cs="Helvetica"/>
+                <w:i w:val="false"/>
+                <w:b w:val="false"/>
+                <w:u w:val="none"/>
+                <w:strike w:val="false"/>
+                <w:sz w:val="22"/>
+                <w:szCs w:val="22"/>
+                <w:color w:val="000000"/>
               </w:rPr>
             </w:pPr>
             <w:r>
               <w:rPr>
-                <w:rFonts w:ascii="Helvetica" w:eastAsia="Helvetica" w:hAnsi="Helvetica" w:cs="Helvetica"/>
-                <w:color w:val="000000"/>
-                <w:sz w:val="22"/>
-                <w:szCs w:val="22"/>
-              </w:rPr>
-              <w:t>ALTO</w:t>
+                <w:rFonts w:ascii="Helvetica" w:hAnsi="Helvetica" w:eastAsia="Helvetica" w:cs="Helvetica"/>
+                <w:i w:val="false"/>
+                <w:b w:val="false"/>
+                <w:u w:val="none"/>
+                <w:strike w:val="false"/>
+                <w:sz w:val="22"/>
+                <w:szCs w:val="22"/>
+                <w:color w:val="000000"/>
+              </w:rPr>
+              <w:t xml:space="preserve">ALTO</w:t>
             </w:r>
           </w:p>
         </w:tc>
         <w:tc>
           <w:tcPr>
-            <w:tcW w:w="3088" w:type="dxa"/>
             <w:tcBorders>
+              <w:bottom w:val="none" w:sz="0" w:space="0" w:color="000000"/>
               <w:top w:val="none" w:sz="0" w:space="0" w:color="000000"/>
               <w:left w:val="none" w:sz="0" w:space="0" w:color="000000"/>
-              <w:bottom w:val="none" w:sz="0" w:space="0" w:color="000000"/>
               <w:right w:val="none" w:sz="0" w:space="0" w:color="000000"/>
             </w:tcBorders>
             <w:shd w:val="clear" w:color="auto" w:fill="FFFFFF"/>
             <w:tcMar>
               <w:top w:w="0" w:type="dxa"/>
+              <w:bottom w:w="0" w:type="dxa"/>
               <w:left w:w="0" w:type="dxa"/>
-              <w:bottom w:w="0" w:type="dxa"/>
               <w:right w:w="0" w:type="dxa"/>
             </w:tcMar>
+            <w:vAlign w:val="top"/>
           </w:tcPr>
           <w:p>
             <w:pPr>
+              <w:pStyle w:val="Normal"/>
+              <w:jc w:val="center"/>
               <w:pBdr>
+                <w:bottom w:val="none" w:sz="0" w:space="0" w:color="000000"/>
                 <w:top w:val="none" w:sz="0" w:space="0" w:color="000000"/>
                 <w:left w:val="none" w:sz="0" w:space="0" w:color="000000"/>
-                <w:bottom w:val="none" w:sz="0" w:space="0" w:color="000000"/>
                 <w:right w:val="none" w:sz="0" w:space="0" w:color="000000"/>
               </w:pBdr>
-              <w:spacing w:before="100" w:after="100"/>
-              <w:ind w:left="100" w:right="100"/>
-              <w:jc w:val="center"/>
-              <w:rPr>
-                <w:rFonts w:ascii="Helvetica" w:eastAsia="Helvetica" w:hAnsi="Helvetica" w:cs="Helvetica"/>
-                <w:color w:val="000000"/>
-                <w:sz w:val="22"/>
-                <w:szCs w:val="22"/>
+              <w:spacing w:after="100" w:before="100" w:line="240"/>
+              <w:ind w:left="100" w:right="100" w:firstLine="0" w:firstLineChars="0"/>
+              <w:rPr>
+                <w:rFonts w:ascii="Helvetica" w:hAnsi="Helvetica" w:eastAsia="Helvetica" w:cs="Helvetica"/>
+                <w:i w:val="false"/>
+                <w:b w:val="false"/>
+                <w:u w:val="none"/>
+                <w:strike w:val="false"/>
+                <w:sz w:val="22"/>
+                <w:szCs w:val="22"/>
+                <w:color w:val="000000"/>
               </w:rPr>
             </w:pPr>
             <w:r>
               <w:rPr>
-                <w:rFonts w:ascii="Helvetica" w:eastAsia="Helvetica" w:hAnsi="Helvetica" w:cs="Helvetica"/>
-                <w:color w:val="000000"/>
-                <w:sz w:val="22"/>
-                <w:szCs w:val="22"/>
-              </w:rPr>
-              <w:t>13,409 (19.2%)</w:t>
+                <w:rFonts w:ascii="Helvetica" w:hAnsi="Helvetica" w:eastAsia="Helvetica" w:cs="Helvetica"/>
+                <w:i w:val="false"/>
+                <w:b w:val="false"/>
+                <w:u w:val="none"/>
+                <w:strike w:val="false"/>
+                <w:sz w:val="22"/>
+                <w:szCs w:val="22"/>
+                <w:color w:val="000000"/>
+              </w:rPr>
+              <w:t xml:space="preserve">13,409 (19.2%)</w:t>
             </w:r>
           </w:p>
         </w:tc>
         <w:tc>
           <w:tcPr>
-            <w:tcW w:w="3088" w:type="dxa"/>
             <w:tcBorders>
+              <w:bottom w:val="none" w:sz="0" w:space="0" w:color="000000"/>
               <w:top w:val="none" w:sz="0" w:space="0" w:color="000000"/>
               <w:left w:val="none" w:sz="0" w:space="0" w:color="000000"/>
-              <w:bottom w:val="none" w:sz="0" w:space="0" w:color="000000"/>
               <w:right w:val="none" w:sz="0" w:space="0" w:color="000000"/>
             </w:tcBorders>
             <w:shd w:val="clear" w:color="auto" w:fill="FFFFFF"/>
             <w:tcMar>
               <w:top w:w="0" w:type="dxa"/>
+              <w:bottom w:w="0" w:type="dxa"/>
               <w:left w:w="0" w:type="dxa"/>
-              <w:bottom w:w="0" w:type="dxa"/>
               <w:right w:w="0" w:type="dxa"/>
             </w:tcMar>
+            <w:vAlign w:val="top"/>
           </w:tcPr>
           <w:p>
             <w:pPr>
+              <w:pStyle w:val="Normal"/>
+              <w:jc w:val="center"/>
               <w:pBdr>
+                <w:bottom w:val="none" w:sz="0" w:space="0" w:color="000000"/>
                 <w:top w:val="none" w:sz="0" w:space="0" w:color="000000"/>
                 <w:left w:val="none" w:sz="0" w:space="0" w:color="000000"/>
-                <w:bottom w:val="none" w:sz="0" w:space="0" w:color="000000"/>
                 <w:right w:val="none" w:sz="0" w:space="0" w:color="000000"/>
               </w:pBdr>
-              <w:spacing w:before="100" w:after="100"/>
-              <w:ind w:left="100" w:right="100"/>
-              <w:jc w:val="center"/>
-              <w:rPr>
-                <w:rFonts w:ascii="Helvetica" w:eastAsia="Helvetica" w:hAnsi="Helvetica" w:cs="Helvetica"/>
-                <w:color w:val="000000"/>
-                <w:sz w:val="22"/>
-                <w:szCs w:val="22"/>
+              <w:spacing w:after="100" w:before="100" w:line="240"/>
+              <w:ind w:left="100" w:right="100" w:firstLine="0" w:firstLineChars="0"/>
+              <w:rPr>
+                <w:rFonts w:ascii="Helvetica" w:hAnsi="Helvetica" w:eastAsia="Helvetica" w:cs="Helvetica"/>
+                <w:i w:val="false"/>
+                <w:b w:val="false"/>
+                <w:u w:val="none"/>
+                <w:strike w:val="false"/>
+                <w:sz w:val="22"/>
+                <w:szCs w:val="22"/>
+                <w:color w:val="000000"/>
               </w:rPr>
             </w:pPr>
             <w:r>
               <w:rPr>
-                <w:rFonts w:ascii="Helvetica" w:eastAsia="Helvetica" w:hAnsi="Helvetica" w:cs="Helvetica"/>
-                <w:color w:val="000000"/>
-                <w:sz w:val="22"/>
-                <w:szCs w:val="22"/>
-              </w:rPr>
-              <w:t>9,073 (20.4%)</w:t>
+                <w:rFonts w:ascii="Helvetica" w:hAnsi="Helvetica" w:eastAsia="Helvetica" w:cs="Helvetica"/>
+                <w:i w:val="false"/>
+                <w:b w:val="false"/>
+                <w:u w:val="none"/>
+                <w:strike w:val="false"/>
+                <w:sz w:val="22"/>
+                <w:szCs w:val="22"/>
+                <w:color w:val="000000"/>
+              </w:rPr>
+              <w:t xml:space="preserve">9,073 (20.4%)</w:t>
             </w:r>
           </w:p>
         </w:tc>
         <w:tc>
           <w:tcPr>
-            <w:tcW w:w="3088" w:type="dxa"/>
             <w:tcBorders>
+              <w:bottom w:val="none" w:sz="0" w:space="0" w:color="000000"/>
               <w:top w:val="none" w:sz="0" w:space="0" w:color="000000"/>
               <w:left w:val="none" w:sz="0" w:space="0" w:color="000000"/>
-              <w:bottom w:val="none" w:sz="0" w:space="0" w:color="000000"/>
               <w:right w:val="none" w:sz="0" w:space="0" w:color="000000"/>
             </w:tcBorders>
             <w:shd w:val="clear" w:color="auto" w:fill="FFFFFF"/>
             <w:tcMar>
               <w:top w:w="0" w:type="dxa"/>
+              <w:bottom w:w="0" w:type="dxa"/>
               <w:left w:w="0" w:type="dxa"/>
-              <w:bottom w:w="0" w:type="dxa"/>
               <w:right w:w="0" w:type="dxa"/>
             </w:tcMar>
+            <w:vAlign w:val="top"/>
           </w:tcPr>
           <w:p>
             <w:pPr>
+              <w:pStyle w:val="Normal"/>
+              <w:jc w:val="center"/>
               <w:pBdr>
+                <w:bottom w:val="none" w:sz="0" w:space="0" w:color="000000"/>
                 <w:top w:val="none" w:sz="0" w:space="0" w:color="000000"/>
                 <w:left w:val="none" w:sz="0" w:space="0" w:color="000000"/>
-                <w:bottom w:val="none" w:sz="0" w:space="0" w:color="000000"/>
                 <w:right w:val="none" w:sz="0" w:space="0" w:color="000000"/>
               </w:pBdr>
-              <w:spacing w:before="100" w:after="100"/>
-              <w:ind w:left="100" w:right="100"/>
-              <w:jc w:val="center"/>
-              <w:rPr>
-                <w:rFonts w:ascii="Helvetica" w:eastAsia="Helvetica" w:hAnsi="Helvetica" w:cs="Helvetica"/>
-                <w:color w:val="000000"/>
-                <w:sz w:val="22"/>
-                <w:szCs w:val="22"/>
+              <w:spacing w:after="100" w:before="100" w:line="240"/>
+              <w:ind w:left="100" w:right="100" w:firstLine="0" w:firstLineChars="0"/>
+              <w:rPr>
+                <w:rFonts w:ascii="Helvetica" w:hAnsi="Helvetica" w:eastAsia="Helvetica" w:cs="Helvetica"/>
+                <w:i w:val="false"/>
+                <w:b w:val="false"/>
+                <w:u w:val="none"/>
+                <w:strike w:val="false"/>
+                <w:sz w:val="22"/>
+                <w:szCs w:val="22"/>
+                <w:color w:val="000000"/>
               </w:rPr>
             </w:pPr>
             <w:r>
               <w:rPr>
-                <w:rFonts w:ascii="Helvetica" w:eastAsia="Helvetica" w:hAnsi="Helvetica" w:cs="Helvetica"/>
-                <w:color w:val="000000"/>
-                <w:sz w:val="22"/>
-                <w:szCs w:val="22"/>
-              </w:rPr>
-              <w:t>4,336 (17.1%)</w:t>
+                <w:rFonts w:ascii="Helvetica" w:hAnsi="Helvetica" w:eastAsia="Helvetica" w:cs="Helvetica"/>
+                <w:i w:val="false"/>
+                <w:b w:val="false"/>
+                <w:u w:val="none"/>
+                <w:strike w:val="false"/>
+                <w:sz w:val="22"/>
+                <w:szCs w:val="22"/>
+                <w:color w:val="000000"/>
+              </w:rPr>
+              <w:t xml:space="preserve">4,336 (17.1%)</w:t>
             </w:r>
           </w:p>
         </w:tc>
       </w:tr>
       <w:tr>
         <w:trPr>
-          <w:jc w:val="center"/>
+          <w:trHeight w:val="616" w:hRule="auto"/>
         </w:trPr>
         <w:tc>
           <w:tcPr>
-            <w:tcW w:w="2576" w:type="dxa"/>
             <w:tcBorders>
+              <w:bottom w:val="single" w:sz="8" w:space="0" w:color="000000"/>
               <w:top w:val="none" w:sz="0" w:space="0" w:color="000000"/>
               <w:left w:val="none" w:sz="0" w:space="0" w:color="000000"/>
-              <w:bottom w:val="single" w:sz="8" w:space="0" w:color="000000"/>
               <w:right w:val="none" w:sz="0" w:space="0" w:color="000000"/>
             </w:tcBorders>
             <w:shd w:val="clear" w:color="auto" w:fill="FFFFFF"/>
             <w:tcMar>
               <w:top w:w="0" w:type="dxa"/>
+              <w:bottom w:w="0" w:type="dxa"/>
               <w:left w:w="0" w:type="dxa"/>
-              <w:bottom w:w="0" w:type="dxa"/>
               <w:right w:w="0" w:type="dxa"/>
             </w:tcMar>
+            <w:vAlign w:val="top"/>
           </w:tcPr>
           <w:p>
             <w:pPr>
+              <w:pStyle w:val="Normal"/>
+              <w:jc w:val="left"/>
               <w:pBdr>
+                <w:bottom w:val="none" w:sz="0" w:space="0" w:color="000000"/>
                 <w:top w:val="none" w:sz="0" w:space="0" w:color="000000"/>
                 <w:left w:val="none" w:sz="0" w:space="0" w:color="000000"/>
-                <w:bottom w:val="none" w:sz="0" w:space="0" w:color="000000"/>
                 <w:right w:val="none" w:sz="0" w:space="0" w:color="000000"/>
               </w:pBdr>
-              <w:spacing w:before="100" w:after="100"/>
-              <w:ind w:left="300" w:right="100"/>
-              <w:rPr>
-                <w:rFonts w:ascii="Helvetica" w:eastAsia="Helvetica" w:hAnsi="Helvetica" w:cs="Helvetica"/>
-                <w:color w:val="000000"/>
-                <w:sz w:val="22"/>
-                <w:szCs w:val="22"/>
+              <w:spacing w:after="100" w:before="100" w:line="240"/>
+              <w:ind w:left="300" w:right="100" w:firstLine="0" w:firstLineChars="0"/>
+              <w:rPr>
+                <w:rFonts w:ascii="Helvetica" w:hAnsi="Helvetica" w:eastAsia="Helvetica" w:cs="Helvetica"/>
+                <w:i w:val="false"/>
+                <w:b w:val="false"/>
+                <w:u w:val="none"/>
+                <w:strike w:val="false"/>
+                <w:sz w:val="22"/>
+                <w:szCs w:val="22"/>
+                <w:color w:val="000000"/>
               </w:rPr>
             </w:pPr>
             <w:r>
               <w:rPr>
-                <w:rFonts w:ascii="Helvetica" w:eastAsia="Helvetica" w:hAnsi="Helvetica" w:cs="Helvetica"/>
-                <w:color w:val="000000"/>
-                <w:sz w:val="22"/>
-                <w:szCs w:val="22"/>
-              </w:rPr>
-              <w:t>MUY ALTO</w:t>
+                <w:rFonts w:ascii="Helvetica" w:hAnsi="Helvetica" w:eastAsia="Helvetica" w:cs="Helvetica"/>
+                <w:i w:val="false"/>
+                <w:b w:val="false"/>
+                <w:u w:val="none"/>
+                <w:strike w:val="false"/>
+                <w:sz w:val="22"/>
+                <w:szCs w:val="22"/>
+                <w:color w:val="000000"/>
+              </w:rPr>
+              <w:t xml:space="preserve">MUY ALTO</w:t>
             </w:r>
           </w:p>
         </w:tc>
         <w:tc>
           <w:tcPr>
-            <w:tcW w:w="3088" w:type="dxa"/>
             <w:tcBorders>
+              <w:bottom w:val="single" w:sz="8" w:space="0" w:color="000000"/>
               <w:top w:val="none" w:sz="0" w:space="0" w:color="000000"/>
               <w:left w:val="none" w:sz="0" w:space="0" w:color="000000"/>
-              <w:bottom w:val="single" w:sz="8" w:space="0" w:color="000000"/>
               <w:right w:val="none" w:sz="0" w:space="0" w:color="000000"/>
             </w:tcBorders>
             <w:shd w:val="clear" w:color="auto" w:fill="FFFFFF"/>
             <w:tcMar>
               <w:top w:w="0" w:type="dxa"/>
+              <w:bottom w:w="0" w:type="dxa"/>
               <w:left w:w="0" w:type="dxa"/>
-              <w:bottom w:w="0" w:type="dxa"/>
               <w:right w:w="0" w:type="dxa"/>
             </w:tcMar>
+            <w:vAlign w:val="top"/>
           </w:tcPr>
           <w:p>
             <w:pPr>
+              <w:pStyle w:val="Normal"/>
+              <w:jc w:val="center"/>
               <w:pBdr>
+                <w:bottom w:val="none" w:sz="0" w:space="0" w:color="000000"/>
                 <w:top w:val="none" w:sz="0" w:space="0" w:color="000000"/>
                 <w:left w:val="none" w:sz="0" w:space="0" w:color="000000"/>
-                <w:bottom w:val="none" w:sz="0" w:space="0" w:color="000000"/>
                 <w:right w:val="none" w:sz="0" w:space="0" w:color="000000"/>
               </w:pBdr>
-              <w:spacing w:before="100" w:after="100"/>
-              <w:ind w:left="100" w:right="100"/>
-              <w:jc w:val="center"/>
-              <w:rPr>
-                <w:rFonts w:ascii="Helvetica" w:eastAsia="Helvetica" w:hAnsi="Helvetica" w:cs="Helvetica"/>
-                <w:color w:val="000000"/>
-                <w:sz w:val="22"/>
-                <w:szCs w:val="22"/>
+              <w:spacing w:after="100" w:before="100" w:line="240"/>
+              <w:ind w:left="100" w:right="100" w:firstLine="0" w:firstLineChars="0"/>
+              <w:rPr>
+                <w:rFonts w:ascii="Helvetica" w:hAnsi="Helvetica" w:eastAsia="Helvetica" w:cs="Helvetica"/>
+                <w:i w:val="false"/>
+                <w:b w:val="false"/>
+                <w:u w:val="none"/>
+                <w:strike w:val="false"/>
+                <w:sz w:val="22"/>
+                <w:szCs w:val="22"/>
+                <w:color w:val="000000"/>
               </w:rPr>
             </w:pPr>
             <w:r>
               <w:rPr>
-                <w:rFonts w:ascii="Helvetica" w:eastAsia="Helvetica" w:hAnsi="Helvetica" w:cs="Helvetica"/>
-                <w:color w:val="000000"/>
-                <w:sz w:val="22"/>
-                <w:szCs w:val="22"/>
-              </w:rPr>
-              <w:t>12,681 (18.2%)</w:t>
+                <w:rFonts w:ascii="Helvetica" w:hAnsi="Helvetica" w:eastAsia="Helvetica" w:cs="Helvetica"/>
+                <w:i w:val="false"/>
+                <w:b w:val="false"/>
+                <w:u w:val="none"/>
+                <w:strike w:val="false"/>
+                <w:sz w:val="22"/>
+                <w:szCs w:val="22"/>
+                <w:color w:val="000000"/>
+              </w:rPr>
+              <w:t xml:space="preserve">12,681 (18.2%)</w:t>
             </w:r>
           </w:p>
         </w:tc>
         <w:tc>
           <w:tcPr>
-            <w:tcW w:w="3088" w:type="dxa"/>
             <w:tcBorders>
+              <w:bottom w:val="single" w:sz="8" w:space="0" w:color="000000"/>
               <w:top w:val="none" w:sz="0" w:space="0" w:color="000000"/>
               <w:left w:val="none" w:sz="0" w:space="0" w:color="000000"/>
-              <w:bottom w:val="single" w:sz="8" w:space="0" w:color="000000"/>
               <w:right w:val="none" w:sz="0" w:space="0" w:color="000000"/>
             </w:tcBorders>
             <w:shd w:val="clear" w:color="auto" w:fill="FFFFFF"/>
             <w:tcMar>
               <w:top w:w="0" w:type="dxa"/>
+              <w:bottom w:w="0" w:type="dxa"/>
               <w:left w:w="0" w:type="dxa"/>
-              <w:bottom w:w="0" w:type="dxa"/>
               <w:right w:w="0" w:type="dxa"/>
             </w:tcMar>
+            <w:vAlign w:val="top"/>
           </w:tcPr>
           <w:p>
             <w:pPr>
+              <w:pStyle w:val="Normal"/>
+              <w:jc w:val="center"/>
               <w:pBdr>
+                <w:bottom w:val="none" w:sz="0" w:space="0" w:color="000000"/>
                 <w:top w:val="none" w:sz="0" w:space="0" w:color="000000"/>
                 <w:left w:val="none" w:sz="0" w:space="0" w:color="000000"/>
-                <w:bottom w:val="none" w:sz="0" w:space="0" w:color="000000"/>
                 <w:right w:val="none" w:sz="0" w:space="0" w:color="000000"/>
               </w:pBdr>
-              <w:spacing w:before="100" w:after="100"/>
-              <w:ind w:left="100" w:right="100"/>
-              <w:jc w:val="center"/>
-              <w:rPr>
-                <w:rFonts w:ascii="Helvetica" w:eastAsia="Helvetica" w:hAnsi="Helvetica" w:cs="Helvetica"/>
-                <w:color w:val="000000"/>
-                <w:sz w:val="22"/>
-                <w:szCs w:val="22"/>
+              <w:spacing w:after="100" w:before="100" w:line="240"/>
+              <w:ind w:left="100" w:right="100" w:firstLine="0" w:firstLineChars="0"/>
+              <w:rPr>
+                <w:rFonts w:ascii="Helvetica" w:hAnsi="Helvetica" w:eastAsia="Helvetica" w:cs="Helvetica"/>
+                <w:i w:val="false"/>
+                <w:b w:val="false"/>
+                <w:u w:val="none"/>
+                <w:strike w:val="false"/>
+                <w:sz w:val="22"/>
+                <w:szCs w:val="22"/>
+                <w:color w:val="000000"/>
               </w:rPr>
             </w:pPr>
             <w:r>
               <w:rPr>
-                <w:rFonts w:ascii="Helvetica" w:eastAsia="Helvetica" w:hAnsi="Helvetica" w:cs="Helvetica"/>
-                <w:color w:val="000000"/>
-                <w:sz w:val="22"/>
-                <w:szCs w:val="22"/>
-              </w:rPr>
-              <w:t>8,390 (18.9%)</w:t>
+                <w:rFonts w:ascii="Helvetica" w:hAnsi="Helvetica" w:eastAsia="Helvetica" w:cs="Helvetica"/>
+                <w:i w:val="false"/>
+                <w:b w:val="false"/>
+                <w:u w:val="none"/>
+                <w:strike w:val="false"/>
+                <w:sz w:val="22"/>
+                <w:szCs w:val="22"/>
+                <w:color w:val="000000"/>
+              </w:rPr>
+              <w:t xml:space="preserve">8,390 (18.9%)</w:t>
             </w:r>
           </w:p>
         </w:tc>
         <w:tc>
           <w:tcPr>
-            <w:tcW w:w="3088" w:type="dxa"/>
             <w:tcBorders>
+              <w:bottom w:val="single" w:sz="8" w:space="0" w:color="000000"/>
               <w:top w:val="none" w:sz="0" w:space="0" w:color="000000"/>
               <w:left w:val="none" w:sz="0" w:space="0" w:color="000000"/>
-              <w:bottom w:val="single" w:sz="8" w:space="0" w:color="000000"/>
               <w:right w:val="none" w:sz="0" w:space="0" w:color="000000"/>
             </w:tcBorders>
             <w:shd w:val="clear" w:color="auto" w:fill="FFFFFF"/>
             <w:tcMar>
               <w:top w:w="0" w:type="dxa"/>
+              <w:bottom w:w="0" w:type="dxa"/>
               <w:left w:w="0" w:type="dxa"/>
-              <w:bottom w:w="0" w:type="dxa"/>
               <w:right w:w="0" w:type="dxa"/>
             </w:tcMar>
+            <w:vAlign w:val="top"/>
           </w:tcPr>
           <w:p>
             <w:pPr>
+              <w:pStyle w:val="Normal"/>
+              <w:jc w:val="center"/>
               <w:pBdr>
+                <w:bottom w:val="none" w:sz="0" w:space="0" w:color="000000"/>
                 <w:top w:val="none" w:sz="0" w:space="0" w:color="000000"/>
                 <w:left w:val="none" w:sz="0" w:space="0" w:color="000000"/>
-                <w:bottom w:val="none" w:sz="0" w:space="0" w:color="000000"/>
                 <w:right w:val="none" w:sz="0" w:space="0" w:color="000000"/>
               </w:pBdr>
-              <w:spacing w:before="100" w:after="100"/>
-              <w:ind w:left="100" w:right="100"/>
-              <w:jc w:val="center"/>
-              <w:rPr>
-                <w:rFonts w:ascii="Helvetica" w:eastAsia="Helvetica" w:hAnsi="Helvetica" w:cs="Helvetica"/>
-                <w:color w:val="000000"/>
-                <w:sz w:val="22"/>
-                <w:szCs w:val="22"/>
+              <w:spacing w:after="100" w:before="100" w:line="240"/>
+              <w:ind w:left="100" w:right="100" w:firstLine="0" w:firstLineChars="0"/>
+              <w:rPr>
+                <w:rFonts w:ascii="Helvetica" w:hAnsi="Helvetica" w:eastAsia="Helvetica" w:cs="Helvetica"/>
+                <w:i w:val="false"/>
+                <w:b w:val="false"/>
+                <w:u w:val="none"/>
+                <w:strike w:val="false"/>
+                <w:sz w:val="22"/>
+                <w:szCs w:val="22"/>
+                <w:color w:val="000000"/>
               </w:rPr>
             </w:pPr>
             <w:r>
               <w:rPr>
-                <w:rFonts w:ascii="Helvetica" w:eastAsia="Helvetica" w:hAnsi="Helvetica" w:cs="Helvetica"/>
-                <w:color w:val="000000"/>
-                <w:sz w:val="22"/>
-                <w:szCs w:val="22"/>
-              </w:rPr>
-              <w:t>4,291 (16.9%)</w:t>
+                <w:rFonts w:ascii="Helvetica" w:hAnsi="Helvetica" w:eastAsia="Helvetica" w:cs="Helvetica"/>
+                <w:i w:val="false"/>
+                <w:b w:val="false"/>
+                <w:u w:val="none"/>
+                <w:strike w:val="false"/>
+                <w:sz w:val="22"/>
+                <w:szCs w:val="22"/>
+                <w:color w:val="000000"/>
+              </w:rPr>
+              <w:t xml:space="preserve">4,291 (16.9%)</w:t>
             </w:r>
           </w:p>
         </w:tc>
       </w:tr>
       <w:tr>
         <w:trPr>
-          <w:jc w:val="center"/>
+          <w:trHeight w:val="360" w:hRule="auto"/>
         </w:trPr>
         <w:tc>
           <w:tcPr>
-            <w:tcW w:w="11840" w:type="dxa"/>
             <w:gridSpan w:val="4"/>
             <w:tcBorders>
+              <w:bottom w:val="none" w:sz="0" w:space="0" w:color="FFFFFF"/>
               <w:top w:val="single" w:sz="8" w:space="0" w:color="000000"/>
               <w:left w:val="none" w:sz="0" w:space="0" w:color="FFFFFF"/>
-              <w:bottom w:val="none" w:sz="0" w:space="0" w:color="FFFFFF"/>
               <w:right w:val="none" w:sz="0" w:space="0" w:color="FFFFFF"/>
             </w:tcBorders>
             <w:shd w:val="clear" w:color="auto" w:fill="FFFFFF"/>
             <w:tcMar>
               <w:top w:w="0" w:type="dxa"/>
+              <w:bottom w:w="0" w:type="dxa"/>
               <w:left w:w="0" w:type="dxa"/>
-              <w:bottom w:w="0" w:type="dxa"/>
               <w:right w:w="0" w:type="dxa"/>
             </w:tcMar>
             <w:vAlign w:val="center"/>
           </w:tcPr>
           <w:p>
             <w:pPr>
+              <w:pStyle w:val="Normal"/>
+              <w:jc w:val="left"/>
               <w:pBdr>
+                <w:bottom w:val="none" w:sz="0" w:space="0" w:color="000000"/>
                 <w:top w:val="none" w:sz="0" w:space="0" w:color="000000"/>
                 <w:left w:val="none" w:sz="0" w:space="0" w:color="000000"/>
-                <w:bottom w:val="none" w:sz="0" w:space="0" w:color="000000"/>
                 <w:right w:val="none" w:sz="0" w:space="0" w:color="000000"/>
               </w:pBdr>
-              <w:spacing w:before="100" w:after="100"/>
-              <w:ind w:left="100" w:right="100"/>
-              <w:rPr>
-                <w:rFonts w:ascii="Helvetica" w:eastAsia="Helvetica" w:hAnsi="Helvetica" w:cs="Helvetica"/>
-                <w:color w:val="000000"/>
-                <w:sz w:val="22"/>
-                <w:szCs w:val="22"/>
+              <w:spacing w:after="100" w:before="100" w:line="240"/>
+              <w:ind w:left="100" w:right="100" w:firstLine="0" w:firstLineChars="0"/>
+              <w:rPr>
+                <w:rFonts w:ascii="Helvetica" w:hAnsi="Helvetica" w:eastAsia="Helvetica" w:cs="Helvetica"/>
+                <w:i w:val="false"/>
+                <w:b w:val="false"/>
+                <w:u w:val="none"/>
+                <w:strike w:val="false"/>
+                <w:sz w:val="22"/>
+                <w:szCs w:val="22"/>
+                <w:color w:val="000000"/>
               </w:rPr>
             </w:pPr>
             <w:r>
               <w:rPr>
-                <w:rFonts w:ascii="Helvetica" w:eastAsia="Helvetica" w:hAnsi="Helvetica" w:cs="Helvetica"/>
-                <w:color w:val="000000"/>
-                <w:sz w:val="22"/>
-                <w:szCs w:val="22"/>
+                <w:rFonts w:ascii="Helvetica" w:hAnsi="Helvetica" w:eastAsia="Helvetica" w:cs="Helvetica"/>
+                <w:i w:val="false"/>
+                <w:b w:val="false"/>
+                <w:u w:val="none"/>
+                <w:strike w:val="false"/>
                 <w:vertAlign w:val="superscript"/>
-              </w:rPr>
-              <w:t>1</w:t>
-            </w:r>
-            <w:r>
-              <w:rPr>
-                <w:rFonts w:ascii="Helvetica" w:eastAsia="Helvetica" w:hAnsi="Helvetica" w:cs="Helvetica"/>
-                <w:color w:val="000000"/>
-                <w:sz w:val="22"/>
-                <w:szCs w:val="22"/>
-              </w:rPr>
-              <w:t xml:space="preserve">n (%); Media ± DE. CPO-D: </w:t>
-            </w:r>
-            <w:proofErr w:type="spellStart"/>
-            <w:r>
-              <w:rPr>
-                <w:rFonts w:ascii="Helvetica" w:eastAsia="Helvetica" w:hAnsi="Helvetica" w:cs="Helvetica"/>
-                <w:color w:val="000000"/>
-                <w:sz w:val="22"/>
-                <w:szCs w:val="22"/>
-              </w:rPr>
-              <w:t>Cariados</w:t>
-            </w:r>
-            <w:proofErr w:type="spellEnd"/>
-            <w:r>
-              <w:rPr>
-                <w:rFonts w:ascii="Helvetica" w:eastAsia="Helvetica" w:hAnsi="Helvetica" w:cs="Helvetica"/>
-                <w:color w:val="000000"/>
-                <w:sz w:val="22"/>
-                <w:szCs w:val="22"/>
-              </w:rPr>
-              <w:t xml:space="preserve">, </w:t>
-            </w:r>
-            <w:proofErr w:type="spellStart"/>
-            <w:r>
-              <w:rPr>
-                <w:rFonts w:ascii="Helvetica" w:eastAsia="Helvetica" w:hAnsi="Helvetica" w:cs="Helvetica"/>
-                <w:color w:val="000000"/>
-                <w:sz w:val="22"/>
-                <w:szCs w:val="22"/>
-              </w:rPr>
-              <w:t>Perdidos</w:t>
-            </w:r>
-            <w:proofErr w:type="spellEnd"/>
-            <w:r>
-              <w:rPr>
-                <w:rFonts w:ascii="Helvetica" w:eastAsia="Helvetica" w:hAnsi="Helvetica" w:cs="Helvetica"/>
-                <w:color w:val="000000"/>
-                <w:sz w:val="22"/>
-                <w:szCs w:val="22"/>
-              </w:rPr>
-              <w:t xml:space="preserve">, </w:t>
-            </w:r>
-            <w:proofErr w:type="spellStart"/>
-            <w:r>
-              <w:rPr>
-                <w:rFonts w:ascii="Helvetica" w:eastAsia="Helvetica" w:hAnsi="Helvetica" w:cs="Helvetica"/>
-                <w:color w:val="000000"/>
-                <w:sz w:val="22"/>
-                <w:szCs w:val="22"/>
-              </w:rPr>
-              <w:t>Obturados</w:t>
-            </w:r>
-            <w:proofErr w:type="spellEnd"/>
-            <w:r>
-              <w:rPr>
-                <w:rFonts w:ascii="Helvetica" w:eastAsia="Helvetica" w:hAnsi="Helvetica" w:cs="Helvetica"/>
-                <w:color w:val="000000"/>
-                <w:sz w:val="22"/>
-                <w:szCs w:val="22"/>
-              </w:rPr>
-              <w:t xml:space="preserve"> - </w:t>
-            </w:r>
-            <w:proofErr w:type="spellStart"/>
-            <w:r>
-              <w:rPr>
-                <w:rFonts w:ascii="Helvetica" w:eastAsia="Helvetica" w:hAnsi="Helvetica" w:cs="Helvetica"/>
-                <w:color w:val="000000"/>
-                <w:sz w:val="22"/>
-                <w:szCs w:val="22"/>
-              </w:rPr>
-              <w:t>Dientes</w:t>
-            </w:r>
-            <w:proofErr w:type="spellEnd"/>
-            <w:r>
-              <w:rPr>
-                <w:rFonts w:ascii="Helvetica" w:eastAsia="Helvetica" w:hAnsi="Helvetica" w:cs="Helvetica"/>
-                <w:color w:val="000000"/>
-                <w:sz w:val="22"/>
-                <w:szCs w:val="22"/>
-              </w:rPr>
-              <w:t>.</w:t>
+                <w:sz w:val="22"/>
+                <w:szCs w:val="22"/>
+                <w:color w:val="000000"/>
+              </w:rPr>
+              <w:t xml:space="preserve">1</w:t>
+            </w:r>
+            <w:r>
+              <w:rPr>
+                <w:rFonts w:ascii="Helvetica" w:hAnsi="Helvetica" w:eastAsia="Helvetica" w:cs="Helvetica"/>
+                <w:i w:val="false"/>
+                <w:b w:val="false"/>
+                <w:u w:val="none"/>
+                <w:strike w:val="false"/>
+                <w:sz w:val="22"/>
+                <w:szCs w:val="22"/>
+                <w:color w:val="000000"/>
+              </w:rPr>
+              <w:t xml:space="preserve">n (%); Media ± DE. CPO-D: Cariados, Perdidos, Obturados - Dientes.</w:t>
             </w:r>
           </w:p>
         </w:tc>
       </w:tr>
     </w:tbl>
-    <w:p/>
     <w:sectPr>
+      <w:pgMar w:header="708" w:bottom="1417" w:top="1417" w:right="1417" w:left="1417" w:footer="708" w:gutter="0"/>
+      <w:pgSz w:h="16838" w:w="11906" w:orient="portrait"/>
       <w:type w:val="continuous"/>
-      <w:pgSz w:w="16838" w:h="11906" w:orient="landscape"/>
-      <w:pgMar w:top="1417" w:right="1417" w:bottom="1417" w:left="1417" w:header="708" w:footer="708" w:gutter="0"/>
-      <w:cols w:space="720"/>
-      <w:docGrid w:linePitch="326"/>
+      <w:cols/>
     </w:sectPr>
   </w:body>
 </w:document>
 </file>
 
+<file path=word/comments.xml><?xml version="1.0" encoding="utf-8"?>
+<w:comments xmlns:wpc="http://schemas.microsoft.com/office/word/2010/wordprocessingCanvas" xmlns:mo="http://schemas.microsoft.com/office/mac/office/2008/main" xmlns:mc="http://schemas.openxmlformats.org/markup-compatibility/2006" xmlns:mv="urn:schemas-microsoft-com:mac:vml" xmlns:o="urn:schemas-microsoft-com:office:office" xmlns:r="http://schemas.openxmlformats.org/officeDocument/2006/relationships" xmlns:m="http://schemas.openxmlformats.org/officeDocument/2006/math" xmlns:v="urn:schemas-microsoft-com:vml" xmlns:wp14="http://schemas.microsoft.com/office/word/2010/wordprocessingDrawing" xmlns:wp="http://schemas.openxmlformats.org/drawingml/2006/wordprocessingDrawing" xmlns:w10="urn:schemas-microsoft-com:office:word" xmlns:w="http://schemas.openxmlformats.org/wordprocessingml/2006/main" xmlns:w14="http://schemas.microsoft.com/office/word/2010/wordml" xmlns:wpg="http://schemas.microsoft.com/office/word/2010/wordprocessingGroup" xmlns:wpi="http://schemas.microsoft.com/office/word/2010/wordprocessingInk" xmlns:wne="http://schemas.microsoft.com/office/word/2006/wordml" xmlns:wps="http://schemas.microsoft.com/office/word/2010/wordprocessingShape" mc:Ignorable="w14 wp14">
+</w:comments>
+</file>
+
+<file path=word/footnotes.xml><?xml version="1.0" encoding="utf-8"?>
+<w:footnotes xmlns:wpc="http://schemas.microsoft.com/office/word/2010/wordprocessingCanvas" xmlns:mo="http://schemas.microsoft.com/office/mac/office/2008/main" xmlns:mc="http://schemas.openxmlformats.org/markup-compatibility/2006" xmlns:mv="urn:schemas-microsoft-com:mac:vml" xmlns:o="urn:schemas-microsoft-com:office:office" xmlns:r="http://schemas.openxmlformats.org/officeDocument/2006/relationships" xmlns:m="http://schemas.openxmlformats.org/officeDocument/2006/math" xmlns:v="urn:schemas-microsoft-com:vml" xmlns:wp14="http://schemas.microsoft.com/office/word/2010/wordprocessingDrawing" xmlns:wp="http://schemas.openxmlformats.org/drawingml/2006/wordprocessingDrawing" xmlns:w10="urn:schemas-microsoft-com:office:word" xmlns:w="http://schemas.openxmlformats.org/wordprocessingml/2006/main" xmlns:w14="http://schemas.microsoft.com/office/word/2010/wordml" xmlns:wpg="http://schemas.microsoft.com/office/word/2010/wordprocessingGroup" xmlns:wpi="http://schemas.microsoft.com/office/word/2010/wordprocessingInk" xmlns:wne="http://schemas.microsoft.com/office/word/2006/wordml" xmlns:wps="http://schemas.microsoft.com/office/word/2010/wordprocessingShape" mc:Ignorable="w14 wp14">
+  <w:footnote w:type="separator" w:id="-1">
+    <w:p>
+      <w:r>
+        <w:separator/>
+      </w:r>
+    </w:p>
+  </w:footnote>
+  <w:footnote w:type="continuationSeparator" w:id="0">
+    <w:p>
+      <w:r>
+        <w:continuationSeparator/>
+      </w:r>
+    </w:p>
+  </w:footnote>
+</w:footnotes>
+</file>
+
 <file path=word/numbering.xml><?xml version="1.0" encoding="utf-8"?>
-<w:numbering xmlns:wpc="http://schemas.microsoft.com/office/word/2010/wordprocessingCanvas" xmlns:cx="http://schemas.microsoft.com/office/drawing/2014/chartex" xmlns:cx1="http://schemas.microsoft.com/office/drawing/2015/9/8/chartex" xmlns:cx2="http://schemas.microsoft.com/office/drawing/2015/10/21/chartex" xmlns:cx3="http://schemas.microsoft.com/office/drawing/2016/5/9/chartex" xmlns:cx4="http://schemas.microsoft.com/office/drawing/2016/5/10/chartex" xmlns:cx5="http://schemas.microsoft.com/office/drawing/2016/5/11/chartex" xmlns:cx6="http://schemas.microsoft.com/office/drawing/2016/5/12/chartex" xmlns:cx7="http://schemas.microsoft.com/office/drawing/2016/5/13/chartex" xmlns:cx8="http://schemas.microsoft.com/office/drawing/2016/5/14/chartex" xmlns:mc="http://schemas.openxmlformats.org/markup-compatibility/2006" xmlns:aink="http://schemas.microsoft.com/office/drawing/2016/ink" xmlns:am3d="http://schemas.microsoft.com/office/drawing/2017/model3d" xmlns:o="urn:schemas-microsoft-com:office:office" xmlns:oel="http://schemas.microsoft.com/office/2019/extlst" xmlns:r="http://schemas.openxmlformats.org/officeDocument/2006/relationships" xmlns:m="http://schemas.openxmlformats.org/officeDocument/2006/math" xmlns:v="urn:schemas-microsoft-com:vml" xmlns:wp14="http://schemas.microsoft.com/office/word/2010/wordprocessingDrawing" xmlns:wp="http://schemas.openxmlformats.org/drawingml/2006/wordprocessingDrawing" xmlns:w10="urn:schemas-microsoft-com:office:word" xmlns:w="http://schemas.openxmlformats.org/wordprocessingml/2006/main" xmlns:w14="http://schemas.microsoft.com/office/word/2010/wordml" xmlns:w15="http://schemas.microsoft.com/office/word/2012/wordml" xmlns:w16cex="http://schemas.microsoft.com/office/word/2018/wordml/cex" xmlns:w16cid="http://schemas.microsoft.com/office/word/2016/wordml/cid" xmlns:w16="http://schemas.microsoft.com/office/word/2018/wordml" xmlns:w16du="http://schemas.microsoft.com/office/word/2023/wordml/word16du" xmlns:w16sdtdh="http://schemas.microsoft.com/office/word/2020/wordml/sdtdatahash" xmlns:w16sdtfl="http://schemas.microsoft.com/office/word/2024/wordml/sdtformatlock" xmlns:w16se="http://schemas.microsoft.com/office/word/2015/wordml/symex" xmlns:wpg="http://schemas.microsoft.com/office/word/2010/wordprocessingGroup" xmlns:wpi="http://schemas.microsoft.com/office/word/2010/wordprocessingInk" xmlns:wne="http://schemas.microsoft.com/office/word/2006/wordml" xmlns:wps="http://schemas.microsoft.com/office/word/2010/wordprocessingShape" mc:Ignorable="w14 w15 w16se w16cid w16 w16cex w16sdtdh w16sdtfl w16du wp14">
+<w:numbering xmlns:wpc="http://schemas.microsoft.com/office/word/2010/wordprocessingCanvas" xmlns:cx="http://schemas.microsoft.com/office/drawing/2014/chartex" xmlns:cx1="http://schemas.microsoft.com/office/drawing/2015/9/8/chartex" xmlns:cx2="http://schemas.microsoft.com/office/drawing/2015/10/21/chartex" xmlns:cx3="http://schemas.microsoft.com/office/drawing/2016/5/9/chartex" xmlns:cx4="http://schemas.microsoft.com/office/drawing/2016/5/10/chartex" xmlns:cx5="http://schemas.microsoft.com/office/drawing/2016/5/11/chartex" xmlns:cx6="http://schemas.microsoft.com/office/drawing/2016/5/12/chartex" xmlns:cx7="http://schemas.microsoft.com/office/drawing/2016/5/13/chartex" xmlns:cx8="http://schemas.microsoft.com/office/drawing/2016/5/14/chartex" xmlns:mc="http://schemas.openxmlformats.org/markup-compatibility/2006" xmlns:aink="http://schemas.microsoft.com/office/drawing/2016/ink" xmlns:am3d="http://schemas.microsoft.com/office/drawing/2017/model3d" xmlns:o="urn:schemas-microsoft-com:office:office" xmlns:r="http://schemas.openxmlformats.org/officeDocument/2006/relationships" xmlns:m="http://schemas.openxmlformats.org/officeDocument/2006/math" xmlns:v="urn:schemas-microsoft-com:vml" xmlns:wp14="http://schemas.microsoft.com/office/word/2010/wordprocessingDrawing" xmlns:wp="http://schemas.openxmlformats.org/drawingml/2006/wordprocessingDrawing" xmlns:w10="urn:schemas-microsoft-com:office:word" xmlns:w="http://schemas.openxmlformats.org/wordprocessingml/2006/main" xmlns:w14="http://schemas.microsoft.com/office/word/2010/wordml" xmlns:w15="http://schemas.microsoft.com/office/word/2012/wordml" xmlns:w16cex="http://schemas.microsoft.com/office/word/2018/wordml/cex" xmlns:w16cid="http://schemas.microsoft.com/office/word/2016/wordml/cid" xmlns:w16="http://schemas.microsoft.com/office/word/2018/wordml" xmlns:w16se="http://schemas.microsoft.com/office/word/2015/wordml/symex" xmlns:wpg="http://schemas.microsoft.com/office/word/2010/wordprocessingGroup" xmlns:wpi="http://schemas.microsoft.com/office/word/2010/wordprocessingInk" xmlns:wne="http://schemas.microsoft.com/office/word/2006/wordml" xmlns:wps="http://schemas.microsoft.com/office/word/2010/wordprocessingShape" mc:Ignorable="w14 w15 w16se w16cid w16 w16cex wp14">
   <w:abstractNum w:abstractNumId="0" w15:restartNumberingAfterBreak="0">
     <w:nsid w:val="07E925FD"/>
     <w:multiLevelType w:val="multilevel"/>
@@ -1950,7 +2133,7 @@
     <w:lvl w:ilvl="0">
       <w:start w:val="1"/>
       <w:numFmt w:val="decimal"/>
-      <w:pStyle w:val="Ttulo1"/>
+      <w:pStyle w:val="Titre1"/>
       <w:lvlText w:val="%1."/>
       <w:lvlJc w:val="left"/>
       <w:pPr>
@@ -1960,7 +2143,7 @@
     <w:lvl w:ilvl="1">
       <w:start w:val="1"/>
       <w:numFmt w:val="decimal"/>
-      <w:pStyle w:val="Ttulo2"/>
+      <w:pStyle w:val="Titre2"/>
       <w:lvlText w:val="%1.%2."/>
       <w:lvlJc w:val="left"/>
       <w:pPr>
@@ -1970,7 +2153,7 @@
     <w:lvl w:ilvl="2">
       <w:start w:val="1"/>
       <w:numFmt w:val="decimal"/>
-      <w:pStyle w:val="Ttulo3"/>
+      <w:pStyle w:val="Titre3"/>
       <w:lvlText w:val="%1.%2.%3."/>
       <w:lvlJc w:val="left"/>
       <w:pPr>
@@ -2204,20 +2387,20 @@
       </w:pPr>
     </w:lvl>
   </w:abstractNum>
-  <w:num w:numId="1" w16cid:durableId="68499848">
+  <w:num w:numId="1">
     <w:abstractNumId w:val="1"/>
   </w:num>
-  <w:num w:numId="2" w16cid:durableId="1861969202">
+  <w:num w:numId="2">
     <w:abstractNumId w:val="2"/>
   </w:num>
-  <w:num w:numId="3" w16cid:durableId="1332441666">
+  <w:num w:numId="3">
     <w:abstractNumId w:val="0"/>
   </w:num>
 </w:numbering>
 </file>
 
 <file path=word/styles.xml><?xml version="1.0" encoding="utf-8"?>
-<w:styles xmlns:mc="http://schemas.openxmlformats.org/markup-compatibility/2006" xmlns:r="http://schemas.openxmlformats.org/officeDocument/2006/relationships" xmlns:w="http://schemas.openxmlformats.org/wordprocessingml/2006/main" xmlns:w14="http://schemas.microsoft.com/office/word/2010/wordml" xmlns:w15="http://schemas.microsoft.com/office/word/2012/wordml" xmlns:w16cex="http://schemas.microsoft.com/office/word/2018/wordml/cex" xmlns:w16cid="http://schemas.microsoft.com/office/word/2016/wordml/cid" xmlns:w16="http://schemas.microsoft.com/office/word/2018/wordml" xmlns:w16du="http://schemas.microsoft.com/office/word/2023/wordml/word16du" xmlns:w16sdtdh="http://schemas.microsoft.com/office/word/2020/wordml/sdtdatahash" xmlns:w16sdtfl="http://schemas.microsoft.com/office/word/2024/wordml/sdtformatlock" xmlns:w16se="http://schemas.microsoft.com/office/word/2015/wordml/symex" mc:Ignorable="w14 w15 w16se w16cid w16 w16cex w16sdtdh w16sdtfl w16du">
+<w:styles xmlns:mc="http://schemas.openxmlformats.org/markup-compatibility/2006" xmlns:r="http://schemas.openxmlformats.org/officeDocument/2006/relationships" xmlns:w="http://schemas.openxmlformats.org/wordprocessingml/2006/main" xmlns:w14="http://schemas.microsoft.com/office/word/2010/wordml" xmlns:w15="http://schemas.microsoft.com/office/word/2012/wordml" xmlns:w16cex="http://schemas.microsoft.com/office/word/2018/wordml/cex" xmlns:w16cid="http://schemas.microsoft.com/office/word/2016/wordml/cid" xmlns:w16="http://schemas.microsoft.com/office/word/2018/wordml" xmlns:w16se="http://schemas.microsoft.com/office/word/2015/wordml/symex" mc:Ignorable="w14 w15 w16se w16cid w16 w16cex">
   <w:docDefaults>
     <w:rPrDefault>
       <w:rPr>
@@ -2602,11 +2785,11 @@
     <w:name w:val="Normal"/>
     <w:qFormat/>
   </w:style>
-  <w:style w:type="paragraph" w:styleId="Ttulo1">
+  <w:style w:type="paragraph" w:styleId="Titre1">
     <w:name w:val="heading 1"/>
     <w:basedOn w:val="Normal"/>
     <w:next w:val="Normal"/>
-    <w:link w:val="Ttulo1Car"/>
+    <w:link w:val="Titre1Car"/>
     <w:uiPriority w:val="9"/>
     <w:qFormat/>
     <w:rsid w:val="00362E65"/>
@@ -2630,11 +2813,11 @@
       <w:szCs w:val="32"/>
     </w:rPr>
   </w:style>
-  <w:style w:type="paragraph" w:styleId="Ttulo2">
+  <w:style w:type="paragraph" w:styleId="Titre2">
     <w:name w:val="heading 2"/>
     <w:basedOn w:val="Normal"/>
     <w:next w:val="Normal"/>
-    <w:link w:val="Ttulo2Car"/>
+    <w:link w:val="Titre2Car"/>
     <w:uiPriority w:val="9"/>
     <w:semiHidden/>
     <w:unhideWhenUsed/>
@@ -2658,11 +2841,11 @@
       <w:szCs w:val="26"/>
     </w:rPr>
   </w:style>
-  <w:style w:type="paragraph" w:styleId="Ttulo3">
+  <w:style w:type="paragraph" w:styleId="Titre3">
     <w:name w:val="heading 3"/>
     <w:basedOn w:val="Normal"/>
     <w:next w:val="Normal"/>
-    <w:link w:val="Ttulo3Car"/>
+    <w:link w:val="Titre3Car"/>
     <w:uiPriority w:val="9"/>
     <w:semiHidden/>
     <w:unhideWhenUsed/>
@@ -2684,13 +2867,13 @@
       <w:bCs/>
     </w:rPr>
   </w:style>
-  <w:style w:type="character" w:default="1" w:styleId="Fuentedeprrafopredeter">
+  <w:style w:type="character" w:default="1" w:styleId="Policepardfaut">
     <w:name w:val="Default Paragraph Font"/>
     <w:uiPriority w:val="1"/>
     <w:semiHidden/>
     <w:unhideWhenUsed/>
   </w:style>
-  <w:style w:type="table" w:default="1" w:styleId="Tablanormal">
+  <w:style w:type="table" w:default="1" w:styleId="TableauNormal">
     <w:name w:val="Normal Table"/>
     <w:uiPriority w:val="99"/>
     <w:semiHidden/>
@@ -2705,15 +2888,15 @@
       </w:tblCellMar>
     </w:tblPr>
   </w:style>
-  <w:style w:type="numbering" w:default="1" w:styleId="Sinlista">
+  <w:style w:type="numbering" w:default="1" w:styleId="Aucuneliste">
     <w:name w:val="No List"/>
     <w:uiPriority w:val="99"/>
     <w:semiHidden/>
     <w:unhideWhenUsed/>
   </w:style>
-  <w:style w:type="character" w:customStyle="1" w:styleId="Fuerte1">
-    <w:name w:val="Fuerte1"/>
-    <w:basedOn w:val="Fuentedeprrafopredeter"/>
+  <w:style w:type="character" w:customStyle="1" w:styleId="strong">
+    <w:name w:val="strong"/>
+    <w:basedOn w:val="Policepardfaut"/>
     <w:uiPriority w:val="1"/>
     <w:qFormat/>
     <w:rsid w:val="007B3E96"/>
@@ -2732,7 +2915,7 @@
   </w:style>
   <w:style w:type="table" w:customStyle="1" w:styleId="tabletemplate">
     <w:name w:val="table_template"/>
-    <w:basedOn w:val="Tablanormal"/>
+    <w:basedOn w:val="TableauNormal"/>
     <w:uiPriority w:val="59"/>
     <w:rsid w:val="00F12158"/>
     <w:pPr>
@@ -2768,9 +2951,9 @@
       </w:tcPr>
     </w:tblStylePr>
   </w:style>
-  <w:style w:type="table" w:styleId="Listaclara-nfasis2">
+  <w:style w:type="table" w:styleId="Listeclaire-Accent2">
     <w:name w:val="Light List Accent 2"/>
-    <w:basedOn w:val="Tablanormal"/>
+    <w:basedOn w:val="TableauNormal"/>
     <w:uiPriority w:val="61"/>
     <w:rsid w:val="00FC557F"/>
     <w:tblPr>
@@ -2850,10 +3033,10 @@
       </w:tcPr>
     </w:tblStylePr>
   </w:style>
-  <w:style w:type="character" w:customStyle="1" w:styleId="Ttulo1Car">
-    <w:name w:val="Título 1 Car"/>
-    <w:basedOn w:val="Fuentedeprrafopredeter"/>
-    <w:link w:val="Ttulo1"/>
+  <w:style w:type="character" w:customStyle="1" w:styleId="Titre1Car">
+    <w:name w:val="Titre 1 Car"/>
+    <w:basedOn w:val="Policepardfaut"/>
+    <w:link w:val="Titre1"/>
     <w:uiPriority w:val="9"/>
     <w:rsid w:val="00362E65"/>
     <w:rPr>
@@ -2864,10 +3047,10 @@
       <w:szCs w:val="32"/>
     </w:rPr>
   </w:style>
-  <w:style w:type="character" w:customStyle="1" w:styleId="Ttulo2Car">
-    <w:name w:val="Título 2 Car"/>
-    <w:basedOn w:val="Fuentedeprrafopredeter"/>
-    <w:link w:val="Ttulo2"/>
+  <w:style w:type="character" w:customStyle="1" w:styleId="Titre2Car">
+    <w:name w:val="Titre 2 Car"/>
+    <w:basedOn w:val="Policepardfaut"/>
+    <w:link w:val="Titre2"/>
     <w:uiPriority w:val="9"/>
     <w:semiHidden/>
     <w:rsid w:val="00362E65"/>
@@ -2879,10 +3062,10 @@
       <w:szCs w:val="26"/>
     </w:rPr>
   </w:style>
-  <w:style w:type="character" w:customStyle="1" w:styleId="Ttulo3Car">
-    <w:name w:val="Título 3 Car"/>
-    <w:basedOn w:val="Fuentedeprrafopredeter"/>
-    <w:link w:val="Ttulo3"/>
+  <w:style w:type="character" w:customStyle="1" w:styleId="Titre3Car">
+    <w:name w:val="Titre 3 Car"/>
+    <w:basedOn w:val="Policepardfaut"/>
+    <w:link w:val="Titre3"/>
     <w:uiPriority w:val="9"/>
     <w:semiHidden/>
     <w:rsid w:val="00362E65"/>
@@ -2911,9 +3094,9 @@
     <w:qFormat/>
     <w:rsid w:val="00AE18EF"/>
   </w:style>
-  <w:style w:type="table" w:styleId="Tablaprofesional">
+  <w:style w:type="table" w:styleId="Tableauprofessionnel">
     <w:name w:val="Table Professional"/>
-    <w:basedOn w:val="Tablanormal"/>
+    <w:basedOn w:val="TableauNormal"/>
     <w:uiPriority w:val="99"/>
     <w:semiHidden/>
     <w:unhideWhenUsed/>
@@ -2943,7 +3126,7 @@
       </w:tcPr>
     </w:tblStylePr>
   </w:style>
-  <w:style w:type="paragraph" w:styleId="TDC1">
+  <w:style w:type="paragraph" w:styleId="TM1">
     <w:name w:val="toc 1"/>
     <w:basedOn w:val="Normal"/>
     <w:next w:val="Normal"/>
@@ -2955,7 +3138,7 @@
       <w:spacing w:after="100"/>
     </w:pPr>
   </w:style>
-  <w:style w:type="paragraph" w:styleId="TDC2">
+  <w:style w:type="paragraph" w:styleId="TM2">
     <w:name w:val="toc 2"/>
     <w:basedOn w:val="Normal"/>
     <w:next w:val="Normal"/>
@@ -2968,10 +3151,10 @@
       <w:ind w:left="240"/>
     </w:pPr>
   </w:style>
-  <w:style w:type="paragraph" w:styleId="Textodeglobo">
+  <w:style w:type="paragraph" w:styleId="Textedebulles">
     <w:name w:val="Balloon Text"/>
     <w:basedOn w:val="Normal"/>
-    <w:link w:val="TextodegloboCar"/>
+    <w:link w:val="TextedebullesCar"/>
     <w:uiPriority w:val="99"/>
     <w:semiHidden/>
     <w:unhideWhenUsed/>
@@ -2982,10 +3165,10 @@
       <w:szCs w:val="18"/>
     </w:rPr>
   </w:style>
-  <w:style w:type="character" w:customStyle="1" w:styleId="TextodegloboCar">
-    <w:name w:val="Texto de globo Car"/>
-    <w:basedOn w:val="Fuentedeprrafopredeter"/>
-    <w:link w:val="Textodeglobo"/>
+  <w:style w:type="character" w:customStyle="1" w:styleId="TextedebullesCar">
+    <w:name w:val="Texte de bulles Car"/>
+    <w:basedOn w:val="Policepardfaut"/>
+    <w:link w:val="Textedebulles"/>
     <w:uiPriority w:val="99"/>
     <w:semiHidden/>
     <w:rsid w:val="00FB63E7"/>
@@ -2997,7 +3180,7 @@
   </w:style>
   <w:style w:type="character" w:customStyle="1" w:styleId="referenceid">
     <w:name w:val="reference_id"/>
-    <w:basedOn w:val="Fuentedeprrafopredeter"/>
+    <w:basedOn w:val="Policepardfaut"/>
     <w:uiPriority w:val="1"/>
     <w:rsid w:val="00457CF1"/>
     <w:rPr>

</xml_diff>

<commit_message>
Update tables 2 and 3 (CPOD by sex and derechohabiencia)
</commit_message>
<xml_diff>
--- a/tabla_2_cpod_sexo.docx
+++ b/tabla_2_cpod_sexo.docx
@@ -1,38 +1,87 @@
 
 <file path=word/document.xml><?xml version="1.0" encoding="utf-8"?>
-<w:document xmlns:wpc="http://schemas.microsoft.com/office/word/2010/wordprocessingCanvas" xmlns:cx="http://schemas.microsoft.com/office/drawing/2014/chartex" xmlns:cx1="http://schemas.microsoft.com/office/drawing/2015/9/8/chartex" xmlns:cx2="http://schemas.microsoft.com/office/drawing/2015/10/21/chartex" xmlns:cx3="http://schemas.microsoft.com/office/drawing/2016/5/9/chartex" xmlns:cx4="http://schemas.microsoft.com/office/drawing/2016/5/10/chartex" xmlns:cx5="http://schemas.microsoft.com/office/drawing/2016/5/11/chartex" xmlns:cx6="http://schemas.microsoft.com/office/drawing/2016/5/12/chartex" xmlns:cx7="http://schemas.microsoft.com/office/drawing/2016/5/13/chartex" xmlns:cx8="http://schemas.microsoft.com/office/drawing/2016/5/14/chartex" xmlns:mc="http://schemas.openxmlformats.org/markup-compatibility/2006" xmlns:aink="http://schemas.microsoft.com/office/drawing/2016/ink" xmlns:am3d="http://schemas.microsoft.com/office/drawing/2017/model3d" xmlns:o="urn:schemas-microsoft-com:office:office" xmlns:r="http://schemas.openxmlformats.org/officeDocument/2006/relationships" xmlns:m="http://schemas.openxmlformats.org/officeDocument/2006/math" xmlns:v="urn:schemas-microsoft-com:vml" xmlns:wp14="http://schemas.microsoft.com/office/word/2010/wordprocessingDrawing" xmlns:wp="http://schemas.openxmlformats.org/drawingml/2006/wordprocessingDrawing" xmlns:w10="urn:schemas-microsoft-com:office:word" xmlns:w="http://schemas.openxmlformats.org/wordprocessingml/2006/main" xmlns:w14="http://schemas.microsoft.com/office/word/2010/wordml" xmlns:w15="http://schemas.microsoft.com/office/word/2012/wordml" xmlns:w16cex="http://schemas.microsoft.com/office/word/2018/wordml/cex" xmlns:w16cid="http://schemas.microsoft.com/office/word/2016/wordml/cid" xmlns:w16="http://schemas.microsoft.com/office/word/2018/wordml" xmlns:w16se="http://schemas.microsoft.com/office/word/2015/wordml/symex" xmlns:wpg="http://schemas.microsoft.com/office/word/2010/wordprocessingGroup" xmlns:wpi="http://schemas.microsoft.com/office/word/2010/wordprocessingInk" xmlns:wne="http://schemas.microsoft.com/office/word/2006/wordml" xmlns:wps="http://schemas.microsoft.com/office/word/2010/wordprocessingShape" mc:Ignorable="w14 w15 w16se w16cid w16 w16cex wp14">
+<w:document xmlns:wpc="http://schemas.microsoft.com/office/word/2010/wordprocessingCanvas" xmlns:cx="http://schemas.microsoft.com/office/drawing/2014/chartex" xmlns:cx1="http://schemas.microsoft.com/office/drawing/2015/9/8/chartex" xmlns:cx2="http://schemas.microsoft.com/office/drawing/2015/10/21/chartex" xmlns:cx3="http://schemas.microsoft.com/office/drawing/2016/5/9/chartex" xmlns:cx4="http://schemas.microsoft.com/office/drawing/2016/5/10/chartex" xmlns:cx5="http://schemas.microsoft.com/office/drawing/2016/5/11/chartex" xmlns:cx6="http://schemas.microsoft.com/office/drawing/2016/5/12/chartex" xmlns:cx7="http://schemas.microsoft.com/office/drawing/2016/5/13/chartex" xmlns:cx8="http://schemas.microsoft.com/office/drawing/2016/5/14/chartex" xmlns:mc="http://schemas.openxmlformats.org/markup-compatibility/2006" xmlns:aink="http://schemas.microsoft.com/office/drawing/2016/ink" xmlns:am3d="http://schemas.microsoft.com/office/drawing/2017/model3d" xmlns:o="urn:schemas-microsoft-com:office:office" xmlns:oel="http://schemas.microsoft.com/office/2019/extlst" xmlns:r="http://schemas.openxmlformats.org/officeDocument/2006/relationships" xmlns:m="http://schemas.openxmlformats.org/officeDocument/2006/math" xmlns:v="urn:schemas-microsoft-com:vml" xmlns:wp14="http://schemas.microsoft.com/office/word/2010/wordprocessingDrawing" xmlns:wp="http://schemas.openxmlformats.org/drawingml/2006/wordprocessingDrawing" xmlns:w10="urn:schemas-microsoft-com:office:word" xmlns:w="http://schemas.openxmlformats.org/wordprocessingml/2006/main" xmlns:w14="http://schemas.microsoft.com/office/word/2010/wordml" xmlns:w15="http://schemas.microsoft.com/office/word/2012/wordml" xmlns:w16cex="http://schemas.microsoft.com/office/word/2018/wordml/cex" xmlns:w16cid="http://schemas.microsoft.com/office/word/2016/wordml/cid" xmlns:w16="http://schemas.microsoft.com/office/word/2018/wordml" xmlns:w16du="http://schemas.microsoft.com/office/word/2023/wordml/word16du" xmlns:w16sdtdh="http://schemas.microsoft.com/office/word/2020/wordml/sdtdatahash" xmlns:w16sdtfl="http://schemas.microsoft.com/office/word/2024/wordml/sdtformatlock" xmlns:w16se="http://schemas.microsoft.com/office/word/2015/wordml/symex" xmlns:wpg="http://schemas.microsoft.com/office/word/2010/wordprocessingGroup" xmlns:wpi="http://schemas.microsoft.com/office/word/2010/wordprocessingInk" xmlns:wne="http://schemas.microsoft.com/office/word/2006/wordml" xmlns:wps="http://schemas.microsoft.com/office/word/2010/wordprocessingShape" mc:Ignorable="w14 w15 w16se w16cid w16 w16cex w16sdtdh w16sdtfl w16du wp14">
   <w:body>
-    <w:p>
-      <w:pPr>
-        <w:pStyle w:val="Normal"/>
-      </w:pPr>
-      <w:r>
-        <w:t xml:space="preserve"/>
-      </w:r>
-    </w:p>
+    <w:p/>
     <w:p>
       <w:pPr>
         <w:pStyle w:val="TableCaption"/>
-        <w:jc w:val="center"/>
         <w:keepNext/>
         <w:pBdr>
-          <w:bottom w:val="none" w:sz="0" w:space="0" w:color="000000"/>
           <w:top w:val="none" w:sz="0" w:space="0" w:color="000000"/>
           <w:left w:val="none" w:sz="0" w:space="0" w:color="000000"/>
+          <w:bottom w:val="none" w:sz="0" w:space="0" w:color="000000"/>
           <w:right w:val="none" w:sz="0" w:space="0" w:color="000000"/>
         </w:pBdr>
-        <w:spacing w:after="60" w:before="60" w:line="240"/>
-        <w:ind w:left="60" w:right="60" w:firstLine="0" w:firstLineChars="0"/>
+        <w:spacing w:before="60" w:after="60"/>
+        <w:ind w:left="60" w:right="60"/>
       </w:pPr>
       <w:r>
-        <w:t xml:space="preserve">**Tabla 2. Índice CPO-D y estado de salud bucal según sexo**</w:t>
+        <w:t>**</w:t>
+      </w:r>
+      <w:proofErr w:type="spellStart"/>
+      <w:r>
+        <w:t>Tabla</w:t>
+      </w:r>
+      <w:proofErr w:type="spellEnd"/>
+      <w:r>
+        <w:t xml:space="preserve"> 2. </w:t>
+      </w:r>
+      <w:proofErr w:type="spellStart"/>
+      <w:r>
+        <w:t>Índice</w:t>
+      </w:r>
+      <w:proofErr w:type="spellEnd"/>
+      <w:r>
+        <w:t xml:space="preserve"> CPO-D y </w:t>
+      </w:r>
+      <w:proofErr w:type="spellStart"/>
+      <w:r>
+        <w:t>estado</w:t>
+      </w:r>
+      <w:proofErr w:type="spellEnd"/>
+      <w:r>
+        <w:t xml:space="preserve"> de </w:t>
+      </w:r>
+      <w:proofErr w:type="spellStart"/>
+      <w:r>
+        <w:t>salud</w:t>
+      </w:r>
+      <w:proofErr w:type="spellEnd"/>
+      <w:r>
+        <w:t xml:space="preserve"> </w:t>
+      </w:r>
+      <w:proofErr w:type="spellStart"/>
+      <w:r>
+        <w:t>bucal</w:t>
+      </w:r>
+      <w:proofErr w:type="spellEnd"/>
+      <w:r>
+        <w:t xml:space="preserve"> </w:t>
+      </w:r>
+      <w:proofErr w:type="spellStart"/>
+      <w:r>
+        <w:t>según</w:t>
+      </w:r>
+      <w:proofErr w:type="spellEnd"/>
+      <w:r>
+        <w:t xml:space="preserve"> </w:t>
+      </w:r>
+      <w:proofErr w:type="spellStart"/>
+      <w:r>
+        <w:t>sexo</w:t>
+      </w:r>
+      <w:proofErr w:type="spellEnd"/>
+      <w:r>
+        <w:t>**</w:t>
       </w:r>
     </w:p>
-    <w:tbl xmlns:a="http://schemas.openxmlformats.org/drawingml/2006/main" xmlns:pic="http://schemas.openxmlformats.org/drawingml/2006/picture">
+    <w:tbl>
       <w:tblPr>
+        <w:tblW w:w="0" w:type="auto"/>
+        <w:jc w:val="center"/>
         <w:tblLayout w:type="fixed"/>
-        <w:jc w:val="center"/>
-        <w:tblLook w:firstRow="1" w:lastRow="0" w:firstColumn="0" w:lastColumn="0" w:noHBand="0" w:noVBand="1"/>
+        <w:tblLook w:val="0420" w:firstRow="1" w:lastRow="0" w:firstColumn="0" w:lastColumn="0" w:noHBand="0" w:noVBand="1"/>
       </w:tblPr>
       <w:tblGrid>
         <w:gridCol w:w="2576"/>
@@ -42,2090 +91,1858 @@
       </w:tblGrid>
       <w:tr>
         <w:trPr>
-          <w:trHeight w:val="769" w:hRule="auto"/>
           <w:tblHeader/>
+          <w:jc w:val="center"/>
         </w:trPr>
         <w:tc>
           <w:tcPr>
+            <w:tcW w:w="2576" w:type="dxa"/>
             <w:tcBorders>
-              <w:bottom w:val="single" w:sz="8" w:space="0" w:color="000000"/>
               <w:top w:val="single" w:sz="8" w:space="0" w:color="000000"/>
               <w:left w:val="none" w:sz="0" w:space="0" w:color="000000"/>
+              <w:bottom w:val="single" w:sz="8" w:space="0" w:color="000000"/>
               <w:right w:val="none" w:sz="0" w:space="0" w:color="000000"/>
             </w:tcBorders>
             <w:shd w:val="clear" w:color="auto" w:fill="FFFFFF"/>
             <w:tcMar>
               <w:top w:w="0" w:type="dxa"/>
+              <w:left w:w="0" w:type="dxa"/>
               <w:bottom w:w="0" w:type="dxa"/>
-              <w:left w:w="0" w:type="dxa"/>
               <w:right w:w="0" w:type="dxa"/>
             </w:tcMar>
             <w:vAlign w:val="center"/>
           </w:tcPr>
           <w:p>
             <w:pPr>
-              <w:pStyle w:val="Normal"/>
-              <w:jc w:val="left"/>
               <w:pBdr>
-                <w:bottom w:val="none" w:sz="0" w:space="0" w:color="000000"/>
                 <w:top w:val="none" w:sz="0" w:space="0" w:color="000000"/>
                 <w:left w:val="none" w:sz="0" w:space="0" w:color="000000"/>
+                <w:bottom w:val="none" w:sz="0" w:space="0" w:color="000000"/>
                 <w:right w:val="none" w:sz="0" w:space="0" w:color="000000"/>
               </w:pBdr>
-              <w:spacing w:after="40" w:before="40" w:line="240"/>
-              <w:ind w:left="100" w:right="100" w:firstLine="0" w:firstLineChars="0"/>
-              <w:rPr>
-                <w:rFonts w:ascii="Helvetica" w:hAnsi="Helvetica" w:eastAsia="Helvetica" w:cs="Helvetica"/>
-                <w:i w:val="false"/>
-                <w:b w:val="false"/>
-                <w:u w:val="none"/>
-                <w:strike w:val="false"/>
-                <w:sz w:val="22"/>
-                <w:szCs w:val="22"/>
-                <w:color w:val="000000"/>
+              <w:spacing w:before="40" w:after="40"/>
+              <w:ind w:left="100" w:right="100"/>
+              <w:rPr>
+                <w:rFonts w:ascii="Helvetica" w:eastAsia="Helvetica" w:hAnsi="Helvetica" w:cs="Helvetica"/>
+                <w:color w:val="000000"/>
+                <w:sz w:val="22"/>
+                <w:szCs w:val="22"/>
               </w:rPr>
             </w:pPr>
             <w:r>
               <w:rPr>
-                <w:rFonts w:ascii="Helvetica" w:hAnsi="Helvetica" w:eastAsia="Helvetica" w:cs="Helvetica"/>
-                <w:i w:val="false"/>
-                <w:b w:val="true"/>
-                <w:u w:val="none"/>
-                <w:strike w:val="false"/>
-                <w:sz w:val="22"/>
-                <w:szCs w:val="22"/>
-                <w:color w:val="000000"/>
-              </w:rPr>
-              <w:t xml:space="preserve">Characteristic</w:t>
-            </w:r>
-            <w:r>
-              <w:rPr>
-                <w:rFonts w:ascii="Helvetica" w:hAnsi="Helvetica" w:eastAsia="Helvetica" w:cs="Helvetica"/>
-                <w:i w:val="false"/>
-                <w:b w:val="false"/>
-                <w:u w:val="none"/>
-                <w:strike w:val="false"/>
+                <w:rFonts w:ascii="Helvetica" w:eastAsia="Helvetica" w:hAnsi="Helvetica" w:cs="Helvetica"/>
+                <w:b/>
+                <w:color w:val="000000"/>
+                <w:sz w:val="22"/>
+                <w:szCs w:val="22"/>
+              </w:rPr>
+              <w:t>Characteristic</w:t>
+            </w:r>
+            <w:r>
+              <w:rPr>
+                <w:rFonts w:ascii="Helvetica" w:eastAsia="Helvetica" w:hAnsi="Helvetica" w:cs="Helvetica"/>
+                <w:color w:val="000000"/>
+                <w:sz w:val="22"/>
+                <w:szCs w:val="22"/>
                 <w:vertAlign w:val="superscript"/>
-                <w:sz w:val="22"/>
-                <w:szCs w:val="22"/>
-                <w:color w:val="000000"/>
-              </w:rPr>
-              <w:t xml:space="preserve">1</w:t>
+              </w:rPr>
+              <w:t>1</w:t>
             </w:r>
           </w:p>
         </w:tc>
         <w:tc>
           <w:tcPr>
+            <w:tcW w:w="3088" w:type="dxa"/>
             <w:tcBorders>
-              <w:bottom w:val="single" w:sz="8" w:space="0" w:color="000000"/>
               <w:top w:val="single" w:sz="8" w:space="0" w:color="000000"/>
               <w:left w:val="none" w:sz="0" w:space="0" w:color="000000"/>
+              <w:bottom w:val="single" w:sz="8" w:space="0" w:color="000000"/>
               <w:right w:val="none" w:sz="0" w:space="0" w:color="000000"/>
             </w:tcBorders>
             <w:shd w:val="clear" w:color="auto" w:fill="FFFFFF"/>
             <w:tcMar>
               <w:top w:w="0" w:type="dxa"/>
+              <w:left w:w="0" w:type="dxa"/>
               <w:bottom w:w="0" w:type="dxa"/>
-              <w:left w:w="0" w:type="dxa"/>
               <w:right w:w="0" w:type="dxa"/>
             </w:tcMar>
             <w:vAlign w:val="center"/>
           </w:tcPr>
           <w:p>
             <w:pPr>
-              <w:pStyle w:val="Normal"/>
-              <w:jc w:val="center"/>
               <w:pBdr>
-                <w:bottom w:val="none" w:sz="0" w:space="0" w:color="000000"/>
                 <w:top w:val="none" w:sz="0" w:space="0" w:color="000000"/>
                 <w:left w:val="none" w:sz="0" w:space="0" w:color="000000"/>
+                <w:bottom w:val="none" w:sz="0" w:space="0" w:color="000000"/>
                 <w:right w:val="none" w:sz="0" w:space="0" w:color="000000"/>
               </w:pBdr>
-              <w:spacing w:after="40" w:before="40" w:line="240"/>
-              <w:ind w:left="100" w:right="100" w:firstLine="0" w:firstLineChars="0"/>
-              <w:rPr>
-                <w:rFonts w:ascii="Helvetica" w:hAnsi="Helvetica" w:eastAsia="Helvetica" w:cs="Helvetica"/>
-                <w:i w:val="false"/>
-                <w:b w:val="false"/>
-                <w:u w:val="none"/>
-                <w:strike w:val="false"/>
-                <w:sz w:val="22"/>
-                <w:szCs w:val="22"/>
-                <w:color w:val="000000"/>
+              <w:spacing w:before="40" w:after="40"/>
+              <w:ind w:left="100" w:right="100"/>
+              <w:jc w:val="center"/>
+              <w:rPr>
+                <w:rFonts w:ascii="Helvetica" w:eastAsia="Helvetica" w:hAnsi="Helvetica" w:cs="Helvetica"/>
+                <w:color w:val="000000"/>
+                <w:sz w:val="22"/>
+                <w:szCs w:val="22"/>
               </w:rPr>
             </w:pPr>
             <w:r>
               <w:rPr>
-                <w:rFonts w:ascii="Helvetica" w:hAnsi="Helvetica" w:eastAsia="Helvetica" w:cs="Helvetica"/>
-                <w:i w:val="false"/>
-                <w:b w:val="true"/>
-                <w:u w:val="none"/>
-                <w:strike w:val="false"/>
-                <w:sz w:val="22"/>
-                <w:szCs w:val="22"/>
-                <w:color w:val="000000"/>
-              </w:rPr>
-              <w:t xml:space="preserve">Overall</w:t>
-            </w:r>
-            <w:r>
-              <w:rPr>
-                <w:rFonts w:ascii="Helvetica" w:hAnsi="Helvetica" w:eastAsia="Helvetica" w:cs="Helvetica"/>
-                <w:i w:val="false"/>
-                <w:b w:val="false"/>
-                <w:u w:val="none"/>
-                <w:strike w:val="false"/>
-                <w:sz w:val="22"/>
-                <w:szCs w:val="22"/>
-                <w:color w:val="000000"/>
+                <w:rFonts w:ascii="Helvetica" w:eastAsia="Helvetica" w:hAnsi="Helvetica" w:cs="Helvetica"/>
+                <w:b/>
+                <w:color w:val="000000"/>
+                <w:sz w:val="22"/>
+                <w:szCs w:val="22"/>
+              </w:rPr>
+              <w:t>Overall</w:t>
+            </w:r>
+            <w:r>
+              <w:rPr>
+                <w:rFonts w:ascii="Helvetica" w:eastAsia="Helvetica" w:hAnsi="Helvetica" w:cs="Helvetica"/>
+                <w:color w:val="000000"/>
+                <w:sz w:val="22"/>
+                <w:szCs w:val="22"/>
               </w:rPr>
               <w:t xml:space="preserve">  </w:t>
             </w:r>
             <w:r>
               <w:rPr>
-                <w:rFonts w:ascii="Helvetica" w:hAnsi="Helvetica" w:eastAsia="Helvetica" w:cs="Helvetica"/>
-                <w:i w:val="false"/>
-                <w:b w:val="false"/>
-                <w:u w:val="none"/>
-                <w:strike w:val="false"/>
-                <w:sz w:val="22"/>
-                <w:szCs w:val="22"/>
-                <w:color w:val="000000"/>
+                <w:rFonts w:ascii="Helvetica" w:eastAsia="Helvetica" w:hAnsi="Helvetica" w:cs="Helvetica"/>
+                <w:color w:val="000000"/>
+                <w:sz w:val="22"/>
+                <w:szCs w:val="22"/>
               </w:rPr>
               <w:br/>
-            </w:r>
-            <w:r>
-              <w:rPr>
-                <w:rFonts w:ascii="Helvetica" w:hAnsi="Helvetica" w:eastAsia="Helvetica" w:cs="Helvetica"/>
-                <w:i w:val="false"/>
-                <w:b w:val="false"/>
-                <w:u w:val="none"/>
-                <w:strike w:val="false"/>
-                <w:sz w:val="22"/>
-                <w:szCs w:val="22"/>
-                <w:color w:val="000000"/>
-              </w:rPr>
-              <w:t xml:space="preserve">N = 69,840</w:t>
-            </w:r>
-            <w:r>
-              <w:rPr>
-                <w:rFonts w:ascii="Helvetica" w:hAnsi="Helvetica" w:eastAsia="Helvetica" w:cs="Helvetica"/>
-                <w:i w:val="false"/>
-                <w:b w:val="false"/>
-                <w:u w:val="none"/>
-                <w:strike w:val="false"/>
+              <w:t>N = 69,840</w:t>
+            </w:r>
+            <w:r>
+              <w:rPr>
+                <w:rFonts w:ascii="Helvetica" w:eastAsia="Helvetica" w:hAnsi="Helvetica" w:cs="Helvetica"/>
+                <w:color w:val="000000"/>
+                <w:sz w:val="22"/>
+                <w:szCs w:val="22"/>
                 <w:vertAlign w:val="superscript"/>
-                <w:sz w:val="22"/>
-                <w:szCs w:val="22"/>
-                <w:color w:val="000000"/>
-              </w:rPr>
-              <w:t xml:space="preserve">1</w:t>
+              </w:rPr>
+              <w:t>1</w:t>
             </w:r>
           </w:p>
         </w:tc>
         <w:tc>
           <w:tcPr>
+            <w:tcW w:w="3088" w:type="dxa"/>
             <w:tcBorders>
-              <w:bottom w:val="single" w:sz="8" w:space="0" w:color="000000"/>
               <w:top w:val="single" w:sz="8" w:space="0" w:color="000000"/>
               <w:left w:val="none" w:sz="0" w:space="0" w:color="000000"/>
+              <w:bottom w:val="single" w:sz="8" w:space="0" w:color="000000"/>
               <w:right w:val="none" w:sz="0" w:space="0" w:color="000000"/>
             </w:tcBorders>
             <w:shd w:val="clear" w:color="auto" w:fill="FFFFFF"/>
             <w:tcMar>
               <w:top w:w="0" w:type="dxa"/>
+              <w:left w:w="0" w:type="dxa"/>
               <w:bottom w:w="0" w:type="dxa"/>
-              <w:left w:w="0" w:type="dxa"/>
               <w:right w:w="0" w:type="dxa"/>
             </w:tcMar>
             <w:vAlign w:val="center"/>
           </w:tcPr>
           <w:p>
             <w:pPr>
-              <w:pStyle w:val="Normal"/>
-              <w:jc w:val="center"/>
               <w:pBdr>
-                <w:bottom w:val="none" w:sz="0" w:space="0" w:color="000000"/>
                 <w:top w:val="none" w:sz="0" w:space="0" w:color="000000"/>
                 <w:left w:val="none" w:sz="0" w:space="0" w:color="000000"/>
+                <w:bottom w:val="none" w:sz="0" w:space="0" w:color="000000"/>
                 <w:right w:val="none" w:sz="0" w:space="0" w:color="000000"/>
               </w:pBdr>
-              <w:spacing w:after="40" w:before="40" w:line="240"/>
-              <w:ind w:left="100" w:right="100" w:firstLine="0" w:firstLineChars="0"/>
-              <w:rPr>
-                <w:rFonts w:ascii="Helvetica" w:hAnsi="Helvetica" w:eastAsia="Helvetica" w:cs="Helvetica"/>
-                <w:i w:val="false"/>
-                <w:b w:val="false"/>
-                <w:u w:val="none"/>
-                <w:strike w:val="false"/>
-                <w:sz w:val="22"/>
-                <w:szCs w:val="22"/>
-                <w:color w:val="000000"/>
+              <w:spacing w:before="40" w:after="40"/>
+              <w:ind w:left="100" w:right="100"/>
+              <w:jc w:val="center"/>
+              <w:rPr>
+                <w:rFonts w:ascii="Helvetica" w:eastAsia="Helvetica" w:hAnsi="Helvetica" w:cs="Helvetica"/>
+                <w:color w:val="000000"/>
+                <w:sz w:val="22"/>
+                <w:szCs w:val="22"/>
               </w:rPr>
             </w:pPr>
-            <w:r>
-              <w:rPr>
-                <w:rFonts w:ascii="Helvetica" w:hAnsi="Helvetica" w:eastAsia="Helvetica" w:cs="Helvetica"/>
-                <w:i w:val="false"/>
-                <w:b w:val="true"/>
-                <w:u w:val="none"/>
-                <w:strike w:val="false"/>
-                <w:sz w:val="22"/>
-                <w:szCs w:val="22"/>
-                <w:color w:val="000000"/>
-              </w:rPr>
-              <w:t xml:space="preserve">femenino</w:t>
-            </w:r>
-            <w:r>
-              <w:rPr>
-                <w:rFonts w:ascii="Helvetica" w:hAnsi="Helvetica" w:eastAsia="Helvetica" w:cs="Helvetica"/>
-                <w:i w:val="false"/>
-                <w:b w:val="false"/>
-                <w:u w:val="none"/>
-                <w:strike w:val="false"/>
-                <w:sz w:val="22"/>
-                <w:szCs w:val="22"/>
-                <w:color w:val="000000"/>
+            <w:proofErr w:type="spellStart"/>
+            <w:r>
+              <w:rPr>
+                <w:rFonts w:ascii="Helvetica" w:eastAsia="Helvetica" w:hAnsi="Helvetica" w:cs="Helvetica"/>
+                <w:b/>
+                <w:color w:val="000000"/>
+                <w:sz w:val="22"/>
+                <w:szCs w:val="22"/>
+              </w:rPr>
+              <w:t>femenino</w:t>
+            </w:r>
+            <w:proofErr w:type="spellEnd"/>
+            <w:r>
+              <w:rPr>
+                <w:rFonts w:ascii="Helvetica" w:eastAsia="Helvetica" w:hAnsi="Helvetica" w:cs="Helvetica"/>
+                <w:color w:val="000000"/>
+                <w:sz w:val="22"/>
+                <w:szCs w:val="22"/>
               </w:rPr>
               <w:t xml:space="preserve">  </w:t>
             </w:r>
             <w:r>
               <w:rPr>
-                <w:rFonts w:ascii="Helvetica" w:hAnsi="Helvetica" w:eastAsia="Helvetica" w:cs="Helvetica"/>
-                <w:i w:val="false"/>
-                <w:b w:val="false"/>
-                <w:u w:val="none"/>
-                <w:strike w:val="false"/>
-                <w:sz w:val="22"/>
-                <w:szCs w:val="22"/>
-                <w:color w:val="000000"/>
+                <w:rFonts w:ascii="Helvetica" w:eastAsia="Helvetica" w:hAnsi="Helvetica" w:cs="Helvetica"/>
+                <w:color w:val="000000"/>
+                <w:sz w:val="22"/>
+                <w:szCs w:val="22"/>
               </w:rPr>
               <w:br/>
-            </w:r>
-            <w:r>
-              <w:rPr>
-                <w:rFonts w:ascii="Helvetica" w:hAnsi="Helvetica" w:eastAsia="Helvetica" w:cs="Helvetica"/>
-                <w:i w:val="false"/>
-                <w:b w:val="false"/>
-                <w:u w:val="none"/>
-                <w:strike w:val="false"/>
-                <w:sz w:val="22"/>
-                <w:szCs w:val="22"/>
-                <w:color w:val="000000"/>
-              </w:rPr>
-              <w:t xml:space="preserve">N = 44,431</w:t>
-            </w:r>
-            <w:r>
-              <w:rPr>
-                <w:rFonts w:ascii="Helvetica" w:hAnsi="Helvetica" w:eastAsia="Helvetica" w:cs="Helvetica"/>
-                <w:i w:val="false"/>
-                <w:b w:val="false"/>
-                <w:u w:val="none"/>
-                <w:strike w:val="false"/>
+              <w:t>N = 44,431</w:t>
+            </w:r>
+            <w:r>
+              <w:rPr>
+                <w:rFonts w:ascii="Helvetica" w:eastAsia="Helvetica" w:hAnsi="Helvetica" w:cs="Helvetica"/>
+                <w:color w:val="000000"/>
+                <w:sz w:val="22"/>
+                <w:szCs w:val="22"/>
                 <w:vertAlign w:val="superscript"/>
-                <w:sz w:val="22"/>
-                <w:szCs w:val="22"/>
-                <w:color w:val="000000"/>
-              </w:rPr>
-              <w:t xml:space="preserve">1</w:t>
+              </w:rPr>
+              <w:t>1</w:t>
             </w:r>
           </w:p>
         </w:tc>
         <w:tc>
           <w:tcPr>
+            <w:tcW w:w="3088" w:type="dxa"/>
             <w:tcBorders>
-              <w:bottom w:val="single" w:sz="8" w:space="0" w:color="000000"/>
               <w:top w:val="single" w:sz="8" w:space="0" w:color="000000"/>
               <w:left w:val="none" w:sz="0" w:space="0" w:color="000000"/>
+              <w:bottom w:val="single" w:sz="8" w:space="0" w:color="000000"/>
               <w:right w:val="none" w:sz="0" w:space="0" w:color="000000"/>
             </w:tcBorders>
             <w:shd w:val="clear" w:color="auto" w:fill="FFFFFF"/>
             <w:tcMar>
               <w:top w:w="0" w:type="dxa"/>
+              <w:left w:w="0" w:type="dxa"/>
               <w:bottom w:w="0" w:type="dxa"/>
-              <w:left w:w="0" w:type="dxa"/>
               <w:right w:w="0" w:type="dxa"/>
             </w:tcMar>
             <w:vAlign w:val="center"/>
           </w:tcPr>
           <w:p>
             <w:pPr>
-              <w:pStyle w:val="Normal"/>
-              <w:jc w:val="center"/>
               <w:pBdr>
-                <w:bottom w:val="none" w:sz="0" w:space="0" w:color="000000"/>
                 <w:top w:val="none" w:sz="0" w:space="0" w:color="000000"/>
                 <w:left w:val="none" w:sz="0" w:space="0" w:color="000000"/>
+                <w:bottom w:val="none" w:sz="0" w:space="0" w:color="000000"/>
                 <w:right w:val="none" w:sz="0" w:space="0" w:color="000000"/>
               </w:pBdr>
-              <w:spacing w:after="40" w:before="40" w:line="240"/>
-              <w:ind w:left="100" w:right="100" w:firstLine="0" w:firstLineChars="0"/>
-              <w:rPr>
-                <w:rFonts w:ascii="Helvetica" w:hAnsi="Helvetica" w:eastAsia="Helvetica" w:cs="Helvetica"/>
-                <w:i w:val="false"/>
-                <w:b w:val="false"/>
-                <w:u w:val="none"/>
-                <w:strike w:val="false"/>
-                <w:sz w:val="22"/>
-                <w:szCs w:val="22"/>
-                <w:color w:val="000000"/>
+              <w:spacing w:before="40" w:after="40"/>
+              <w:ind w:left="100" w:right="100"/>
+              <w:jc w:val="center"/>
+              <w:rPr>
+                <w:rFonts w:ascii="Helvetica" w:eastAsia="Helvetica" w:hAnsi="Helvetica" w:cs="Helvetica"/>
+                <w:color w:val="000000"/>
+                <w:sz w:val="22"/>
+                <w:szCs w:val="22"/>
               </w:rPr>
             </w:pPr>
-            <w:r>
-              <w:rPr>
-                <w:rFonts w:ascii="Helvetica" w:hAnsi="Helvetica" w:eastAsia="Helvetica" w:cs="Helvetica"/>
-                <w:i w:val="false"/>
-                <w:b w:val="true"/>
-                <w:u w:val="none"/>
-                <w:strike w:val="false"/>
-                <w:sz w:val="22"/>
-                <w:szCs w:val="22"/>
-                <w:color w:val="000000"/>
-              </w:rPr>
-              <w:t xml:space="preserve">masculino</w:t>
-            </w:r>
-            <w:r>
-              <w:rPr>
-                <w:rFonts w:ascii="Helvetica" w:hAnsi="Helvetica" w:eastAsia="Helvetica" w:cs="Helvetica"/>
-                <w:i w:val="false"/>
-                <w:b w:val="false"/>
-                <w:u w:val="none"/>
-                <w:strike w:val="false"/>
-                <w:sz w:val="22"/>
-                <w:szCs w:val="22"/>
-                <w:color w:val="000000"/>
+            <w:proofErr w:type="spellStart"/>
+            <w:r>
+              <w:rPr>
+                <w:rFonts w:ascii="Helvetica" w:eastAsia="Helvetica" w:hAnsi="Helvetica" w:cs="Helvetica"/>
+                <w:b/>
+                <w:color w:val="000000"/>
+                <w:sz w:val="22"/>
+                <w:szCs w:val="22"/>
+              </w:rPr>
+              <w:t>masculino</w:t>
+            </w:r>
+            <w:proofErr w:type="spellEnd"/>
+            <w:r>
+              <w:rPr>
+                <w:rFonts w:ascii="Helvetica" w:eastAsia="Helvetica" w:hAnsi="Helvetica" w:cs="Helvetica"/>
+                <w:color w:val="000000"/>
+                <w:sz w:val="22"/>
+                <w:szCs w:val="22"/>
               </w:rPr>
               <w:t xml:space="preserve">  </w:t>
             </w:r>
             <w:r>
               <w:rPr>
-                <w:rFonts w:ascii="Helvetica" w:hAnsi="Helvetica" w:eastAsia="Helvetica" w:cs="Helvetica"/>
-                <w:i w:val="false"/>
-                <w:b w:val="false"/>
-                <w:u w:val="none"/>
-                <w:strike w:val="false"/>
-                <w:sz w:val="22"/>
-                <w:szCs w:val="22"/>
-                <w:color w:val="000000"/>
+                <w:rFonts w:ascii="Helvetica" w:eastAsia="Helvetica" w:hAnsi="Helvetica" w:cs="Helvetica"/>
+                <w:color w:val="000000"/>
+                <w:sz w:val="22"/>
+                <w:szCs w:val="22"/>
               </w:rPr>
               <w:br/>
-            </w:r>
-            <w:r>
-              <w:rPr>
-                <w:rFonts w:ascii="Helvetica" w:hAnsi="Helvetica" w:eastAsia="Helvetica" w:cs="Helvetica"/>
-                <w:i w:val="false"/>
-                <w:b w:val="false"/>
-                <w:u w:val="none"/>
-                <w:strike w:val="false"/>
-                <w:sz w:val="22"/>
-                <w:szCs w:val="22"/>
-                <w:color w:val="000000"/>
-              </w:rPr>
-              <w:t xml:space="preserve">N = 25,409</w:t>
-            </w:r>
-            <w:r>
-              <w:rPr>
-                <w:rFonts w:ascii="Helvetica" w:hAnsi="Helvetica" w:eastAsia="Helvetica" w:cs="Helvetica"/>
-                <w:i w:val="false"/>
-                <w:b w:val="false"/>
-                <w:u w:val="none"/>
-                <w:strike w:val="false"/>
+              <w:t>N = 25,409</w:t>
+            </w:r>
+            <w:r>
+              <w:rPr>
+                <w:rFonts w:ascii="Helvetica" w:eastAsia="Helvetica" w:hAnsi="Helvetica" w:cs="Helvetica"/>
+                <w:color w:val="000000"/>
+                <w:sz w:val="22"/>
+                <w:szCs w:val="22"/>
                 <w:vertAlign w:val="superscript"/>
-                <w:sz w:val="22"/>
-                <w:szCs w:val="22"/>
-                <w:color w:val="000000"/>
-              </w:rPr>
-              <w:t xml:space="preserve">1</w:t>
+              </w:rPr>
+              <w:t>1</w:t>
             </w:r>
           </w:p>
         </w:tc>
       </w:tr>
       <w:tr>
         <w:trPr>
-          <w:trHeight w:val="620" w:hRule="auto"/>
+          <w:jc w:val="center"/>
         </w:trPr>
         <w:tc>
           <w:tcPr>
+            <w:tcW w:w="2576" w:type="dxa"/>
             <w:tcBorders>
-              <w:bottom w:val="none" w:sz="0" w:space="0" w:color="000000"/>
               <w:top w:val="single" w:sz="8" w:space="0" w:color="000000"/>
               <w:left w:val="none" w:sz="0" w:space="0" w:color="000000"/>
+              <w:bottom w:val="none" w:sz="0" w:space="0" w:color="000000"/>
               <w:right w:val="none" w:sz="0" w:space="0" w:color="000000"/>
             </w:tcBorders>
             <w:shd w:val="clear" w:color="auto" w:fill="FFFFFF"/>
             <w:tcMar>
               <w:top w:w="0" w:type="dxa"/>
+              <w:left w:w="0" w:type="dxa"/>
               <w:bottom w:w="0" w:type="dxa"/>
-              <w:left w:w="0" w:type="dxa"/>
               <w:right w:w="0" w:type="dxa"/>
             </w:tcMar>
-            <w:vAlign w:val="top"/>
           </w:tcPr>
           <w:p>
             <w:pPr>
-              <w:pStyle w:val="Normal"/>
-              <w:jc w:val="left"/>
               <w:pBdr>
-                <w:bottom w:val="none" w:sz="0" w:space="0" w:color="000000"/>
                 <w:top w:val="none" w:sz="0" w:space="0" w:color="000000"/>
                 <w:left w:val="none" w:sz="0" w:space="0" w:color="000000"/>
+                <w:bottom w:val="none" w:sz="0" w:space="0" w:color="000000"/>
                 <w:right w:val="none" w:sz="0" w:space="0" w:color="000000"/>
               </w:pBdr>
-              <w:spacing w:after="100" w:before="100" w:line="240"/>
-              <w:ind w:left="100" w:right="100" w:firstLine="0" w:firstLineChars="0"/>
-              <w:rPr>
-                <w:rFonts w:ascii="Helvetica" w:hAnsi="Helvetica" w:eastAsia="Helvetica" w:cs="Helvetica"/>
-                <w:i w:val="false"/>
-                <w:b w:val="true"/>
-                <w:u w:val="none"/>
-                <w:strike w:val="false"/>
-                <w:sz w:val="22"/>
-                <w:szCs w:val="22"/>
-                <w:color w:val="000000"/>
+              <w:spacing w:before="100" w:after="100"/>
+              <w:ind w:left="100" w:right="100"/>
+              <w:rPr>
+                <w:rFonts w:ascii="Helvetica" w:eastAsia="Helvetica" w:hAnsi="Helvetica" w:cs="Helvetica"/>
+                <w:b/>
+                <w:color w:val="000000"/>
+                <w:sz w:val="22"/>
+                <w:szCs w:val="22"/>
               </w:rPr>
             </w:pPr>
-            <w:r>
-              <w:rPr>
-                <w:rFonts w:ascii="Helvetica" w:hAnsi="Helvetica" w:eastAsia="Helvetica" w:cs="Helvetica"/>
-                <w:i w:val="false"/>
-                <w:b w:val="true"/>
-                <w:u w:val="none"/>
-                <w:strike w:val="false"/>
-                <w:sz w:val="22"/>
-                <w:szCs w:val="22"/>
-                <w:color w:val="000000"/>
-              </w:rPr>
-              <w:t xml:space="preserve">Índice CPO-D</w:t>
+            <w:proofErr w:type="spellStart"/>
+            <w:r>
+              <w:rPr>
+                <w:rFonts w:ascii="Helvetica" w:eastAsia="Helvetica" w:hAnsi="Helvetica" w:cs="Helvetica"/>
+                <w:b/>
+                <w:color w:val="000000"/>
+                <w:sz w:val="22"/>
+                <w:szCs w:val="22"/>
+              </w:rPr>
+              <w:t>Índice</w:t>
+            </w:r>
+            <w:proofErr w:type="spellEnd"/>
+            <w:r>
+              <w:rPr>
+                <w:rFonts w:ascii="Helvetica" w:eastAsia="Helvetica" w:hAnsi="Helvetica" w:cs="Helvetica"/>
+                <w:b/>
+                <w:color w:val="000000"/>
+                <w:sz w:val="22"/>
+                <w:szCs w:val="22"/>
+              </w:rPr>
+              <w:t xml:space="preserve"> CPO-D</w:t>
             </w:r>
           </w:p>
         </w:tc>
         <w:tc>
           <w:tcPr>
+            <w:tcW w:w="3088" w:type="dxa"/>
             <w:tcBorders>
-              <w:bottom w:val="none" w:sz="0" w:space="0" w:color="000000"/>
               <w:top w:val="single" w:sz="8" w:space="0" w:color="000000"/>
               <w:left w:val="none" w:sz="0" w:space="0" w:color="000000"/>
+              <w:bottom w:val="none" w:sz="0" w:space="0" w:color="000000"/>
               <w:right w:val="none" w:sz="0" w:space="0" w:color="000000"/>
             </w:tcBorders>
             <w:shd w:val="clear" w:color="auto" w:fill="FFFFFF"/>
             <w:tcMar>
               <w:top w:w="0" w:type="dxa"/>
+              <w:left w:w="0" w:type="dxa"/>
               <w:bottom w:w="0" w:type="dxa"/>
-              <w:left w:w="0" w:type="dxa"/>
               <w:right w:w="0" w:type="dxa"/>
             </w:tcMar>
-            <w:vAlign w:val="top"/>
           </w:tcPr>
           <w:p>
             <w:pPr>
-              <w:pStyle w:val="Normal"/>
-              <w:jc w:val="center"/>
               <w:pBdr>
-                <w:bottom w:val="none" w:sz="0" w:space="0" w:color="000000"/>
                 <w:top w:val="none" w:sz="0" w:space="0" w:color="000000"/>
                 <w:left w:val="none" w:sz="0" w:space="0" w:color="000000"/>
+                <w:bottom w:val="none" w:sz="0" w:space="0" w:color="000000"/>
                 <w:right w:val="none" w:sz="0" w:space="0" w:color="000000"/>
               </w:pBdr>
-              <w:spacing w:after="100" w:before="100" w:line="240"/>
-              <w:ind w:left="100" w:right="100" w:firstLine="0" w:firstLineChars="0"/>
-              <w:rPr>
-                <w:rFonts w:ascii="Helvetica" w:hAnsi="Helvetica" w:eastAsia="Helvetica" w:cs="Helvetica"/>
-                <w:i w:val="false"/>
-                <w:b w:val="false"/>
-                <w:u w:val="none"/>
-                <w:strike w:val="false"/>
-                <w:sz w:val="22"/>
-                <w:szCs w:val="22"/>
-                <w:color w:val="000000"/>
+              <w:spacing w:before="100" w:after="100"/>
+              <w:ind w:left="100" w:right="100"/>
+              <w:jc w:val="center"/>
+              <w:rPr>
+                <w:rFonts w:ascii="Helvetica" w:eastAsia="Helvetica" w:hAnsi="Helvetica" w:cs="Helvetica"/>
+                <w:color w:val="000000"/>
+                <w:sz w:val="22"/>
+                <w:szCs w:val="22"/>
               </w:rPr>
             </w:pPr>
             <w:r>
               <w:rPr>
-                <w:rFonts w:ascii="Helvetica" w:hAnsi="Helvetica" w:eastAsia="Helvetica" w:cs="Helvetica"/>
-                <w:i w:val="false"/>
-                <w:b w:val="false"/>
-                <w:u w:val="none"/>
-                <w:strike w:val="false"/>
-                <w:sz w:val="22"/>
-                <w:szCs w:val="22"/>
-                <w:color w:val="000000"/>
-              </w:rPr>
-              <w:t xml:space="preserve">14.9 ± 7.5 (rango: 0.0-32.0)</w:t>
+                <w:rFonts w:ascii="Helvetica" w:eastAsia="Helvetica" w:hAnsi="Helvetica" w:cs="Helvetica"/>
+                <w:color w:val="000000"/>
+                <w:sz w:val="22"/>
+                <w:szCs w:val="22"/>
+              </w:rPr>
+              <w:t>14.9 ± 7.5 (</w:t>
+            </w:r>
+            <w:proofErr w:type="spellStart"/>
+            <w:r>
+              <w:rPr>
+                <w:rFonts w:ascii="Helvetica" w:eastAsia="Helvetica" w:hAnsi="Helvetica" w:cs="Helvetica"/>
+                <w:color w:val="000000"/>
+                <w:sz w:val="22"/>
+                <w:szCs w:val="22"/>
+              </w:rPr>
+              <w:t>rango</w:t>
+            </w:r>
+            <w:proofErr w:type="spellEnd"/>
+            <w:r>
+              <w:rPr>
+                <w:rFonts w:ascii="Helvetica" w:eastAsia="Helvetica" w:hAnsi="Helvetica" w:cs="Helvetica"/>
+                <w:color w:val="000000"/>
+                <w:sz w:val="22"/>
+                <w:szCs w:val="22"/>
+              </w:rPr>
+              <w:t>: 0.0-32.0)</w:t>
             </w:r>
           </w:p>
         </w:tc>
         <w:tc>
           <w:tcPr>
+            <w:tcW w:w="3088" w:type="dxa"/>
             <w:tcBorders>
-              <w:bottom w:val="none" w:sz="0" w:space="0" w:color="000000"/>
               <w:top w:val="single" w:sz="8" w:space="0" w:color="000000"/>
               <w:left w:val="none" w:sz="0" w:space="0" w:color="000000"/>
+              <w:bottom w:val="none" w:sz="0" w:space="0" w:color="000000"/>
               <w:right w:val="none" w:sz="0" w:space="0" w:color="000000"/>
             </w:tcBorders>
             <w:shd w:val="clear" w:color="auto" w:fill="FFFFFF"/>
             <w:tcMar>
               <w:top w:w="0" w:type="dxa"/>
+              <w:left w:w="0" w:type="dxa"/>
               <w:bottom w:w="0" w:type="dxa"/>
-              <w:left w:w="0" w:type="dxa"/>
               <w:right w:w="0" w:type="dxa"/>
             </w:tcMar>
-            <w:vAlign w:val="top"/>
           </w:tcPr>
           <w:p>
             <w:pPr>
-              <w:pStyle w:val="Normal"/>
-              <w:jc w:val="center"/>
               <w:pBdr>
-                <w:bottom w:val="none" w:sz="0" w:space="0" w:color="000000"/>
                 <w:top w:val="none" w:sz="0" w:space="0" w:color="000000"/>
                 <w:left w:val="none" w:sz="0" w:space="0" w:color="000000"/>
+                <w:bottom w:val="none" w:sz="0" w:space="0" w:color="000000"/>
                 <w:right w:val="none" w:sz="0" w:space="0" w:color="000000"/>
               </w:pBdr>
-              <w:spacing w:after="100" w:before="100" w:line="240"/>
-              <w:ind w:left="100" w:right="100" w:firstLine="0" w:firstLineChars="0"/>
-              <w:rPr>
-                <w:rFonts w:ascii="Helvetica" w:hAnsi="Helvetica" w:eastAsia="Helvetica" w:cs="Helvetica"/>
-                <w:i w:val="false"/>
-                <w:b w:val="false"/>
-                <w:u w:val="none"/>
-                <w:strike w:val="false"/>
-                <w:sz w:val="22"/>
-                <w:szCs w:val="22"/>
-                <w:color w:val="000000"/>
+              <w:spacing w:before="100" w:after="100"/>
+              <w:ind w:left="100" w:right="100"/>
+              <w:jc w:val="center"/>
+              <w:rPr>
+                <w:rFonts w:ascii="Helvetica" w:eastAsia="Helvetica" w:hAnsi="Helvetica" w:cs="Helvetica"/>
+                <w:color w:val="000000"/>
+                <w:sz w:val="22"/>
+                <w:szCs w:val="22"/>
               </w:rPr>
             </w:pPr>
             <w:r>
               <w:rPr>
-                <w:rFonts w:ascii="Helvetica" w:hAnsi="Helvetica" w:eastAsia="Helvetica" w:cs="Helvetica"/>
-                <w:i w:val="false"/>
-                <w:b w:val="false"/>
-                <w:u w:val="none"/>
-                <w:strike w:val="false"/>
-                <w:sz w:val="22"/>
-                <w:szCs w:val="22"/>
-                <w:color w:val="000000"/>
-              </w:rPr>
-              <w:t xml:space="preserve">15.3 ± 7.3 (rango: 0.0-32.0)</w:t>
+                <w:rFonts w:ascii="Helvetica" w:eastAsia="Helvetica" w:hAnsi="Helvetica" w:cs="Helvetica"/>
+                <w:color w:val="000000"/>
+                <w:sz w:val="22"/>
+                <w:szCs w:val="22"/>
+              </w:rPr>
+              <w:t>15.3 ± 7.3 (</w:t>
+            </w:r>
+            <w:proofErr w:type="spellStart"/>
+            <w:r>
+              <w:rPr>
+                <w:rFonts w:ascii="Helvetica" w:eastAsia="Helvetica" w:hAnsi="Helvetica" w:cs="Helvetica"/>
+                <w:color w:val="000000"/>
+                <w:sz w:val="22"/>
+                <w:szCs w:val="22"/>
+              </w:rPr>
+              <w:t>rango</w:t>
+            </w:r>
+            <w:proofErr w:type="spellEnd"/>
+            <w:r>
+              <w:rPr>
+                <w:rFonts w:ascii="Helvetica" w:eastAsia="Helvetica" w:hAnsi="Helvetica" w:cs="Helvetica"/>
+                <w:color w:val="000000"/>
+                <w:sz w:val="22"/>
+                <w:szCs w:val="22"/>
+              </w:rPr>
+              <w:t>: 0.0-32.0)</w:t>
             </w:r>
           </w:p>
         </w:tc>
         <w:tc>
           <w:tcPr>
+            <w:tcW w:w="3088" w:type="dxa"/>
             <w:tcBorders>
-              <w:bottom w:val="none" w:sz="0" w:space="0" w:color="000000"/>
               <w:top w:val="single" w:sz="8" w:space="0" w:color="000000"/>
               <w:left w:val="none" w:sz="0" w:space="0" w:color="000000"/>
+              <w:bottom w:val="none" w:sz="0" w:space="0" w:color="000000"/>
               <w:right w:val="none" w:sz="0" w:space="0" w:color="000000"/>
             </w:tcBorders>
             <w:shd w:val="clear" w:color="auto" w:fill="FFFFFF"/>
             <w:tcMar>
               <w:top w:w="0" w:type="dxa"/>
+              <w:left w:w="0" w:type="dxa"/>
               <w:bottom w:w="0" w:type="dxa"/>
-              <w:left w:w="0" w:type="dxa"/>
               <w:right w:w="0" w:type="dxa"/>
             </w:tcMar>
-            <w:vAlign w:val="top"/>
           </w:tcPr>
           <w:p>
             <w:pPr>
-              <w:pStyle w:val="Normal"/>
-              <w:jc w:val="center"/>
               <w:pBdr>
-                <w:bottom w:val="none" w:sz="0" w:space="0" w:color="000000"/>
                 <w:top w:val="none" w:sz="0" w:space="0" w:color="000000"/>
                 <w:left w:val="none" w:sz="0" w:space="0" w:color="000000"/>
+                <w:bottom w:val="none" w:sz="0" w:space="0" w:color="000000"/>
                 <w:right w:val="none" w:sz="0" w:space="0" w:color="000000"/>
               </w:pBdr>
-              <w:spacing w:after="100" w:before="100" w:line="240"/>
-              <w:ind w:left="100" w:right="100" w:firstLine="0" w:firstLineChars="0"/>
-              <w:rPr>
-                <w:rFonts w:ascii="Helvetica" w:hAnsi="Helvetica" w:eastAsia="Helvetica" w:cs="Helvetica"/>
-                <w:i w:val="false"/>
-                <w:b w:val="false"/>
-                <w:u w:val="none"/>
-                <w:strike w:val="false"/>
-                <w:sz w:val="22"/>
-                <w:szCs w:val="22"/>
-                <w:color w:val="000000"/>
+              <w:spacing w:before="100" w:after="100"/>
+              <w:ind w:left="100" w:right="100"/>
+              <w:jc w:val="center"/>
+              <w:rPr>
+                <w:rFonts w:ascii="Helvetica" w:eastAsia="Helvetica" w:hAnsi="Helvetica" w:cs="Helvetica"/>
+                <w:color w:val="000000"/>
+                <w:sz w:val="22"/>
+                <w:szCs w:val="22"/>
               </w:rPr>
             </w:pPr>
             <w:r>
               <w:rPr>
-                <w:rFonts w:ascii="Helvetica" w:hAnsi="Helvetica" w:eastAsia="Helvetica" w:cs="Helvetica"/>
-                <w:i w:val="false"/>
-                <w:b w:val="false"/>
-                <w:u w:val="none"/>
-                <w:strike w:val="false"/>
-                <w:sz w:val="22"/>
-                <w:szCs w:val="22"/>
-                <w:color w:val="000000"/>
-              </w:rPr>
-              <w:t xml:space="preserve">14.1 ± 7.8 (rango: 0.0-32.0)</w:t>
+                <w:rFonts w:ascii="Helvetica" w:eastAsia="Helvetica" w:hAnsi="Helvetica" w:cs="Helvetica"/>
+                <w:color w:val="000000"/>
+                <w:sz w:val="22"/>
+                <w:szCs w:val="22"/>
+              </w:rPr>
+              <w:t>14.1 ± 7.8 (</w:t>
+            </w:r>
+            <w:proofErr w:type="spellStart"/>
+            <w:r>
+              <w:rPr>
+                <w:rFonts w:ascii="Helvetica" w:eastAsia="Helvetica" w:hAnsi="Helvetica" w:cs="Helvetica"/>
+                <w:color w:val="000000"/>
+                <w:sz w:val="22"/>
+                <w:szCs w:val="22"/>
+              </w:rPr>
+              <w:t>rango</w:t>
+            </w:r>
+            <w:proofErr w:type="spellEnd"/>
+            <w:r>
+              <w:rPr>
+                <w:rFonts w:ascii="Helvetica" w:eastAsia="Helvetica" w:hAnsi="Helvetica" w:cs="Helvetica"/>
+                <w:color w:val="000000"/>
+                <w:sz w:val="22"/>
+                <w:szCs w:val="22"/>
+              </w:rPr>
+              <w:t>: 0.0-32.0)</w:t>
             </w:r>
           </w:p>
         </w:tc>
       </w:tr>
       <w:tr>
         <w:trPr>
-          <w:trHeight w:val="573" w:hRule="auto"/>
+          <w:jc w:val="center"/>
         </w:trPr>
         <w:tc>
           <w:tcPr>
+            <w:tcW w:w="2576" w:type="dxa"/>
             <w:tcBorders>
-              <w:bottom w:val="none" w:sz="0" w:space="0" w:color="000000"/>
               <w:top w:val="none" w:sz="0" w:space="0" w:color="000000"/>
               <w:left w:val="none" w:sz="0" w:space="0" w:color="000000"/>
+              <w:bottom w:val="none" w:sz="0" w:space="0" w:color="000000"/>
               <w:right w:val="none" w:sz="0" w:space="0" w:color="000000"/>
             </w:tcBorders>
             <w:shd w:val="clear" w:color="auto" w:fill="FFFFFF"/>
             <w:tcMar>
               <w:top w:w="0" w:type="dxa"/>
+              <w:left w:w="0" w:type="dxa"/>
               <w:bottom w:w="0" w:type="dxa"/>
-              <w:left w:w="0" w:type="dxa"/>
               <w:right w:w="0" w:type="dxa"/>
             </w:tcMar>
-            <w:vAlign w:val="top"/>
           </w:tcPr>
           <w:p>
             <w:pPr>
-              <w:pStyle w:val="Normal"/>
-              <w:jc w:val="left"/>
               <w:pBdr>
-                <w:bottom w:val="none" w:sz="0" w:space="0" w:color="000000"/>
                 <w:top w:val="none" w:sz="0" w:space="0" w:color="000000"/>
                 <w:left w:val="none" w:sz="0" w:space="0" w:color="000000"/>
+                <w:bottom w:val="none" w:sz="0" w:space="0" w:color="000000"/>
                 <w:right w:val="none" w:sz="0" w:space="0" w:color="000000"/>
               </w:pBdr>
-              <w:spacing w:after="100" w:before="100" w:line="240"/>
-              <w:ind w:left="100" w:right="100" w:firstLine="0" w:firstLineChars="0"/>
-              <w:rPr>
-                <w:rFonts w:ascii="Helvetica" w:hAnsi="Helvetica" w:eastAsia="Helvetica" w:cs="Helvetica"/>
-                <w:i w:val="false"/>
-                <w:b w:val="true"/>
-                <w:u w:val="none"/>
-                <w:strike w:val="false"/>
-                <w:sz w:val="22"/>
-                <w:szCs w:val="22"/>
-                <w:color w:val="000000"/>
+              <w:spacing w:before="100" w:after="100"/>
+              <w:ind w:left="100" w:right="100"/>
+              <w:rPr>
+                <w:rFonts w:ascii="Helvetica" w:eastAsia="Helvetica" w:hAnsi="Helvetica" w:cs="Helvetica"/>
+                <w:b/>
+                <w:color w:val="000000"/>
+                <w:sz w:val="22"/>
+                <w:szCs w:val="22"/>
               </w:rPr>
             </w:pPr>
             <w:r>
               <w:rPr>
-                <w:rFonts w:ascii="Helvetica" w:hAnsi="Helvetica" w:eastAsia="Helvetica" w:cs="Helvetica"/>
-                <w:i w:val="false"/>
-                <w:b w:val="true"/>
-                <w:u w:val="none"/>
-                <w:strike w:val="false"/>
-                <w:sz w:val="22"/>
-                <w:szCs w:val="22"/>
-                <w:color w:val="000000"/>
-              </w:rPr>
-              <w:t xml:space="preserve">Estado de salud bucal</w:t>
-            </w:r>
+                <w:rFonts w:ascii="Helvetica" w:eastAsia="Helvetica" w:hAnsi="Helvetica" w:cs="Helvetica"/>
+                <w:b/>
+                <w:color w:val="000000"/>
+                <w:sz w:val="22"/>
+                <w:szCs w:val="22"/>
+              </w:rPr>
+              <w:t xml:space="preserve">Estado de </w:t>
+            </w:r>
+            <w:proofErr w:type="spellStart"/>
+            <w:r>
+              <w:rPr>
+                <w:rFonts w:ascii="Helvetica" w:eastAsia="Helvetica" w:hAnsi="Helvetica" w:cs="Helvetica"/>
+                <w:b/>
+                <w:color w:val="000000"/>
+                <w:sz w:val="22"/>
+                <w:szCs w:val="22"/>
+              </w:rPr>
+              <w:t>salud</w:t>
+            </w:r>
+            <w:proofErr w:type="spellEnd"/>
+            <w:r>
+              <w:rPr>
+                <w:rFonts w:ascii="Helvetica" w:eastAsia="Helvetica" w:hAnsi="Helvetica" w:cs="Helvetica"/>
+                <w:b/>
+                <w:color w:val="000000"/>
+                <w:sz w:val="22"/>
+                <w:szCs w:val="22"/>
+              </w:rPr>
+              <w:t xml:space="preserve"> </w:t>
+            </w:r>
+            <w:proofErr w:type="spellStart"/>
+            <w:r>
+              <w:rPr>
+                <w:rFonts w:ascii="Helvetica" w:eastAsia="Helvetica" w:hAnsi="Helvetica" w:cs="Helvetica"/>
+                <w:b/>
+                <w:color w:val="000000"/>
+                <w:sz w:val="22"/>
+                <w:szCs w:val="22"/>
+              </w:rPr>
+              <w:t>bucal</w:t>
+            </w:r>
+            <w:proofErr w:type="spellEnd"/>
           </w:p>
         </w:tc>
         <w:tc>
           <w:tcPr>
+            <w:tcW w:w="3088" w:type="dxa"/>
             <w:tcBorders>
-              <w:bottom w:val="none" w:sz="0" w:space="0" w:color="000000"/>
               <w:top w:val="none" w:sz="0" w:space="0" w:color="000000"/>
               <w:left w:val="none" w:sz="0" w:space="0" w:color="000000"/>
+              <w:bottom w:val="none" w:sz="0" w:space="0" w:color="000000"/>
               <w:right w:val="none" w:sz="0" w:space="0" w:color="000000"/>
             </w:tcBorders>
             <w:shd w:val="clear" w:color="auto" w:fill="FFFFFF"/>
             <w:tcMar>
               <w:top w:w="0" w:type="dxa"/>
+              <w:left w:w="0" w:type="dxa"/>
               <w:bottom w:w="0" w:type="dxa"/>
-              <w:left w:w="0" w:type="dxa"/>
               <w:right w:w="0" w:type="dxa"/>
             </w:tcMar>
-            <w:vAlign w:val="top"/>
           </w:tcPr>
           <w:p>
             <w:pPr>
-              <w:pStyle w:val="Normal"/>
-              <w:jc w:val="center"/>
               <w:pBdr>
-                <w:bottom w:val="none" w:sz="0" w:space="0" w:color="000000"/>
                 <w:top w:val="none" w:sz="0" w:space="0" w:color="000000"/>
                 <w:left w:val="none" w:sz="0" w:space="0" w:color="000000"/>
+                <w:bottom w:val="none" w:sz="0" w:space="0" w:color="000000"/>
                 <w:right w:val="none" w:sz="0" w:space="0" w:color="000000"/>
               </w:pBdr>
-              <w:spacing w:after="100" w:before="100" w:line="240"/>
-              <w:ind w:left="100" w:right="100" w:firstLine="0" w:firstLineChars="0"/>
-              <w:rPr>
-                <w:rFonts w:ascii="Helvetica" w:hAnsi="Helvetica" w:eastAsia="Helvetica" w:cs="Helvetica"/>
-                <w:i w:val="false"/>
-                <w:b w:val="false"/>
-                <w:u w:val="none"/>
-                <w:strike w:val="false"/>
-                <w:sz w:val="22"/>
-                <w:szCs w:val="22"/>
-                <w:color w:val="000000"/>
+              <w:spacing w:before="100" w:after="100"/>
+              <w:ind w:left="100" w:right="100"/>
+              <w:jc w:val="center"/>
+              <w:rPr>
+                <w:rFonts w:ascii="Helvetica" w:eastAsia="Helvetica" w:hAnsi="Helvetica" w:cs="Helvetica"/>
+                <w:color w:val="000000"/>
+                <w:sz w:val="22"/>
+                <w:szCs w:val="22"/>
               </w:rPr>
             </w:pPr>
-            <w:r>
-              <w:rPr>
-                <w:rFonts w:ascii="Helvetica" w:hAnsi="Helvetica" w:eastAsia="Helvetica" w:cs="Helvetica"/>
-                <w:i w:val="false"/>
-                <w:b w:val="false"/>
-                <w:u w:val="none"/>
-                <w:strike w:val="false"/>
-                <w:sz w:val="22"/>
-                <w:szCs w:val="22"/>
-                <w:color w:val="000000"/>
-              </w:rPr>
-              <w:t xml:space="preserve"/>
-            </w:r>
           </w:p>
         </w:tc>
         <w:tc>
           <w:tcPr>
+            <w:tcW w:w="3088" w:type="dxa"/>
             <w:tcBorders>
-              <w:bottom w:val="none" w:sz="0" w:space="0" w:color="000000"/>
               <w:top w:val="none" w:sz="0" w:space="0" w:color="000000"/>
               <w:left w:val="none" w:sz="0" w:space="0" w:color="000000"/>
+              <w:bottom w:val="none" w:sz="0" w:space="0" w:color="000000"/>
               <w:right w:val="none" w:sz="0" w:space="0" w:color="000000"/>
             </w:tcBorders>
             <w:shd w:val="clear" w:color="auto" w:fill="FFFFFF"/>
             <w:tcMar>
               <w:top w:w="0" w:type="dxa"/>
+              <w:left w:w="0" w:type="dxa"/>
               <w:bottom w:w="0" w:type="dxa"/>
-              <w:left w:w="0" w:type="dxa"/>
               <w:right w:w="0" w:type="dxa"/>
             </w:tcMar>
-            <w:vAlign w:val="top"/>
           </w:tcPr>
           <w:p>
             <w:pPr>
-              <w:pStyle w:val="Normal"/>
-              <w:jc w:val="center"/>
               <w:pBdr>
-                <w:bottom w:val="none" w:sz="0" w:space="0" w:color="000000"/>
                 <w:top w:val="none" w:sz="0" w:space="0" w:color="000000"/>
                 <w:left w:val="none" w:sz="0" w:space="0" w:color="000000"/>
+                <w:bottom w:val="none" w:sz="0" w:space="0" w:color="000000"/>
                 <w:right w:val="none" w:sz="0" w:space="0" w:color="000000"/>
               </w:pBdr>
-              <w:spacing w:after="100" w:before="100" w:line="240"/>
-              <w:ind w:left="100" w:right="100" w:firstLine="0" w:firstLineChars="0"/>
-              <w:rPr>
-                <w:rFonts w:ascii="Helvetica" w:hAnsi="Helvetica" w:eastAsia="Helvetica" w:cs="Helvetica"/>
-                <w:i w:val="false"/>
-                <w:b w:val="false"/>
-                <w:u w:val="none"/>
-                <w:strike w:val="false"/>
-                <w:sz w:val="22"/>
-                <w:szCs w:val="22"/>
-                <w:color w:val="000000"/>
+              <w:spacing w:before="100" w:after="100"/>
+              <w:ind w:left="100" w:right="100"/>
+              <w:jc w:val="center"/>
+              <w:rPr>
+                <w:rFonts w:ascii="Helvetica" w:eastAsia="Helvetica" w:hAnsi="Helvetica" w:cs="Helvetica"/>
+                <w:color w:val="000000"/>
+                <w:sz w:val="22"/>
+                <w:szCs w:val="22"/>
               </w:rPr>
             </w:pPr>
-            <w:r>
-              <w:rPr>
-                <w:rFonts w:ascii="Helvetica" w:hAnsi="Helvetica" w:eastAsia="Helvetica" w:cs="Helvetica"/>
-                <w:i w:val="false"/>
-                <w:b w:val="false"/>
-                <w:u w:val="none"/>
-                <w:strike w:val="false"/>
-                <w:sz w:val="22"/>
-                <w:szCs w:val="22"/>
-                <w:color w:val="000000"/>
-              </w:rPr>
-              <w:t xml:space="preserve"/>
-            </w:r>
           </w:p>
         </w:tc>
         <w:tc>
           <w:tcPr>
+            <w:tcW w:w="3088" w:type="dxa"/>
             <w:tcBorders>
-              <w:bottom w:val="none" w:sz="0" w:space="0" w:color="000000"/>
               <w:top w:val="none" w:sz="0" w:space="0" w:color="000000"/>
               <w:left w:val="none" w:sz="0" w:space="0" w:color="000000"/>
+              <w:bottom w:val="none" w:sz="0" w:space="0" w:color="000000"/>
               <w:right w:val="none" w:sz="0" w:space="0" w:color="000000"/>
             </w:tcBorders>
             <w:shd w:val="clear" w:color="auto" w:fill="FFFFFF"/>
             <w:tcMar>
               <w:top w:w="0" w:type="dxa"/>
+              <w:left w:w="0" w:type="dxa"/>
               <w:bottom w:w="0" w:type="dxa"/>
-              <w:left w:w="0" w:type="dxa"/>
               <w:right w:w="0" w:type="dxa"/>
             </w:tcMar>
-            <w:vAlign w:val="top"/>
           </w:tcPr>
           <w:p>
             <w:pPr>
-              <w:pStyle w:val="Normal"/>
-              <w:jc w:val="center"/>
               <w:pBdr>
-                <w:bottom w:val="none" w:sz="0" w:space="0" w:color="000000"/>
                 <w:top w:val="none" w:sz="0" w:space="0" w:color="000000"/>
                 <w:left w:val="none" w:sz="0" w:space="0" w:color="000000"/>
+                <w:bottom w:val="none" w:sz="0" w:space="0" w:color="000000"/>
                 <w:right w:val="none" w:sz="0" w:space="0" w:color="000000"/>
               </w:pBdr>
-              <w:spacing w:after="100" w:before="100" w:line="240"/>
-              <w:ind w:left="100" w:right="100" w:firstLine="0" w:firstLineChars="0"/>
-              <w:rPr>
-                <w:rFonts w:ascii="Helvetica" w:hAnsi="Helvetica" w:eastAsia="Helvetica" w:cs="Helvetica"/>
-                <w:i w:val="false"/>
-                <w:b w:val="false"/>
-                <w:u w:val="none"/>
-                <w:strike w:val="false"/>
-                <w:sz w:val="22"/>
-                <w:szCs w:val="22"/>
-                <w:color w:val="000000"/>
+              <w:spacing w:before="100" w:after="100"/>
+              <w:ind w:left="100" w:right="100"/>
+              <w:jc w:val="center"/>
+              <w:rPr>
+                <w:rFonts w:ascii="Helvetica" w:eastAsia="Helvetica" w:hAnsi="Helvetica" w:cs="Helvetica"/>
+                <w:color w:val="000000"/>
+                <w:sz w:val="22"/>
+                <w:szCs w:val="22"/>
               </w:rPr>
             </w:pPr>
-            <w:r>
-              <w:rPr>
-                <w:rFonts w:ascii="Helvetica" w:hAnsi="Helvetica" w:eastAsia="Helvetica" w:cs="Helvetica"/>
-                <w:i w:val="false"/>
-                <w:b w:val="false"/>
-                <w:u w:val="none"/>
-                <w:strike w:val="false"/>
-                <w:sz w:val="22"/>
-                <w:szCs w:val="22"/>
-                <w:color w:val="000000"/>
-              </w:rPr>
-              <w:t xml:space="preserve"/>
-            </w:r>
           </w:p>
         </w:tc>
       </w:tr>
       <w:tr>
         <w:trPr>
-          <w:trHeight w:val="616" w:hRule="auto"/>
+          <w:jc w:val="center"/>
         </w:trPr>
         <w:tc>
           <w:tcPr>
+            <w:tcW w:w="2576" w:type="dxa"/>
             <w:tcBorders>
-              <w:bottom w:val="none" w:sz="0" w:space="0" w:color="000000"/>
               <w:top w:val="none" w:sz="0" w:space="0" w:color="000000"/>
               <w:left w:val="none" w:sz="0" w:space="0" w:color="000000"/>
+              <w:bottom w:val="none" w:sz="0" w:space="0" w:color="000000"/>
               <w:right w:val="none" w:sz="0" w:space="0" w:color="000000"/>
             </w:tcBorders>
             <w:shd w:val="clear" w:color="auto" w:fill="FFFFFF"/>
             <w:tcMar>
               <w:top w:w="0" w:type="dxa"/>
+              <w:left w:w="0" w:type="dxa"/>
               <w:bottom w:w="0" w:type="dxa"/>
-              <w:left w:w="0" w:type="dxa"/>
               <w:right w:w="0" w:type="dxa"/>
             </w:tcMar>
-            <w:vAlign w:val="top"/>
           </w:tcPr>
           <w:p>
             <w:pPr>
-              <w:pStyle w:val="Normal"/>
-              <w:jc w:val="left"/>
               <w:pBdr>
-                <w:bottom w:val="none" w:sz="0" w:space="0" w:color="000000"/>
                 <w:top w:val="none" w:sz="0" w:space="0" w:color="000000"/>
                 <w:left w:val="none" w:sz="0" w:space="0" w:color="000000"/>
+                <w:bottom w:val="none" w:sz="0" w:space="0" w:color="000000"/>
                 <w:right w:val="none" w:sz="0" w:space="0" w:color="000000"/>
               </w:pBdr>
-              <w:spacing w:after="100" w:before="100" w:line="240"/>
-              <w:ind w:left="300" w:right="100" w:firstLine="0" w:firstLineChars="0"/>
-              <w:rPr>
-                <w:rFonts w:ascii="Helvetica" w:hAnsi="Helvetica" w:eastAsia="Helvetica" w:cs="Helvetica"/>
-                <w:i w:val="false"/>
-                <w:b w:val="false"/>
-                <w:u w:val="none"/>
-                <w:strike w:val="false"/>
-                <w:sz w:val="22"/>
-                <w:szCs w:val="22"/>
-                <w:color w:val="000000"/>
+              <w:spacing w:before="100" w:after="100"/>
+              <w:ind w:left="300" w:right="100"/>
+              <w:rPr>
+                <w:rFonts w:ascii="Helvetica" w:eastAsia="Helvetica" w:hAnsi="Helvetica" w:cs="Helvetica"/>
+                <w:color w:val="000000"/>
+                <w:sz w:val="22"/>
+                <w:szCs w:val="22"/>
               </w:rPr>
             </w:pPr>
             <w:r>
               <w:rPr>
-                <w:rFonts w:ascii="Helvetica" w:hAnsi="Helvetica" w:eastAsia="Helvetica" w:cs="Helvetica"/>
-                <w:i w:val="false"/>
-                <w:b w:val="false"/>
-                <w:u w:val="none"/>
-                <w:strike w:val="false"/>
-                <w:sz w:val="22"/>
-                <w:szCs w:val="22"/>
-                <w:color w:val="000000"/>
-              </w:rPr>
-              <w:t xml:space="preserve">MUY BAJO</w:t>
+                <w:rFonts w:ascii="Helvetica" w:eastAsia="Helvetica" w:hAnsi="Helvetica" w:cs="Helvetica"/>
+                <w:color w:val="000000"/>
+                <w:sz w:val="22"/>
+                <w:szCs w:val="22"/>
+              </w:rPr>
+              <w:t>MUY BAJO</w:t>
             </w:r>
           </w:p>
         </w:tc>
         <w:tc>
           <w:tcPr>
+            <w:tcW w:w="3088" w:type="dxa"/>
             <w:tcBorders>
-              <w:bottom w:val="none" w:sz="0" w:space="0" w:color="000000"/>
               <w:top w:val="none" w:sz="0" w:space="0" w:color="000000"/>
               <w:left w:val="none" w:sz="0" w:space="0" w:color="000000"/>
+              <w:bottom w:val="none" w:sz="0" w:space="0" w:color="000000"/>
               <w:right w:val="none" w:sz="0" w:space="0" w:color="000000"/>
             </w:tcBorders>
             <w:shd w:val="clear" w:color="auto" w:fill="FFFFFF"/>
             <w:tcMar>
               <w:top w:w="0" w:type="dxa"/>
+              <w:left w:w="0" w:type="dxa"/>
               <w:bottom w:w="0" w:type="dxa"/>
-              <w:left w:w="0" w:type="dxa"/>
               <w:right w:w="0" w:type="dxa"/>
             </w:tcMar>
-            <w:vAlign w:val="top"/>
           </w:tcPr>
           <w:p>
             <w:pPr>
-              <w:pStyle w:val="Normal"/>
-              <w:jc w:val="center"/>
               <w:pBdr>
-                <w:bottom w:val="none" w:sz="0" w:space="0" w:color="000000"/>
                 <w:top w:val="none" w:sz="0" w:space="0" w:color="000000"/>
                 <w:left w:val="none" w:sz="0" w:space="0" w:color="000000"/>
+                <w:bottom w:val="none" w:sz="0" w:space="0" w:color="000000"/>
                 <w:right w:val="none" w:sz="0" w:space="0" w:color="000000"/>
               </w:pBdr>
-              <w:spacing w:after="100" w:before="100" w:line="240"/>
-              <w:ind w:left="100" w:right="100" w:firstLine="0" w:firstLineChars="0"/>
-              <w:rPr>
-                <w:rFonts w:ascii="Helvetica" w:hAnsi="Helvetica" w:eastAsia="Helvetica" w:cs="Helvetica"/>
-                <w:i w:val="false"/>
-                <w:b w:val="false"/>
-                <w:u w:val="none"/>
-                <w:strike w:val="false"/>
-                <w:sz w:val="22"/>
-                <w:szCs w:val="22"/>
-                <w:color w:val="000000"/>
+              <w:spacing w:before="100" w:after="100"/>
+              <w:ind w:left="100" w:right="100"/>
+              <w:jc w:val="center"/>
+              <w:rPr>
+                <w:rFonts w:ascii="Helvetica" w:eastAsia="Helvetica" w:hAnsi="Helvetica" w:cs="Helvetica"/>
+                <w:color w:val="000000"/>
+                <w:sz w:val="22"/>
+                <w:szCs w:val="22"/>
               </w:rPr>
             </w:pPr>
             <w:r>
               <w:rPr>
-                <w:rFonts w:ascii="Helvetica" w:hAnsi="Helvetica" w:eastAsia="Helvetica" w:cs="Helvetica"/>
-                <w:i w:val="false"/>
-                <w:b w:val="false"/>
-                <w:u w:val="none"/>
-                <w:strike w:val="false"/>
-                <w:sz w:val="22"/>
-                <w:szCs w:val="22"/>
-                <w:color w:val="000000"/>
-              </w:rPr>
-              <w:t xml:space="preserve">16,038 (23.0%)</w:t>
+                <w:rFonts w:ascii="Helvetica" w:eastAsia="Helvetica" w:hAnsi="Helvetica" w:cs="Helvetica"/>
+                <w:color w:val="000000"/>
+                <w:sz w:val="22"/>
+                <w:szCs w:val="22"/>
+              </w:rPr>
+              <w:t>16,038 (23.0%)</w:t>
             </w:r>
           </w:p>
         </w:tc>
         <w:tc>
           <w:tcPr>
+            <w:tcW w:w="3088" w:type="dxa"/>
             <w:tcBorders>
-              <w:bottom w:val="none" w:sz="0" w:space="0" w:color="000000"/>
               <w:top w:val="none" w:sz="0" w:space="0" w:color="000000"/>
               <w:left w:val="none" w:sz="0" w:space="0" w:color="000000"/>
+              <w:bottom w:val="none" w:sz="0" w:space="0" w:color="000000"/>
               <w:right w:val="none" w:sz="0" w:space="0" w:color="000000"/>
             </w:tcBorders>
             <w:shd w:val="clear" w:color="auto" w:fill="FFFFFF"/>
             <w:tcMar>
               <w:top w:w="0" w:type="dxa"/>
+              <w:left w:w="0" w:type="dxa"/>
               <w:bottom w:w="0" w:type="dxa"/>
-              <w:left w:w="0" w:type="dxa"/>
               <w:right w:w="0" w:type="dxa"/>
             </w:tcMar>
-            <w:vAlign w:val="top"/>
           </w:tcPr>
           <w:p>
             <w:pPr>
-              <w:pStyle w:val="Normal"/>
-              <w:jc w:val="center"/>
               <w:pBdr>
-                <w:bottom w:val="none" w:sz="0" w:space="0" w:color="000000"/>
                 <w:top w:val="none" w:sz="0" w:space="0" w:color="000000"/>
                 <w:left w:val="none" w:sz="0" w:space="0" w:color="000000"/>
+                <w:bottom w:val="none" w:sz="0" w:space="0" w:color="000000"/>
                 <w:right w:val="none" w:sz="0" w:space="0" w:color="000000"/>
               </w:pBdr>
-              <w:spacing w:after="100" w:before="100" w:line="240"/>
-              <w:ind w:left="100" w:right="100" w:firstLine="0" w:firstLineChars="0"/>
-              <w:rPr>
-                <w:rFonts w:ascii="Helvetica" w:hAnsi="Helvetica" w:eastAsia="Helvetica" w:cs="Helvetica"/>
-                <w:i w:val="false"/>
-                <w:b w:val="false"/>
-                <w:u w:val="none"/>
-                <w:strike w:val="false"/>
-                <w:sz w:val="22"/>
-                <w:szCs w:val="22"/>
-                <w:color w:val="000000"/>
+              <w:spacing w:before="100" w:after="100"/>
+              <w:ind w:left="100" w:right="100"/>
+              <w:jc w:val="center"/>
+              <w:rPr>
+                <w:rFonts w:ascii="Helvetica" w:eastAsia="Helvetica" w:hAnsi="Helvetica" w:cs="Helvetica"/>
+                <w:color w:val="000000"/>
+                <w:sz w:val="22"/>
+                <w:szCs w:val="22"/>
               </w:rPr>
             </w:pPr>
             <w:r>
               <w:rPr>
-                <w:rFonts w:ascii="Helvetica" w:hAnsi="Helvetica" w:eastAsia="Helvetica" w:cs="Helvetica"/>
-                <w:i w:val="false"/>
-                <w:b w:val="false"/>
-                <w:u w:val="none"/>
-                <w:strike w:val="false"/>
-                <w:sz w:val="22"/>
-                <w:szCs w:val="22"/>
-                <w:color w:val="000000"/>
-              </w:rPr>
-              <w:t xml:space="preserve">9,210 (20.7%)</w:t>
+                <w:rFonts w:ascii="Helvetica" w:eastAsia="Helvetica" w:hAnsi="Helvetica" w:cs="Helvetica"/>
+                <w:color w:val="000000"/>
+                <w:sz w:val="22"/>
+                <w:szCs w:val="22"/>
+              </w:rPr>
+              <w:t>9,210 (20.7%)</w:t>
             </w:r>
           </w:p>
         </w:tc>
         <w:tc>
           <w:tcPr>
+            <w:tcW w:w="3088" w:type="dxa"/>
             <w:tcBorders>
-              <w:bottom w:val="none" w:sz="0" w:space="0" w:color="000000"/>
               <w:top w:val="none" w:sz="0" w:space="0" w:color="000000"/>
               <w:left w:val="none" w:sz="0" w:space="0" w:color="000000"/>
+              <w:bottom w:val="none" w:sz="0" w:space="0" w:color="000000"/>
               <w:right w:val="none" w:sz="0" w:space="0" w:color="000000"/>
             </w:tcBorders>
             <w:shd w:val="clear" w:color="auto" w:fill="FFFFFF"/>
             <w:tcMar>
               <w:top w:w="0" w:type="dxa"/>
+              <w:left w:w="0" w:type="dxa"/>
               <w:bottom w:w="0" w:type="dxa"/>
-              <w:left w:w="0" w:type="dxa"/>
               <w:right w:w="0" w:type="dxa"/>
             </w:tcMar>
-            <w:vAlign w:val="top"/>
           </w:tcPr>
           <w:p>
             <w:pPr>
-              <w:pStyle w:val="Normal"/>
-              <w:jc w:val="center"/>
               <w:pBdr>
-                <w:bottom w:val="none" w:sz="0" w:space="0" w:color="000000"/>
                 <w:top w:val="none" w:sz="0" w:space="0" w:color="000000"/>
                 <w:left w:val="none" w:sz="0" w:space="0" w:color="000000"/>
+                <w:bottom w:val="none" w:sz="0" w:space="0" w:color="000000"/>
                 <w:right w:val="none" w:sz="0" w:space="0" w:color="000000"/>
               </w:pBdr>
-              <w:spacing w:after="100" w:before="100" w:line="240"/>
-              <w:ind w:left="100" w:right="100" w:firstLine="0" w:firstLineChars="0"/>
-              <w:rPr>
-                <w:rFonts w:ascii="Helvetica" w:hAnsi="Helvetica" w:eastAsia="Helvetica" w:cs="Helvetica"/>
-                <w:i w:val="false"/>
-                <w:b w:val="false"/>
-                <w:u w:val="none"/>
-                <w:strike w:val="false"/>
-                <w:sz w:val="22"/>
-                <w:szCs w:val="22"/>
-                <w:color w:val="000000"/>
+              <w:spacing w:before="100" w:after="100"/>
+              <w:ind w:left="100" w:right="100"/>
+              <w:jc w:val="center"/>
+              <w:rPr>
+                <w:rFonts w:ascii="Helvetica" w:eastAsia="Helvetica" w:hAnsi="Helvetica" w:cs="Helvetica"/>
+                <w:color w:val="000000"/>
+                <w:sz w:val="22"/>
+                <w:szCs w:val="22"/>
               </w:rPr>
             </w:pPr>
             <w:r>
               <w:rPr>
-                <w:rFonts w:ascii="Helvetica" w:hAnsi="Helvetica" w:eastAsia="Helvetica" w:cs="Helvetica"/>
-                <w:i w:val="false"/>
-                <w:b w:val="false"/>
-                <w:u w:val="none"/>
-                <w:strike w:val="false"/>
-                <w:sz w:val="22"/>
-                <w:szCs w:val="22"/>
-                <w:color w:val="000000"/>
-              </w:rPr>
-              <w:t xml:space="preserve">6,828 (26.9%)</w:t>
+                <w:rFonts w:ascii="Helvetica" w:eastAsia="Helvetica" w:hAnsi="Helvetica" w:cs="Helvetica"/>
+                <w:color w:val="000000"/>
+                <w:sz w:val="22"/>
+                <w:szCs w:val="22"/>
+              </w:rPr>
+              <w:t>6,828 (26.9%)</w:t>
             </w:r>
           </w:p>
         </w:tc>
       </w:tr>
       <w:tr>
         <w:trPr>
-          <w:trHeight w:val="616" w:hRule="auto"/>
+          <w:jc w:val="center"/>
         </w:trPr>
         <w:tc>
           <w:tcPr>
+            <w:tcW w:w="2576" w:type="dxa"/>
             <w:tcBorders>
-              <w:bottom w:val="none" w:sz="0" w:space="0" w:color="000000"/>
               <w:top w:val="none" w:sz="0" w:space="0" w:color="000000"/>
               <w:left w:val="none" w:sz="0" w:space="0" w:color="000000"/>
+              <w:bottom w:val="none" w:sz="0" w:space="0" w:color="000000"/>
               <w:right w:val="none" w:sz="0" w:space="0" w:color="000000"/>
             </w:tcBorders>
             <w:shd w:val="clear" w:color="auto" w:fill="FFFFFF"/>
             <w:tcMar>
               <w:top w:w="0" w:type="dxa"/>
+              <w:left w:w="0" w:type="dxa"/>
               <w:bottom w:w="0" w:type="dxa"/>
-              <w:left w:w="0" w:type="dxa"/>
               <w:right w:w="0" w:type="dxa"/>
             </w:tcMar>
-            <w:vAlign w:val="top"/>
           </w:tcPr>
           <w:p>
             <w:pPr>
-              <w:pStyle w:val="Normal"/>
-              <w:jc w:val="left"/>
               <w:pBdr>
-                <w:bottom w:val="none" w:sz="0" w:space="0" w:color="000000"/>
                 <w:top w:val="none" w:sz="0" w:space="0" w:color="000000"/>
                 <w:left w:val="none" w:sz="0" w:space="0" w:color="000000"/>
+                <w:bottom w:val="none" w:sz="0" w:space="0" w:color="000000"/>
                 <w:right w:val="none" w:sz="0" w:space="0" w:color="000000"/>
               </w:pBdr>
-              <w:spacing w:after="100" w:before="100" w:line="240"/>
-              <w:ind w:left="300" w:right="100" w:firstLine="0" w:firstLineChars="0"/>
-              <w:rPr>
-                <w:rFonts w:ascii="Helvetica" w:hAnsi="Helvetica" w:eastAsia="Helvetica" w:cs="Helvetica"/>
-                <w:i w:val="false"/>
-                <w:b w:val="false"/>
-                <w:u w:val="none"/>
-                <w:strike w:val="false"/>
-                <w:sz w:val="22"/>
-                <w:szCs w:val="22"/>
-                <w:color w:val="000000"/>
+              <w:spacing w:before="100" w:after="100"/>
+              <w:ind w:left="300" w:right="100"/>
+              <w:rPr>
+                <w:rFonts w:ascii="Helvetica" w:eastAsia="Helvetica" w:hAnsi="Helvetica" w:cs="Helvetica"/>
+                <w:color w:val="000000"/>
+                <w:sz w:val="22"/>
+                <w:szCs w:val="22"/>
               </w:rPr>
             </w:pPr>
             <w:r>
               <w:rPr>
-                <w:rFonts w:ascii="Helvetica" w:hAnsi="Helvetica" w:eastAsia="Helvetica" w:cs="Helvetica"/>
-                <w:i w:val="false"/>
-                <w:b w:val="false"/>
-                <w:u w:val="none"/>
-                <w:strike w:val="false"/>
-                <w:sz w:val="22"/>
-                <w:szCs w:val="22"/>
-                <w:color w:val="000000"/>
-              </w:rPr>
-              <w:t xml:space="preserve">BAJO</w:t>
+                <w:rFonts w:ascii="Helvetica" w:eastAsia="Helvetica" w:hAnsi="Helvetica" w:cs="Helvetica"/>
+                <w:color w:val="000000"/>
+                <w:sz w:val="22"/>
+                <w:szCs w:val="22"/>
+              </w:rPr>
+              <w:t>BAJO</w:t>
             </w:r>
           </w:p>
         </w:tc>
         <w:tc>
           <w:tcPr>
+            <w:tcW w:w="3088" w:type="dxa"/>
             <w:tcBorders>
-              <w:bottom w:val="none" w:sz="0" w:space="0" w:color="000000"/>
               <w:top w:val="none" w:sz="0" w:space="0" w:color="000000"/>
               <w:left w:val="none" w:sz="0" w:space="0" w:color="000000"/>
+              <w:bottom w:val="none" w:sz="0" w:space="0" w:color="000000"/>
               <w:right w:val="none" w:sz="0" w:space="0" w:color="000000"/>
             </w:tcBorders>
             <w:shd w:val="clear" w:color="auto" w:fill="FFFFFF"/>
             <w:tcMar>
               <w:top w:w="0" w:type="dxa"/>
+              <w:left w:w="0" w:type="dxa"/>
               <w:bottom w:w="0" w:type="dxa"/>
-              <w:left w:w="0" w:type="dxa"/>
               <w:right w:w="0" w:type="dxa"/>
             </w:tcMar>
-            <w:vAlign w:val="top"/>
           </w:tcPr>
           <w:p>
             <w:pPr>
-              <w:pStyle w:val="Normal"/>
-              <w:jc w:val="center"/>
               <w:pBdr>
-                <w:bottom w:val="none" w:sz="0" w:space="0" w:color="000000"/>
                 <w:top w:val="none" w:sz="0" w:space="0" w:color="000000"/>
                 <w:left w:val="none" w:sz="0" w:space="0" w:color="000000"/>
+                <w:bottom w:val="none" w:sz="0" w:space="0" w:color="000000"/>
                 <w:right w:val="none" w:sz="0" w:space="0" w:color="000000"/>
               </w:pBdr>
-              <w:spacing w:after="100" w:before="100" w:line="240"/>
-              <w:ind w:left="100" w:right="100" w:firstLine="0" w:firstLineChars="0"/>
-              <w:rPr>
-                <w:rFonts w:ascii="Helvetica" w:hAnsi="Helvetica" w:eastAsia="Helvetica" w:cs="Helvetica"/>
-                <w:i w:val="false"/>
-                <w:b w:val="false"/>
-                <w:u w:val="none"/>
-                <w:strike w:val="false"/>
-                <w:sz w:val="22"/>
-                <w:szCs w:val="22"/>
-                <w:color w:val="000000"/>
+              <w:spacing w:before="100" w:after="100"/>
+              <w:ind w:left="100" w:right="100"/>
+              <w:jc w:val="center"/>
+              <w:rPr>
+                <w:rFonts w:ascii="Helvetica" w:eastAsia="Helvetica" w:hAnsi="Helvetica" w:cs="Helvetica"/>
+                <w:color w:val="000000"/>
+                <w:sz w:val="22"/>
+                <w:szCs w:val="22"/>
               </w:rPr>
             </w:pPr>
             <w:r>
               <w:rPr>
-                <w:rFonts w:ascii="Helvetica" w:hAnsi="Helvetica" w:eastAsia="Helvetica" w:cs="Helvetica"/>
-                <w:i w:val="false"/>
-                <w:b w:val="false"/>
-                <w:u w:val="none"/>
-                <w:strike w:val="false"/>
-                <w:sz w:val="22"/>
-                <w:szCs w:val="22"/>
-                <w:color w:val="000000"/>
-              </w:rPr>
-              <w:t xml:space="preserve">13,508 (19.3%)</w:t>
+                <w:rFonts w:ascii="Helvetica" w:eastAsia="Helvetica" w:hAnsi="Helvetica" w:cs="Helvetica"/>
+                <w:color w:val="000000"/>
+                <w:sz w:val="22"/>
+                <w:szCs w:val="22"/>
+              </w:rPr>
+              <w:t>13,508 (19.3%)</w:t>
             </w:r>
           </w:p>
         </w:tc>
         <w:tc>
           <w:tcPr>
+            <w:tcW w:w="3088" w:type="dxa"/>
             <w:tcBorders>
-              <w:bottom w:val="none" w:sz="0" w:space="0" w:color="000000"/>
               <w:top w:val="none" w:sz="0" w:space="0" w:color="000000"/>
               <w:left w:val="none" w:sz="0" w:space="0" w:color="000000"/>
+              <w:bottom w:val="none" w:sz="0" w:space="0" w:color="000000"/>
               <w:right w:val="none" w:sz="0" w:space="0" w:color="000000"/>
             </w:tcBorders>
             <w:shd w:val="clear" w:color="auto" w:fill="FFFFFF"/>
             <w:tcMar>
               <w:top w:w="0" w:type="dxa"/>
+              <w:left w:w="0" w:type="dxa"/>
               <w:bottom w:w="0" w:type="dxa"/>
-              <w:left w:w="0" w:type="dxa"/>
               <w:right w:w="0" w:type="dxa"/>
             </w:tcMar>
-            <w:vAlign w:val="top"/>
           </w:tcPr>
           <w:p>
             <w:pPr>
-              <w:pStyle w:val="Normal"/>
-              <w:jc w:val="center"/>
               <w:pBdr>
-                <w:bottom w:val="none" w:sz="0" w:space="0" w:color="000000"/>
                 <w:top w:val="none" w:sz="0" w:space="0" w:color="000000"/>
                 <w:left w:val="none" w:sz="0" w:space="0" w:color="000000"/>
+                <w:bottom w:val="none" w:sz="0" w:space="0" w:color="000000"/>
                 <w:right w:val="none" w:sz="0" w:space="0" w:color="000000"/>
               </w:pBdr>
-              <w:spacing w:after="100" w:before="100" w:line="240"/>
-              <w:ind w:left="100" w:right="100" w:firstLine="0" w:firstLineChars="0"/>
-              <w:rPr>
-                <w:rFonts w:ascii="Helvetica" w:hAnsi="Helvetica" w:eastAsia="Helvetica" w:cs="Helvetica"/>
-                <w:i w:val="false"/>
-                <w:b w:val="false"/>
-                <w:u w:val="none"/>
-                <w:strike w:val="false"/>
-                <w:sz w:val="22"/>
-                <w:szCs w:val="22"/>
-                <w:color w:val="000000"/>
+              <w:spacing w:before="100" w:after="100"/>
+              <w:ind w:left="100" w:right="100"/>
+              <w:jc w:val="center"/>
+              <w:rPr>
+                <w:rFonts w:ascii="Helvetica" w:eastAsia="Helvetica" w:hAnsi="Helvetica" w:cs="Helvetica"/>
+                <w:color w:val="000000"/>
+                <w:sz w:val="22"/>
+                <w:szCs w:val="22"/>
               </w:rPr>
             </w:pPr>
             <w:r>
               <w:rPr>
-                <w:rFonts w:ascii="Helvetica" w:hAnsi="Helvetica" w:eastAsia="Helvetica" w:cs="Helvetica"/>
-                <w:i w:val="false"/>
-                <w:b w:val="false"/>
-                <w:u w:val="none"/>
-                <w:strike w:val="false"/>
-                <w:sz w:val="22"/>
-                <w:szCs w:val="22"/>
-                <w:color w:val="000000"/>
-              </w:rPr>
-              <w:t xml:space="preserve">8,450 (19.0%)</w:t>
+                <w:rFonts w:ascii="Helvetica" w:eastAsia="Helvetica" w:hAnsi="Helvetica" w:cs="Helvetica"/>
+                <w:color w:val="000000"/>
+                <w:sz w:val="22"/>
+                <w:szCs w:val="22"/>
+              </w:rPr>
+              <w:t>8,450 (19.0%)</w:t>
             </w:r>
           </w:p>
         </w:tc>
         <w:tc>
           <w:tcPr>
+            <w:tcW w:w="3088" w:type="dxa"/>
             <w:tcBorders>
-              <w:bottom w:val="none" w:sz="0" w:space="0" w:color="000000"/>
               <w:top w:val="none" w:sz="0" w:space="0" w:color="000000"/>
               <w:left w:val="none" w:sz="0" w:space="0" w:color="000000"/>
+              <w:bottom w:val="none" w:sz="0" w:space="0" w:color="000000"/>
               <w:right w:val="none" w:sz="0" w:space="0" w:color="000000"/>
             </w:tcBorders>
             <w:shd w:val="clear" w:color="auto" w:fill="FFFFFF"/>
             <w:tcMar>
               <w:top w:w="0" w:type="dxa"/>
+              <w:left w:w="0" w:type="dxa"/>
               <w:bottom w:w="0" w:type="dxa"/>
-              <w:left w:w="0" w:type="dxa"/>
               <w:right w:w="0" w:type="dxa"/>
             </w:tcMar>
-            <w:vAlign w:val="top"/>
           </w:tcPr>
           <w:p>
             <w:pPr>
-              <w:pStyle w:val="Normal"/>
-              <w:jc w:val="center"/>
               <w:pBdr>
-                <w:bottom w:val="none" w:sz="0" w:space="0" w:color="000000"/>
                 <w:top w:val="none" w:sz="0" w:space="0" w:color="000000"/>
                 <w:left w:val="none" w:sz="0" w:space="0" w:color="000000"/>
+                <w:bottom w:val="none" w:sz="0" w:space="0" w:color="000000"/>
                 <w:right w:val="none" w:sz="0" w:space="0" w:color="000000"/>
               </w:pBdr>
-              <w:spacing w:after="100" w:before="100" w:line="240"/>
-              <w:ind w:left="100" w:right="100" w:firstLine="0" w:firstLineChars="0"/>
-              <w:rPr>
-                <w:rFonts w:ascii="Helvetica" w:hAnsi="Helvetica" w:eastAsia="Helvetica" w:cs="Helvetica"/>
-                <w:i w:val="false"/>
-                <w:b w:val="false"/>
-                <w:u w:val="none"/>
-                <w:strike w:val="false"/>
-                <w:sz w:val="22"/>
-                <w:szCs w:val="22"/>
-                <w:color w:val="000000"/>
+              <w:spacing w:before="100" w:after="100"/>
+              <w:ind w:left="100" w:right="100"/>
+              <w:jc w:val="center"/>
+              <w:rPr>
+                <w:rFonts w:ascii="Helvetica" w:eastAsia="Helvetica" w:hAnsi="Helvetica" w:cs="Helvetica"/>
+                <w:color w:val="000000"/>
+                <w:sz w:val="22"/>
+                <w:szCs w:val="22"/>
               </w:rPr>
             </w:pPr>
             <w:r>
               <w:rPr>
-                <w:rFonts w:ascii="Helvetica" w:hAnsi="Helvetica" w:eastAsia="Helvetica" w:cs="Helvetica"/>
-                <w:i w:val="false"/>
-                <w:b w:val="false"/>
-                <w:u w:val="none"/>
-                <w:strike w:val="false"/>
-                <w:sz w:val="22"/>
-                <w:szCs w:val="22"/>
-                <w:color w:val="000000"/>
-              </w:rPr>
-              <w:t xml:space="preserve">5,058 (19.9%)</w:t>
+                <w:rFonts w:ascii="Helvetica" w:eastAsia="Helvetica" w:hAnsi="Helvetica" w:cs="Helvetica"/>
+                <w:color w:val="000000"/>
+                <w:sz w:val="22"/>
+                <w:szCs w:val="22"/>
+              </w:rPr>
+              <w:t>5,058 (19.9%)</w:t>
             </w:r>
           </w:p>
         </w:tc>
       </w:tr>
       <w:tr>
         <w:trPr>
-          <w:trHeight w:val="616" w:hRule="auto"/>
+          <w:jc w:val="center"/>
         </w:trPr>
         <w:tc>
           <w:tcPr>
+            <w:tcW w:w="2576" w:type="dxa"/>
             <w:tcBorders>
-              <w:bottom w:val="none" w:sz="0" w:space="0" w:color="000000"/>
               <w:top w:val="none" w:sz="0" w:space="0" w:color="000000"/>
               <w:left w:val="none" w:sz="0" w:space="0" w:color="000000"/>
+              <w:bottom w:val="none" w:sz="0" w:space="0" w:color="000000"/>
               <w:right w:val="none" w:sz="0" w:space="0" w:color="000000"/>
             </w:tcBorders>
             <w:shd w:val="clear" w:color="auto" w:fill="FFFFFF"/>
             <w:tcMar>
               <w:top w:w="0" w:type="dxa"/>
+              <w:left w:w="0" w:type="dxa"/>
               <w:bottom w:w="0" w:type="dxa"/>
-              <w:left w:w="0" w:type="dxa"/>
               <w:right w:w="0" w:type="dxa"/>
             </w:tcMar>
-            <w:vAlign w:val="top"/>
           </w:tcPr>
           <w:p>
             <w:pPr>
-              <w:pStyle w:val="Normal"/>
-              <w:jc w:val="left"/>
               <w:pBdr>
-                <w:bottom w:val="none" w:sz="0" w:space="0" w:color="000000"/>
                 <w:top w:val="none" w:sz="0" w:space="0" w:color="000000"/>
                 <w:left w:val="none" w:sz="0" w:space="0" w:color="000000"/>
+                <w:bottom w:val="none" w:sz="0" w:space="0" w:color="000000"/>
                 <w:right w:val="none" w:sz="0" w:space="0" w:color="000000"/>
               </w:pBdr>
-              <w:spacing w:after="100" w:before="100" w:line="240"/>
-              <w:ind w:left="300" w:right="100" w:firstLine="0" w:firstLineChars="0"/>
-              <w:rPr>
-                <w:rFonts w:ascii="Helvetica" w:hAnsi="Helvetica" w:eastAsia="Helvetica" w:cs="Helvetica"/>
-                <w:i w:val="false"/>
-                <w:b w:val="false"/>
-                <w:u w:val="none"/>
-                <w:strike w:val="false"/>
-                <w:sz w:val="22"/>
-                <w:szCs w:val="22"/>
-                <w:color w:val="000000"/>
+              <w:spacing w:before="100" w:after="100"/>
+              <w:ind w:left="300" w:right="100"/>
+              <w:rPr>
+                <w:rFonts w:ascii="Helvetica" w:eastAsia="Helvetica" w:hAnsi="Helvetica" w:cs="Helvetica"/>
+                <w:color w:val="000000"/>
+                <w:sz w:val="22"/>
+                <w:szCs w:val="22"/>
               </w:rPr>
             </w:pPr>
             <w:r>
               <w:rPr>
-                <w:rFonts w:ascii="Helvetica" w:hAnsi="Helvetica" w:eastAsia="Helvetica" w:cs="Helvetica"/>
-                <w:i w:val="false"/>
-                <w:b w:val="false"/>
-                <w:u w:val="none"/>
-                <w:strike w:val="false"/>
-                <w:sz w:val="22"/>
-                <w:szCs w:val="22"/>
-                <w:color w:val="000000"/>
-              </w:rPr>
-              <w:t xml:space="preserve">MODERADO</w:t>
+                <w:rFonts w:ascii="Helvetica" w:eastAsia="Helvetica" w:hAnsi="Helvetica" w:cs="Helvetica"/>
+                <w:color w:val="000000"/>
+                <w:sz w:val="22"/>
+                <w:szCs w:val="22"/>
+              </w:rPr>
+              <w:t>MODERADO</w:t>
             </w:r>
           </w:p>
         </w:tc>
         <w:tc>
           <w:tcPr>
+            <w:tcW w:w="3088" w:type="dxa"/>
             <w:tcBorders>
-              <w:bottom w:val="none" w:sz="0" w:space="0" w:color="000000"/>
               <w:top w:val="none" w:sz="0" w:space="0" w:color="000000"/>
               <w:left w:val="none" w:sz="0" w:space="0" w:color="000000"/>
+              <w:bottom w:val="none" w:sz="0" w:space="0" w:color="000000"/>
               <w:right w:val="none" w:sz="0" w:space="0" w:color="000000"/>
             </w:tcBorders>
             <w:shd w:val="clear" w:color="auto" w:fill="FFFFFF"/>
             <w:tcMar>
               <w:top w:w="0" w:type="dxa"/>
+              <w:left w:w="0" w:type="dxa"/>
               <w:bottom w:w="0" w:type="dxa"/>
-              <w:left w:w="0" w:type="dxa"/>
               <w:right w:w="0" w:type="dxa"/>
             </w:tcMar>
-            <w:vAlign w:val="top"/>
           </w:tcPr>
           <w:p>
             <w:pPr>
-              <w:pStyle w:val="Normal"/>
-              <w:jc w:val="center"/>
               <w:pBdr>
-                <w:bottom w:val="none" w:sz="0" w:space="0" w:color="000000"/>
                 <w:top w:val="none" w:sz="0" w:space="0" w:color="000000"/>
                 <w:left w:val="none" w:sz="0" w:space="0" w:color="000000"/>
+                <w:bottom w:val="none" w:sz="0" w:space="0" w:color="000000"/>
                 <w:right w:val="none" w:sz="0" w:space="0" w:color="000000"/>
               </w:pBdr>
-              <w:spacing w:after="100" w:before="100" w:line="240"/>
-              <w:ind w:left="100" w:right="100" w:firstLine="0" w:firstLineChars="0"/>
-              <w:rPr>
-                <w:rFonts w:ascii="Helvetica" w:hAnsi="Helvetica" w:eastAsia="Helvetica" w:cs="Helvetica"/>
-                <w:i w:val="false"/>
-                <w:b w:val="false"/>
-                <w:u w:val="none"/>
-                <w:strike w:val="false"/>
-                <w:sz w:val="22"/>
-                <w:szCs w:val="22"/>
-                <w:color w:val="000000"/>
+              <w:spacing w:before="100" w:after="100"/>
+              <w:ind w:left="100" w:right="100"/>
+              <w:jc w:val="center"/>
+              <w:rPr>
+                <w:rFonts w:ascii="Helvetica" w:eastAsia="Helvetica" w:hAnsi="Helvetica" w:cs="Helvetica"/>
+                <w:color w:val="000000"/>
+                <w:sz w:val="22"/>
+                <w:szCs w:val="22"/>
               </w:rPr>
             </w:pPr>
             <w:r>
               <w:rPr>
-                <w:rFonts w:ascii="Helvetica" w:hAnsi="Helvetica" w:eastAsia="Helvetica" w:cs="Helvetica"/>
-                <w:i w:val="false"/>
-                <w:b w:val="false"/>
-                <w:u w:val="none"/>
-                <w:strike w:val="false"/>
-                <w:sz w:val="22"/>
-                <w:szCs w:val="22"/>
-                <w:color w:val="000000"/>
-              </w:rPr>
-              <w:t xml:space="preserve">14,204 (20.3%)</w:t>
+                <w:rFonts w:ascii="Helvetica" w:eastAsia="Helvetica" w:hAnsi="Helvetica" w:cs="Helvetica"/>
+                <w:color w:val="000000"/>
+                <w:sz w:val="22"/>
+                <w:szCs w:val="22"/>
+              </w:rPr>
+              <w:t>14,204 (20.3%)</w:t>
             </w:r>
           </w:p>
         </w:tc>
         <w:tc>
           <w:tcPr>
+            <w:tcW w:w="3088" w:type="dxa"/>
             <w:tcBorders>
-              <w:bottom w:val="none" w:sz="0" w:space="0" w:color="000000"/>
               <w:top w:val="none" w:sz="0" w:space="0" w:color="000000"/>
               <w:left w:val="none" w:sz="0" w:space="0" w:color="000000"/>
+              <w:bottom w:val="none" w:sz="0" w:space="0" w:color="000000"/>
               <w:right w:val="none" w:sz="0" w:space="0" w:color="000000"/>
             </w:tcBorders>
             <w:shd w:val="clear" w:color="auto" w:fill="FFFFFF"/>
             <w:tcMar>
               <w:top w:w="0" w:type="dxa"/>
+              <w:left w:w="0" w:type="dxa"/>
               <w:bottom w:w="0" w:type="dxa"/>
-              <w:left w:w="0" w:type="dxa"/>
               <w:right w:w="0" w:type="dxa"/>
             </w:tcMar>
-            <w:vAlign w:val="top"/>
           </w:tcPr>
           <w:p>
             <w:pPr>
-              <w:pStyle w:val="Normal"/>
-              <w:jc w:val="center"/>
               <w:pBdr>
-                <w:bottom w:val="none" w:sz="0" w:space="0" w:color="000000"/>
                 <w:top w:val="none" w:sz="0" w:space="0" w:color="000000"/>
                 <w:left w:val="none" w:sz="0" w:space="0" w:color="000000"/>
+                <w:bottom w:val="none" w:sz="0" w:space="0" w:color="000000"/>
                 <w:right w:val="none" w:sz="0" w:space="0" w:color="000000"/>
               </w:pBdr>
-              <w:spacing w:after="100" w:before="100" w:line="240"/>
-              <w:ind w:left="100" w:right="100" w:firstLine="0" w:firstLineChars="0"/>
-              <w:rPr>
-                <w:rFonts w:ascii="Helvetica" w:hAnsi="Helvetica" w:eastAsia="Helvetica" w:cs="Helvetica"/>
-                <w:i w:val="false"/>
-                <w:b w:val="false"/>
-                <w:u w:val="none"/>
-                <w:strike w:val="false"/>
-                <w:sz w:val="22"/>
-                <w:szCs w:val="22"/>
-                <w:color w:val="000000"/>
+              <w:spacing w:before="100" w:after="100"/>
+              <w:ind w:left="100" w:right="100"/>
+              <w:jc w:val="center"/>
+              <w:rPr>
+                <w:rFonts w:ascii="Helvetica" w:eastAsia="Helvetica" w:hAnsi="Helvetica" w:cs="Helvetica"/>
+                <w:color w:val="000000"/>
+                <w:sz w:val="22"/>
+                <w:szCs w:val="22"/>
               </w:rPr>
             </w:pPr>
             <w:r>
               <w:rPr>
-                <w:rFonts w:ascii="Helvetica" w:hAnsi="Helvetica" w:eastAsia="Helvetica" w:cs="Helvetica"/>
-                <w:i w:val="false"/>
-                <w:b w:val="false"/>
-                <w:u w:val="none"/>
-                <w:strike w:val="false"/>
-                <w:sz w:val="22"/>
-                <w:szCs w:val="22"/>
-                <w:color w:val="000000"/>
-              </w:rPr>
-              <w:t xml:space="preserve">9,308 (20.9%)</w:t>
+                <w:rFonts w:ascii="Helvetica" w:eastAsia="Helvetica" w:hAnsi="Helvetica" w:cs="Helvetica"/>
+                <w:color w:val="000000"/>
+                <w:sz w:val="22"/>
+                <w:szCs w:val="22"/>
+              </w:rPr>
+              <w:t>9,308 (20.9%)</w:t>
             </w:r>
           </w:p>
         </w:tc>
         <w:tc>
           <w:tcPr>
+            <w:tcW w:w="3088" w:type="dxa"/>
             <w:tcBorders>
-              <w:bottom w:val="none" w:sz="0" w:space="0" w:color="000000"/>
               <w:top w:val="none" w:sz="0" w:space="0" w:color="000000"/>
               <w:left w:val="none" w:sz="0" w:space="0" w:color="000000"/>
+              <w:bottom w:val="none" w:sz="0" w:space="0" w:color="000000"/>
               <w:right w:val="none" w:sz="0" w:space="0" w:color="000000"/>
             </w:tcBorders>
             <w:shd w:val="clear" w:color="auto" w:fill="FFFFFF"/>
             <w:tcMar>
               <w:top w:w="0" w:type="dxa"/>
+              <w:left w:w="0" w:type="dxa"/>
               <w:bottom w:w="0" w:type="dxa"/>
-              <w:left w:w="0" w:type="dxa"/>
               <w:right w:w="0" w:type="dxa"/>
             </w:tcMar>
-            <w:vAlign w:val="top"/>
           </w:tcPr>
           <w:p>
             <w:pPr>
-              <w:pStyle w:val="Normal"/>
-              <w:jc w:val="center"/>
               <w:pBdr>
-                <w:bottom w:val="none" w:sz="0" w:space="0" w:color="000000"/>
                 <w:top w:val="none" w:sz="0" w:space="0" w:color="000000"/>
                 <w:left w:val="none" w:sz="0" w:space="0" w:color="000000"/>
+                <w:bottom w:val="none" w:sz="0" w:space="0" w:color="000000"/>
                 <w:right w:val="none" w:sz="0" w:space="0" w:color="000000"/>
               </w:pBdr>
-              <w:spacing w:after="100" w:before="100" w:line="240"/>
-              <w:ind w:left="100" w:right="100" w:firstLine="0" w:firstLineChars="0"/>
-              <w:rPr>
-                <w:rFonts w:ascii="Helvetica" w:hAnsi="Helvetica" w:eastAsia="Helvetica" w:cs="Helvetica"/>
-                <w:i w:val="false"/>
-                <w:b w:val="false"/>
-                <w:u w:val="none"/>
-                <w:strike w:val="false"/>
-                <w:sz w:val="22"/>
-                <w:szCs w:val="22"/>
-                <w:color w:val="000000"/>
+              <w:spacing w:before="100" w:after="100"/>
+              <w:ind w:left="100" w:right="100"/>
+              <w:jc w:val="center"/>
+              <w:rPr>
+                <w:rFonts w:ascii="Helvetica" w:eastAsia="Helvetica" w:hAnsi="Helvetica" w:cs="Helvetica"/>
+                <w:color w:val="000000"/>
+                <w:sz w:val="22"/>
+                <w:szCs w:val="22"/>
               </w:rPr>
             </w:pPr>
             <w:r>
               <w:rPr>
-                <w:rFonts w:ascii="Helvetica" w:hAnsi="Helvetica" w:eastAsia="Helvetica" w:cs="Helvetica"/>
-                <w:i w:val="false"/>
-                <w:b w:val="false"/>
-                <w:u w:val="none"/>
-                <w:strike w:val="false"/>
-                <w:sz w:val="22"/>
-                <w:szCs w:val="22"/>
-                <w:color w:val="000000"/>
-              </w:rPr>
-              <w:t xml:space="preserve">4,896 (19.3%)</w:t>
+                <w:rFonts w:ascii="Helvetica" w:eastAsia="Helvetica" w:hAnsi="Helvetica" w:cs="Helvetica"/>
+                <w:color w:val="000000"/>
+                <w:sz w:val="22"/>
+                <w:szCs w:val="22"/>
+              </w:rPr>
+              <w:t>4,896 (19.3%)</w:t>
             </w:r>
           </w:p>
         </w:tc>
       </w:tr>
       <w:tr>
         <w:trPr>
-          <w:trHeight w:val="616" w:hRule="auto"/>
+          <w:jc w:val="center"/>
         </w:trPr>
         <w:tc>
           <w:tcPr>
+            <w:tcW w:w="2576" w:type="dxa"/>
             <w:tcBorders>
-              <w:bottom w:val="none" w:sz="0" w:space="0" w:color="000000"/>
               <w:top w:val="none" w:sz="0" w:space="0" w:color="000000"/>
               <w:left w:val="none" w:sz="0" w:space="0" w:color="000000"/>
+              <w:bottom w:val="none" w:sz="0" w:space="0" w:color="000000"/>
               <w:right w:val="none" w:sz="0" w:space="0" w:color="000000"/>
             </w:tcBorders>
             <w:shd w:val="clear" w:color="auto" w:fill="FFFFFF"/>
             <w:tcMar>
               <w:top w:w="0" w:type="dxa"/>
+              <w:left w:w="0" w:type="dxa"/>
               <w:bottom w:w="0" w:type="dxa"/>
-              <w:left w:w="0" w:type="dxa"/>
               <w:right w:w="0" w:type="dxa"/>
             </w:tcMar>
-            <w:vAlign w:val="top"/>
           </w:tcPr>
           <w:p>
             <w:pPr>
-              <w:pStyle w:val="Normal"/>
-              <w:jc w:val="left"/>
               <w:pBdr>
-                <w:bottom w:val="none" w:sz="0" w:space="0" w:color="000000"/>
                 <w:top w:val="none" w:sz="0" w:space="0" w:color="000000"/>
                 <w:left w:val="none" w:sz="0" w:space="0" w:color="000000"/>
+                <w:bottom w:val="none" w:sz="0" w:space="0" w:color="000000"/>
                 <w:right w:val="none" w:sz="0" w:space="0" w:color="000000"/>
               </w:pBdr>
-              <w:spacing w:after="100" w:before="100" w:line="240"/>
-              <w:ind w:left="300" w:right="100" w:firstLine="0" w:firstLineChars="0"/>
-              <w:rPr>
-                <w:rFonts w:ascii="Helvetica" w:hAnsi="Helvetica" w:eastAsia="Helvetica" w:cs="Helvetica"/>
-                <w:i w:val="false"/>
-                <w:b w:val="false"/>
-                <w:u w:val="none"/>
-                <w:strike w:val="false"/>
-                <w:sz w:val="22"/>
-                <w:szCs w:val="22"/>
-                <w:color w:val="000000"/>
+              <w:spacing w:before="100" w:after="100"/>
+              <w:ind w:left="300" w:right="100"/>
+              <w:rPr>
+                <w:rFonts w:ascii="Helvetica" w:eastAsia="Helvetica" w:hAnsi="Helvetica" w:cs="Helvetica"/>
+                <w:color w:val="000000"/>
+                <w:sz w:val="22"/>
+                <w:szCs w:val="22"/>
               </w:rPr>
             </w:pPr>
             <w:r>
               <w:rPr>
-                <w:rFonts w:ascii="Helvetica" w:hAnsi="Helvetica" w:eastAsia="Helvetica" w:cs="Helvetica"/>
-                <w:i w:val="false"/>
-                <w:b w:val="false"/>
-                <w:u w:val="none"/>
-                <w:strike w:val="false"/>
-                <w:sz w:val="22"/>
-                <w:szCs w:val="22"/>
-                <w:color w:val="000000"/>
-              </w:rPr>
-              <w:t xml:space="preserve">ALTO</w:t>
+                <w:rFonts w:ascii="Helvetica" w:eastAsia="Helvetica" w:hAnsi="Helvetica" w:cs="Helvetica"/>
+                <w:color w:val="000000"/>
+                <w:sz w:val="22"/>
+                <w:szCs w:val="22"/>
+              </w:rPr>
+              <w:t>ALTO</w:t>
             </w:r>
           </w:p>
         </w:tc>
         <w:tc>
           <w:tcPr>
+            <w:tcW w:w="3088" w:type="dxa"/>
             <w:tcBorders>
-              <w:bottom w:val="none" w:sz="0" w:space="0" w:color="000000"/>
               <w:top w:val="none" w:sz="0" w:space="0" w:color="000000"/>
               <w:left w:val="none" w:sz="0" w:space="0" w:color="000000"/>
+              <w:bottom w:val="none" w:sz="0" w:space="0" w:color="000000"/>
               <w:right w:val="none" w:sz="0" w:space="0" w:color="000000"/>
             </w:tcBorders>
             <w:shd w:val="clear" w:color="auto" w:fill="FFFFFF"/>
             <w:tcMar>
               <w:top w:w="0" w:type="dxa"/>
+              <w:left w:w="0" w:type="dxa"/>
               <w:bottom w:w="0" w:type="dxa"/>
-              <w:left w:w="0" w:type="dxa"/>
               <w:right w:w="0" w:type="dxa"/>
             </w:tcMar>
-            <w:vAlign w:val="top"/>
           </w:tcPr>
           <w:p>
             <w:pPr>
-              <w:pStyle w:val="Normal"/>
-              <w:jc w:val="center"/>
               <w:pBdr>
-                <w:bottom w:val="none" w:sz="0" w:space="0" w:color="000000"/>
                 <w:top w:val="none" w:sz="0" w:space="0" w:color="000000"/>
                 <w:left w:val="none" w:sz="0" w:space="0" w:color="000000"/>
+                <w:bottom w:val="none" w:sz="0" w:space="0" w:color="000000"/>
                 <w:right w:val="none" w:sz="0" w:space="0" w:color="000000"/>
               </w:pBdr>
-              <w:spacing w:after="100" w:before="100" w:line="240"/>
-              <w:ind w:left="100" w:right="100" w:firstLine="0" w:firstLineChars="0"/>
-              <w:rPr>
-                <w:rFonts w:ascii="Helvetica" w:hAnsi="Helvetica" w:eastAsia="Helvetica" w:cs="Helvetica"/>
-                <w:i w:val="false"/>
-                <w:b w:val="false"/>
-                <w:u w:val="none"/>
-                <w:strike w:val="false"/>
-                <w:sz w:val="22"/>
-                <w:szCs w:val="22"/>
-                <w:color w:val="000000"/>
+              <w:spacing w:before="100" w:after="100"/>
+              <w:ind w:left="100" w:right="100"/>
+              <w:jc w:val="center"/>
+              <w:rPr>
+                <w:rFonts w:ascii="Helvetica" w:eastAsia="Helvetica" w:hAnsi="Helvetica" w:cs="Helvetica"/>
+                <w:color w:val="000000"/>
+                <w:sz w:val="22"/>
+                <w:szCs w:val="22"/>
               </w:rPr>
             </w:pPr>
             <w:r>
               <w:rPr>
-                <w:rFonts w:ascii="Helvetica" w:hAnsi="Helvetica" w:eastAsia="Helvetica" w:cs="Helvetica"/>
-                <w:i w:val="false"/>
-                <w:b w:val="false"/>
-                <w:u w:val="none"/>
-                <w:strike w:val="false"/>
-                <w:sz w:val="22"/>
-                <w:szCs w:val="22"/>
-                <w:color w:val="000000"/>
-              </w:rPr>
-              <w:t xml:space="preserve">13,409 (19.2%)</w:t>
+                <w:rFonts w:ascii="Helvetica" w:eastAsia="Helvetica" w:hAnsi="Helvetica" w:cs="Helvetica"/>
+                <w:color w:val="000000"/>
+                <w:sz w:val="22"/>
+                <w:szCs w:val="22"/>
+              </w:rPr>
+              <w:t>13,409 (19.2%)</w:t>
             </w:r>
           </w:p>
         </w:tc>
         <w:tc>
           <w:tcPr>
+            <w:tcW w:w="3088" w:type="dxa"/>
             <w:tcBorders>
-              <w:bottom w:val="none" w:sz="0" w:space="0" w:color="000000"/>
               <w:top w:val="none" w:sz="0" w:space="0" w:color="000000"/>
               <w:left w:val="none" w:sz="0" w:space="0" w:color="000000"/>
+              <w:bottom w:val="none" w:sz="0" w:space="0" w:color="000000"/>
               <w:right w:val="none" w:sz="0" w:space="0" w:color="000000"/>
             </w:tcBorders>
             <w:shd w:val="clear" w:color="auto" w:fill="FFFFFF"/>
             <w:tcMar>
               <w:top w:w="0" w:type="dxa"/>
+              <w:left w:w="0" w:type="dxa"/>
               <w:bottom w:w="0" w:type="dxa"/>
-              <w:left w:w="0" w:type="dxa"/>
               <w:right w:w="0" w:type="dxa"/>
             </w:tcMar>
-            <w:vAlign w:val="top"/>
           </w:tcPr>
           <w:p>
             <w:pPr>
-              <w:pStyle w:val="Normal"/>
-              <w:jc w:val="center"/>
               <w:pBdr>
-                <w:bottom w:val="none" w:sz="0" w:space="0" w:color="000000"/>
                 <w:top w:val="none" w:sz="0" w:space="0" w:color="000000"/>
                 <w:left w:val="none" w:sz="0" w:space="0" w:color="000000"/>
+                <w:bottom w:val="none" w:sz="0" w:space="0" w:color="000000"/>
                 <w:right w:val="none" w:sz="0" w:space="0" w:color="000000"/>
               </w:pBdr>
-              <w:spacing w:after="100" w:before="100" w:line="240"/>
-              <w:ind w:left="100" w:right="100" w:firstLine="0" w:firstLineChars="0"/>
-              <w:rPr>
-                <w:rFonts w:ascii="Helvetica" w:hAnsi="Helvetica" w:eastAsia="Helvetica" w:cs="Helvetica"/>
-                <w:i w:val="false"/>
-                <w:b w:val="false"/>
-                <w:u w:val="none"/>
-                <w:strike w:val="false"/>
-                <w:sz w:val="22"/>
-                <w:szCs w:val="22"/>
-                <w:color w:val="000000"/>
+              <w:spacing w:before="100" w:after="100"/>
+              <w:ind w:left="100" w:right="100"/>
+              <w:jc w:val="center"/>
+              <w:rPr>
+                <w:rFonts w:ascii="Helvetica" w:eastAsia="Helvetica" w:hAnsi="Helvetica" w:cs="Helvetica"/>
+                <w:color w:val="000000"/>
+                <w:sz w:val="22"/>
+                <w:szCs w:val="22"/>
               </w:rPr>
             </w:pPr>
             <w:r>
               <w:rPr>
-                <w:rFonts w:ascii="Helvetica" w:hAnsi="Helvetica" w:eastAsia="Helvetica" w:cs="Helvetica"/>
-                <w:i w:val="false"/>
-                <w:b w:val="false"/>
-                <w:u w:val="none"/>
-                <w:strike w:val="false"/>
-                <w:sz w:val="22"/>
-                <w:szCs w:val="22"/>
-                <w:color w:val="000000"/>
-              </w:rPr>
-              <w:t xml:space="preserve">9,073 (20.4%)</w:t>
+                <w:rFonts w:ascii="Helvetica" w:eastAsia="Helvetica" w:hAnsi="Helvetica" w:cs="Helvetica"/>
+                <w:color w:val="000000"/>
+                <w:sz w:val="22"/>
+                <w:szCs w:val="22"/>
+              </w:rPr>
+              <w:t>9,073 (20.4%)</w:t>
             </w:r>
           </w:p>
         </w:tc>
         <w:tc>
           <w:tcPr>
+            <w:tcW w:w="3088" w:type="dxa"/>
             <w:tcBorders>
-              <w:bottom w:val="none" w:sz="0" w:space="0" w:color="000000"/>
               <w:top w:val="none" w:sz="0" w:space="0" w:color="000000"/>
               <w:left w:val="none" w:sz="0" w:space="0" w:color="000000"/>
+              <w:bottom w:val="none" w:sz="0" w:space="0" w:color="000000"/>
               <w:right w:val="none" w:sz="0" w:space="0" w:color="000000"/>
             </w:tcBorders>
             <w:shd w:val="clear" w:color="auto" w:fill="FFFFFF"/>
             <w:tcMar>
               <w:top w:w="0" w:type="dxa"/>
+              <w:left w:w="0" w:type="dxa"/>
               <w:bottom w:w="0" w:type="dxa"/>
-              <w:left w:w="0" w:type="dxa"/>
               <w:right w:w="0" w:type="dxa"/>
             </w:tcMar>
-            <w:vAlign w:val="top"/>
           </w:tcPr>
           <w:p>
             <w:pPr>
-              <w:pStyle w:val="Normal"/>
-              <w:jc w:val="center"/>
               <w:pBdr>
-                <w:bottom w:val="none" w:sz="0" w:space="0" w:color="000000"/>
                 <w:top w:val="none" w:sz="0" w:space="0" w:color="000000"/>
                 <w:left w:val="none" w:sz="0" w:space="0" w:color="000000"/>
+                <w:bottom w:val="none" w:sz="0" w:space="0" w:color="000000"/>
                 <w:right w:val="none" w:sz="0" w:space="0" w:color="000000"/>
               </w:pBdr>
-              <w:spacing w:after="100" w:before="100" w:line="240"/>
-              <w:ind w:left="100" w:right="100" w:firstLine="0" w:firstLineChars="0"/>
-              <w:rPr>
-                <w:rFonts w:ascii="Helvetica" w:hAnsi="Helvetica" w:eastAsia="Helvetica" w:cs="Helvetica"/>
-                <w:i w:val="false"/>
-                <w:b w:val="false"/>
-                <w:u w:val="none"/>
-                <w:strike w:val="false"/>
-                <w:sz w:val="22"/>
-                <w:szCs w:val="22"/>
-                <w:color w:val="000000"/>
+              <w:spacing w:before="100" w:after="100"/>
+              <w:ind w:left="100" w:right="100"/>
+              <w:jc w:val="center"/>
+              <w:rPr>
+                <w:rFonts w:ascii="Helvetica" w:eastAsia="Helvetica" w:hAnsi="Helvetica" w:cs="Helvetica"/>
+                <w:color w:val="000000"/>
+                <w:sz w:val="22"/>
+                <w:szCs w:val="22"/>
               </w:rPr>
             </w:pPr>
             <w:r>
               <w:rPr>
-                <w:rFonts w:ascii="Helvetica" w:hAnsi="Helvetica" w:eastAsia="Helvetica" w:cs="Helvetica"/>
-                <w:i w:val="false"/>
-                <w:b w:val="false"/>
-                <w:u w:val="none"/>
-                <w:strike w:val="false"/>
-                <w:sz w:val="22"/>
-                <w:szCs w:val="22"/>
-                <w:color w:val="000000"/>
-              </w:rPr>
-              <w:t xml:space="preserve">4,336 (17.1%)</w:t>
+                <w:rFonts w:ascii="Helvetica" w:eastAsia="Helvetica" w:hAnsi="Helvetica" w:cs="Helvetica"/>
+                <w:color w:val="000000"/>
+                <w:sz w:val="22"/>
+                <w:szCs w:val="22"/>
+              </w:rPr>
+              <w:t>4,336 (17.1%)</w:t>
             </w:r>
           </w:p>
         </w:tc>
       </w:tr>
       <w:tr>
         <w:trPr>
-          <w:trHeight w:val="616" w:hRule="auto"/>
+          <w:jc w:val="center"/>
         </w:trPr>
         <w:tc>
           <w:tcPr>
+            <w:tcW w:w="2576" w:type="dxa"/>
             <w:tcBorders>
-              <w:bottom w:val="single" w:sz="8" w:space="0" w:color="000000"/>
               <w:top w:val="none" w:sz="0" w:space="0" w:color="000000"/>
               <w:left w:val="none" w:sz="0" w:space="0" w:color="000000"/>
+              <w:bottom w:val="single" w:sz="8" w:space="0" w:color="000000"/>
               <w:right w:val="none" w:sz="0" w:space="0" w:color="000000"/>
             </w:tcBorders>
             <w:shd w:val="clear" w:color="auto" w:fill="FFFFFF"/>
             <w:tcMar>
               <w:top w:w="0" w:type="dxa"/>
+              <w:left w:w="0" w:type="dxa"/>
               <w:bottom w:w="0" w:type="dxa"/>
-              <w:left w:w="0" w:type="dxa"/>
               <w:right w:w="0" w:type="dxa"/>
             </w:tcMar>
-            <w:vAlign w:val="top"/>
           </w:tcPr>
           <w:p>
             <w:pPr>
-              <w:pStyle w:val="Normal"/>
-              <w:jc w:val="left"/>
               <w:pBdr>
-                <w:bottom w:val="none" w:sz="0" w:space="0" w:color="000000"/>
                 <w:top w:val="none" w:sz="0" w:space="0" w:color="000000"/>
                 <w:left w:val="none" w:sz="0" w:space="0" w:color="000000"/>
+                <w:bottom w:val="none" w:sz="0" w:space="0" w:color="000000"/>
                 <w:right w:val="none" w:sz="0" w:space="0" w:color="000000"/>
               </w:pBdr>
-              <w:spacing w:after="100" w:before="100" w:line="240"/>
-              <w:ind w:left="300" w:right="100" w:firstLine="0" w:firstLineChars="0"/>
-              <w:rPr>
-                <w:rFonts w:ascii="Helvetica" w:hAnsi="Helvetica" w:eastAsia="Helvetica" w:cs="Helvetica"/>
-                <w:i w:val="false"/>
-                <w:b w:val="false"/>
-                <w:u w:val="none"/>
-                <w:strike w:val="false"/>
-                <w:sz w:val="22"/>
-                <w:szCs w:val="22"/>
-                <w:color w:val="000000"/>
+              <w:spacing w:before="100" w:after="100"/>
+              <w:ind w:left="300" w:right="100"/>
+              <w:rPr>
+                <w:rFonts w:ascii="Helvetica" w:eastAsia="Helvetica" w:hAnsi="Helvetica" w:cs="Helvetica"/>
+                <w:color w:val="000000"/>
+                <w:sz w:val="22"/>
+                <w:szCs w:val="22"/>
               </w:rPr>
             </w:pPr>
             <w:r>
               <w:rPr>
-                <w:rFonts w:ascii="Helvetica" w:hAnsi="Helvetica" w:eastAsia="Helvetica" w:cs="Helvetica"/>
-                <w:i w:val="false"/>
-                <w:b w:val="false"/>
-                <w:u w:val="none"/>
-                <w:strike w:val="false"/>
-                <w:sz w:val="22"/>
-                <w:szCs w:val="22"/>
-                <w:color w:val="000000"/>
-              </w:rPr>
-              <w:t xml:space="preserve">MUY ALTO</w:t>
+                <w:rFonts w:ascii="Helvetica" w:eastAsia="Helvetica" w:hAnsi="Helvetica" w:cs="Helvetica"/>
+                <w:color w:val="000000"/>
+                <w:sz w:val="22"/>
+                <w:szCs w:val="22"/>
+              </w:rPr>
+              <w:t>MUY ALTO</w:t>
             </w:r>
           </w:p>
         </w:tc>
         <w:tc>
           <w:tcPr>
+            <w:tcW w:w="3088" w:type="dxa"/>
             <w:tcBorders>
-              <w:bottom w:val="single" w:sz="8" w:space="0" w:color="000000"/>
               <w:top w:val="none" w:sz="0" w:space="0" w:color="000000"/>
               <w:left w:val="none" w:sz="0" w:space="0" w:color="000000"/>
+              <w:bottom w:val="single" w:sz="8" w:space="0" w:color="000000"/>
               <w:right w:val="none" w:sz="0" w:space="0" w:color="000000"/>
             </w:tcBorders>
             <w:shd w:val="clear" w:color="auto" w:fill="FFFFFF"/>
             <w:tcMar>
               <w:top w:w="0" w:type="dxa"/>
+              <w:left w:w="0" w:type="dxa"/>
               <w:bottom w:w="0" w:type="dxa"/>
-              <w:left w:w="0" w:type="dxa"/>
               <w:right w:w="0" w:type="dxa"/>
             </w:tcMar>
-            <w:vAlign w:val="top"/>
           </w:tcPr>
           <w:p>
             <w:pPr>
-              <w:pStyle w:val="Normal"/>
-              <w:jc w:val="center"/>
               <w:pBdr>
-                <w:bottom w:val="none" w:sz="0" w:space="0" w:color="000000"/>
                 <w:top w:val="none" w:sz="0" w:space="0" w:color="000000"/>
                 <w:left w:val="none" w:sz="0" w:space="0" w:color="000000"/>
+                <w:bottom w:val="none" w:sz="0" w:space="0" w:color="000000"/>
                 <w:right w:val="none" w:sz="0" w:space="0" w:color="000000"/>
               </w:pBdr>
-              <w:spacing w:after="100" w:before="100" w:line="240"/>
-              <w:ind w:left="100" w:right="100" w:firstLine="0" w:firstLineChars="0"/>
-              <w:rPr>
-                <w:rFonts w:ascii="Helvetica" w:hAnsi="Helvetica" w:eastAsia="Helvetica" w:cs="Helvetica"/>
-                <w:i w:val="false"/>
-                <w:b w:val="false"/>
-                <w:u w:val="none"/>
-                <w:strike w:val="false"/>
-                <w:sz w:val="22"/>
-                <w:szCs w:val="22"/>
-                <w:color w:val="000000"/>
+              <w:spacing w:before="100" w:after="100"/>
+              <w:ind w:left="100" w:right="100"/>
+              <w:jc w:val="center"/>
+              <w:rPr>
+                <w:rFonts w:ascii="Helvetica" w:eastAsia="Helvetica" w:hAnsi="Helvetica" w:cs="Helvetica"/>
+                <w:color w:val="000000"/>
+                <w:sz w:val="22"/>
+                <w:szCs w:val="22"/>
               </w:rPr>
             </w:pPr>
             <w:r>
               <w:rPr>
-                <w:rFonts w:ascii="Helvetica" w:hAnsi="Helvetica" w:eastAsia="Helvetica" w:cs="Helvetica"/>
-                <w:i w:val="false"/>
-                <w:b w:val="false"/>
-                <w:u w:val="none"/>
-                <w:strike w:val="false"/>
-                <w:sz w:val="22"/>
-                <w:szCs w:val="22"/>
-                <w:color w:val="000000"/>
-              </w:rPr>
-              <w:t xml:space="preserve">12,681 (18.2%)</w:t>
+                <w:rFonts w:ascii="Helvetica" w:eastAsia="Helvetica" w:hAnsi="Helvetica" w:cs="Helvetica"/>
+                <w:color w:val="000000"/>
+                <w:sz w:val="22"/>
+                <w:szCs w:val="22"/>
+              </w:rPr>
+              <w:t>12,681 (18.2%)</w:t>
             </w:r>
           </w:p>
         </w:tc>
         <w:tc>
           <w:tcPr>
+            <w:tcW w:w="3088" w:type="dxa"/>
             <w:tcBorders>
-              <w:bottom w:val="single" w:sz="8" w:space="0" w:color="000000"/>
               <w:top w:val="none" w:sz="0" w:space="0" w:color="000000"/>
               <w:left w:val="none" w:sz="0" w:space="0" w:color="000000"/>
+              <w:bottom w:val="single" w:sz="8" w:space="0" w:color="000000"/>
               <w:right w:val="none" w:sz="0" w:space="0" w:color="000000"/>
             </w:tcBorders>
             <w:shd w:val="clear" w:color="auto" w:fill="FFFFFF"/>
             <w:tcMar>
               <w:top w:w="0" w:type="dxa"/>
+              <w:left w:w="0" w:type="dxa"/>
               <w:bottom w:w="0" w:type="dxa"/>
-              <w:left w:w="0" w:type="dxa"/>
               <w:right w:w="0" w:type="dxa"/>
             </w:tcMar>
-            <w:vAlign w:val="top"/>
           </w:tcPr>
           <w:p>
             <w:pPr>
-              <w:pStyle w:val="Normal"/>
-              <w:jc w:val="center"/>
               <w:pBdr>
-                <w:bottom w:val="none" w:sz="0" w:space="0" w:color="000000"/>
                 <w:top w:val="none" w:sz="0" w:space="0" w:color="000000"/>
                 <w:left w:val="none" w:sz="0" w:space="0" w:color="000000"/>
+                <w:bottom w:val="none" w:sz="0" w:space="0" w:color="000000"/>
                 <w:right w:val="none" w:sz="0" w:space="0" w:color="000000"/>
               </w:pBdr>
-              <w:spacing w:after="100" w:before="100" w:line="240"/>
-              <w:ind w:left="100" w:right="100" w:firstLine="0" w:firstLineChars="0"/>
-              <w:rPr>
-                <w:rFonts w:ascii="Helvetica" w:hAnsi="Helvetica" w:eastAsia="Helvetica" w:cs="Helvetica"/>
-                <w:i w:val="false"/>
-                <w:b w:val="false"/>
-                <w:u w:val="none"/>
-                <w:strike w:val="false"/>
-                <w:sz w:val="22"/>
-                <w:szCs w:val="22"/>
-                <w:color w:val="000000"/>
+              <w:spacing w:before="100" w:after="100"/>
+              <w:ind w:left="100" w:right="100"/>
+              <w:jc w:val="center"/>
+              <w:rPr>
+                <w:rFonts w:ascii="Helvetica" w:eastAsia="Helvetica" w:hAnsi="Helvetica" w:cs="Helvetica"/>
+                <w:color w:val="000000"/>
+                <w:sz w:val="22"/>
+                <w:szCs w:val="22"/>
               </w:rPr>
             </w:pPr>
             <w:r>
               <w:rPr>
-                <w:rFonts w:ascii="Helvetica" w:hAnsi="Helvetica" w:eastAsia="Helvetica" w:cs="Helvetica"/>
-                <w:i w:val="false"/>
-                <w:b w:val="false"/>
-                <w:u w:val="none"/>
-                <w:strike w:val="false"/>
-                <w:sz w:val="22"/>
-                <w:szCs w:val="22"/>
-                <w:color w:val="000000"/>
-              </w:rPr>
-              <w:t xml:space="preserve">8,390 (18.9%)</w:t>
+                <w:rFonts w:ascii="Helvetica" w:eastAsia="Helvetica" w:hAnsi="Helvetica" w:cs="Helvetica"/>
+                <w:color w:val="000000"/>
+                <w:sz w:val="22"/>
+                <w:szCs w:val="22"/>
+              </w:rPr>
+              <w:t>8,390 (18.9%)</w:t>
             </w:r>
           </w:p>
         </w:tc>
         <w:tc>
           <w:tcPr>
+            <w:tcW w:w="3088" w:type="dxa"/>
             <w:tcBorders>
-              <w:bottom w:val="single" w:sz="8" w:space="0" w:color="000000"/>
               <w:top w:val="none" w:sz="0" w:space="0" w:color="000000"/>
               <w:left w:val="none" w:sz="0" w:space="0" w:color="000000"/>
+              <w:bottom w:val="single" w:sz="8" w:space="0" w:color="000000"/>
               <w:right w:val="none" w:sz="0" w:space="0" w:color="000000"/>
             </w:tcBorders>
             <w:shd w:val="clear" w:color="auto" w:fill="FFFFFF"/>
             <w:tcMar>
               <w:top w:w="0" w:type="dxa"/>
+              <w:left w:w="0" w:type="dxa"/>
               <w:bottom w:w="0" w:type="dxa"/>
-              <w:left w:w="0" w:type="dxa"/>
               <w:right w:w="0" w:type="dxa"/>
             </w:tcMar>
-            <w:vAlign w:val="top"/>
           </w:tcPr>
           <w:p>
             <w:pPr>
-              <w:pStyle w:val="Normal"/>
-              <w:jc w:val="center"/>
               <w:pBdr>
-                <w:bottom w:val="none" w:sz="0" w:space="0" w:color="000000"/>
                 <w:top w:val="none" w:sz="0" w:space="0" w:color="000000"/>
                 <w:left w:val="none" w:sz="0" w:space="0" w:color="000000"/>
+                <w:bottom w:val="none" w:sz="0" w:space="0" w:color="000000"/>
                 <w:right w:val="none" w:sz="0" w:space="0" w:color="000000"/>
               </w:pBdr>
-              <w:spacing w:after="100" w:before="100" w:line="240"/>
-              <w:ind w:left="100" w:right="100" w:firstLine="0" w:firstLineChars="0"/>
-              <w:rPr>
-                <w:rFonts w:ascii="Helvetica" w:hAnsi="Helvetica" w:eastAsia="Helvetica" w:cs="Helvetica"/>
-                <w:i w:val="false"/>
-                <w:b w:val="false"/>
-                <w:u w:val="none"/>
-                <w:strike w:val="false"/>
-                <w:sz w:val="22"/>
-                <w:szCs w:val="22"/>
-                <w:color w:val="000000"/>
+              <w:spacing w:before="100" w:after="100"/>
+              <w:ind w:left="100" w:right="100"/>
+              <w:jc w:val="center"/>
+              <w:rPr>
+                <w:rFonts w:ascii="Helvetica" w:eastAsia="Helvetica" w:hAnsi="Helvetica" w:cs="Helvetica"/>
+                <w:color w:val="000000"/>
+                <w:sz w:val="22"/>
+                <w:szCs w:val="22"/>
               </w:rPr>
             </w:pPr>
             <w:r>
               <w:rPr>
-                <w:rFonts w:ascii="Helvetica" w:hAnsi="Helvetica" w:eastAsia="Helvetica" w:cs="Helvetica"/>
-                <w:i w:val="false"/>
-                <w:b w:val="false"/>
-                <w:u w:val="none"/>
-                <w:strike w:val="false"/>
-                <w:sz w:val="22"/>
-                <w:szCs w:val="22"/>
-                <w:color w:val="000000"/>
-              </w:rPr>
-              <w:t xml:space="preserve">4,291 (16.9%)</w:t>
+                <w:rFonts w:ascii="Helvetica" w:eastAsia="Helvetica" w:hAnsi="Helvetica" w:cs="Helvetica"/>
+                <w:color w:val="000000"/>
+                <w:sz w:val="22"/>
+                <w:szCs w:val="22"/>
+              </w:rPr>
+              <w:t>4,291 (16.9%)</w:t>
             </w:r>
           </w:p>
         </w:tc>
       </w:tr>
       <w:tr>
         <w:trPr>
-          <w:trHeight w:val="360" w:hRule="auto"/>
+          <w:jc w:val="center"/>
         </w:trPr>
         <w:tc>
           <w:tcPr>
+            <w:tcW w:w="11840" w:type="dxa"/>
             <w:gridSpan w:val="4"/>
             <w:tcBorders>
-              <w:bottom w:val="none" w:sz="0" w:space="0" w:color="FFFFFF"/>
               <w:top w:val="single" w:sz="8" w:space="0" w:color="000000"/>
               <w:left w:val="none" w:sz="0" w:space="0" w:color="FFFFFF"/>
+              <w:bottom w:val="none" w:sz="0" w:space="0" w:color="FFFFFF"/>
               <w:right w:val="none" w:sz="0" w:space="0" w:color="FFFFFF"/>
             </w:tcBorders>
             <w:shd w:val="clear" w:color="auto" w:fill="FFFFFF"/>
             <w:tcMar>
               <w:top w:w="0" w:type="dxa"/>
+              <w:left w:w="0" w:type="dxa"/>
               <w:bottom w:w="0" w:type="dxa"/>
-              <w:left w:w="0" w:type="dxa"/>
               <w:right w:w="0" w:type="dxa"/>
             </w:tcMar>
             <w:vAlign w:val="center"/>
           </w:tcPr>
           <w:p>
             <w:pPr>
-              <w:pStyle w:val="Normal"/>
-              <w:jc w:val="left"/>
               <w:pBdr>
-                <w:bottom w:val="none" w:sz="0" w:space="0" w:color="000000"/>
                 <w:top w:val="none" w:sz="0" w:space="0" w:color="000000"/>
                 <w:left w:val="none" w:sz="0" w:space="0" w:color="000000"/>
+                <w:bottom w:val="none" w:sz="0" w:space="0" w:color="000000"/>
                 <w:right w:val="none" w:sz="0" w:space="0" w:color="000000"/>
               </w:pBdr>
-              <w:spacing w:after="100" w:before="100" w:line="240"/>
-              <w:ind w:left="100" w:right="100" w:firstLine="0" w:firstLineChars="0"/>
-              <w:rPr>
-                <w:rFonts w:ascii="Helvetica" w:hAnsi="Helvetica" w:eastAsia="Helvetica" w:cs="Helvetica"/>
-                <w:i w:val="false"/>
-                <w:b w:val="false"/>
-                <w:u w:val="none"/>
-                <w:strike w:val="false"/>
-                <w:sz w:val="22"/>
-                <w:szCs w:val="22"/>
-                <w:color w:val="000000"/>
+              <w:spacing w:before="100" w:after="100"/>
+              <w:ind w:left="100" w:right="100"/>
+              <w:rPr>
+                <w:rFonts w:ascii="Helvetica" w:eastAsia="Helvetica" w:hAnsi="Helvetica" w:cs="Helvetica"/>
+                <w:color w:val="000000"/>
+                <w:sz w:val="22"/>
+                <w:szCs w:val="22"/>
               </w:rPr>
             </w:pPr>
             <w:r>
               <w:rPr>
-                <w:rFonts w:ascii="Helvetica" w:hAnsi="Helvetica" w:eastAsia="Helvetica" w:cs="Helvetica"/>
-                <w:i w:val="false"/>
-                <w:b w:val="false"/>
-                <w:u w:val="none"/>
-                <w:strike w:val="false"/>
+                <w:rFonts w:ascii="Helvetica" w:eastAsia="Helvetica" w:hAnsi="Helvetica" w:cs="Helvetica"/>
+                <w:color w:val="000000"/>
+                <w:sz w:val="22"/>
+                <w:szCs w:val="22"/>
                 <w:vertAlign w:val="superscript"/>
-                <w:sz w:val="22"/>
-                <w:szCs w:val="22"/>
-                <w:color w:val="000000"/>
-              </w:rPr>
-              <w:t xml:space="preserve">1</w:t>
-            </w:r>
-            <w:r>
-              <w:rPr>
-                <w:rFonts w:ascii="Helvetica" w:hAnsi="Helvetica" w:eastAsia="Helvetica" w:cs="Helvetica"/>
-                <w:i w:val="false"/>
-                <w:b w:val="false"/>
-                <w:u w:val="none"/>
-                <w:strike w:val="false"/>
-                <w:sz w:val="22"/>
-                <w:szCs w:val="22"/>
-                <w:color w:val="000000"/>
-              </w:rPr>
-              <w:t xml:space="preserve">n (%); Media ± DE. CPO-D: Cariados, Perdidos, Obturados - Dientes.</w:t>
+              </w:rPr>
+              <w:t>1</w:t>
+            </w:r>
+            <w:r>
+              <w:rPr>
+                <w:rFonts w:ascii="Helvetica" w:eastAsia="Helvetica" w:hAnsi="Helvetica" w:cs="Helvetica"/>
+                <w:color w:val="000000"/>
+                <w:sz w:val="22"/>
+                <w:szCs w:val="22"/>
+              </w:rPr>
+              <w:t xml:space="preserve">n (%); Media ± DE. CPO-D: </w:t>
+            </w:r>
+            <w:proofErr w:type="spellStart"/>
+            <w:r>
+              <w:rPr>
+                <w:rFonts w:ascii="Helvetica" w:eastAsia="Helvetica" w:hAnsi="Helvetica" w:cs="Helvetica"/>
+                <w:color w:val="000000"/>
+                <w:sz w:val="22"/>
+                <w:szCs w:val="22"/>
+              </w:rPr>
+              <w:t>Cariados</w:t>
+            </w:r>
+            <w:proofErr w:type="spellEnd"/>
+            <w:r>
+              <w:rPr>
+                <w:rFonts w:ascii="Helvetica" w:eastAsia="Helvetica" w:hAnsi="Helvetica" w:cs="Helvetica"/>
+                <w:color w:val="000000"/>
+                <w:sz w:val="22"/>
+                <w:szCs w:val="22"/>
+              </w:rPr>
+              <w:t xml:space="preserve">, </w:t>
+            </w:r>
+            <w:proofErr w:type="spellStart"/>
+            <w:r>
+              <w:rPr>
+                <w:rFonts w:ascii="Helvetica" w:eastAsia="Helvetica" w:hAnsi="Helvetica" w:cs="Helvetica"/>
+                <w:color w:val="000000"/>
+                <w:sz w:val="22"/>
+                <w:szCs w:val="22"/>
+              </w:rPr>
+              <w:t>Perdidos</w:t>
+            </w:r>
+            <w:proofErr w:type="spellEnd"/>
+            <w:r>
+              <w:rPr>
+                <w:rFonts w:ascii="Helvetica" w:eastAsia="Helvetica" w:hAnsi="Helvetica" w:cs="Helvetica"/>
+                <w:color w:val="000000"/>
+                <w:sz w:val="22"/>
+                <w:szCs w:val="22"/>
+              </w:rPr>
+              <w:t xml:space="preserve">, </w:t>
+            </w:r>
+            <w:proofErr w:type="spellStart"/>
+            <w:r>
+              <w:rPr>
+                <w:rFonts w:ascii="Helvetica" w:eastAsia="Helvetica" w:hAnsi="Helvetica" w:cs="Helvetica"/>
+                <w:color w:val="000000"/>
+                <w:sz w:val="22"/>
+                <w:szCs w:val="22"/>
+              </w:rPr>
+              <w:t>Obturados</w:t>
+            </w:r>
+            <w:proofErr w:type="spellEnd"/>
+            <w:r>
+              <w:rPr>
+                <w:rFonts w:ascii="Helvetica" w:eastAsia="Helvetica" w:hAnsi="Helvetica" w:cs="Helvetica"/>
+                <w:color w:val="000000"/>
+                <w:sz w:val="22"/>
+                <w:szCs w:val="22"/>
+              </w:rPr>
+              <w:t xml:space="preserve"> - </w:t>
+            </w:r>
+            <w:proofErr w:type="spellStart"/>
+            <w:r>
+              <w:rPr>
+                <w:rFonts w:ascii="Helvetica" w:eastAsia="Helvetica" w:hAnsi="Helvetica" w:cs="Helvetica"/>
+                <w:color w:val="000000"/>
+                <w:sz w:val="22"/>
+                <w:szCs w:val="22"/>
+              </w:rPr>
+              <w:t>Dientes</w:t>
+            </w:r>
+            <w:proofErr w:type="spellEnd"/>
+            <w:r>
+              <w:rPr>
+                <w:rFonts w:ascii="Helvetica" w:eastAsia="Helvetica" w:hAnsi="Helvetica" w:cs="Helvetica"/>
+                <w:color w:val="000000"/>
+                <w:sz w:val="22"/>
+                <w:szCs w:val="22"/>
+              </w:rPr>
+              <w:t>.</w:t>
             </w:r>
           </w:p>
         </w:tc>
       </w:tr>
     </w:tbl>
+    <w:p/>
     <w:sectPr>
-      <w:pgMar w:header="708" w:bottom="1417" w:top="1417" w:right="1417" w:left="1417" w:footer="708" w:gutter="0"/>
-      <w:pgSz w:h="16838" w:w="11906" w:orient="portrait"/>
       <w:type w:val="continuous"/>
-      <w:cols/>
+      <w:pgSz w:w="16838" w:h="11906" w:orient="landscape"/>
+      <w:pgMar w:top="1417" w:right="1417" w:bottom="1417" w:left="1417" w:header="708" w:footer="708" w:gutter="0"/>
+      <w:cols w:space="720"/>
+      <w:docGrid w:linePitch="326"/>
     </w:sectPr>
   </w:body>
 </w:document>
 </file>
 
-<file path=word/comments.xml><?xml version="1.0" encoding="utf-8"?>
-<w:comments xmlns:wpc="http://schemas.microsoft.com/office/word/2010/wordprocessingCanvas" xmlns:mo="http://schemas.microsoft.com/office/mac/office/2008/main" xmlns:mc="http://schemas.openxmlformats.org/markup-compatibility/2006" xmlns:mv="urn:schemas-microsoft-com:mac:vml" xmlns:o="urn:schemas-microsoft-com:office:office" xmlns:r="http://schemas.openxmlformats.org/officeDocument/2006/relationships" xmlns:m="http://schemas.openxmlformats.org/officeDocument/2006/math" xmlns:v="urn:schemas-microsoft-com:vml" xmlns:wp14="http://schemas.microsoft.com/office/word/2010/wordprocessingDrawing" xmlns:wp="http://schemas.openxmlformats.org/drawingml/2006/wordprocessingDrawing" xmlns:w10="urn:schemas-microsoft-com:office:word" xmlns:w="http://schemas.openxmlformats.org/wordprocessingml/2006/main" xmlns:w14="http://schemas.microsoft.com/office/word/2010/wordml" xmlns:wpg="http://schemas.microsoft.com/office/word/2010/wordprocessingGroup" xmlns:wpi="http://schemas.microsoft.com/office/word/2010/wordprocessingInk" xmlns:wne="http://schemas.microsoft.com/office/word/2006/wordml" xmlns:wps="http://schemas.microsoft.com/office/word/2010/wordprocessingShape" mc:Ignorable="w14 wp14">
-</w:comments>
-</file>
-
-<file path=word/footnotes.xml><?xml version="1.0" encoding="utf-8"?>
-<w:footnotes xmlns:wpc="http://schemas.microsoft.com/office/word/2010/wordprocessingCanvas" xmlns:mo="http://schemas.microsoft.com/office/mac/office/2008/main" xmlns:mc="http://schemas.openxmlformats.org/markup-compatibility/2006" xmlns:mv="urn:schemas-microsoft-com:mac:vml" xmlns:o="urn:schemas-microsoft-com:office:office" xmlns:r="http://schemas.openxmlformats.org/officeDocument/2006/relationships" xmlns:m="http://schemas.openxmlformats.org/officeDocument/2006/math" xmlns:v="urn:schemas-microsoft-com:vml" xmlns:wp14="http://schemas.microsoft.com/office/word/2010/wordprocessingDrawing" xmlns:wp="http://schemas.openxmlformats.org/drawingml/2006/wordprocessingDrawing" xmlns:w10="urn:schemas-microsoft-com:office:word" xmlns:w="http://schemas.openxmlformats.org/wordprocessingml/2006/main" xmlns:w14="http://schemas.microsoft.com/office/word/2010/wordml" xmlns:wpg="http://schemas.microsoft.com/office/word/2010/wordprocessingGroup" xmlns:wpi="http://schemas.microsoft.com/office/word/2010/wordprocessingInk" xmlns:wne="http://schemas.microsoft.com/office/word/2006/wordml" xmlns:wps="http://schemas.microsoft.com/office/word/2010/wordprocessingShape" mc:Ignorable="w14 wp14">
-  <w:footnote w:type="separator" w:id="-1">
-    <w:p>
-      <w:r>
-        <w:separator/>
-      </w:r>
-    </w:p>
-  </w:footnote>
-  <w:footnote w:type="continuationSeparator" w:id="0">
-    <w:p>
-      <w:r>
-        <w:continuationSeparator/>
-      </w:r>
-    </w:p>
-  </w:footnote>
-</w:footnotes>
-</file>
-
 <file path=word/numbering.xml><?xml version="1.0" encoding="utf-8"?>
-<w:numbering xmlns:wpc="http://schemas.microsoft.com/office/word/2010/wordprocessingCanvas" xmlns:cx="http://schemas.microsoft.com/office/drawing/2014/chartex" xmlns:cx1="http://schemas.microsoft.com/office/drawing/2015/9/8/chartex" xmlns:cx2="http://schemas.microsoft.com/office/drawing/2015/10/21/chartex" xmlns:cx3="http://schemas.microsoft.com/office/drawing/2016/5/9/chartex" xmlns:cx4="http://schemas.microsoft.com/office/drawing/2016/5/10/chartex" xmlns:cx5="http://schemas.microsoft.com/office/drawing/2016/5/11/chartex" xmlns:cx6="http://schemas.microsoft.com/office/drawing/2016/5/12/chartex" xmlns:cx7="http://schemas.microsoft.com/office/drawing/2016/5/13/chartex" xmlns:cx8="http://schemas.microsoft.com/office/drawing/2016/5/14/chartex" xmlns:mc="http://schemas.openxmlformats.org/markup-compatibility/2006" xmlns:aink="http://schemas.microsoft.com/office/drawing/2016/ink" xmlns:am3d="http://schemas.microsoft.com/office/drawing/2017/model3d" xmlns:o="urn:schemas-microsoft-com:office:office" xmlns:r="http://schemas.openxmlformats.org/officeDocument/2006/relationships" xmlns:m="http://schemas.openxmlformats.org/officeDocument/2006/math" xmlns:v="urn:schemas-microsoft-com:vml" xmlns:wp14="http://schemas.microsoft.com/office/word/2010/wordprocessingDrawing" xmlns:wp="http://schemas.openxmlformats.org/drawingml/2006/wordprocessingDrawing" xmlns:w10="urn:schemas-microsoft-com:office:word" xmlns:w="http://schemas.openxmlformats.org/wordprocessingml/2006/main" xmlns:w14="http://schemas.microsoft.com/office/word/2010/wordml" xmlns:w15="http://schemas.microsoft.com/office/word/2012/wordml" xmlns:w16cex="http://schemas.microsoft.com/office/word/2018/wordml/cex" xmlns:w16cid="http://schemas.microsoft.com/office/word/2016/wordml/cid" xmlns:w16="http://schemas.microsoft.com/office/word/2018/wordml" xmlns:w16se="http://schemas.microsoft.com/office/word/2015/wordml/symex" xmlns:wpg="http://schemas.microsoft.com/office/word/2010/wordprocessingGroup" xmlns:wpi="http://schemas.microsoft.com/office/word/2010/wordprocessingInk" xmlns:wne="http://schemas.microsoft.com/office/word/2006/wordml" xmlns:wps="http://schemas.microsoft.com/office/word/2010/wordprocessingShape" mc:Ignorable="w14 w15 w16se w16cid w16 w16cex wp14">
+<w:numbering xmlns:wpc="http://schemas.microsoft.com/office/word/2010/wordprocessingCanvas" xmlns:cx="http://schemas.microsoft.com/office/drawing/2014/chartex" xmlns:cx1="http://schemas.microsoft.com/office/drawing/2015/9/8/chartex" xmlns:cx2="http://schemas.microsoft.com/office/drawing/2015/10/21/chartex" xmlns:cx3="http://schemas.microsoft.com/office/drawing/2016/5/9/chartex" xmlns:cx4="http://schemas.microsoft.com/office/drawing/2016/5/10/chartex" xmlns:cx5="http://schemas.microsoft.com/office/drawing/2016/5/11/chartex" xmlns:cx6="http://schemas.microsoft.com/office/drawing/2016/5/12/chartex" xmlns:cx7="http://schemas.microsoft.com/office/drawing/2016/5/13/chartex" xmlns:cx8="http://schemas.microsoft.com/office/drawing/2016/5/14/chartex" xmlns:mc="http://schemas.openxmlformats.org/markup-compatibility/2006" xmlns:aink="http://schemas.microsoft.com/office/drawing/2016/ink" xmlns:am3d="http://schemas.microsoft.com/office/drawing/2017/model3d" xmlns:o="urn:schemas-microsoft-com:office:office" xmlns:oel="http://schemas.microsoft.com/office/2019/extlst" xmlns:r="http://schemas.openxmlformats.org/officeDocument/2006/relationships" xmlns:m="http://schemas.openxmlformats.org/officeDocument/2006/math" xmlns:v="urn:schemas-microsoft-com:vml" xmlns:wp14="http://schemas.microsoft.com/office/word/2010/wordprocessingDrawing" xmlns:wp="http://schemas.openxmlformats.org/drawingml/2006/wordprocessingDrawing" xmlns:w10="urn:schemas-microsoft-com:office:word" xmlns:w="http://schemas.openxmlformats.org/wordprocessingml/2006/main" xmlns:w14="http://schemas.microsoft.com/office/word/2010/wordml" xmlns:w15="http://schemas.microsoft.com/office/word/2012/wordml" xmlns:w16cex="http://schemas.microsoft.com/office/word/2018/wordml/cex" xmlns:w16cid="http://schemas.microsoft.com/office/word/2016/wordml/cid" xmlns:w16="http://schemas.microsoft.com/office/word/2018/wordml" xmlns:w16du="http://schemas.microsoft.com/office/word/2023/wordml/word16du" xmlns:w16sdtdh="http://schemas.microsoft.com/office/word/2020/wordml/sdtdatahash" xmlns:w16sdtfl="http://schemas.microsoft.com/office/word/2024/wordml/sdtformatlock" xmlns:w16se="http://schemas.microsoft.com/office/word/2015/wordml/symex" xmlns:wpg="http://schemas.microsoft.com/office/word/2010/wordprocessingGroup" xmlns:wpi="http://schemas.microsoft.com/office/word/2010/wordprocessingInk" xmlns:wne="http://schemas.microsoft.com/office/word/2006/wordml" xmlns:wps="http://schemas.microsoft.com/office/word/2010/wordprocessingShape" mc:Ignorable="w14 w15 w16se w16cid w16 w16cex w16sdtdh w16sdtfl w16du wp14">
   <w:abstractNum w:abstractNumId="0" w15:restartNumberingAfterBreak="0">
     <w:nsid w:val="07E925FD"/>
     <w:multiLevelType w:val="multilevel"/>
@@ -2133,7 +1950,7 @@
     <w:lvl w:ilvl="0">
       <w:start w:val="1"/>
       <w:numFmt w:val="decimal"/>
-      <w:pStyle w:val="Titre1"/>
+      <w:pStyle w:val="Ttulo1"/>
       <w:lvlText w:val="%1."/>
       <w:lvlJc w:val="left"/>
       <w:pPr>
@@ -2143,7 +1960,7 @@
     <w:lvl w:ilvl="1">
       <w:start w:val="1"/>
       <w:numFmt w:val="decimal"/>
-      <w:pStyle w:val="Titre2"/>
+      <w:pStyle w:val="Ttulo2"/>
       <w:lvlText w:val="%1.%2."/>
       <w:lvlJc w:val="left"/>
       <w:pPr>
@@ -2153,7 +1970,7 @@
     <w:lvl w:ilvl="2">
       <w:start w:val="1"/>
       <w:numFmt w:val="decimal"/>
-      <w:pStyle w:val="Titre3"/>
+      <w:pStyle w:val="Ttulo3"/>
       <w:lvlText w:val="%1.%2.%3."/>
       <w:lvlJc w:val="left"/>
       <w:pPr>
@@ -2387,20 +2204,20 @@
       </w:pPr>
     </w:lvl>
   </w:abstractNum>
-  <w:num w:numId="1">
+  <w:num w:numId="1" w16cid:durableId="1311595340">
     <w:abstractNumId w:val="1"/>
   </w:num>
-  <w:num w:numId="2">
+  <w:num w:numId="2" w16cid:durableId="1897623960">
     <w:abstractNumId w:val="2"/>
   </w:num>
-  <w:num w:numId="3">
+  <w:num w:numId="3" w16cid:durableId="1417282597">
     <w:abstractNumId w:val="0"/>
   </w:num>
 </w:numbering>
 </file>
 
 <file path=word/styles.xml><?xml version="1.0" encoding="utf-8"?>
-<w:styles xmlns:mc="http://schemas.openxmlformats.org/markup-compatibility/2006" xmlns:r="http://schemas.openxmlformats.org/officeDocument/2006/relationships" xmlns:w="http://schemas.openxmlformats.org/wordprocessingml/2006/main" xmlns:w14="http://schemas.microsoft.com/office/word/2010/wordml" xmlns:w15="http://schemas.microsoft.com/office/word/2012/wordml" xmlns:w16cex="http://schemas.microsoft.com/office/word/2018/wordml/cex" xmlns:w16cid="http://schemas.microsoft.com/office/word/2016/wordml/cid" xmlns:w16="http://schemas.microsoft.com/office/word/2018/wordml" xmlns:w16se="http://schemas.microsoft.com/office/word/2015/wordml/symex" mc:Ignorable="w14 w15 w16se w16cid w16 w16cex">
+<w:styles xmlns:mc="http://schemas.openxmlformats.org/markup-compatibility/2006" xmlns:r="http://schemas.openxmlformats.org/officeDocument/2006/relationships" xmlns:w="http://schemas.openxmlformats.org/wordprocessingml/2006/main" xmlns:w14="http://schemas.microsoft.com/office/word/2010/wordml" xmlns:w15="http://schemas.microsoft.com/office/word/2012/wordml" xmlns:w16cex="http://schemas.microsoft.com/office/word/2018/wordml/cex" xmlns:w16cid="http://schemas.microsoft.com/office/word/2016/wordml/cid" xmlns:w16="http://schemas.microsoft.com/office/word/2018/wordml" xmlns:w16du="http://schemas.microsoft.com/office/word/2023/wordml/word16du" xmlns:w16sdtdh="http://schemas.microsoft.com/office/word/2020/wordml/sdtdatahash" xmlns:w16sdtfl="http://schemas.microsoft.com/office/word/2024/wordml/sdtformatlock" xmlns:w16se="http://schemas.microsoft.com/office/word/2015/wordml/symex" mc:Ignorable="w14 w15 w16se w16cid w16 w16cex w16sdtdh w16sdtfl w16du">
   <w:docDefaults>
     <w:rPrDefault>
       <w:rPr>
@@ -2785,11 +2602,11 @@
     <w:name w:val="Normal"/>
     <w:qFormat/>
   </w:style>
-  <w:style w:type="paragraph" w:styleId="Titre1">
+  <w:style w:type="paragraph" w:styleId="Ttulo1">
     <w:name w:val="heading 1"/>
     <w:basedOn w:val="Normal"/>
     <w:next w:val="Normal"/>
-    <w:link w:val="Titre1Car"/>
+    <w:link w:val="Ttulo1Car"/>
     <w:uiPriority w:val="9"/>
     <w:qFormat/>
     <w:rsid w:val="00362E65"/>
@@ -2813,11 +2630,11 @@
       <w:szCs w:val="32"/>
     </w:rPr>
   </w:style>
-  <w:style w:type="paragraph" w:styleId="Titre2">
+  <w:style w:type="paragraph" w:styleId="Ttulo2">
     <w:name w:val="heading 2"/>
     <w:basedOn w:val="Normal"/>
     <w:next w:val="Normal"/>
-    <w:link w:val="Titre2Car"/>
+    <w:link w:val="Ttulo2Car"/>
     <w:uiPriority w:val="9"/>
     <w:semiHidden/>
     <w:unhideWhenUsed/>
@@ -2841,11 +2658,11 @@
       <w:szCs w:val="26"/>
     </w:rPr>
   </w:style>
-  <w:style w:type="paragraph" w:styleId="Titre3">
+  <w:style w:type="paragraph" w:styleId="Ttulo3">
     <w:name w:val="heading 3"/>
     <w:basedOn w:val="Normal"/>
     <w:next w:val="Normal"/>
-    <w:link w:val="Titre3Car"/>
+    <w:link w:val="Ttulo3Car"/>
     <w:uiPriority w:val="9"/>
     <w:semiHidden/>
     <w:unhideWhenUsed/>
@@ -2867,13 +2684,13 @@
       <w:bCs/>
     </w:rPr>
   </w:style>
-  <w:style w:type="character" w:default="1" w:styleId="Policepardfaut">
+  <w:style w:type="character" w:default="1" w:styleId="Fuentedeprrafopredeter">
     <w:name w:val="Default Paragraph Font"/>
     <w:uiPriority w:val="1"/>
     <w:semiHidden/>
     <w:unhideWhenUsed/>
   </w:style>
-  <w:style w:type="table" w:default="1" w:styleId="TableauNormal">
+  <w:style w:type="table" w:default="1" w:styleId="Tablanormal">
     <w:name w:val="Normal Table"/>
     <w:uiPriority w:val="99"/>
     <w:semiHidden/>
@@ -2888,15 +2705,15 @@
       </w:tblCellMar>
     </w:tblPr>
   </w:style>
-  <w:style w:type="numbering" w:default="1" w:styleId="Aucuneliste">
+  <w:style w:type="numbering" w:default="1" w:styleId="Sinlista">
     <w:name w:val="No List"/>
     <w:uiPriority w:val="99"/>
     <w:semiHidden/>
     <w:unhideWhenUsed/>
   </w:style>
-  <w:style w:type="character" w:customStyle="1" w:styleId="strong">
-    <w:name w:val="strong"/>
-    <w:basedOn w:val="Policepardfaut"/>
+  <w:style w:type="character" w:customStyle="1" w:styleId="Textoennegrita1">
+    <w:name w:val="Texto en negrita1"/>
+    <w:basedOn w:val="Fuentedeprrafopredeter"/>
     <w:uiPriority w:val="1"/>
     <w:qFormat/>
     <w:rsid w:val="007B3E96"/>
@@ -2915,7 +2732,7 @@
   </w:style>
   <w:style w:type="table" w:customStyle="1" w:styleId="tabletemplate">
     <w:name w:val="table_template"/>
-    <w:basedOn w:val="TableauNormal"/>
+    <w:basedOn w:val="Tablanormal"/>
     <w:uiPriority w:val="59"/>
     <w:rsid w:val="00F12158"/>
     <w:pPr>
@@ -2951,9 +2768,9 @@
       </w:tcPr>
     </w:tblStylePr>
   </w:style>
-  <w:style w:type="table" w:styleId="Listeclaire-Accent2">
+  <w:style w:type="table" w:styleId="Listaclara-nfasis2">
     <w:name w:val="Light List Accent 2"/>
-    <w:basedOn w:val="TableauNormal"/>
+    <w:basedOn w:val="Tablanormal"/>
     <w:uiPriority w:val="61"/>
     <w:rsid w:val="00FC557F"/>
     <w:tblPr>
@@ -3033,10 +2850,10 @@
       </w:tcPr>
     </w:tblStylePr>
   </w:style>
-  <w:style w:type="character" w:customStyle="1" w:styleId="Titre1Car">
-    <w:name w:val="Titre 1 Car"/>
-    <w:basedOn w:val="Policepardfaut"/>
-    <w:link w:val="Titre1"/>
+  <w:style w:type="character" w:customStyle="1" w:styleId="Ttulo1Car">
+    <w:name w:val="Título 1 Car"/>
+    <w:basedOn w:val="Fuentedeprrafopredeter"/>
+    <w:link w:val="Ttulo1"/>
     <w:uiPriority w:val="9"/>
     <w:rsid w:val="00362E65"/>
     <w:rPr>
@@ -3047,10 +2864,10 @@
       <w:szCs w:val="32"/>
     </w:rPr>
   </w:style>
-  <w:style w:type="character" w:customStyle="1" w:styleId="Titre2Car">
-    <w:name w:val="Titre 2 Car"/>
-    <w:basedOn w:val="Policepardfaut"/>
-    <w:link w:val="Titre2"/>
+  <w:style w:type="character" w:customStyle="1" w:styleId="Ttulo2Car">
+    <w:name w:val="Título 2 Car"/>
+    <w:basedOn w:val="Fuentedeprrafopredeter"/>
+    <w:link w:val="Ttulo2"/>
     <w:uiPriority w:val="9"/>
     <w:semiHidden/>
     <w:rsid w:val="00362E65"/>
@@ -3062,10 +2879,10 @@
       <w:szCs w:val="26"/>
     </w:rPr>
   </w:style>
-  <w:style w:type="character" w:customStyle="1" w:styleId="Titre3Car">
-    <w:name w:val="Titre 3 Car"/>
-    <w:basedOn w:val="Policepardfaut"/>
-    <w:link w:val="Titre3"/>
+  <w:style w:type="character" w:customStyle="1" w:styleId="Ttulo3Car">
+    <w:name w:val="Título 3 Car"/>
+    <w:basedOn w:val="Fuentedeprrafopredeter"/>
+    <w:link w:val="Ttulo3"/>
     <w:uiPriority w:val="9"/>
     <w:semiHidden/>
     <w:rsid w:val="00362E65"/>
@@ -3094,9 +2911,9 @@
     <w:qFormat/>
     <w:rsid w:val="00AE18EF"/>
   </w:style>
-  <w:style w:type="table" w:styleId="Tableauprofessionnel">
+  <w:style w:type="table" w:styleId="Tablaprofesional">
     <w:name w:val="Table Professional"/>
-    <w:basedOn w:val="TableauNormal"/>
+    <w:basedOn w:val="Tablanormal"/>
     <w:uiPriority w:val="99"/>
     <w:semiHidden/>
     <w:unhideWhenUsed/>
@@ -3126,7 +2943,7 @@
       </w:tcPr>
     </w:tblStylePr>
   </w:style>
-  <w:style w:type="paragraph" w:styleId="TM1">
+  <w:style w:type="paragraph" w:styleId="TDC1">
     <w:name w:val="toc 1"/>
     <w:basedOn w:val="Normal"/>
     <w:next w:val="Normal"/>
@@ -3138,7 +2955,7 @@
       <w:spacing w:after="100"/>
     </w:pPr>
   </w:style>
-  <w:style w:type="paragraph" w:styleId="TM2">
+  <w:style w:type="paragraph" w:styleId="TDC2">
     <w:name w:val="toc 2"/>
     <w:basedOn w:val="Normal"/>
     <w:next w:val="Normal"/>
@@ -3151,10 +2968,10 @@
       <w:ind w:left="240"/>
     </w:pPr>
   </w:style>
-  <w:style w:type="paragraph" w:styleId="Textedebulles">
+  <w:style w:type="paragraph" w:styleId="Textodeglobo">
     <w:name w:val="Balloon Text"/>
     <w:basedOn w:val="Normal"/>
-    <w:link w:val="TextedebullesCar"/>
+    <w:link w:val="TextodegloboCar"/>
     <w:uiPriority w:val="99"/>
     <w:semiHidden/>
     <w:unhideWhenUsed/>
@@ -3165,10 +2982,10 @@
       <w:szCs w:val="18"/>
     </w:rPr>
   </w:style>
-  <w:style w:type="character" w:customStyle="1" w:styleId="TextedebullesCar">
-    <w:name w:val="Texte de bulles Car"/>
-    <w:basedOn w:val="Policepardfaut"/>
-    <w:link w:val="Textedebulles"/>
+  <w:style w:type="character" w:customStyle="1" w:styleId="TextodegloboCar">
+    <w:name w:val="Texto de globo Car"/>
+    <w:basedOn w:val="Fuentedeprrafopredeter"/>
+    <w:link w:val="Textodeglobo"/>
     <w:uiPriority w:val="99"/>
     <w:semiHidden/>
     <w:rsid w:val="00FB63E7"/>
@@ -3180,7 +2997,7 @@
   </w:style>
   <w:style w:type="character" w:customStyle="1" w:styleId="referenceid">
     <w:name w:val="reference_id"/>
-    <w:basedOn w:val="Policepardfaut"/>
+    <w:basedOn w:val="Fuentedeprrafopredeter"/>
     <w:uiPriority w:val="1"/>
     <w:rsid w:val="00457CF1"/>
     <w:rPr>

</xml_diff>

<commit_message>
Update tables 1, 2, and 3 with revised data
</commit_message>
<xml_diff>
--- a/tabla_2_cpod_sexo.docx
+++ b/tabla_2_cpod_sexo.docx
@@ -1,87 +1,38 @@
 
 <file path=word/document.xml><?xml version="1.0" encoding="utf-8"?>
-<w:document xmlns:wpc="http://schemas.microsoft.com/office/word/2010/wordprocessingCanvas" xmlns:cx="http://schemas.microsoft.com/office/drawing/2014/chartex" xmlns:cx1="http://schemas.microsoft.com/office/drawing/2015/9/8/chartex" xmlns:cx2="http://schemas.microsoft.com/office/drawing/2015/10/21/chartex" xmlns:cx3="http://schemas.microsoft.com/office/drawing/2016/5/9/chartex" xmlns:cx4="http://schemas.microsoft.com/office/drawing/2016/5/10/chartex" xmlns:cx5="http://schemas.microsoft.com/office/drawing/2016/5/11/chartex" xmlns:cx6="http://schemas.microsoft.com/office/drawing/2016/5/12/chartex" xmlns:cx7="http://schemas.microsoft.com/office/drawing/2016/5/13/chartex" xmlns:cx8="http://schemas.microsoft.com/office/drawing/2016/5/14/chartex" xmlns:mc="http://schemas.openxmlformats.org/markup-compatibility/2006" xmlns:aink="http://schemas.microsoft.com/office/drawing/2016/ink" xmlns:am3d="http://schemas.microsoft.com/office/drawing/2017/model3d" xmlns:o="urn:schemas-microsoft-com:office:office" xmlns:oel="http://schemas.microsoft.com/office/2019/extlst" xmlns:r="http://schemas.openxmlformats.org/officeDocument/2006/relationships" xmlns:m="http://schemas.openxmlformats.org/officeDocument/2006/math" xmlns:v="urn:schemas-microsoft-com:vml" xmlns:wp14="http://schemas.microsoft.com/office/word/2010/wordprocessingDrawing" xmlns:wp="http://schemas.openxmlformats.org/drawingml/2006/wordprocessingDrawing" xmlns:w10="urn:schemas-microsoft-com:office:word" xmlns:w="http://schemas.openxmlformats.org/wordprocessingml/2006/main" xmlns:w14="http://schemas.microsoft.com/office/word/2010/wordml" xmlns:w15="http://schemas.microsoft.com/office/word/2012/wordml" xmlns:w16cex="http://schemas.microsoft.com/office/word/2018/wordml/cex" xmlns:w16cid="http://schemas.microsoft.com/office/word/2016/wordml/cid" xmlns:w16="http://schemas.microsoft.com/office/word/2018/wordml" xmlns:w16du="http://schemas.microsoft.com/office/word/2023/wordml/word16du" xmlns:w16sdtdh="http://schemas.microsoft.com/office/word/2020/wordml/sdtdatahash" xmlns:w16sdtfl="http://schemas.microsoft.com/office/word/2024/wordml/sdtformatlock" xmlns:w16se="http://schemas.microsoft.com/office/word/2015/wordml/symex" xmlns:wpg="http://schemas.microsoft.com/office/word/2010/wordprocessingGroup" xmlns:wpi="http://schemas.microsoft.com/office/word/2010/wordprocessingInk" xmlns:wne="http://schemas.microsoft.com/office/word/2006/wordml" xmlns:wps="http://schemas.microsoft.com/office/word/2010/wordprocessingShape" mc:Ignorable="w14 w15 w16se w16cid w16 w16cex w16sdtdh w16sdtfl w16du wp14">
+<w:document xmlns:wpc="http://schemas.microsoft.com/office/word/2010/wordprocessingCanvas" xmlns:cx="http://schemas.microsoft.com/office/drawing/2014/chartex" xmlns:cx1="http://schemas.microsoft.com/office/drawing/2015/9/8/chartex" xmlns:cx2="http://schemas.microsoft.com/office/drawing/2015/10/21/chartex" xmlns:cx3="http://schemas.microsoft.com/office/drawing/2016/5/9/chartex" xmlns:cx4="http://schemas.microsoft.com/office/drawing/2016/5/10/chartex" xmlns:cx5="http://schemas.microsoft.com/office/drawing/2016/5/11/chartex" xmlns:cx6="http://schemas.microsoft.com/office/drawing/2016/5/12/chartex" xmlns:cx7="http://schemas.microsoft.com/office/drawing/2016/5/13/chartex" xmlns:cx8="http://schemas.microsoft.com/office/drawing/2016/5/14/chartex" xmlns:mc="http://schemas.openxmlformats.org/markup-compatibility/2006" xmlns:aink="http://schemas.microsoft.com/office/drawing/2016/ink" xmlns:am3d="http://schemas.microsoft.com/office/drawing/2017/model3d" xmlns:o="urn:schemas-microsoft-com:office:office" xmlns:r="http://schemas.openxmlformats.org/officeDocument/2006/relationships" xmlns:m="http://schemas.openxmlformats.org/officeDocument/2006/math" xmlns:v="urn:schemas-microsoft-com:vml" xmlns:wp14="http://schemas.microsoft.com/office/word/2010/wordprocessingDrawing" xmlns:wp="http://schemas.openxmlformats.org/drawingml/2006/wordprocessingDrawing" xmlns:w10="urn:schemas-microsoft-com:office:word" xmlns:w="http://schemas.openxmlformats.org/wordprocessingml/2006/main" xmlns:w14="http://schemas.microsoft.com/office/word/2010/wordml" xmlns:w15="http://schemas.microsoft.com/office/word/2012/wordml" xmlns:w16cex="http://schemas.microsoft.com/office/word/2018/wordml/cex" xmlns:w16cid="http://schemas.microsoft.com/office/word/2016/wordml/cid" xmlns:w16="http://schemas.microsoft.com/office/word/2018/wordml" xmlns:w16se="http://schemas.microsoft.com/office/word/2015/wordml/symex" xmlns:wpg="http://schemas.microsoft.com/office/word/2010/wordprocessingGroup" xmlns:wpi="http://schemas.microsoft.com/office/word/2010/wordprocessingInk" xmlns:wne="http://schemas.microsoft.com/office/word/2006/wordml" xmlns:wps="http://schemas.microsoft.com/office/word/2010/wordprocessingShape" mc:Ignorable="w14 w15 w16se w16cid w16 w16cex wp14">
   <w:body>
-    <w:p/>
+    <w:p>
+      <w:pPr>
+        <w:pStyle w:val="Normal"/>
+      </w:pPr>
+      <w:r>
+        <w:t xml:space="preserve"/>
+      </w:r>
+    </w:p>
     <w:p>
       <w:pPr>
         <w:pStyle w:val="TableCaption"/>
+        <w:jc w:val="center"/>
         <w:keepNext/>
         <w:pBdr>
+          <w:bottom w:val="none" w:sz="0" w:space="0" w:color="000000"/>
           <w:top w:val="none" w:sz="0" w:space="0" w:color="000000"/>
           <w:left w:val="none" w:sz="0" w:space="0" w:color="000000"/>
-          <w:bottom w:val="none" w:sz="0" w:space="0" w:color="000000"/>
           <w:right w:val="none" w:sz="0" w:space="0" w:color="000000"/>
         </w:pBdr>
-        <w:spacing w:before="60" w:after="60"/>
-        <w:ind w:left="60" w:right="60"/>
+        <w:spacing w:after="60" w:before="60" w:line="240"/>
+        <w:ind w:left="60" w:right="60" w:firstLine="0" w:firstLineChars="0"/>
       </w:pPr>
       <w:r>
-        <w:t>**</w:t>
-      </w:r>
-      <w:proofErr w:type="spellStart"/>
-      <w:r>
-        <w:t>Tabla</w:t>
-      </w:r>
-      <w:proofErr w:type="spellEnd"/>
-      <w:r>
-        <w:t xml:space="preserve"> 2. </w:t>
-      </w:r>
-      <w:proofErr w:type="spellStart"/>
-      <w:r>
-        <w:t>Índice</w:t>
-      </w:r>
-      <w:proofErr w:type="spellEnd"/>
-      <w:r>
-        <w:t xml:space="preserve"> CPO-D y </w:t>
-      </w:r>
-      <w:proofErr w:type="spellStart"/>
-      <w:r>
-        <w:t>estado</w:t>
-      </w:r>
-      <w:proofErr w:type="spellEnd"/>
-      <w:r>
-        <w:t xml:space="preserve"> de </w:t>
-      </w:r>
-      <w:proofErr w:type="spellStart"/>
-      <w:r>
-        <w:t>salud</w:t>
-      </w:r>
-      <w:proofErr w:type="spellEnd"/>
-      <w:r>
-        <w:t xml:space="preserve"> </w:t>
-      </w:r>
-      <w:proofErr w:type="spellStart"/>
-      <w:r>
-        <w:t>bucal</w:t>
-      </w:r>
-      <w:proofErr w:type="spellEnd"/>
-      <w:r>
-        <w:t xml:space="preserve"> </w:t>
-      </w:r>
-      <w:proofErr w:type="spellStart"/>
-      <w:r>
-        <w:t>según</w:t>
-      </w:r>
-      <w:proofErr w:type="spellEnd"/>
-      <w:r>
-        <w:t xml:space="preserve"> </w:t>
-      </w:r>
-      <w:proofErr w:type="spellStart"/>
-      <w:r>
-        <w:t>sexo</w:t>
-      </w:r>
-      <w:proofErr w:type="spellEnd"/>
-      <w:r>
-        <w:t>**</w:t>
+        <w:t xml:space="preserve">**Tabla 2. Índice CPO-D y estado de salud bucal según sexo**</w:t>
       </w:r>
     </w:p>
-    <w:tbl>
+    <w:tbl xmlns:a="http://schemas.openxmlformats.org/drawingml/2006/main" xmlns:pic="http://schemas.openxmlformats.org/drawingml/2006/picture">
       <w:tblPr>
-        <w:tblW w:w="0" w:type="auto"/>
+        <w:tblLayout w:type="fixed"/>
         <w:jc w:val="center"/>
-        <w:tblLayout w:type="fixed"/>
-        <w:tblLook w:val="0420" w:firstRow="1" w:lastRow="0" w:firstColumn="0" w:lastColumn="0" w:noHBand="0" w:noVBand="1"/>
+        <w:tblLook w:firstRow="1" w:lastRow="0" w:firstColumn="0" w:lastColumn="0" w:noHBand="0" w:noVBand="1"/>
       </w:tblPr>
       <w:tblGrid>
         <w:gridCol w:w="2576"/>
@@ -91,1858 +42,2090 @@
       </w:tblGrid>
       <w:tr>
         <w:trPr>
+          <w:trHeight w:val="769" w:hRule="auto"/>
           <w:tblHeader/>
-          <w:jc w:val="center"/>
         </w:trPr>
         <w:tc>
           <w:tcPr>
-            <w:tcW w:w="2576" w:type="dxa"/>
             <w:tcBorders>
+              <w:bottom w:val="single" w:sz="8" w:space="0" w:color="000000"/>
               <w:top w:val="single" w:sz="8" w:space="0" w:color="000000"/>
               <w:left w:val="none" w:sz="0" w:space="0" w:color="000000"/>
-              <w:bottom w:val="single" w:sz="8" w:space="0" w:color="000000"/>
               <w:right w:val="none" w:sz="0" w:space="0" w:color="000000"/>
             </w:tcBorders>
             <w:shd w:val="clear" w:color="auto" w:fill="FFFFFF"/>
             <w:tcMar>
               <w:top w:w="0" w:type="dxa"/>
+              <w:bottom w:w="0" w:type="dxa"/>
               <w:left w:w="0" w:type="dxa"/>
-              <w:bottom w:w="0" w:type="dxa"/>
               <w:right w:w="0" w:type="dxa"/>
             </w:tcMar>
             <w:vAlign w:val="center"/>
           </w:tcPr>
           <w:p>
             <w:pPr>
+              <w:pStyle w:val="Normal"/>
+              <w:jc w:val="left"/>
               <w:pBdr>
+                <w:bottom w:val="none" w:sz="0" w:space="0" w:color="000000"/>
                 <w:top w:val="none" w:sz="0" w:space="0" w:color="000000"/>
                 <w:left w:val="none" w:sz="0" w:space="0" w:color="000000"/>
-                <w:bottom w:val="none" w:sz="0" w:space="0" w:color="000000"/>
                 <w:right w:val="none" w:sz="0" w:space="0" w:color="000000"/>
               </w:pBdr>
-              <w:spacing w:before="40" w:after="40"/>
-              <w:ind w:left="100" w:right="100"/>
-              <w:rPr>
-                <w:rFonts w:ascii="Helvetica" w:eastAsia="Helvetica" w:hAnsi="Helvetica" w:cs="Helvetica"/>
-                <w:color w:val="000000"/>
-                <w:sz w:val="22"/>
-                <w:szCs w:val="22"/>
+              <w:spacing w:after="40" w:before="40" w:line="240"/>
+              <w:ind w:left="100" w:right="100" w:firstLine="0" w:firstLineChars="0"/>
+              <w:rPr>
+                <w:rFonts w:ascii="Helvetica" w:hAnsi="Helvetica" w:eastAsia="Helvetica" w:cs="Helvetica"/>
+                <w:i w:val="false"/>
+                <w:b w:val="false"/>
+                <w:u w:val="none"/>
+                <w:strike w:val="false"/>
+                <w:sz w:val="22"/>
+                <w:szCs w:val="22"/>
+                <w:color w:val="000000"/>
               </w:rPr>
             </w:pPr>
             <w:r>
               <w:rPr>
-                <w:rFonts w:ascii="Helvetica" w:eastAsia="Helvetica" w:hAnsi="Helvetica" w:cs="Helvetica"/>
-                <w:b/>
-                <w:color w:val="000000"/>
-                <w:sz w:val="22"/>
-                <w:szCs w:val="22"/>
-              </w:rPr>
-              <w:t>Characteristic</w:t>
-            </w:r>
-            <w:r>
-              <w:rPr>
-                <w:rFonts w:ascii="Helvetica" w:eastAsia="Helvetica" w:hAnsi="Helvetica" w:cs="Helvetica"/>
-                <w:color w:val="000000"/>
-                <w:sz w:val="22"/>
-                <w:szCs w:val="22"/>
+                <w:rFonts w:ascii="Helvetica" w:hAnsi="Helvetica" w:eastAsia="Helvetica" w:cs="Helvetica"/>
+                <w:i w:val="false"/>
+                <w:b w:val="true"/>
+                <w:u w:val="none"/>
+                <w:strike w:val="false"/>
+                <w:sz w:val="22"/>
+                <w:szCs w:val="22"/>
+                <w:color w:val="000000"/>
+              </w:rPr>
+              <w:t xml:space="preserve">Characteristic</w:t>
+            </w:r>
+            <w:r>
+              <w:rPr>
+                <w:rFonts w:ascii="Helvetica" w:hAnsi="Helvetica" w:eastAsia="Helvetica" w:cs="Helvetica"/>
+                <w:i w:val="false"/>
+                <w:b w:val="false"/>
+                <w:u w:val="none"/>
+                <w:strike w:val="false"/>
                 <w:vertAlign w:val="superscript"/>
-              </w:rPr>
-              <w:t>1</w:t>
+                <w:sz w:val="22"/>
+                <w:szCs w:val="22"/>
+                <w:color w:val="000000"/>
+              </w:rPr>
+              <w:t xml:space="preserve">1</w:t>
             </w:r>
           </w:p>
         </w:tc>
         <w:tc>
           <w:tcPr>
-            <w:tcW w:w="3088" w:type="dxa"/>
             <w:tcBorders>
+              <w:bottom w:val="single" w:sz="8" w:space="0" w:color="000000"/>
               <w:top w:val="single" w:sz="8" w:space="0" w:color="000000"/>
               <w:left w:val="none" w:sz="0" w:space="0" w:color="000000"/>
-              <w:bottom w:val="single" w:sz="8" w:space="0" w:color="000000"/>
               <w:right w:val="none" w:sz="0" w:space="0" w:color="000000"/>
             </w:tcBorders>
             <w:shd w:val="clear" w:color="auto" w:fill="FFFFFF"/>
             <w:tcMar>
               <w:top w:w="0" w:type="dxa"/>
+              <w:bottom w:w="0" w:type="dxa"/>
               <w:left w:w="0" w:type="dxa"/>
-              <w:bottom w:w="0" w:type="dxa"/>
               <w:right w:w="0" w:type="dxa"/>
             </w:tcMar>
             <w:vAlign w:val="center"/>
           </w:tcPr>
           <w:p>
             <w:pPr>
+              <w:pStyle w:val="Normal"/>
+              <w:jc w:val="center"/>
               <w:pBdr>
+                <w:bottom w:val="none" w:sz="0" w:space="0" w:color="000000"/>
                 <w:top w:val="none" w:sz="0" w:space="0" w:color="000000"/>
                 <w:left w:val="none" w:sz="0" w:space="0" w:color="000000"/>
-                <w:bottom w:val="none" w:sz="0" w:space="0" w:color="000000"/>
                 <w:right w:val="none" w:sz="0" w:space="0" w:color="000000"/>
               </w:pBdr>
-              <w:spacing w:before="40" w:after="40"/>
-              <w:ind w:left="100" w:right="100"/>
-              <w:jc w:val="center"/>
-              <w:rPr>
-                <w:rFonts w:ascii="Helvetica" w:eastAsia="Helvetica" w:hAnsi="Helvetica" w:cs="Helvetica"/>
-                <w:color w:val="000000"/>
-                <w:sz w:val="22"/>
-                <w:szCs w:val="22"/>
+              <w:spacing w:after="40" w:before="40" w:line="240"/>
+              <w:ind w:left="100" w:right="100" w:firstLine="0" w:firstLineChars="0"/>
+              <w:rPr>
+                <w:rFonts w:ascii="Helvetica" w:hAnsi="Helvetica" w:eastAsia="Helvetica" w:cs="Helvetica"/>
+                <w:i w:val="false"/>
+                <w:b w:val="false"/>
+                <w:u w:val="none"/>
+                <w:strike w:val="false"/>
+                <w:sz w:val="22"/>
+                <w:szCs w:val="22"/>
+                <w:color w:val="000000"/>
               </w:rPr>
             </w:pPr>
             <w:r>
               <w:rPr>
-                <w:rFonts w:ascii="Helvetica" w:eastAsia="Helvetica" w:hAnsi="Helvetica" w:cs="Helvetica"/>
-                <w:b/>
-                <w:color w:val="000000"/>
-                <w:sz w:val="22"/>
-                <w:szCs w:val="22"/>
-              </w:rPr>
-              <w:t>Overall</w:t>
-            </w:r>
-            <w:r>
-              <w:rPr>
-                <w:rFonts w:ascii="Helvetica" w:eastAsia="Helvetica" w:hAnsi="Helvetica" w:cs="Helvetica"/>
-                <w:color w:val="000000"/>
-                <w:sz w:val="22"/>
-                <w:szCs w:val="22"/>
+                <w:rFonts w:ascii="Helvetica" w:hAnsi="Helvetica" w:eastAsia="Helvetica" w:cs="Helvetica"/>
+                <w:i w:val="false"/>
+                <w:b w:val="true"/>
+                <w:u w:val="none"/>
+                <w:strike w:val="false"/>
+                <w:sz w:val="22"/>
+                <w:szCs w:val="22"/>
+                <w:color w:val="000000"/>
+              </w:rPr>
+              <w:t xml:space="preserve">Overall</w:t>
+            </w:r>
+            <w:r>
+              <w:rPr>
+                <w:rFonts w:ascii="Helvetica" w:hAnsi="Helvetica" w:eastAsia="Helvetica" w:cs="Helvetica"/>
+                <w:i w:val="false"/>
+                <w:b w:val="false"/>
+                <w:u w:val="none"/>
+                <w:strike w:val="false"/>
+                <w:sz w:val="22"/>
+                <w:szCs w:val="22"/>
+                <w:color w:val="000000"/>
               </w:rPr>
               <w:t xml:space="preserve">  </w:t>
             </w:r>
             <w:r>
               <w:rPr>
-                <w:rFonts w:ascii="Helvetica" w:eastAsia="Helvetica" w:hAnsi="Helvetica" w:cs="Helvetica"/>
-                <w:color w:val="000000"/>
-                <w:sz w:val="22"/>
-                <w:szCs w:val="22"/>
+                <w:rFonts w:ascii="Helvetica" w:hAnsi="Helvetica" w:eastAsia="Helvetica" w:cs="Helvetica"/>
+                <w:i w:val="false"/>
+                <w:b w:val="false"/>
+                <w:u w:val="none"/>
+                <w:strike w:val="false"/>
+                <w:sz w:val="22"/>
+                <w:szCs w:val="22"/>
+                <w:color w:val="000000"/>
               </w:rPr>
               <w:br/>
-              <w:t>N = 69,840</w:t>
-            </w:r>
-            <w:r>
-              <w:rPr>
-                <w:rFonts w:ascii="Helvetica" w:eastAsia="Helvetica" w:hAnsi="Helvetica" w:cs="Helvetica"/>
-                <w:color w:val="000000"/>
-                <w:sz w:val="22"/>
-                <w:szCs w:val="22"/>
+            </w:r>
+            <w:r>
+              <w:rPr>
+                <w:rFonts w:ascii="Helvetica" w:hAnsi="Helvetica" w:eastAsia="Helvetica" w:cs="Helvetica"/>
+                <w:i w:val="false"/>
+                <w:b w:val="false"/>
+                <w:u w:val="none"/>
+                <w:strike w:val="false"/>
+                <w:sz w:val="22"/>
+                <w:szCs w:val="22"/>
+                <w:color w:val="000000"/>
+              </w:rPr>
+              <w:t xml:space="preserve">N = 69,840</w:t>
+            </w:r>
+            <w:r>
+              <w:rPr>
+                <w:rFonts w:ascii="Helvetica" w:hAnsi="Helvetica" w:eastAsia="Helvetica" w:cs="Helvetica"/>
+                <w:i w:val="false"/>
+                <w:b w:val="false"/>
+                <w:u w:val="none"/>
+                <w:strike w:val="false"/>
                 <w:vertAlign w:val="superscript"/>
-              </w:rPr>
-              <w:t>1</w:t>
+                <w:sz w:val="22"/>
+                <w:szCs w:val="22"/>
+                <w:color w:val="000000"/>
+              </w:rPr>
+              <w:t xml:space="preserve">1</w:t>
             </w:r>
           </w:p>
         </w:tc>
         <w:tc>
           <w:tcPr>
-            <w:tcW w:w="3088" w:type="dxa"/>
             <w:tcBorders>
+              <w:bottom w:val="single" w:sz="8" w:space="0" w:color="000000"/>
               <w:top w:val="single" w:sz="8" w:space="0" w:color="000000"/>
               <w:left w:val="none" w:sz="0" w:space="0" w:color="000000"/>
-              <w:bottom w:val="single" w:sz="8" w:space="0" w:color="000000"/>
               <w:right w:val="none" w:sz="0" w:space="0" w:color="000000"/>
             </w:tcBorders>
             <w:shd w:val="clear" w:color="auto" w:fill="FFFFFF"/>
             <w:tcMar>
               <w:top w:w="0" w:type="dxa"/>
+              <w:bottom w:w="0" w:type="dxa"/>
               <w:left w:w="0" w:type="dxa"/>
-              <w:bottom w:w="0" w:type="dxa"/>
               <w:right w:w="0" w:type="dxa"/>
             </w:tcMar>
             <w:vAlign w:val="center"/>
           </w:tcPr>
           <w:p>
             <w:pPr>
+              <w:pStyle w:val="Normal"/>
+              <w:jc w:val="center"/>
               <w:pBdr>
+                <w:bottom w:val="none" w:sz="0" w:space="0" w:color="000000"/>
                 <w:top w:val="none" w:sz="0" w:space="0" w:color="000000"/>
                 <w:left w:val="none" w:sz="0" w:space="0" w:color="000000"/>
-                <w:bottom w:val="none" w:sz="0" w:space="0" w:color="000000"/>
                 <w:right w:val="none" w:sz="0" w:space="0" w:color="000000"/>
               </w:pBdr>
-              <w:spacing w:before="40" w:after="40"/>
-              <w:ind w:left="100" w:right="100"/>
-              <w:jc w:val="center"/>
-              <w:rPr>
-                <w:rFonts w:ascii="Helvetica" w:eastAsia="Helvetica" w:hAnsi="Helvetica" w:cs="Helvetica"/>
-                <w:color w:val="000000"/>
-                <w:sz w:val="22"/>
-                <w:szCs w:val="22"/>
+              <w:spacing w:after="40" w:before="40" w:line="240"/>
+              <w:ind w:left="100" w:right="100" w:firstLine="0" w:firstLineChars="0"/>
+              <w:rPr>
+                <w:rFonts w:ascii="Helvetica" w:hAnsi="Helvetica" w:eastAsia="Helvetica" w:cs="Helvetica"/>
+                <w:i w:val="false"/>
+                <w:b w:val="false"/>
+                <w:u w:val="none"/>
+                <w:strike w:val="false"/>
+                <w:sz w:val="22"/>
+                <w:szCs w:val="22"/>
+                <w:color w:val="000000"/>
               </w:rPr>
             </w:pPr>
-            <w:proofErr w:type="spellStart"/>
-            <w:r>
-              <w:rPr>
-                <w:rFonts w:ascii="Helvetica" w:eastAsia="Helvetica" w:hAnsi="Helvetica" w:cs="Helvetica"/>
-                <w:b/>
-                <w:color w:val="000000"/>
-                <w:sz w:val="22"/>
-                <w:szCs w:val="22"/>
-              </w:rPr>
-              <w:t>femenino</w:t>
-            </w:r>
-            <w:proofErr w:type="spellEnd"/>
-            <w:r>
-              <w:rPr>
-                <w:rFonts w:ascii="Helvetica" w:eastAsia="Helvetica" w:hAnsi="Helvetica" w:cs="Helvetica"/>
-                <w:color w:val="000000"/>
-                <w:sz w:val="22"/>
-                <w:szCs w:val="22"/>
+            <w:r>
+              <w:rPr>
+                <w:rFonts w:ascii="Helvetica" w:hAnsi="Helvetica" w:eastAsia="Helvetica" w:cs="Helvetica"/>
+                <w:i w:val="false"/>
+                <w:b w:val="true"/>
+                <w:u w:val="none"/>
+                <w:strike w:val="false"/>
+                <w:sz w:val="22"/>
+                <w:szCs w:val="22"/>
+                <w:color w:val="000000"/>
+              </w:rPr>
+              <w:t xml:space="preserve">femenino</w:t>
+            </w:r>
+            <w:r>
+              <w:rPr>
+                <w:rFonts w:ascii="Helvetica" w:hAnsi="Helvetica" w:eastAsia="Helvetica" w:cs="Helvetica"/>
+                <w:i w:val="false"/>
+                <w:b w:val="false"/>
+                <w:u w:val="none"/>
+                <w:strike w:val="false"/>
+                <w:sz w:val="22"/>
+                <w:szCs w:val="22"/>
+                <w:color w:val="000000"/>
               </w:rPr>
               <w:t xml:space="preserve">  </w:t>
             </w:r>
             <w:r>
               <w:rPr>
-                <w:rFonts w:ascii="Helvetica" w:eastAsia="Helvetica" w:hAnsi="Helvetica" w:cs="Helvetica"/>
-                <w:color w:val="000000"/>
-                <w:sz w:val="22"/>
-                <w:szCs w:val="22"/>
+                <w:rFonts w:ascii="Helvetica" w:hAnsi="Helvetica" w:eastAsia="Helvetica" w:cs="Helvetica"/>
+                <w:i w:val="false"/>
+                <w:b w:val="false"/>
+                <w:u w:val="none"/>
+                <w:strike w:val="false"/>
+                <w:sz w:val="22"/>
+                <w:szCs w:val="22"/>
+                <w:color w:val="000000"/>
               </w:rPr>
               <w:br/>
-              <w:t>N = 44,431</w:t>
-            </w:r>
-            <w:r>
-              <w:rPr>
-                <w:rFonts w:ascii="Helvetica" w:eastAsia="Helvetica" w:hAnsi="Helvetica" w:cs="Helvetica"/>
-                <w:color w:val="000000"/>
-                <w:sz w:val="22"/>
-                <w:szCs w:val="22"/>
+            </w:r>
+            <w:r>
+              <w:rPr>
+                <w:rFonts w:ascii="Helvetica" w:hAnsi="Helvetica" w:eastAsia="Helvetica" w:cs="Helvetica"/>
+                <w:i w:val="false"/>
+                <w:b w:val="false"/>
+                <w:u w:val="none"/>
+                <w:strike w:val="false"/>
+                <w:sz w:val="22"/>
+                <w:szCs w:val="22"/>
+                <w:color w:val="000000"/>
+              </w:rPr>
+              <w:t xml:space="preserve">N = 44,431</w:t>
+            </w:r>
+            <w:r>
+              <w:rPr>
+                <w:rFonts w:ascii="Helvetica" w:hAnsi="Helvetica" w:eastAsia="Helvetica" w:cs="Helvetica"/>
+                <w:i w:val="false"/>
+                <w:b w:val="false"/>
+                <w:u w:val="none"/>
+                <w:strike w:val="false"/>
                 <w:vertAlign w:val="superscript"/>
-              </w:rPr>
-              <w:t>1</w:t>
+                <w:sz w:val="22"/>
+                <w:szCs w:val="22"/>
+                <w:color w:val="000000"/>
+              </w:rPr>
+              <w:t xml:space="preserve">1</w:t>
             </w:r>
           </w:p>
         </w:tc>
         <w:tc>
           <w:tcPr>
-            <w:tcW w:w="3088" w:type="dxa"/>
             <w:tcBorders>
+              <w:bottom w:val="single" w:sz="8" w:space="0" w:color="000000"/>
               <w:top w:val="single" w:sz="8" w:space="0" w:color="000000"/>
               <w:left w:val="none" w:sz="0" w:space="0" w:color="000000"/>
-              <w:bottom w:val="single" w:sz="8" w:space="0" w:color="000000"/>
               <w:right w:val="none" w:sz="0" w:space="0" w:color="000000"/>
             </w:tcBorders>
             <w:shd w:val="clear" w:color="auto" w:fill="FFFFFF"/>
             <w:tcMar>
               <w:top w:w="0" w:type="dxa"/>
+              <w:bottom w:w="0" w:type="dxa"/>
               <w:left w:w="0" w:type="dxa"/>
-              <w:bottom w:w="0" w:type="dxa"/>
               <w:right w:w="0" w:type="dxa"/>
             </w:tcMar>
             <w:vAlign w:val="center"/>
           </w:tcPr>
           <w:p>
             <w:pPr>
+              <w:pStyle w:val="Normal"/>
+              <w:jc w:val="center"/>
               <w:pBdr>
+                <w:bottom w:val="none" w:sz="0" w:space="0" w:color="000000"/>
                 <w:top w:val="none" w:sz="0" w:space="0" w:color="000000"/>
                 <w:left w:val="none" w:sz="0" w:space="0" w:color="000000"/>
-                <w:bottom w:val="none" w:sz="0" w:space="0" w:color="000000"/>
                 <w:right w:val="none" w:sz="0" w:space="0" w:color="000000"/>
               </w:pBdr>
-              <w:spacing w:before="40" w:after="40"/>
-              <w:ind w:left="100" w:right="100"/>
-              <w:jc w:val="center"/>
-              <w:rPr>
-                <w:rFonts w:ascii="Helvetica" w:eastAsia="Helvetica" w:hAnsi="Helvetica" w:cs="Helvetica"/>
-                <w:color w:val="000000"/>
-                <w:sz w:val="22"/>
-                <w:szCs w:val="22"/>
+              <w:spacing w:after="40" w:before="40" w:line="240"/>
+              <w:ind w:left="100" w:right="100" w:firstLine="0" w:firstLineChars="0"/>
+              <w:rPr>
+                <w:rFonts w:ascii="Helvetica" w:hAnsi="Helvetica" w:eastAsia="Helvetica" w:cs="Helvetica"/>
+                <w:i w:val="false"/>
+                <w:b w:val="false"/>
+                <w:u w:val="none"/>
+                <w:strike w:val="false"/>
+                <w:sz w:val="22"/>
+                <w:szCs w:val="22"/>
+                <w:color w:val="000000"/>
               </w:rPr>
             </w:pPr>
-            <w:proofErr w:type="spellStart"/>
-            <w:r>
-              <w:rPr>
-                <w:rFonts w:ascii="Helvetica" w:eastAsia="Helvetica" w:hAnsi="Helvetica" w:cs="Helvetica"/>
-                <w:b/>
-                <w:color w:val="000000"/>
-                <w:sz w:val="22"/>
-                <w:szCs w:val="22"/>
-              </w:rPr>
-              <w:t>masculino</w:t>
-            </w:r>
-            <w:proofErr w:type="spellEnd"/>
-            <w:r>
-              <w:rPr>
-                <w:rFonts w:ascii="Helvetica" w:eastAsia="Helvetica" w:hAnsi="Helvetica" w:cs="Helvetica"/>
-                <w:color w:val="000000"/>
-                <w:sz w:val="22"/>
-                <w:szCs w:val="22"/>
+            <w:r>
+              <w:rPr>
+                <w:rFonts w:ascii="Helvetica" w:hAnsi="Helvetica" w:eastAsia="Helvetica" w:cs="Helvetica"/>
+                <w:i w:val="false"/>
+                <w:b w:val="true"/>
+                <w:u w:val="none"/>
+                <w:strike w:val="false"/>
+                <w:sz w:val="22"/>
+                <w:szCs w:val="22"/>
+                <w:color w:val="000000"/>
+              </w:rPr>
+              <w:t xml:space="preserve">masculino</w:t>
+            </w:r>
+            <w:r>
+              <w:rPr>
+                <w:rFonts w:ascii="Helvetica" w:hAnsi="Helvetica" w:eastAsia="Helvetica" w:cs="Helvetica"/>
+                <w:i w:val="false"/>
+                <w:b w:val="false"/>
+                <w:u w:val="none"/>
+                <w:strike w:val="false"/>
+                <w:sz w:val="22"/>
+                <w:szCs w:val="22"/>
+                <w:color w:val="000000"/>
               </w:rPr>
               <w:t xml:space="preserve">  </w:t>
             </w:r>
             <w:r>
               <w:rPr>
-                <w:rFonts w:ascii="Helvetica" w:eastAsia="Helvetica" w:hAnsi="Helvetica" w:cs="Helvetica"/>
-                <w:color w:val="000000"/>
-                <w:sz w:val="22"/>
-                <w:szCs w:val="22"/>
+                <w:rFonts w:ascii="Helvetica" w:hAnsi="Helvetica" w:eastAsia="Helvetica" w:cs="Helvetica"/>
+                <w:i w:val="false"/>
+                <w:b w:val="false"/>
+                <w:u w:val="none"/>
+                <w:strike w:val="false"/>
+                <w:sz w:val="22"/>
+                <w:szCs w:val="22"/>
+                <w:color w:val="000000"/>
               </w:rPr>
               <w:br/>
-              <w:t>N = 25,409</w:t>
-            </w:r>
-            <w:r>
-              <w:rPr>
-                <w:rFonts w:ascii="Helvetica" w:eastAsia="Helvetica" w:hAnsi="Helvetica" w:cs="Helvetica"/>
-                <w:color w:val="000000"/>
-                <w:sz w:val="22"/>
-                <w:szCs w:val="22"/>
+            </w:r>
+            <w:r>
+              <w:rPr>
+                <w:rFonts w:ascii="Helvetica" w:hAnsi="Helvetica" w:eastAsia="Helvetica" w:cs="Helvetica"/>
+                <w:i w:val="false"/>
+                <w:b w:val="false"/>
+                <w:u w:val="none"/>
+                <w:strike w:val="false"/>
+                <w:sz w:val="22"/>
+                <w:szCs w:val="22"/>
+                <w:color w:val="000000"/>
+              </w:rPr>
+              <w:t xml:space="preserve">N = 25,409</w:t>
+            </w:r>
+            <w:r>
+              <w:rPr>
+                <w:rFonts w:ascii="Helvetica" w:hAnsi="Helvetica" w:eastAsia="Helvetica" w:cs="Helvetica"/>
+                <w:i w:val="false"/>
+                <w:b w:val="false"/>
+                <w:u w:val="none"/>
+                <w:strike w:val="false"/>
                 <w:vertAlign w:val="superscript"/>
-              </w:rPr>
-              <w:t>1</w:t>
+                <w:sz w:val="22"/>
+                <w:szCs w:val="22"/>
+                <w:color w:val="000000"/>
+              </w:rPr>
+              <w:t xml:space="preserve">1</w:t>
             </w:r>
           </w:p>
         </w:tc>
       </w:tr>
       <w:tr>
         <w:trPr>
-          <w:jc w:val="center"/>
+          <w:trHeight w:val="620" w:hRule="auto"/>
         </w:trPr>
         <w:tc>
           <w:tcPr>
-            <w:tcW w:w="2576" w:type="dxa"/>
             <w:tcBorders>
+              <w:bottom w:val="none" w:sz="0" w:space="0" w:color="000000"/>
               <w:top w:val="single" w:sz="8" w:space="0" w:color="000000"/>
               <w:left w:val="none" w:sz="0" w:space="0" w:color="000000"/>
-              <w:bottom w:val="none" w:sz="0" w:space="0" w:color="000000"/>
               <w:right w:val="none" w:sz="0" w:space="0" w:color="000000"/>
             </w:tcBorders>
             <w:shd w:val="clear" w:color="auto" w:fill="FFFFFF"/>
             <w:tcMar>
               <w:top w:w="0" w:type="dxa"/>
+              <w:bottom w:w="0" w:type="dxa"/>
               <w:left w:w="0" w:type="dxa"/>
-              <w:bottom w:w="0" w:type="dxa"/>
               <w:right w:w="0" w:type="dxa"/>
             </w:tcMar>
+            <w:vAlign w:val="top"/>
           </w:tcPr>
           <w:p>
             <w:pPr>
+              <w:pStyle w:val="Normal"/>
+              <w:jc w:val="left"/>
               <w:pBdr>
+                <w:bottom w:val="none" w:sz="0" w:space="0" w:color="000000"/>
                 <w:top w:val="none" w:sz="0" w:space="0" w:color="000000"/>
                 <w:left w:val="none" w:sz="0" w:space="0" w:color="000000"/>
-                <w:bottom w:val="none" w:sz="0" w:space="0" w:color="000000"/>
                 <w:right w:val="none" w:sz="0" w:space="0" w:color="000000"/>
               </w:pBdr>
-              <w:spacing w:before="100" w:after="100"/>
-              <w:ind w:left="100" w:right="100"/>
-              <w:rPr>
-                <w:rFonts w:ascii="Helvetica" w:eastAsia="Helvetica" w:hAnsi="Helvetica" w:cs="Helvetica"/>
-                <w:b/>
-                <w:color w:val="000000"/>
-                <w:sz w:val="22"/>
-                <w:szCs w:val="22"/>
+              <w:spacing w:after="100" w:before="100" w:line="240"/>
+              <w:ind w:left="100" w:right="100" w:firstLine="0" w:firstLineChars="0"/>
+              <w:rPr>
+                <w:rFonts w:ascii="Helvetica" w:hAnsi="Helvetica" w:eastAsia="Helvetica" w:cs="Helvetica"/>
+                <w:i w:val="false"/>
+                <w:b w:val="true"/>
+                <w:u w:val="none"/>
+                <w:strike w:val="false"/>
+                <w:sz w:val="22"/>
+                <w:szCs w:val="22"/>
+                <w:color w:val="000000"/>
               </w:rPr>
             </w:pPr>
-            <w:proofErr w:type="spellStart"/>
-            <w:r>
-              <w:rPr>
-                <w:rFonts w:ascii="Helvetica" w:eastAsia="Helvetica" w:hAnsi="Helvetica" w:cs="Helvetica"/>
-                <w:b/>
-                <w:color w:val="000000"/>
-                <w:sz w:val="22"/>
-                <w:szCs w:val="22"/>
-              </w:rPr>
-              <w:t>Índice</w:t>
-            </w:r>
-            <w:proofErr w:type="spellEnd"/>
-            <w:r>
-              <w:rPr>
-                <w:rFonts w:ascii="Helvetica" w:eastAsia="Helvetica" w:hAnsi="Helvetica" w:cs="Helvetica"/>
-                <w:b/>
-                <w:color w:val="000000"/>
-                <w:sz w:val="22"/>
-                <w:szCs w:val="22"/>
-              </w:rPr>
-              <w:t xml:space="preserve"> CPO-D</w:t>
+            <w:r>
+              <w:rPr>
+                <w:rFonts w:ascii="Helvetica" w:hAnsi="Helvetica" w:eastAsia="Helvetica" w:cs="Helvetica"/>
+                <w:i w:val="false"/>
+                <w:b w:val="true"/>
+                <w:u w:val="none"/>
+                <w:strike w:val="false"/>
+                <w:sz w:val="22"/>
+                <w:szCs w:val="22"/>
+                <w:color w:val="000000"/>
+              </w:rPr>
+              <w:t xml:space="preserve">Índice CPO-D</w:t>
             </w:r>
           </w:p>
         </w:tc>
         <w:tc>
           <w:tcPr>
-            <w:tcW w:w="3088" w:type="dxa"/>
             <w:tcBorders>
+              <w:bottom w:val="none" w:sz="0" w:space="0" w:color="000000"/>
               <w:top w:val="single" w:sz="8" w:space="0" w:color="000000"/>
               <w:left w:val="none" w:sz="0" w:space="0" w:color="000000"/>
-              <w:bottom w:val="none" w:sz="0" w:space="0" w:color="000000"/>
               <w:right w:val="none" w:sz="0" w:space="0" w:color="000000"/>
             </w:tcBorders>
             <w:shd w:val="clear" w:color="auto" w:fill="FFFFFF"/>
             <w:tcMar>
               <w:top w:w="0" w:type="dxa"/>
+              <w:bottom w:w="0" w:type="dxa"/>
               <w:left w:w="0" w:type="dxa"/>
-              <w:bottom w:w="0" w:type="dxa"/>
               <w:right w:w="0" w:type="dxa"/>
             </w:tcMar>
+            <w:vAlign w:val="top"/>
           </w:tcPr>
           <w:p>
             <w:pPr>
+              <w:pStyle w:val="Normal"/>
+              <w:jc w:val="center"/>
               <w:pBdr>
+                <w:bottom w:val="none" w:sz="0" w:space="0" w:color="000000"/>
                 <w:top w:val="none" w:sz="0" w:space="0" w:color="000000"/>
                 <w:left w:val="none" w:sz="0" w:space="0" w:color="000000"/>
-                <w:bottom w:val="none" w:sz="0" w:space="0" w:color="000000"/>
                 <w:right w:val="none" w:sz="0" w:space="0" w:color="000000"/>
               </w:pBdr>
-              <w:spacing w:before="100" w:after="100"/>
-              <w:ind w:left="100" w:right="100"/>
-              <w:jc w:val="center"/>
-              <w:rPr>
-                <w:rFonts w:ascii="Helvetica" w:eastAsia="Helvetica" w:hAnsi="Helvetica" w:cs="Helvetica"/>
-                <w:color w:val="000000"/>
-                <w:sz w:val="22"/>
-                <w:szCs w:val="22"/>
+              <w:spacing w:after="100" w:before="100" w:line="240"/>
+              <w:ind w:left="100" w:right="100" w:firstLine="0" w:firstLineChars="0"/>
+              <w:rPr>
+                <w:rFonts w:ascii="Helvetica" w:hAnsi="Helvetica" w:eastAsia="Helvetica" w:cs="Helvetica"/>
+                <w:i w:val="false"/>
+                <w:b w:val="false"/>
+                <w:u w:val="none"/>
+                <w:strike w:val="false"/>
+                <w:sz w:val="22"/>
+                <w:szCs w:val="22"/>
+                <w:color w:val="000000"/>
               </w:rPr>
             </w:pPr>
             <w:r>
               <w:rPr>
-                <w:rFonts w:ascii="Helvetica" w:eastAsia="Helvetica" w:hAnsi="Helvetica" w:cs="Helvetica"/>
-                <w:color w:val="000000"/>
-                <w:sz w:val="22"/>
-                <w:szCs w:val="22"/>
-              </w:rPr>
-              <w:t>14.9 ± 7.5 (</w:t>
-            </w:r>
-            <w:proofErr w:type="spellStart"/>
-            <w:r>
-              <w:rPr>
-                <w:rFonts w:ascii="Helvetica" w:eastAsia="Helvetica" w:hAnsi="Helvetica" w:cs="Helvetica"/>
-                <w:color w:val="000000"/>
-                <w:sz w:val="22"/>
-                <w:szCs w:val="22"/>
-              </w:rPr>
-              <w:t>rango</w:t>
-            </w:r>
-            <w:proofErr w:type="spellEnd"/>
-            <w:r>
-              <w:rPr>
-                <w:rFonts w:ascii="Helvetica" w:eastAsia="Helvetica" w:hAnsi="Helvetica" w:cs="Helvetica"/>
-                <w:color w:val="000000"/>
-                <w:sz w:val="22"/>
-                <w:szCs w:val="22"/>
-              </w:rPr>
-              <w:t>: 0.0-32.0)</w:t>
+                <w:rFonts w:ascii="Helvetica" w:hAnsi="Helvetica" w:eastAsia="Helvetica" w:cs="Helvetica"/>
+                <w:i w:val="false"/>
+                <w:b w:val="false"/>
+                <w:u w:val="none"/>
+                <w:strike w:val="false"/>
+                <w:sz w:val="22"/>
+                <w:szCs w:val="22"/>
+                <w:color w:val="000000"/>
+              </w:rPr>
+              <w:t xml:space="preserve">14.9 ± 7.5 (rango: 0.0-32.0)</w:t>
             </w:r>
           </w:p>
         </w:tc>
         <w:tc>
           <w:tcPr>
-            <w:tcW w:w="3088" w:type="dxa"/>
             <w:tcBorders>
+              <w:bottom w:val="none" w:sz="0" w:space="0" w:color="000000"/>
               <w:top w:val="single" w:sz="8" w:space="0" w:color="000000"/>
               <w:left w:val="none" w:sz="0" w:space="0" w:color="000000"/>
-              <w:bottom w:val="none" w:sz="0" w:space="0" w:color="000000"/>
               <w:right w:val="none" w:sz="0" w:space="0" w:color="000000"/>
             </w:tcBorders>
             <w:shd w:val="clear" w:color="auto" w:fill="FFFFFF"/>
             <w:tcMar>
               <w:top w:w="0" w:type="dxa"/>
+              <w:bottom w:w="0" w:type="dxa"/>
               <w:left w:w="0" w:type="dxa"/>
-              <w:bottom w:w="0" w:type="dxa"/>
               <w:right w:w="0" w:type="dxa"/>
             </w:tcMar>
+            <w:vAlign w:val="top"/>
           </w:tcPr>
           <w:p>
             <w:pPr>
+              <w:pStyle w:val="Normal"/>
+              <w:jc w:val="center"/>
               <w:pBdr>
+                <w:bottom w:val="none" w:sz="0" w:space="0" w:color="000000"/>
                 <w:top w:val="none" w:sz="0" w:space="0" w:color="000000"/>
                 <w:left w:val="none" w:sz="0" w:space="0" w:color="000000"/>
-                <w:bottom w:val="none" w:sz="0" w:space="0" w:color="000000"/>
                 <w:right w:val="none" w:sz="0" w:space="0" w:color="000000"/>
               </w:pBdr>
-              <w:spacing w:before="100" w:after="100"/>
-              <w:ind w:left="100" w:right="100"/>
-              <w:jc w:val="center"/>
-              <w:rPr>
-                <w:rFonts w:ascii="Helvetica" w:eastAsia="Helvetica" w:hAnsi="Helvetica" w:cs="Helvetica"/>
-                <w:color w:val="000000"/>
-                <w:sz w:val="22"/>
-                <w:szCs w:val="22"/>
+              <w:spacing w:after="100" w:before="100" w:line="240"/>
+              <w:ind w:left="100" w:right="100" w:firstLine="0" w:firstLineChars="0"/>
+              <w:rPr>
+                <w:rFonts w:ascii="Helvetica" w:hAnsi="Helvetica" w:eastAsia="Helvetica" w:cs="Helvetica"/>
+                <w:i w:val="false"/>
+                <w:b w:val="false"/>
+                <w:u w:val="none"/>
+                <w:strike w:val="false"/>
+                <w:sz w:val="22"/>
+                <w:szCs w:val="22"/>
+                <w:color w:val="000000"/>
               </w:rPr>
             </w:pPr>
             <w:r>
               <w:rPr>
-                <w:rFonts w:ascii="Helvetica" w:eastAsia="Helvetica" w:hAnsi="Helvetica" w:cs="Helvetica"/>
-                <w:color w:val="000000"/>
-                <w:sz w:val="22"/>
-                <w:szCs w:val="22"/>
-              </w:rPr>
-              <w:t>15.3 ± 7.3 (</w:t>
-            </w:r>
-            <w:proofErr w:type="spellStart"/>
-            <w:r>
-              <w:rPr>
-                <w:rFonts w:ascii="Helvetica" w:eastAsia="Helvetica" w:hAnsi="Helvetica" w:cs="Helvetica"/>
-                <w:color w:val="000000"/>
-                <w:sz w:val="22"/>
-                <w:szCs w:val="22"/>
-              </w:rPr>
-              <w:t>rango</w:t>
-            </w:r>
-            <w:proofErr w:type="spellEnd"/>
-            <w:r>
-              <w:rPr>
-                <w:rFonts w:ascii="Helvetica" w:eastAsia="Helvetica" w:hAnsi="Helvetica" w:cs="Helvetica"/>
-                <w:color w:val="000000"/>
-                <w:sz w:val="22"/>
-                <w:szCs w:val="22"/>
-              </w:rPr>
-              <w:t>: 0.0-32.0)</w:t>
+                <w:rFonts w:ascii="Helvetica" w:hAnsi="Helvetica" w:eastAsia="Helvetica" w:cs="Helvetica"/>
+                <w:i w:val="false"/>
+                <w:b w:val="false"/>
+                <w:u w:val="none"/>
+                <w:strike w:val="false"/>
+                <w:sz w:val="22"/>
+                <w:szCs w:val="22"/>
+                <w:color w:val="000000"/>
+              </w:rPr>
+              <w:t xml:space="preserve">15.3 ± 7.3 (rango: 0.0-32.0)</w:t>
             </w:r>
           </w:p>
         </w:tc>
         <w:tc>
           <w:tcPr>
-            <w:tcW w:w="3088" w:type="dxa"/>
             <w:tcBorders>
+              <w:bottom w:val="none" w:sz="0" w:space="0" w:color="000000"/>
               <w:top w:val="single" w:sz="8" w:space="0" w:color="000000"/>
               <w:left w:val="none" w:sz="0" w:space="0" w:color="000000"/>
-              <w:bottom w:val="none" w:sz="0" w:space="0" w:color="000000"/>
               <w:right w:val="none" w:sz="0" w:space="0" w:color="000000"/>
             </w:tcBorders>
             <w:shd w:val="clear" w:color="auto" w:fill="FFFFFF"/>
             <w:tcMar>
               <w:top w:w="0" w:type="dxa"/>
+              <w:bottom w:w="0" w:type="dxa"/>
               <w:left w:w="0" w:type="dxa"/>
-              <w:bottom w:w="0" w:type="dxa"/>
               <w:right w:w="0" w:type="dxa"/>
             </w:tcMar>
+            <w:vAlign w:val="top"/>
           </w:tcPr>
           <w:p>
             <w:pPr>
+              <w:pStyle w:val="Normal"/>
+              <w:jc w:val="center"/>
               <w:pBdr>
+                <w:bottom w:val="none" w:sz="0" w:space="0" w:color="000000"/>
                 <w:top w:val="none" w:sz="0" w:space="0" w:color="000000"/>
                 <w:left w:val="none" w:sz="0" w:space="0" w:color="000000"/>
-                <w:bottom w:val="none" w:sz="0" w:space="0" w:color="000000"/>
                 <w:right w:val="none" w:sz="0" w:space="0" w:color="000000"/>
               </w:pBdr>
-              <w:spacing w:before="100" w:after="100"/>
-              <w:ind w:left="100" w:right="100"/>
-              <w:jc w:val="center"/>
-              <w:rPr>
-                <w:rFonts w:ascii="Helvetica" w:eastAsia="Helvetica" w:hAnsi="Helvetica" w:cs="Helvetica"/>
-                <w:color w:val="000000"/>
-                <w:sz w:val="22"/>
-                <w:szCs w:val="22"/>
+              <w:spacing w:after="100" w:before="100" w:line="240"/>
+              <w:ind w:left="100" w:right="100" w:firstLine="0" w:firstLineChars="0"/>
+              <w:rPr>
+                <w:rFonts w:ascii="Helvetica" w:hAnsi="Helvetica" w:eastAsia="Helvetica" w:cs="Helvetica"/>
+                <w:i w:val="false"/>
+                <w:b w:val="false"/>
+                <w:u w:val="none"/>
+                <w:strike w:val="false"/>
+                <w:sz w:val="22"/>
+                <w:szCs w:val="22"/>
+                <w:color w:val="000000"/>
               </w:rPr>
             </w:pPr>
             <w:r>
               <w:rPr>
-                <w:rFonts w:ascii="Helvetica" w:eastAsia="Helvetica" w:hAnsi="Helvetica" w:cs="Helvetica"/>
-                <w:color w:val="000000"/>
-                <w:sz w:val="22"/>
-                <w:szCs w:val="22"/>
-              </w:rPr>
-              <w:t>14.1 ± 7.8 (</w:t>
-            </w:r>
-            <w:proofErr w:type="spellStart"/>
-            <w:r>
-              <w:rPr>
-                <w:rFonts w:ascii="Helvetica" w:eastAsia="Helvetica" w:hAnsi="Helvetica" w:cs="Helvetica"/>
-                <w:color w:val="000000"/>
-                <w:sz w:val="22"/>
-                <w:szCs w:val="22"/>
-              </w:rPr>
-              <w:t>rango</w:t>
-            </w:r>
-            <w:proofErr w:type="spellEnd"/>
-            <w:r>
-              <w:rPr>
-                <w:rFonts w:ascii="Helvetica" w:eastAsia="Helvetica" w:hAnsi="Helvetica" w:cs="Helvetica"/>
-                <w:color w:val="000000"/>
-                <w:sz w:val="22"/>
-                <w:szCs w:val="22"/>
-              </w:rPr>
-              <w:t>: 0.0-32.0)</w:t>
+                <w:rFonts w:ascii="Helvetica" w:hAnsi="Helvetica" w:eastAsia="Helvetica" w:cs="Helvetica"/>
+                <w:i w:val="false"/>
+                <w:b w:val="false"/>
+                <w:u w:val="none"/>
+                <w:strike w:val="false"/>
+                <w:sz w:val="22"/>
+                <w:szCs w:val="22"/>
+                <w:color w:val="000000"/>
+              </w:rPr>
+              <w:t xml:space="preserve">14.1 ± 7.8 (rango: 0.0-32.0)</w:t>
             </w:r>
           </w:p>
         </w:tc>
       </w:tr>
       <w:tr>
         <w:trPr>
-          <w:jc w:val="center"/>
+          <w:trHeight w:val="573" w:hRule="auto"/>
         </w:trPr>
         <w:tc>
           <w:tcPr>
-            <w:tcW w:w="2576" w:type="dxa"/>
             <w:tcBorders>
+              <w:bottom w:val="none" w:sz="0" w:space="0" w:color="000000"/>
               <w:top w:val="none" w:sz="0" w:space="0" w:color="000000"/>
               <w:left w:val="none" w:sz="0" w:space="0" w:color="000000"/>
-              <w:bottom w:val="none" w:sz="0" w:space="0" w:color="000000"/>
               <w:right w:val="none" w:sz="0" w:space="0" w:color="000000"/>
             </w:tcBorders>
             <w:shd w:val="clear" w:color="auto" w:fill="FFFFFF"/>
             <w:tcMar>
               <w:top w:w="0" w:type="dxa"/>
+              <w:bottom w:w="0" w:type="dxa"/>
               <w:left w:w="0" w:type="dxa"/>
-              <w:bottom w:w="0" w:type="dxa"/>
               <w:right w:w="0" w:type="dxa"/>
             </w:tcMar>
+            <w:vAlign w:val="top"/>
           </w:tcPr>
           <w:p>
             <w:pPr>
+              <w:pStyle w:val="Normal"/>
+              <w:jc w:val="left"/>
               <w:pBdr>
+                <w:bottom w:val="none" w:sz="0" w:space="0" w:color="000000"/>
                 <w:top w:val="none" w:sz="0" w:space="0" w:color="000000"/>
                 <w:left w:val="none" w:sz="0" w:space="0" w:color="000000"/>
-                <w:bottom w:val="none" w:sz="0" w:space="0" w:color="000000"/>
                 <w:right w:val="none" w:sz="0" w:space="0" w:color="000000"/>
               </w:pBdr>
-              <w:spacing w:before="100" w:after="100"/>
-              <w:ind w:left="100" w:right="100"/>
-              <w:rPr>
-                <w:rFonts w:ascii="Helvetica" w:eastAsia="Helvetica" w:hAnsi="Helvetica" w:cs="Helvetica"/>
-                <w:b/>
-                <w:color w:val="000000"/>
-                <w:sz w:val="22"/>
-                <w:szCs w:val="22"/>
+              <w:spacing w:after="100" w:before="100" w:line="240"/>
+              <w:ind w:left="100" w:right="100" w:firstLine="0" w:firstLineChars="0"/>
+              <w:rPr>
+                <w:rFonts w:ascii="Helvetica" w:hAnsi="Helvetica" w:eastAsia="Helvetica" w:cs="Helvetica"/>
+                <w:i w:val="false"/>
+                <w:b w:val="true"/>
+                <w:u w:val="none"/>
+                <w:strike w:val="false"/>
+                <w:sz w:val="22"/>
+                <w:szCs w:val="22"/>
+                <w:color w:val="000000"/>
               </w:rPr>
             </w:pPr>
             <w:r>
               <w:rPr>
-                <w:rFonts w:ascii="Helvetica" w:eastAsia="Helvetica" w:hAnsi="Helvetica" w:cs="Helvetica"/>
-                <w:b/>
-                <w:color w:val="000000"/>
-                <w:sz w:val="22"/>
-                <w:szCs w:val="22"/>
-              </w:rPr>
-              <w:t xml:space="preserve">Estado de </w:t>
-            </w:r>
-            <w:proofErr w:type="spellStart"/>
-            <w:r>
-              <w:rPr>
-                <w:rFonts w:ascii="Helvetica" w:eastAsia="Helvetica" w:hAnsi="Helvetica" w:cs="Helvetica"/>
-                <w:b/>
-                <w:color w:val="000000"/>
-                <w:sz w:val="22"/>
-                <w:szCs w:val="22"/>
-              </w:rPr>
-              <w:t>salud</w:t>
-            </w:r>
-            <w:proofErr w:type="spellEnd"/>
-            <w:r>
-              <w:rPr>
-                <w:rFonts w:ascii="Helvetica" w:eastAsia="Helvetica" w:hAnsi="Helvetica" w:cs="Helvetica"/>
-                <w:b/>
-                <w:color w:val="000000"/>
-                <w:sz w:val="22"/>
-                <w:szCs w:val="22"/>
-              </w:rPr>
-              <w:t xml:space="preserve"> </w:t>
-            </w:r>
-            <w:proofErr w:type="spellStart"/>
-            <w:r>
-              <w:rPr>
-                <w:rFonts w:ascii="Helvetica" w:eastAsia="Helvetica" w:hAnsi="Helvetica" w:cs="Helvetica"/>
-                <w:b/>
-                <w:color w:val="000000"/>
-                <w:sz w:val="22"/>
-                <w:szCs w:val="22"/>
-              </w:rPr>
-              <w:t>bucal</w:t>
-            </w:r>
-            <w:proofErr w:type="spellEnd"/>
+                <w:rFonts w:ascii="Helvetica" w:hAnsi="Helvetica" w:eastAsia="Helvetica" w:cs="Helvetica"/>
+                <w:i w:val="false"/>
+                <w:b w:val="true"/>
+                <w:u w:val="none"/>
+                <w:strike w:val="false"/>
+                <w:sz w:val="22"/>
+                <w:szCs w:val="22"/>
+                <w:color w:val="000000"/>
+              </w:rPr>
+              <w:t xml:space="preserve">Estado de salud bucal</w:t>
+            </w:r>
           </w:p>
         </w:tc>
         <w:tc>
           <w:tcPr>
-            <w:tcW w:w="3088" w:type="dxa"/>
             <w:tcBorders>
+              <w:bottom w:val="none" w:sz="0" w:space="0" w:color="000000"/>
               <w:top w:val="none" w:sz="0" w:space="0" w:color="000000"/>
               <w:left w:val="none" w:sz="0" w:space="0" w:color="000000"/>
-              <w:bottom w:val="none" w:sz="0" w:space="0" w:color="000000"/>
               <w:right w:val="none" w:sz="0" w:space="0" w:color="000000"/>
             </w:tcBorders>
             <w:shd w:val="clear" w:color="auto" w:fill="FFFFFF"/>
             <w:tcMar>
               <w:top w:w="0" w:type="dxa"/>
+              <w:bottom w:w="0" w:type="dxa"/>
               <w:left w:w="0" w:type="dxa"/>
-              <w:bottom w:w="0" w:type="dxa"/>
               <w:right w:w="0" w:type="dxa"/>
             </w:tcMar>
+            <w:vAlign w:val="top"/>
           </w:tcPr>
           <w:p>
             <w:pPr>
+              <w:pStyle w:val="Normal"/>
+              <w:jc w:val="center"/>
               <w:pBdr>
+                <w:bottom w:val="none" w:sz="0" w:space="0" w:color="000000"/>
                 <w:top w:val="none" w:sz="0" w:space="0" w:color="000000"/>
                 <w:left w:val="none" w:sz="0" w:space="0" w:color="000000"/>
-                <w:bottom w:val="none" w:sz="0" w:space="0" w:color="000000"/>
                 <w:right w:val="none" w:sz="0" w:space="0" w:color="000000"/>
               </w:pBdr>
-              <w:spacing w:before="100" w:after="100"/>
-              <w:ind w:left="100" w:right="100"/>
-              <w:jc w:val="center"/>
-              <w:rPr>
-                <w:rFonts w:ascii="Helvetica" w:eastAsia="Helvetica" w:hAnsi="Helvetica" w:cs="Helvetica"/>
-                <w:color w:val="000000"/>
-                <w:sz w:val="22"/>
-                <w:szCs w:val="22"/>
+              <w:spacing w:after="100" w:before="100" w:line="240"/>
+              <w:ind w:left="100" w:right="100" w:firstLine="0" w:firstLineChars="0"/>
+              <w:rPr>
+                <w:rFonts w:ascii="Helvetica" w:hAnsi="Helvetica" w:eastAsia="Helvetica" w:cs="Helvetica"/>
+                <w:i w:val="false"/>
+                <w:b w:val="false"/>
+                <w:u w:val="none"/>
+                <w:strike w:val="false"/>
+                <w:sz w:val="22"/>
+                <w:szCs w:val="22"/>
+                <w:color w:val="000000"/>
               </w:rPr>
             </w:pPr>
+            <w:r>
+              <w:rPr>
+                <w:rFonts w:ascii="Helvetica" w:hAnsi="Helvetica" w:eastAsia="Helvetica" w:cs="Helvetica"/>
+                <w:i w:val="false"/>
+                <w:b w:val="false"/>
+                <w:u w:val="none"/>
+                <w:strike w:val="false"/>
+                <w:sz w:val="22"/>
+                <w:szCs w:val="22"/>
+                <w:color w:val="000000"/>
+              </w:rPr>
+              <w:t xml:space="preserve"/>
+            </w:r>
           </w:p>
         </w:tc>
         <w:tc>
           <w:tcPr>
-            <w:tcW w:w="3088" w:type="dxa"/>
             <w:tcBorders>
+              <w:bottom w:val="none" w:sz="0" w:space="0" w:color="000000"/>
               <w:top w:val="none" w:sz="0" w:space="0" w:color="000000"/>
               <w:left w:val="none" w:sz="0" w:space="0" w:color="000000"/>
-              <w:bottom w:val="none" w:sz="0" w:space="0" w:color="000000"/>
               <w:right w:val="none" w:sz="0" w:space="0" w:color="000000"/>
             </w:tcBorders>
             <w:shd w:val="clear" w:color="auto" w:fill="FFFFFF"/>
             <w:tcMar>
               <w:top w:w="0" w:type="dxa"/>
+              <w:bottom w:w="0" w:type="dxa"/>
               <w:left w:w="0" w:type="dxa"/>
-              <w:bottom w:w="0" w:type="dxa"/>
               <w:right w:w="0" w:type="dxa"/>
             </w:tcMar>
+            <w:vAlign w:val="top"/>
           </w:tcPr>
           <w:p>
             <w:pPr>
+              <w:pStyle w:val="Normal"/>
+              <w:jc w:val="center"/>
               <w:pBdr>
+                <w:bottom w:val="none" w:sz="0" w:space="0" w:color="000000"/>
                 <w:top w:val="none" w:sz="0" w:space="0" w:color="000000"/>
                 <w:left w:val="none" w:sz="0" w:space="0" w:color="000000"/>
-                <w:bottom w:val="none" w:sz="0" w:space="0" w:color="000000"/>
                 <w:right w:val="none" w:sz="0" w:space="0" w:color="000000"/>
               </w:pBdr>
-              <w:spacing w:before="100" w:after="100"/>
-              <w:ind w:left="100" w:right="100"/>
-              <w:jc w:val="center"/>
-              <w:rPr>
-                <w:rFonts w:ascii="Helvetica" w:eastAsia="Helvetica" w:hAnsi="Helvetica" w:cs="Helvetica"/>
-                <w:color w:val="000000"/>
-                <w:sz w:val="22"/>
-                <w:szCs w:val="22"/>
+              <w:spacing w:after="100" w:before="100" w:line="240"/>
+              <w:ind w:left="100" w:right="100" w:firstLine="0" w:firstLineChars="0"/>
+              <w:rPr>
+                <w:rFonts w:ascii="Helvetica" w:hAnsi="Helvetica" w:eastAsia="Helvetica" w:cs="Helvetica"/>
+                <w:i w:val="false"/>
+                <w:b w:val="false"/>
+                <w:u w:val="none"/>
+                <w:strike w:val="false"/>
+                <w:sz w:val="22"/>
+                <w:szCs w:val="22"/>
+                <w:color w:val="000000"/>
               </w:rPr>
             </w:pPr>
+            <w:r>
+              <w:rPr>
+                <w:rFonts w:ascii="Helvetica" w:hAnsi="Helvetica" w:eastAsia="Helvetica" w:cs="Helvetica"/>
+                <w:i w:val="false"/>
+                <w:b w:val="false"/>
+                <w:u w:val="none"/>
+                <w:strike w:val="false"/>
+                <w:sz w:val="22"/>
+                <w:szCs w:val="22"/>
+                <w:color w:val="000000"/>
+              </w:rPr>
+              <w:t xml:space="preserve"/>
+            </w:r>
           </w:p>
         </w:tc>
         <w:tc>
           <w:tcPr>
-            <w:tcW w:w="3088" w:type="dxa"/>
             <w:tcBorders>
+              <w:bottom w:val="none" w:sz="0" w:space="0" w:color="000000"/>
               <w:top w:val="none" w:sz="0" w:space="0" w:color="000000"/>
               <w:left w:val="none" w:sz="0" w:space="0" w:color="000000"/>
-              <w:bottom w:val="none" w:sz="0" w:space="0" w:color="000000"/>
               <w:right w:val="none" w:sz="0" w:space="0" w:color="000000"/>
             </w:tcBorders>
             <w:shd w:val="clear" w:color="auto" w:fill="FFFFFF"/>
             <w:tcMar>
               <w:top w:w="0" w:type="dxa"/>
+              <w:bottom w:w="0" w:type="dxa"/>
               <w:left w:w="0" w:type="dxa"/>
-              <w:bottom w:w="0" w:type="dxa"/>
               <w:right w:w="0" w:type="dxa"/>
             </w:tcMar>
+            <w:vAlign w:val="top"/>
           </w:tcPr>
           <w:p>
             <w:pPr>
+              <w:pStyle w:val="Normal"/>
+              <w:jc w:val="center"/>
               <w:pBdr>
+                <w:bottom w:val="none" w:sz="0" w:space="0" w:color="000000"/>
                 <w:top w:val="none" w:sz="0" w:space="0" w:color="000000"/>
                 <w:left w:val="none" w:sz="0" w:space="0" w:color="000000"/>
-                <w:bottom w:val="none" w:sz="0" w:space="0" w:color="000000"/>
                 <w:right w:val="none" w:sz="0" w:space="0" w:color="000000"/>
               </w:pBdr>
-              <w:spacing w:before="100" w:after="100"/>
-              <w:ind w:left="100" w:right="100"/>
-              <w:jc w:val="center"/>
-              <w:rPr>
-                <w:rFonts w:ascii="Helvetica" w:eastAsia="Helvetica" w:hAnsi="Helvetica" w:cs="Helvetica"/>
-                <w:color w:val="000000"/>
-                <w:sz w:val="22"/>
-                <w:szCs w:val="22"/>
+              <w:spacing w:after="100" w:before="100" w:line="240"/>
+              <w:ind w:left="100" w:right="100" w:firstLine="0" w:firstLineChars="0"/>
+              <w:rPr>
+                <w:rFonts w:ascii="Helvetica" w:hAnsi="Helvetica" w:eastAsia="Helvetica" w:cs="Helvetica"/>
+                <w:i w:val="false"/>
+                <w:b w:val="false"/>
+                <w:u w:val="none"/>
+                <w:strike w:val="false"/>
+                <w:sz w:val="22"/>
+                <w:szCs w:val="22"/>
+                <w:color w:val="000000"/>
               </w:rPr>
             </w:pPr>
+            <w:r>
+              <w:rPr>
+                <w:rFonts w:ascii="Helvetica" w:hAnsi="Helvetica" w:eastAsia="Helvetica" w:cs="Helvetica"/>
+                <w:i w:val="false"/>
+                <w:b w:val="false"/>
+                <w:u w:val="none"/>
+                <w:strike w:val="false"/>
+                <w:sz w:val="22"/>
+                <w:szCs w:val="22"/>
+                <w:color w:val="000000"/>
+              </w:rPr>
+              <w:t xml:space="preserve"/>
+            </w:r>
           </w:p>
         </w:tc>
       </w:tr>
       <w:tr>
         <w:trPr>
-          <w:jc w:val="center"/>
+          <w:trHeight w:val="616" w:hRule="auto"/>
         </w:trPr>
         <w:tc>
           <w:tcPr>
-            <w:tcW w:w="2576" w:type="dxa"/>
             <w:tcBorders>
+              <w:bottom w:val="none" w:sz="0" w:space="0" w:color="000000"/>
               <w:top w:val="none" w:sz="0" w:space="0" w:color="000000"/>
               <w:left w:val="none" w:sz="0" w:space="0" w:color="000000"/>
-              <w:bottom w:val="none" w:sz="0" w:space="0" w:color="000000"/>
               <w:right w:val="none" w:sz="0" w:space="0" w:color="000000"/>
             </w:tcBorders>
             <w:shd w:val="clear" w:color="auto" w:fill="FFFFFF"/>
             <w:tcMar>
               <w:top w:w="0" w:type="dxa"/>
+              <w:bottom w:w="0" w:type="dxa"/>
               <w:left w:w="0" w:type="dxa"/>
-              <w:bottom w:w="0" w:type="dxa"/>
               <w:right w:w="0" w:type="dxa"/>
             </w:tcMar>
+            <w:vAlign w:val="top"/>
           </w:tcPr>
           <w:p>
             <w:pPr>
+              <w:pStyle w:val="Normal"/>
+              <w:jc w:val="left"/>
               <w:pBdr>
+                <w:bottom w:val="none" w:sz="0" w:space="0" w:color="000000"/>
                 <w:top w:val="none" w:sz="0" w:space="0" w:color="000000"/>
                 <w:left w:val="none" w:sz="0" w:space="0" w:color="000000"/>
-                <w:bottom w:val="none" w:sz="0" w:space="0" w:color="000000"/>
                 <w:right w:val="none" w:sz="0" w:space="0" w:color="000000"/>
               </w:pBdr>
-              <w:spacing w:before="100" w:after="100"/>
-              <w:ind w:left="300" w:right="100"/>
-              <w:rPr>
-                <w:rFonts w:ascii="Helvetica" w:eastAsia="Helvetica" w:hAnsi="Helvetica" w:cs="Helvetica"/>
-                <w:color w:val="000000"/>
-                <w:sz w:val="22"/>
-                <w:szCs w:val="22"/>
+              <w:spacing w:after="100" w:before="100" w:line="240"/>
+              <w:ind w:left="300" w:right="100" w:firstLine="0" w:firstLineChars="0"/>
+              <w:rPr>
+                <w:rFonts w:ascii="Helvetica" w:hAnsi="Helvetica" w:eastAsia="Helvetica" w:cs="Helvetica"/>
+                <w:i w:val="false"/>
+                <w:b w:val="false"/>
+                <w:u w:val="none"/>
+                <w:strike w:val="false"/>
+                <w:sz w:val="22"/>
+                <w:szCs w:val="22"/>
+                <w:color w:val="000000"/>
               </w:rPr>
             </w:pPr>
             <w:r>
               <w:rPr>
-                <w:rFonts w:ascii="Helvetica" w:eastAsia="Helvetica" w:hAnsi="Helvetica" w:cs="Helvetica"/>
-                <w:color w:val="000000"/>
-                <w:sz w:val="22"/>
-                <w:szCs w:val="22"/>
-              </w:rPr>
-              <w:t>MUY BAJO</w:t>
+                <w:rFonts w:ascii="Helvetica" w:hAnsi="Helvetica" w:eastAsia="Helvetica" w:cs="Helvetica"/>
+                <w:i w:val="false"/>
+                <w:b w:val="false"/>
+                <w:u w:val="none"/>
+                <w:strike w:val="false"/>
+                <w:sz w:val="22"/>
+                <w:szCs w:val="22"/>
+                <w:color w:val="000000"/>
+              </w:rPr>
+              <w:t xml:space="preserve">MUY BAJO</w:t>
             </w:r>
           </w:p>
         </w:tc>
         <w:tc>
           <w:tcPr>
-            <w:tcW w:w="3088" w:type="dxa"/>
             <w:tcBorders>
+              <w:bottom w:val="none" w:sz="0" w:space="0" w:color="000000"/>
               <w:top w:val="none" w:sz="0" w:space="0" w:color="000000"/>
               <w:left w:val="none" w:sz="0" w:space="0" w:color="000000"/>
-              <w:bottom w:val="none" w:sz="0" w:space="0" w:color="000000"/>
               <w:right w:val="none" w:sz="0" w:space="0" w:color="000000"/>
             </w:tcBorders>
             <w:shd w:val="clear" w:color="auto" w:fill="FFFFFF"/>
             <w:tcMar>
               <w:top w:w="0" w:type="dxa"/>
+              <w:bottom w:w="0" w:type="dxa"/>
               <w:left w:w="0" w:type="dxa"/>
-              <w:bottom w:w="0" w:type="dxa"/>
               <w:right w:w="0" w:type="dxa"/>
             </w:tcMar>
+            <w:vAlign w:val="top"/>
           </w:tcPr>
           <w:p>
             <w:pPr>
+              <w:pStyle w:val="Normal"/>
+              <w:jc w:val="center"/>
               <w:pBdr>
+                <w:bottom w:val="none" w:sz="0" w:space="0" w:color="000000"/>
                 <w:top w:val="none" w:sz="0" w:space="0" w:color="000000"/>
                 <w:left w:val="none" w:sz="0" w:space="0" w:color="000000"/>
-                <w:bottom w:val="none" w:sz="0" w:space="0" w:color="000000"/>
                 <w:right w:val="none" w:sz="0" w:space="0" w:color="000000"/>
               </w:pBdr>
-              <w:spacing w:before="100" w:after="100"/>
-              <w:ind w:left="100" w:right="100"/>
-              <w:jc w:val="center"/>
-              <w:rPr>
-                <w:rFonts w:ascii="Helvetica" w:eastAsia="Helvetica" w:hAnsi="Helvetica" w:cs="Helvetica"/>
-                <w:color w:val="000000"/>
-                <w:sz w:val="22"/>
-                <w:szCs w:val="22"/>
+              <w:spacing w:after="100" w:before="100" w:line="240"/>
+              <w:ind w:left="100" w:right="100" w:firstLine="0" w:firstLineChars="0"/>
+              <w:rPr>
+                <w:rFonts w:ascii="Helvetica" w:hAnsi="Helvetica" w:eastAsia="Helvetica" w:cs="Helvetica"/>
+                <w:i w:val="false"/>
+                <w:b w:val="false"/>
+                <w:u w:val="none"/>
+                <w:strike w:val="false"/>
+                <w:sz w:val="22"/>
+                <w:szCs w:val="22"/>
+                <w:color w:val="000000"/>
               </w:rPr>
             </w:pPr>
             <w:r>
               <w:rPr>
-                <w:rFonts w:ascii="Helvetica" w:eastAsia="Helvetica" w:hAnsi="Helvetica" w:cs="Helvetica"/>
-                <w:color w:val="000000"/>
-                <w:sz w:val="22"/>
-                <w:szCs w:val="22"/>
-              </w:rPr>
-              <w:t>16,038 (23.0%)</w:t>
+                <w:rFonts w:ascii="Helvetica" w:hAnsi="Helvetica" w:eastAsia="Helvetica" w:cs="Helvetica"/>
+                <w:i w:val="false"/>
+                <w:b w:val="false"/>
+                <w:u w:val="none"/>
+                <w:strike w:val="false"/>
+                <w:sz w:val="22"/>
+                <w:szCs w:val="22"/>
+                <w:color w:val="000000"/>
+              </w:rPr>
+              <w:t xml:space="preserve">16,038 (23.0%)</w:t>
             </w:r>
           </w:p>
         </w:tc>
         <w:tc>
           <w:tcPr>
-            <w:tcW w:w="3088" w:type="dxa"/>
             <w:tcBorders>
+              <w:bottom w:val="none" w:sz="0" w:space="0" w:color="000000"/>
               <w:top w:val="none" w:sz="0" w:space="0" w:color="000000"/>
               <w:left w:val="none" w:sz="0" w:space="0" w:color="000000"/>
-              <w:bottom w:val="none" w:sz="0" w:space="0" w:color="000000"/>
               <w:right w:val="none" w:sz="0" w:space="0" w:color="000000"/>
             </w:tcBorders>
             <w:shd w:val="clear" w:color="auto" w:fill="FFFFFF"/>
             <w:tcMar>
               <w:top w:w="0" w:type="dxa"/>
+              <w:bottom w:w="0" w:type="dxa"/>
               <w:left w:w="0" w:type="dxa"/>
-              <w:bottom w:w="0" w:type="dxa"/>
               <w:right w:w="0" w:type="dxa"/>
             </w:tcMar>
+            <w:vAlign w:val="top"/>
           </w:tcPr>
           <w:p>
             <w:pPr>
+              <w:pStyle w:val="Normal"/>
+              <w:jc w:val="center"/>
               <w:pBdr>
+                <w:bottom w:val="none" w:sz="0" w:space="0" w:color="000000"/>
                 <w:top w:val="none" w:sz="0" w:space="0" w:color="000000"/>
                 <w:left w:val="none" w:sz="0" w:space="0" w:color="000000"/>
-                <w:bottom w:val="none" w:sz="0" w:space="0" w:color="000000"/>
                 <w:right w:val="none" w:sz="0" w:space="0" w:color="000000"/>
               </w:pBdr>
-              <w:spacing w:before="100" w:after="100"/>
-              <w:ind w:left="100" w:right="100"/>
-              <w:jc w:val="center"/>
-              <w:rPr>
-                <w:rFonts w:ascii="Helvetica" w:eastAsia="Helvetica" w:hAnsi="Helvetica" w:cs="Helvetica"/>
-                <w:color w:val="000000"/>
-                <w:sz w:val="22"/>
-                <w:szCs w:val="22"/>
+              <w:spacing w:after="100" w:before="100" w:line="240"/>
+              <w:ind w:left="100" w:right="100" w:firstLine="0" w:firstLineChars="0"/>
+              <w:rPr>
+                <w:rFonts w:ascii="Helvetica" w:hAnsi="Helvetica" w:eastAsia="Helvetica" w:cs="Helvetica"/>
+                <w:i w:val="false"/>
+                <w:b w:val="false"/>
+                <w:u w:val="none"/>
+                <w:strike w:val="false"/>
+                <w:sz w:val="22"/>
+                <w:szCs w:val="22"/>
+                <w:color w:val="000000"/>
               </w:rPr>
             </w:pPr>
             <w:r>
               <w:rPr>
-                <w:rFonts w:ascii="Helvetica" w:eastAsia="Helvetica" w:hAnsi="Helvetica" w:cs="Helvetica"/>
-                <w:color w:val="000000"/>
-                <w:sz w:val="22"/>
-                <w:szCs w:val="22"/>
-              </w:rPr>
-              <w:t>9,210 (20.7%)</w:t>
+                <w:rFonts w:ascii="Helvetica" w:hAnsi="Helvetica" w:eastAsia="Helvetica" w:cs="Helvetica"/>
+                <w:i w:val="false"/>
+                <w:b w:val="false"/>
+                <w:u w:val="none"/>
+                <w:strike w:val="false"/>
+                <w:sz w:val="22"/>
+                <w:szCs w:val="22"/>
+                <w:color w:val="000000"/>
+              </w:rPr>
+              <w:t xml:space="preserve">9,210 (20.7%)</w:t>
             </w:r>
           </w:p>
         </w:tc>
         <w:tc>
           <w:tcPr>
-            <w:tcW w:w="3088" w:type="dxa"/>
             <w:tcBorders>
+              <w:bottom w:val="none" w:sz="0" w:space="0" w:color="000000"/>
               <w:top w:val="none" w:sz="0" w:space="0" w:color="000000"/>
               <w:left w:val="none" w:sz="0" w:space="0" w:color="000000"/>
-              <w:bottom w:val="none" w:sz="0" w:space="0" w:color="000000"/>
               <w:right w:val="none" w:sz="0" w:space="0" w:color="000000"/>
             </w:tcBorders>
             <w:shd w:val="clear" w:color="auto" w:fill="FFFFFF"/>
             <w:tcMar>
               <w:top w:w="0" w:type="dxa"/>
+              <w:bottom w:w="0" w:type="dxa"/>
               <w:left w:w="0" w:type="dxa"/>
-              <w:bottom w:w="0" w:type="dxa"/>
               <w:right w:w="0" w:type="dxa"/>
             </w:tcMar>
+            <w:vAlign w:val="top"/>
           </w:tcPr>
           <w:p>
             <w:pPr>
+              <w:pStyle w:val="Normal"/>
+              <w:jc w:val="center"/>
               <w:pBdr>
+                <w:bottom w:val="none" w:sz="0" w:space="0" w:color="000000"/>
                 <w:top w:val="none" w:sz="0" w:space="0" w:color="000000"/>
                 <w:left w:val="none" w:sz="0" w:space="0" w:color="000000"/>
-                <w:bottom w:val="none" w:sz="0" w:space="0" w:color="000000"/>
                 <w:right w:val="none" w:sz="0" w:space="0" w:color="000000"/>
               </w:pBdr>
-              <w:spacing w:before="100" w:after="100"/>
-              <w:ind w:left="100" w:right="100"/>
-              <w:jc w:val="center"/>
-              <w:rPr>
-                <w:rFonts w:ascii="Helvetica" w:eastAsia="Helvetica" w:hAnsi="Helvetica" w:cs="Helvetica"/>
-                <w:color w:val="000000"/>
-                <w:sz w:val="22"/>
-                <w:szCs w:val="22"/>
+              <w:spacing w:after="100" w:before="100" w:line="240"/>
+              <w:ind w:left="100" w:right="100" w:firstLine="0" w:firstLineChars="0"/>
+              <w:rPr>
+                <w:rFonts w:ascii="Helvetica" w:hAnsi="Helvetica" w:eastAsia="Helvetica" w:cs="Helvetica"/>
+                <w:i w:val="false"/>
+                <w:b w:val="false"/>
+                <w:u w:val="none"/>
+                <w:strike w:val="false"/>
+                <w:sz w:val="22"/>
+                <w:szCs w:val="22"/>
+                <w:color w:val="000000"/>
               </w:rPr>
             </w:pPr>
             <w:r>
               <w:rPr>
-                <w:rFonts w:ascii="Helvetica" w:eastAsia="Helvetica" w:hAnsi="Helvetica" w:cs="Helvetica"/>
-                <w:color w:val="000000"/>
-                <w:sz w:val="22"/>
-                <w:szCs w:val="22"/>
-              </w:rPr>
-              <w:t>6,828 (26.9%)</w:t>
+                <w:rFonts w:ascii="Helvetica" w:hAnsi="Helvetica" w:eastAsia="Helvetica" w:cs="Helvetica"/>
+                <w:i w:val="false"/>
+                <w:b w:val="false"/>
+                <w:u w:val="none"/>
+                <w:strike w:val="false"/>
+                <w:sz w:val="22"/>
+                <w:szCs w:val="22"/>
+                <w:color w:val="000000"/>
+              </w:rPr>
+              <w:t xml:space="preserve">6,828 (26.9%)</w:t>
             </w:r>
           </w:p>
         </w:tc>
       </w:tr>
       <w:tr>
         <w:trPr>
-          <w:jc w:val="center"/>
+          <w:trHeight w:val="616" w:hRule="auto"/>
         </w:trPr>
         <w:tc>
           <w:tcPr>
-            <w:tcW w:w="2576" w:type="dxa"/>
             <w:tcBorders>
+              <w:bottom w:val="none" w:sz="0" w:space="0" w:color="000000"/>
               <w:top w:val="none" w:sz="0" w:space="0" w:color="000000"/>
               <w:left w:val="none" w:sz="0" w:space="0" w:color="000000"/>
-              <w:bottom w:val="none" w:sz="0" w:space="0" w:color="000000"/>
               <w:right w:val="none" w:sz="0" w:space="0" w:color="000000"/>
             </w:tcBorders>
             <w:shd w:val="clear" w:color="auto" w:fill="FFFFFF"/>
             <w:tcMar>
               <w:top w:w="0" w:type="dxa"/>
+              <w:bottom w:w="0" w:type="dxa"/>
               <w:left w:w="0" w:type="dxa"/>
-              <w:bottom w:w="0" w:type="dxa"/>
               <w:right w:w="0" w:type="dxa"/>
             </w:tcMar>
+            <w:vAlign w:val="top"/>
           </w:tcPr>
           <w:p>
             <w:pPr>
+              <w:pStyle w:val="Normal"/>
+              <w:jc w:val="left"/>
               <w:pBdr>
+                <w:bottom w:val="none" w:sz="0" w:space="0" w:color="000000"/>
                 <w:top w:val="none" w:sz="0" w:space="0" w:color="000000"/>
                 <w:left w:val="none" w:sz="0" w:space="0" w:color="000000"/>
-                <w:bottom w:val="none" w:sz="0" w:space="0" w:color="000000"/>
                 <w:right w:val="none" w:sz="0" w:space="0" w:color="000000"/>
               </w:pBdr>
-              <w:spacing w:before="100" w:after="100"/>
-              <w:ind w:left="300" w:right="100"/>
-              <w:rPr>
-                <w:rFonts w:ascii="Helvetica" w:eastAsia="Helvetica" w:hAnsi="Helvetica" w:cs="Helvetica"/>
-                <w:color w:val="000000"/>
-                <w:sz w:val="22"/>
-                <w:szCs w:val="22"/>
+              <w:spacing w:after="100" w:before="100" w:line="240"/>
+              <w:ind w:left="300" w:right="100" w:firstLine="0" w:firstLineChars="0"/>
+              <w:rPr>
+                <w:rFonts w:ascii="Helvetica" w:hAnsi="Helvetica" w:eastAsia="Helvetica" w:cs="Helvetica"/>
+                <w:i w:val="false"/>
+                <w:b w:val="false"/>
+                <w:u w:val="none"/>
+                <w:strike w:val="false"/>
+                <w:sz w:val="22"/>
+                <w:szCs w:val="22"/>
+                <w:color w:val="000000"/>
               </w:rPr>
             </w:pPr>
             <w:r>
               <w:rPr>
-                <w:rFonts w:ascii="Helvetica" w:eastAsia="Helvetica" w:hAnsi="Helvetica" w:cs="Helvetica"/>
-                <w:color w:val="000000"/>
-                <w:sz w:val="22"/>
-                <w:szCs w:val="22"/>
-              </w:rPr>
-              <w:t>BAJO</w:t>
+                <w:rFonts w:ascii="Helvetica" w:hAnsi="Helvetica" w:eastAsia="Helvetica" w:cs="Helvetica"/>
+                <w:i w:val="false"/>
+                <w:b w:val="false"/>
+                <w:u w:val="none"/>
+                <w:strike w:val="false"/>
+                <w:sz w:val="22"/>
+                <w:szCs w:val="22"/>
+                <w:color w:val="000000"/>
+              </w:rPr>
+              <w:t xml:space="preserve">BAJO</w:t>
             </w:r>
           </w:p>
         </w:tc>
         <w:tc>
           <w:tcPr>
-            <w:tcW w:w="3088" w:type="dxa"/>
             <w:tcBorders>
+              <w:bottom w:val="none" w:sz="0" w:space="0" w:color="000000"/>
               <w:top w:val="none" w:sz="0" w:space="0" w:color="000000"/>
               <w:left w:val="none" w:sz="0" w:space="0" w:color="000000"/>
-              <w:bottom w:val="none" w:sz="0" w:space="0" w:color="000000"/>
               <w:right w:val="none" w:sz="0" w:space="0" w:color="000000"/>
             </w:tcBorders>
             <w:shd w:val="clear" w:color="auto" w:fill="FFFFFF"/>
             <w:tcMar>
               <w:top w:w="0" w:type="dxa"/>
+              <w:bottom w:w="0" w:type="dxa"/>
               <w:left w:w="0" w:type="dxa"/>
-              <w:bottom w:w="0" w:type="dxa"/>
               <w:right w:w="0" w:type="dxa"/>
             </w:tcMar>
+            <w:vAlign w:val="top"/>
           </w:tcPr>
           <w:p>
             <w:pPr>
+              <w:pStyle w:val="Normal"/>
+              <w:jc w:val="center"/>
               <w:pBdr>
+                <w:bottom w:val="none" w:sz="0" w:space="0" w:color="000000"/>
                 <w:top w:val="none" w:sz="0" w:space="0" w:color="000000"/>
                 <w:left w:val="none" w:sz="0" w:space="0" w:color="000000"/>
-                <w:bottom w:val="none" w:sz="0" w:space="0" w:color="000000"/>
                 <w:right w:val="none" w:sz="0" w:space="0" w:color="000000"/>
               </w:pBdr>
-              <w:spacing w:before="100" w:after="100"/>
-              <w:ind w:left="100" w:right="100"/>
-              <w:jc w:val="center"/>
-              <w:rPr>
-                <w:rFonts w:ascii="Helvetica" w:eastAsia="Helvetica" w:hAnsi="Helvetica" w:cs="Helvetica"/>
-                <w:color w:val="000000"/>
-                <w:sz w:val="22"/>
-                <w:szCs w:val="22"/>
+              <w:spacing w:after="100" w:before="100" w:line="240"/>
+              <w:ind w:left="100" w:right="100" w:firstLine="0" w:firstLineChars="0"/>
+              <w:rPr>
+                <w:rFonts w:ascii="Helvetica" w:hAnsi="Helvetica" w:eastAsia="Helvetica" w:cs="Helvetica"/>
+                <w:i w:val="false"/>
+                <w:b w:val="false"/>
+                <w:u w:val="none"/>
+                <w:strike w:val="false"/>
+                <w:sz w:val="22"/>
+                <w:szCs w:val="22"/>
+                <w:color w:val="000000"/>
               </w:rPr>
             </w:pPr>
             <w:r>
               <w:rPr>
-                <w:rFonts w:ascii="Helvetica" w:eastAsia="Helvetica" w:hAnsi="Helvetica" w:cs="Helvetica"/>
-                <w:color w:val="000000"/>
-                <w:sz w:val="22"/>
-                <w:szCs w:val="22"/>
-              </w:rPr>
-              <w:t>13,508 (19.3%)</w:t>
+                <w:rFonts w:ascii="Helvetica" w:hAnsi="Helvetica" w:eastAsia="Helvetica" w:cs="Helvetica"/>
+                <w:i w:val="false"/>
+                <w:b w:val="false"/>
+                <w:u w:val="none"/>
+                <w:strike w:val="false"/>
+                <w:sz w:val="22"/>
+                <w:szCs w:val="22"/>
+                <w:color w:val="000000"/>
+              </w:rPr>
+              <w:t xml:space="preserve">13,508 (19.3%)</w:t>
             </w:r>
           </w:p>
         </w:tc>
         <w:tc>
           <w:tcPr>
-            <w:tcW w:w="3088" w:type="dxa"/>
             <w:tcBorders>
+              <w:bottom w:val="none" w:sz="0" w:space="0" w:color="000000"/>
               <w:top w:val="none" w:sz="0" w:space="0" w:color="000000"/>
               <w:left w:val="none" w:sz="0" w:space="0" w:color="000000"/>
-              <w:bottom w:val="none" w:sz="0" w:space="0" w:color="000000"/>
               <w:right w:val="none" w:sz="0" w:space="0" w:color="000000"/>
             </w:tcBorders>
             <w:shd w:val="clear" w:color="auto" w:fill="FFFFFF"/>
             <w:tcMar>
               <w:top w:w="0" w:type="dxa"/>
+              <w:bottom w:w="0" w:type="dxa"/>
               <w:left w:w="0" w:type="dxa"/>
-              <w:bottom w:w="0" w:type="dxa"/>
               <w:right w:w="0" w:type="dxa"/>
             </w:tcMar>
+            <w:vAlign w:val="top"/>
           </w:tcPr>
           <w:p>
             <w:pPr>
+              <w:pStyle w:val="Normal"/>
+              <w:jc w:val="center"/>
               <w:pBdr>
+                <w:bottom w:val="none" w:sz="0" w:space="0" w:color="000000"/>
                 <w:top w:val="none" w:sz="0" w:space="0" w:color="000000"/>
                 <w:left w:val="none" w:sz="0" w:space="0" w:color="000000"/>
-                <w:bottom w:val="none" w:sz="0" w:space="0" w:color="000000"/>
                 <w:right w:val="none" w:sz="0" w:space="0" w:color="000000"/>
               </w:pBdr>
-              <w:spacing w:before="100" w:after="100"/>
-              <w:ind w:left="100" w:right="100"/>
-              <w:jc w:val="center"/>
-              <w:rPr>
-                <w:rFonts w:ascii="Helvetica" w:eastAsia="Helvetica" w:hAnsi="Helvetica" w:cs="Helvetica"/>
-                <w:color w:val="000000"/>
-                <w:sz w:val="22"/>
-                <w:szCs w:val="22"/>
+              <w:spacing w:after="100" w:before="100" w:line="240"/>
+              <w:ind w:left="100" w:right="100" w:firstLine="0" w:firstLineChars="0"/>
+              <w:rPr>
+                <w:rFonts w:ascii="Helvetica" w:hAnsi="Helvetica" w:eastAsia="Helvetica" w:cs="Helvetica"/>
+                <w:i w:val="false"/>
+                <w:b w:val="false"/>
+                <w:u w:val="none"/>
+                <w:strike w:val="false"/>
+                <w:sz w:val="22"/>
+                <w:szCs w:val="22"/>
+                <w:color w:val="000000"/>
               </w:rPr>
             </w:pPr>
             <w:r>
               <w:rPr>
-                <w:rFonts w:ascii="Helvetica" w:eastAsia="Helvetica" w:hAnsi="Helvetica" w:cs="Helvetica"/>
-                <w:color w:val="000000"/>
-                <w:sz w:val="22"/>
-                <w:szCs w:val="22"/>
-              </w:rPr>
-              <w:t>8,450 (19.0%)</w:t>
+                <w:rFonts w:ascii="Helvetica" w:hAnsi="Helvetica" w:eastAsia="Helvetica" w:cs="Helvetica"/>
+                <w:i w:val="false"/>
+                <w:b w:val="false"/>
+                <w:u w:val="none"/>
+                <w:strike w:val="false"/>
+                <w:sz w:val="22"/>
+                <w:szCs w:val="22"/>
+                <w:color w:val="000000"/>
+              </w:rPr>
+              <w:t xml:space="preserve">8,450 (19.0%)</w:t>
             </w:r>
           </w:p>
         </w:tc>
         <w:tc>
           <w:tcPr>
-            <w:tcW w:w="3088" w:type="dxa"/>
             <w:tcBorders>
+              <w:bottom w:val="none" w:sz="0" w:space="0" w:color="000000"/>
               <w:top w:val="none" w:sz="0" w:space="0" w:color="000000"/>
               <w:left w:val="none" w:sz="0" w:space="0" w:color="000000"/>
-              <w:bottom w:val="none" w:sz="0" w:space="0" w:color="000000"/>
               <w:right w:val="none" w:sz="0" w:space="0" w:color="000000"/>
             </w:tcBorders>
             <w:shd w:val="clear" w:color="auto" w:fill="FFFFFF"/>
             <w:tcMar>
               <w:top w:w="0" w:type="dxa"/>
+              <w:bottom w:w="0" w:type="dxa"/>
               <w:left w:w="0" w:type="dxa"/>
-              <w:bottom w:w="0" w:type="dxa"/>
               <w:right w:w="0" w:type="dxa"/>
             </w:tcMar>
+            <w:vAlign w:val="top"/>
           </w:tcPr>
           <w:p>
             <w:pPr>
+              <w:pStyle w:val="Normal"/>
+              <w:jc w:val="center"/>
               <w:pBdr>
+                <w:bottom w:val="none" w:sz="0" w:space="0" w:color="000000"/>
                 <w:top w:val="none" w:sz="0" w:space="0" w:color="000000"/>
                 <w:left w:val="none" w:sz="0" w:space="0" w:color="000000"/>
-                <w:bottom w:val="none" w:sz="0" w:space="0" w:color="000000"/>
                 <w:right w:val="none" w:sz="0" w:space="0" w:color="000000"/>
               </w:pBdr>
-              <w:spacing w:before="100" w:after="100"/>
-              <w:ind w:left="100" w:right="100"/>
-              <w:jc w:val="center"/>
-              <w:rPr>
-                <w:rFonts w:ascii="Helvetica" w:eastAsia="Helvetica" w:hAnsi="Helvetica" w:cs="Helvetica"/>
-                <w:color w:val="000000"/>
-                <w:sz w:val="22"/>
-                <w:szCs w:val="22"/>
+              <w:spacing w:after="100" w:before="100" w:line="240"/>
+              <w:ind w:left="100" w:right="100" w:firstLine="0" w:firstLineChars="0"/>
+              <w:rPr>
+                <w:rFonts w:ascii="Helvetica" w:hAnsi="Helvetica" w:eastAsia="Helvetica" w:cs="Helvetica"/>
+                <w:i w:val="false"/>
+                <w:b w:val="false"/>
+                <w:u w:val="none"/>
+                <w:strike w:val="false"/>
+                <w:sz w:val="22"/>
+                <w:szCs w:val="22"/>
+                <w:color w:val="000000"/>
               </w:rPr>
             </w:pPr>
             <w:r>
               <w:rPr>
-                <w:rFonts w:ascii="Helvetica" w:eastAsia="Helvetica" w:hAnsi="Helvetica" w:cs="Helvetica"/>
-                <w:color w:val="000000"/>
-                <w:sz w:val="22"/>
-                <w:szCs w:val="22"/>
-              </w:rPr>
-              <w:t>5,058 (19.9%)</w:t>
+                <w:rFonts w:ascii="Helvetica" w:hAnsi="Helvetica" w:eastAsia="Helvetica" w:cs="Helvetica"/>
+                <w:i w:val="false"/>
+                <w:b w:val="false"/>
+                <w:u w:val="none"/>
+                <w:strike w:val="false"/>
+                <w:sz w:val="22"/>
+                <w:szCs w:val="22"/>
+                <w:color w:val="000000"/>
+              </w:rPr>
+              <w:t xml:space="preserve">5,058 (19.9%)</w:t>
             </w:r>
           </w:p>
         </w:tc>
       </w:tr>
       <w:tr>
         <w:trPr>
-          <w:jc w:val="center"/>
+          <w:trHeight w:val="616" w:hRule="auto"/>
         </w:trPr>
         <w:tc>
           <w:tcPr>
-            <w:tcW w:w="2576" w:type="dxa"/>
             <w:tcBorders>
+              <w:bottom w:val="none" w:sz="0" w:space="0" w:color="000000"/>
               <w:top w:val="none" w:sz="0" w:space="0" w:color="000000"/>
               <w:left w:val="none" w:sz="0" w:space="0" w:color="000000"/>
-              <w:bottom w:val="none" w:sz="0" w:space="0" w:color="000000"/>
               <w:right w:val="none" w:sz="0" w:space="0" w:color="000000"/>
             </w:tcBorders>
             <w:shd w:val="clear" w:color="auto" w:fill="FFFFFF"/>
             <w:tcMar>
               <w:top w:w="0" w:type="dxa"/>
+              <w:bottom w:w="0" w:type="dxa"/>
               <w:left w:w="0" w:type="dxa"/>
-              <w:bottom w:w="0" w:type="dxa"/>
               <w:right w:w="0" w:type="dxa"/>
             </w:tcMar>
+            <w:vAlign w:val="top"/>
           </w:tcPr>
           <w:p>
             <w:pPr>
+              <w:pStyle w:val="Normal"/>
+              <w:jc w:val="left"/>
               <w:pBdr>
+                <w:bottom w:val="none" w:sz="0" w:space="0" w:color="000000"/>
                 <w:top w:val="none" w:sz="0" w:space="0" w:color="000000"/>
                 <w:left w:val="none" w:sz="0" w:space="0" w:color="000000"/>
-                <w:bottom w:val="none" w:sz="0" w:space="0" w:color="000000"/>
                 <w:right w:val="none" w:sz="0" w:space="0" w:color="000000"/>
               </w:pBdr>
-              <w:spacing w:before="100" w:after="100"/>
-              <w:ind w:left="300" w:right="100"/>
-              <w:rPr>
-                <w:rFonts w:ascii="Helvetica" w:eastAsia="Helvetica" w:hAnsi="Helvetica" w:cs="Helvetica"/>
-                <w:color w:val="000000"/>
-                <w:sz w:val="22"/>
-                <w:szCs w:val="22"/>
+              <w:spacing w:after="100" w:before="100" w:line="240"/>
+              <w:ind w:left="300" w:right="100" w:firstLine="0" w:firstLineChars="0"/>
+              <w:rPr>
+                <w:rFonts w:ascii="Helvetica" w:hAnsi="Helvetica" w:eastAsia="Helvetica" w:cs="Helvetica"/>
+                <w:i w:val="false"/>
+                <w:b w:val="false"/>
+                <w:u w:val="none"/>
+                <w:strike w:val="false"/>
+                <w:sz w:val="22"/>
+                <w:szCs w:val="22"/>
+                <w:color w:val="000000"/>
               </w:rPr>
             </w:pPr>
             <w:r>
               <w:rPr>
-                <w:rFonts w:ascii="Helvetica" w:eastAsia="Helvetica" w:hAnsi="Helvetica" w:cs="Helvetica"/>
-                <w:color w:val="000000"/>
-                <w:sz w:val="22"/>
-                <w:szCs w:val="22"/>
-              </w:rPr>
-              <w:t>MODERADO</w:t>
+                <w:rFonts w:ascii="Helvetica" w:hAnsi="Helvetica" w:eastAsia="Helvetica" w:cs="Helvetica"/>
+                <w:i w:val="false"/>
+                <w:b w:val="false"/>
+                <w:u w:val="none"/>
+                <w:strike w:val="false"/>
+                <w:sz w:val="22"/>
+                <w:szCs w:val="22"/>
+                <w:color w:val="000000"/>
+              </w:rPr>
+              <w:t xml:space="preserve">MODERADO</w:t>
             </w:r>
           </w:p>
         </w:tc>
         <w:tc>
           <w:tcPr>
-            <w:tcW w:w="3088" w:type="dxa"/>
             <w:tcBorders>
+              <w:bottom w:val="none" w:sz="0" w:space="0" w:color="000000"/>
               <w:top w:val="none" w:sz="0" w:space="0" w:color="000000"/>
               <w:left w:val="none" w:sz="0" w:space="0" w:color="000000"/>
-              <w:bottom w:val="none" w:sz="0" w:space="0" w:color="000000"/>
               <w:right w:val="none" w:sz="0" w:space="0" w:color="000000"/>
             </w:tcBorders>
             <w:shd w:val="clear" w:color="auto" w:fill="FFFFFF"/>
             <w:tcMar>
               <w:top w:w="0" w:type="dxa"/>
+              <w:bottom w:w="0" w:type="dxa"/>
               <w:left w:w="0" w:type="dxa"/>
-              <w:bottom w:w="0" w:type="dxa"/>
               <w:right w:w="0" w:type="dxa"/>
             </w:tcMar>
+            <w:vAlign w:val="top"/>
           </w:tcPr>
           <w:p>
             <w:pPr>
+              <w:pStyle w:val="Normal"/>
+              <w:jc w:val="center"/>
               <w:pBdr>
+                <w:bottom w:val="none" w:sz="0" w:space="0" w:color="000000"/>
                 <w:top w:val="none" w:sz="0" w:space="0" w:color="000000"/>
                 <w:left w:val="none" w:sz="0" w:space="0" w:color="000000"/>
-                <w:bottom w:val="none" w:sz="0" w:space="0" w:color="000000"/>
                 <w:right w:val="none" w:sz="0" w:space="0" w:color="000000"/>
               </w:pBdr>
-              <w:spacing w:before="100" w:after="100"/>
-              <w:ind w:left="100" w:right="100"/>
-              <w:jc w:val="center"/>
-              <w:rPr>
-                <w:rFonts w:ascii="Helvetica" w:eastAsia="Helvetica" w:hAnsi="Helvetica" w:cs="Helvetica"/>
-                <w:color w:val="000000"/>
-                <w:sz w:val="22"/>
-                <w:szCs w:val="22"/>
+              <w:spacing w:after="100" w:before="100" w:line="240"/>
+              <w:ind w:left="100" w:right="100" w:firstLine="0" w:firstLineChars="0"/>
+              <w:rPr>
+                <w:rFonts w:ascii="Helvetica" w:hAnsi="Helvetica" w:eastAsia="Helvetica" w:cs="Helvetica"/>
+                <w:i w:val="false"/>
+                <w:b w:val="false"/>
+                <w:u w:val="none"/>
+                <w:strike w:val="false"/>
+                <w:sz w:val="22"/>
+                <w:szCs w:val="22"/>
+                <w:color w:val="000000"/>
               </w:rPr>
             </w:pPr>
             <w:r>
               <w:rPr>
-                <w:rFonts w:ascii="Helvetica" w:eastAsia="Helvetica" w:hAnsi="Helvetica" w:cs="Helvetica"/>
-                <w:color w:val="000000"/>
-                <w:sz w:val="22"/>
-                <w:szCs w:val="22"/>
-              </w:rPr>
-              <w:t>14,204 (20.3%)</w:t>
+                <w:rFonts w:ascii="Helvetica" w:hAnsi="Helvetica" w:eastAsia="Helvetica" w:cs="Helvetica"/>
+                <w:i w:val="false"/>
+                <w:b w:val="false"/>
+                <w:u w:val="none"/>
+                <w:strike w:val="false"/>
+                <w:sz w:val="22"/>
+                <w:szCs w:val="22"/>
+                <w:color w:val="000000"/>
+              </w:rPr>
+              <w:t xml:space="preserve">14,204 (20.3%)</w:t>
             </w:r>
           </w:p>
         </w:tc>
         <w:tc>
           <w:tcPr>
-            <w:tcW w:w="3088" w:type="dxa"/>
             <w:tcBorders>
+              <w:bottom w:val="none" w:sz="0" w:space="0" w:color="000000"/>
               <w:top w:val="none" w:sz="0" w:space="0" w:color="000000"/>
               <w:left w:val="none" w:sz="0" w:space="0" w:color="000000"/>
-              <w:bottom w:val="none" w:sz="0" w:space="0" w:color="000000"/>
               <w:right w:val="none" w:sz="0" w:space="0" w:color="000000"/>
             </w:tcBorders>
             <w:shd w:val="clear" w:color="auto" w:fill="FFFFFF"/>
             <w:tcMar>
               <w:top w:w="0" w:type="dxa"/>
+              <w:bottom w:w="0" w:type="dxa"/>
               <w:left w:w="0" w:type="dxa"/>
-              <w:bottom w:w="0" w:type="dxa"/>
               <w:right w:w="0" w:type="dxa"/>
             </w:tcMar>
+            <w:vAlign w:val="top"/>
           </w:tcPr>
           <w:p>
             <w:pPr>
+              <w:pStyle w:val="Normal"/>
+              <w:jc w:val="center"/>
               <w:pBdr>
+                <w:bottom w:val="none" w:sz="0" w:space="0" w:color="000000"/>
                 <w:top w:val="none" w:sz="0" w:space="0" w:color="000000"/>
                 <w:left w:val="none" w:sz="0" w:space="0" w:color="000000"/>
-                <w:bottom w:val="none" w:sz="0" w:space="0" w:color="000000"/>
                 <w:right w:val="none" w:sz="0" w:space="0" w:color="000000"/>
               </w:pBdr>
-              <w:spacing w:before="100" w:after="100"/>
-              <w:ind w:left="100" w:right="100"/>
-              <w:jc w:val="center"/>
-              <w:rPr>
-                <w:rFonts w:ascii="Helvetica" w:eastAsia="Helvetica" w:hAnsi="Helvetica" w:cs="Helvetica"/>
-                <w:color w:val="000000"/>
-                <w:sz w:val="22"/>
-                <w:szCs w:val="22"/>
+              <w:spacing w:after="100" w:before="100" w:line="240"/>
+              <w:ind w:left="100" w:right="100" w:firstLine="0" w:firstLineChars="0"/>
+              <w:rPr>
+                <w:rFonts w:ascii="Helvetica" w:hAnsi="Helvetica" w:eastAsia="Helvetica" w:cs="Helvetica"/>
+                <w:i w:val="false"/>
+                <w:b w:val="false"/>
+                <w:u w:val="none"/>
+                <w:strike w:val="false"/>
+                <w:sz w:val="22"/>
+                <w:szCs w:val="22"/>
+                <w:color w:val="000000"/>
               </w:rPr>
             </w:pPr>
             <w:r>
               <w:rPr>
-                <w:rFonts w:ascii="Helvetica" w:eastAsia="Helvetica" w:hAnsi="Helvetica" w:cs="Helvetica"/>
-                <w:color w:val="000000"/>
-                <w:sz w:val="22"/>
-                <w:szCs w:val="22"/>
-              </w:rPr>
-              <w:t>9,308 (20.9%)</w:t>
+                <w:rFonts w:ascii="Helvetica" w:hAnsi="Helvetica" w:eastAsia="Helvetica" w:cs="Helvetica"/>
+                <w:i w:val="false"/>
+                <w:b w:val="false"/>
+                <w:u w:val="none"/>
+                <w:strike w:val="false"/>
+                <w:sz w:val="22"/>
+                <w:szCs w:val="22"/>
+                <w:color w:val="000000"/>
+              </w:rPr>
+              <w:t xml:space="preserve">9,308 (20.9%)</w:t>
             </w:r>
           </w:p>
         </w:tc>
         <w:tc>
           <w:tcPr>
-            <w:tcW w:w="3088" w:type="dxa"/>
             <w:tcBorders>
+              <w:bottom w:val="none" w:sz="0" w:space="0" w:color="000000"/>
               <w:top w:val="none" w:sz="0" w:space="0" w:color="000000"/>
               <w:left w:val="none" w:sz="0" w:space="0" w:color="000000"/>
-              <w:bottom w:val="none" w:sz="0" w:space="0" w:color="000000"/>
               <w:right w:val="none" w:sz="0" w:space="0" w:color="000000"/>
             </w:tcBorders>
             <w:shd w:val="clear" w:color="auto" w:fill="FFFFFF"/>
             <w:tcMar>
               <w:top w:w="0" w:type="dxa"/>
+              <w:bottom w:w="0" w:type="dxa"/>
               <w:left w:w="0" w:type="dxa"/>
-              <w:bottom w:w="0" w:type="dxa"/>
               <w:right w:w="0" w:type="dxa"/>
             </w:tcMar>
+            <w:vAlign w:val="top"/>
           </w:tcPr>
           <w:p>
             <w:pPr>
+              <w:pStyle w:val="Normal"/>
+              <w:jc w:val="center"/>
               <w:pBdr>
+                <w:bottom w:val="none" w:sz="0" w:space="0" w:color="000000"/>
                 <w:top w:val="none" w:sz="0" w:space="0" w:color="000000"/>
                 <w:left w:val="none" w:sz="0" w:space="0" w:color="000000"/>
-                <w:bottom w:val="none" w:sz="0" w:space="0" w:color="000000"/>
                 <w:right w:val="none" w:sz="0" w:space="0" w:color="000000"/>
               </w:pBdr>
-              <w:spacing w:before="100" w:after="100"/>
-              <w:ind w:left="100" w:right="100"/>
-              <w:jc w:val="center"/>
-              <w:rPr>
-                <w:rFonts w:ascii="Helvetica" w:eastAsia="Helvetica" w:hAnsi="Helvetica" w:cs="Helvetica"/>
-                <w:color w:val="000000"/>
-                <w:sz w:val="22"/>
-                <w:szCs w:val="22"/>
+              <w:spacing w:after="100" w:before="100" w:line="240"/>
+              <w:ind w:left="100" w:right="100" w:firstLine="0" w:firstLineChars="0"/>
+              <w:rPr>
+                <w:rFonts w:ascii="Helvetica" w:hAnsi="Helvetica" w:eastAsia="Helvetica" w:cs="Helvetica"/>
+                <w:i w:val="false"/>
+                <w:b w:val="false"/>
+                <w:u w:val="none"/>
+                <w:strike w:val="false"/>
+                <w:sz w:val="22"/>
+                <w:szCs w:val="22"/>
+                <w:color w:val="000000"/>
               </w:rPr>
             </w:pPr>
             <w:r>
               <w:rPr>
-                <w:rFonts w:ascii="Helvetica" w:eastAsia="Helvetica" w:hAnsi="Helvetica" w:cs="Helvetica"/>
-                <w:color w:val="000000"/>
-                <w:sz w:val="22"/>
-                <w:szCs w:val="22"/>
-              </w:rPr>
-              <w:t>4,896 (19.3%)</w:t>
+                <w:rFonts w:ascii="Helvetica" w:hAnsi="Helvetica" w:eastAsia="Helvetica" w:cs="Helvetica"/>
+                <w:i w:val="false"/>
+                <w:b w:val="false"/>
+                <w:u w:val="none"/>
+                <w:strike w:val="false"/>
+                <w:sz w:val="22"/>
+                <w:szCs w:val="22"/>
+                <w:color w:val="000000"/>
+              </w:rPr>
+              <w:t xml:space="preserve">4,896 (19.3%)</w:t>
             </w:r>
           </w:p>
         </w:tc>
       </w:tr>
       <w:tr>
         <w:trPr>
-          <w:jc w:val="center"/>
+          <w:trHeight w:val="616" w:hRule="auto"/>
         </w:trPr>
         <w:tc>
           <w:tcPr>
-            <w:tcW w:w="2576" w:type="dxa"/>
             <w:tcBorders>
+              <w:bottom w:val="none" w:sz="0" w:space="0" w:color="000000"/>
               <w:top w:val="none" w:sz="0" w:space="0" w:color="000000"/>
               <w:left w:val="none" w:sz="0" w:space="0" w:color="000000"/>
-              <w:bottom w:val="none" w:sz="0" w:space="0" w:color="000000"/>
               <w:right w:val="none" w:sz="0" w:space="0" w:color="000000"/>
             </w:tcBorders>
             <w:shd w:val="clear" w:color="auto" w:fill="FFFFFF"/>
             <w:tcMar>
               <w:top w:w="0" w:type="dxa"/>
+              <w:bottom w:w="0" w:type="dxa"/>
               <w:left w:w="0" w:type="dxa"/>
-              <w:bottom w:w="0" w:type="dxa"/>
               <w:right w:w="0" w:type="dxa"/>
             </w:tcMar>
+            <w:vAlign w:val="top"/>
           </w:tcPr>
           <w:p>
             <w:pPr>
+              <w:pStyle w:val="Normal"/>
+              <w:jc w:val="left"/>
               <w:pBdr>
+                <w:bottom w:val="none" w:sz="0" w:space="0" w:color="000000"/>
                 <w:top w:val="none" w:sz="0" w:space="0" w:color="000000"/>
                 <w:left w:val="none" w:sz="0" w:space="0" w:color="000000"/>
-                <w:bottom w:val="none" w:sz="0" w:space="0" w:color="000000"/>
                 <w:right w:val="none" w:sz="0" w:space="0" w:color="000000"/>
               </w:pBdr>
-              <w:spacing w:before="100" w:after="100"/>
-              <w:ind w:left="300" w:right="100"/>
-              <w:rPr>
-                <w:rFonts w:ascii="Helvetica" w:eastAsia="Helvetica" w:hAnsi="Helvetica" w:cs="Helvetica"/>
-                <w:color w:val="000000"/>
-                <w:sz w:val="22"/>
-                <w:szCs w:val="22"/>
+              <w:spacing w:after="100" w:before="100" w:line="240"/>
+              <w:ind w:left="300" w:right="100" w:firstLine="0" w:firstLineChars="0"/>
+              <w:rPr>
+                <w:rFonts w:ascii="Helvetica" w:hAnsi="Helvetica" w:eastAsia="Helvetica" w:cs="Helvetica"/>
+                <w:i w:val="false"/>
+                <w:b w:val="false"/>
+                <w:u w:val="none"/>
+                <w:strike w:val="false"/>
+                <w:sz w:val="22"/>
+                <w:szCs w:val="22"/>
+                <w:color w:val="000000"/>
               </w:rPr>
             </w:pPr>
             <w:r>
               <w:rPr>
-                <w:rFonts w:ascii="Helvetica" w:eastAsia="Helvetica" w:hAnsi="Helvetica" w:cs="Helvetica"/>
-                <w:color w:val="000000"/>
-                <w:sz w:val="22"/>
-                <w:szCs w:val="22"/>
-              </w:rPr>
-              <w:t>ALTO</w:t>
+                <w:rFonts w:ascii="Helvetica" w:hAnsi="Helvetica" w:eastAsia="Helvetica" w:cs="Helvetica"/>
+                <w:i w:val="false"/>
+                <w:b w:val="false"/>
+                <w:u w:val="none"/>
+                <w:strike w:val="false"/>
+                <w:sz w:val="22"/>
+                <w:szCs w:val="22"/>
+                <w:color w:val="000000"/>
+              </w:rPr>
+              <w:t xml:space="preserve">ALTO</w:t>
             </w:r>
           </w:p>
         </w:tc>
         <w:tc>
           <w:tcPr>
-            <w:tcW w:w="3088" w:type="dxa"/>
             <w:tcBorders>
+              <w:bottom w:val="none" w:sz="0" w:space="0" w:color="000000"/>
               <w:top w:val="none" w:sz="0" w:space="0" w:color="000000"/>
               <w:left w:val="none" w:sz="0" w:space="0" w:color="000000"/>
-              <w:bottom w:val="none" w:sz="0" w:space="0" w:color="000000"/>
               <w:right w:val="none" w:sz="0" w:space="0" w:color="000000"/>
             </w:tcBorders>
             <w:shd w:val="clear" w:color="auto" w:fill="FFFFFF"/>
             <w:tcMar>
               <w:top w:w="0" w:type="dxa"/>
+              <w:bottom w:w="0" w:type="dxa"/>
               <w:left w:w="0" w:type="dxa"/>
-              <w:bottom w:w="0" w:type="dxa"/>
               <w:right w:w="0" w:type="dxa"/>
             </w:tcMar>
+            <w:vAlign w:val="top"/>
           </w:tcPr>
           <w:p>
             <w:pPr>
+              <w:pStyle w:val="Normal"/>
+              <w:jc w:val="center"/>
               <w:pBdr>
+                <w:bottom w:val="none" w:sz="0" w:space="0" w:color="000000"/>
                 <w:top w:val="none" w:sz="0" w:space="0" w:color="000000"/>
                 <w:left w:val="none" w:sz="0" w:space="0" w:color="000000"/>
-                <w:bottom w:val="none" w:sz="0" w:space="0" w:color="000000"/>
                 <w:right w:val="none" w:sz="0" w:space="0" w:color="000000"/>
               </w:pBdr>
-              <w:spacing w:before="100" w:after="100"/>
-              <w:ind w:left="100" w:right="100"/>
-              <w:jc w:val="center"/>
-              <w:rPr>
-                <w:rFonts w:ascii="Helvetica" w:eastAsia="Helvetica" w:hAnsi="Helvetica" w:cs="Helvetica"/>
-                <w:color w:val="000000"/>
-                <w:sz w:val="22"/>
-                <w:szCs w:val="22"/>
+              <w:spacing w:after="100" w:before="100" w:line="240"/>
+              <w:ind w:left="100" w:right="100" w:firstLine="0" w:firstLineChars="0"/>
+              <w:rPr>
+                <w:rFonts w:ascii="Helvetica" w:hAnsi="Helvetica" w:eastAsia="Helvetica" w:cs="Helvetica"/>
+                <w:i w:val="false"/>
+                <w:b w:val="false"/>
+                <w:u w:val="none"/>
+                <w:strike w:val="false"/>
+                <w:sz w:val="22"/>
+                <w:szCs w:val="22"/>
+                <w:color w:val="000000"/>
               </w:rPr>
             </w:pPr>
             <w:r>
               <w:rPr>
-                <w:rFonts w:ascii="Helvetica" w:eastAsia="Helvetica" w:hAnsi="Helvetica" w:cs="Helvetica"/>
-                <w:color w:val="000000"/>
-                <w:sz w:val="22"/>
-                <w:szCs w:val="22"/>
-              </w:rPr>
-              <w:t>13,409 (19.2%)</w:t>
+                <w:rFonts w:ascii="Helvetica" w:hAnsi="Helvetica" w:eastAsia="Helvetica" w:cs="Helvetica"/>
+                <w:i w:val="false"/>
+                <w:b w:val="false"/>
+                <w:u w:val="none"/>
+                <w:strike w:val="false"/>
+                <w:sz w:val="22"/>
+                <w:szCs w:val="22"/>
+                <w:color w:val="000000"/>
+              </w:rPr>
+              <w:t xml:space="preserve">13,409 (19.2%)</w:t>
             </w:r>
           </w:p>
         </w:tc>
         <w:tc>
           <w:tcPr>
-            <w:tcW w:w="3088" w:type="dxa"/>
             <w:tcBorders>
+              <w:bottom w:val="none" w:sz="0" w:space="0" w:color="000000"/>
               <w:top w:val="none" w:sz="0" w:space="0" w:color="000000"/>
               <w:left w:val="none" w:sz="0" w:space="0" w:color="000000"/>
-              <w:bottom w:val="none" w:sz="0" w:space="0" w:color="000000"/>
               <w:right w:val="none" w:sz="0" w:space="0" w:color="000000"/>
             </w:tcBorders>
             <w:shd w:val="clear" w:color="auto" w:fill="FFFFFF"/>
             <w:tcMar>
               <w:top w:w="0" w:type="dxa"/>
+              <w:bottom w:w="0" w:type="dxa"/>
               <w:left w:w="0" w:type="dxa"/>
-              <w:bottom w:w="0" w:type="dxa"/>
               <w:right w:w="0" w:type="dxa"/>
             </w:tcMar>
+            <w:vAlign w:val="top"/>
           </w:tcPr>
           <w:p>
             <w:pPr>
+              <w:pStyle w:val="Normal"/>
+              <w:jc w:val="center"/>
               <w:pBdr>
+                <w:bottom w:val="none" w:sz="0" w:space="0" w:color="000000"/>
                 <w:top w:val="none" w:sz="0" w:space="0" w:color="000000"/>
                 <w:left w:val="none" w:sz="0" w:space="0" w:color="000000"/>
-                <w:bottom w:val="none" w:sz="0" w:space="0" w:color="000000"/>
                 <w:right w:val="none" w:sz="0" w:space="0" w:color="000000"/>
               </w:pBdr>
-              <w:spacing w:before="100" w:after="100"/>
-              <w:ind w:left="100" w:right="100"/>
-              <w:jc w:val="center"/>
-              <w:rPr>
-                <w:rFonts w:ascii="Helvetica" w:eastAsia="Helvetica" w:hAnsi="Helvetica" w:cs="Helvetica"/>
-                <w:color w:val="000000"/>
-                <w:sz w:val="22"/>
-                <w:szCs w:val="22"/>
+              <w:spacing w:after="100" w:before="100" w:line="240"/>
+              <w:ind w:left="100" w:right="100" w:firstLine="0" w:firstLineChars="0"/>
+              <w:rPr>
+                <w:rFonts w:ascii="Helvetica" w:hAnsi="Helvetica" w:eastAsia="Helvetica" w:cs="Helvetica"/>
+                <w:i w:val="false"/>
+                <w:b w:val="false"/>
+                <w:u w:val="none"/>
+                <w:strike w:val="false"/>
+                <w:sz w:val="22"/>
+                <w:szCs w:val="22"/>
+                <w:color w:val="000000"/>
               </w:rPr>
             </w:pPr>
             <w:r>
               <w:rPr>
-                <w:rFonts w:ascii="Helvetica" w:eastAsia="Helvetica" w:hAnsi="Helvetica" w:cs="Helvetica"/>
-                <w:color w:val="000000"/>
-                <w:sz w:val="22"/>
-                <w:szCs w:val="22"/>
-              </w:rPr>
-              <w:t>9,073 (20.4%)</w:t>
+                <w:rFonts w:ascii="Helvetica" w:hAnsi="Helvetica" w:eastAsia="Helvetica" w:cs="Helvetica"/>
+                <w:i w:val="false"/>
+                <w:b w:val="false"/>
+                <w:u w:val="none"/>
+                <w:strike w:val="false"/>
+                <w:sz w:val="22"/>
+                <w:szCs w:val="22"/>
+                <w:color w:val="000000"/>
+              </w:rPr>
+              <w:t xml:space="preserve">9,073 (20.4%)</w:t>
             </w:r>
           </w:p>
         </w:tc>
         <w:tc>
           <w:tcPr>
-            <w:tcW w:w="3088" w:type="dxa"/>
             <w:tcBorders>
+              <w:bottom w:val="none" w:sz="0" w:space="0" w:color="000000"/>
               <w:top w:val="none" w:sz="0" w:space="0" w:color="000000"/>
               <w:left w:val="none" w:sz="0" w:space="0" w:color="000000"/>
-              <w:bottom w:val="none" w:sz="0" w:space="0" w:color="000000"/>
               <w:right w:val="none" w:sz="0" w:space="0" w:color="000000"/>
             </w:tcBorders>
             <w:shd w:val="clear" w:color="auto" w:fill="FFFFFF"/>
             <w:tcMar>
               <w:top w:w="0" w:type="dxa"/>
+              <w:bottom w:w="0" w:type="dxa"/>
               <w:left w:w="0" w:type="dxa"/>
-              <w:bottom w:w="0" w:type="dxa"/>
               <w:right w:w="0" w:type="dxa"/>
             </w:tcMar>
+            <w:vAlign w:val="top"/>
           </w:tcPr>
           <w:p>
             <w:pPr>
+              <w:pStyle w:val="Normal"/>
+              <w:jc w:val="center"/>
               <w:pBdr>
+                <w:bottom w:val="none" w:sz="0" w:space="0" w:color="000000"/>
                 <w:top w:val="none" w:sz="0" w:space="0" w:color="000000"/>
                 <w:left w:val="none" w:sz="0" w:space="0" w:color="000000"/>
-                <w:bottom w:val="none" w:sz="0" w:space="0" w:color="000000"/>
                 <w:right w:val="none" w:sz="0" w:space="0" w:color="000000"/>
               </w:pBdr>
-              <w:spacing w:before="100" w:after="100"/>
-              <w:ind w:left="100" w:right="100"/>
-              <w:jc w:val="center"/>
-              <w:rPr>
-                <w:rFonts w:ascii="Helvetica" w:eastAsia="Helvetica" w:hAnsi="Helvetica" w:cs="Helvetica"/>
-                <w:color w:val="000000"/>
-                <w:sz w:val="22"/>
-                <w:szCs w:val="22"/>
+              <w:spacing w:after="100" w:before="100" w:line="240"/>
+              <w:ind w:left="100" w:right="100" w:firstLine="0" w:firstLineChars="0"/>
+              <w:rPr>
+                <w:rFonts w:ascii="Helvetica" w:hAnsi="Helvetica" w:eastAsia="Helvetica" w:cs="Helvetica"/>
+                <w:i w:val="false"/>
+                <w:b w:val="false"/>
+                <w:u w:val="none"/>
+                <w:strike w:val="false"/>
+                <w:sz w:val="22"/>
+                <w:szCs w:val="22"/>
+                <w:color w:val="000000"/>
               </w:rPr>
             </w:pPr>
             <w:r>
               <w:rPr>
-                <w:rFonts w:ascii="Helvetica" w:eastAsia="Helvetica" w:hAnsi="Helvetica" w:cs="Helvetica"/>
-                <w:color w:val="000000"/>
-                <w:sz w:val="22"/>
-                <w:szCs w:val="22"/>
-              </w:rPr>
-              <w:t>4,336 (17.1%)</w:t>
+                <w:rFonts w:ascii="Helvetica" w:hAnsi="Helvetica" w:eastAsia="Helvetica" w:cs="Helvetica"/>
+                <w:i w:val="false"/>
+                <w:b w:val="false"/>
+                <w:u w:val="none"/>
+                <w:strike w:val="false"/>
+                <w:sz w:val="22"/>
+                <w:szCs w:val="22"/>
+                <w:color w:val="000000"/>
+              </w:rPr>
+              <w:t xml:space="preserve">4,336 (17.1%)</w:t>
             </w:r>
           </w:p>
         </w:tc>
       </w:tr>
       <w:tr>
         <w:trPr>
-          <w:jc w:val="center"/>
+          <w:trHeight w:val="616" w:hRule="auto"/>
         </w:trPr>
         <w:tc>
           <w:tcPr>
-            <w:tcW w:w="2576" w:type="dxa"/>
             <w:tcBorders>
+              <w:bottom w:val="single" w:sz="8" w:space="0" w:color="000000"/>
               <w:top w:val="none" w:sz="0" w:space="0" w:color="000000"/>
               <w:left w:val="none" w:sz="0" w:space="0" w:color="000000"/>
-              <w:bottom w:val="single" w:sz="8" w:space="0" w:color="000000"/>
               <w:right w:val="none" w:sz="0" w:space="0" w:color="000000"/>
             </w:tcBorders>
             <w:shd w:val="clear" w:color="auto" w:fill="FFFFFF"/>
             <w:tcMar>
               <w:top w:w="0" w:type="dxa"/>
+              <w:bottom w:w="0" w:type="dxa"/>
               <w:left w:w="0" w:type="dxa"/>
-              <w:bottom w:w="0" w:type="dxa"/>
               <w:right w:w="0" w:type="dxa"/>
             </w:tcMar>
+            <w:vAlign w:val="top"/>
           </w:tcPr>
           <w:p>
             <w:pPr>
+              <w:pStyle w:val="Normal"/>
+              <w:jc w:val="left"/>
               <w:pBdr>
+                <w:bottom w:val="none" w:sz="0" w:space="0" w:color="000000"/>
                 <w:top w:val="none" w:sz="0" w:space="0" w:color="000000"/>
                 <w:left w:val="none" w:sz="0" w:space="0" w:color="000000"/>
-                <w:bottom w:val="none" w:sz="0" w:space="0" w:color="000000"/>
                 <w:right w:val="none" w:sz="0" w:space="0" w:color="000000"/>
               </w:pBdr>
-              <w:spacing w:before="100" w:after="100"/>
-              <w:ind w:left="300" w:right="100"/>
-              <w:rPr>
-                <w:rFonts w:ascii="Helvetica" w:eastAsia="Helvetica" w:hAnsi="Helvetica" w:cs="Helvetica"/>
-                <w:color w:val="000000"/>
-                <w:sz w:val="22"/>
-                <w:szCs w:val="22"/>
+              <w:spacing w:after="100" w:before="100" w:line="240"/>
+              <w:ind w:left="300" w:right="100" w:firstLine="0" w:firstLineChars="0"/>
+              <w:rPr>
+                <w:rFonts w:ascii="Helvetica" w:hAnsi="Helvetica" w:eastAsia="Helvetica" w:cs="Helvetica"/>
+                <w:i w:val="false"/>
+                <w:b w:val="false"/>
+                <w:u w:val="none"/>
+                <w:strike w:val="false"/>
+                <w:sz w:val="22"/>
+                <w:szCs w:val="22"/>
+                <w:color w:val="000000"/>
               </w:rPr>
             </w:pPr>
             <w:r>
               <w:rPr>
-                <w:rFonts w:ascii="Helvetica" w:eastAsia="Helvetica" w:hAnsi="Helvetica" w:cs="Helvetica"/>
-                <w:color w:val="000000"/>
-                <w:sz w:val="22"/>
-                <w:szCs w:val="22"/>
-              </w:rPr>
-              <w:t>MUY ALTO</w:t>
+                <w:rFonts w:ascii="Helvetica" w:hAnsi="Helvetica" w:eastAsia="Helvetica" w:cs="Helvetica"/>
+                <w:i w:val="false"/>
+                <w:b w:val="false"/>
+                <w:u w:val="none"/>
+                <w:strike w:val="false"/>
+                <w:sz w:val="22"/>
+                <w:szCs w:val="22"/>
+                <w:color w:val="000000"/>
+              </w:rPr>
+              <w:t xml:space="preserve">MUY ALTO</w:t>
             </w:r>
           </w:p>
         </w:tc>
         <w:tc>
           <w:tcPr>
-            <w:tcW w:w="3088" w:type="dxa"/>
             <w:tcBorders>
+              <w:bottom w:val="single" w:sz="8" w:space="0" w:color="000000"/>
               <w:top w:val="none" w:sz="0" w:space="0" w:color="000000"/>
               <w:left w:val="none" w:sz="0" w:space="0" w:color="000000"/>
-              <w:bottom w:val="single" w:sz="8" w:space="0" w:color="000000"/>
               <w:right w:val="none" w:sz="0" w:space="0" w:color="000000"/>
             </w:tcBorders>
             <w:shd w:val="clear" w:color="auto" w:fill="FFFFFF"/>
             <w:tcMar>
               <w:top w:w="0" w:type="dxa"/>
+              <w:bottom w:w="0" w:type="dxa"/>
               <w:left w:w="0" w:type="dxa"/>
-              <w:bottom w:w="0" w:type="dxa"/>
               <w:right w:w="0" w:type="dxa"/>
             </w:tcMar>
+            <w:vAlign w:val="top"/>
           </w:tcPr>
           <w:p>
             <w:pPr>
+              <w:pStyle w:val="Normal"/>
+              <w:jc w:val="center"/>
               <w:pBdr>
+                <w:bottom w:val="none" w:sz="0" w:space="0" w:color="000000"/>
                 <w:top w:val="none" w:sz="0" w:space="0" w:color="000000"/>
                 <w:left w:val="none" w:sz="0" w:space="0" w:color="000000"/>
-                <w:bottom w:val="none" w:sz="0" w:space="0" w:color="000000"/>
                 <w:right w:val="none" w:sz="0" w:space="0" w:color="000000"/>
               </w:pBdr>
-              <w:spacing w:before="100" w:after="100"/>
-              <w:ind w:left="100" w:right="100"/>
-              <w:jc w:val="center"/>
-              <w:rPr>
-                <w:rFonts w:ascii="Helvetica" w:eastAsia="Helvetica" w:hAnsi="Helvetica" w:cs="Helvetica"/>
-                <w:color w:val="000000"/>
-                <w:sz w:val="22"/>
-                <w:szCs w:val="22"/>
+              <w:spacing w:after="100" w:before="100" w:line="240"/>
+              <w:ind w:left="100" w:right="100" w:firstLine="0" w:firstLineChars="0"/>
+              <w:rPr>
+                <w:rFonts w:ascii="Helvetica" w:hAnsi="Helvetica" w:eastAsia="Helvetica" w:cs="Helvetica"/>
+                <w:i w:val="false"/>
+                <w:b w:val="false"/>
+                <w:u w:val="none"/>
+                <w:strike w:val="false"/>
+                <w:sz w:val="22"/>
+                <w:szCs w:val="22"/>
+                <w:color w:val="000000"/>
               </w:rPr>
             </w:pPr>
             <w:r>
               <w:rPr>
-                <w:rFonts w:ascii="Helvetica" w:eastAsia="Helvetica" w:hAnsi="Helvetica" w:cs="Helvetica"/>
-                <w:color w:val="000000"/>
-                <w:sz w:val="22"/>
-                <w:szCs w:val="22"/>
-              </w:rPr>
-              <w:t>12,681 (18.2%)</w:t>
+                <w:rFonts w:ascii="Helvetica" w:hAnsi="Helvetica" w:eastAsia="Helvetica" w:cs="Helvetica"/>
+                <w:i w:val="false"/>
+                <w:b w:val="false"/>
+                <w:u w:val="none"/>
+                <w:strike w:val="false"/>
+                <w:sz w:val="22"/>
+                <w:szCs w:val="22"/>
+                <w:color w:val="000000"/>
+              </w:rPr>
+              <w:t xml:space="preserve">12,681 (18.2%)</w:t>
             </w:r>
           </w:p>
         </w:tc>
         <w:tc>
           <w:tcPr>
-            <w:tcW w:w="3088" w:type="dxa"/>
             <w:tcBorders>
+              <w:bottom w:val="single" w:sz="8" w:space="0" w:color="000000"/>
               <w:top w:val="none" w:sz="0" w:space="0" w:color="000000"/>
               <w:left w:val="none" w:sz="0" w:space="0" w:color="000000"/>
-              <w:bottom w:val="single" w:sz="8" w:space="0" w:color="000000"/>
               <w:right w:val="none" w:sz="0" w:space="0" w:color="000000"/>
             </w:tcBorders>
             <w:shd w:val="clear" w:color="auto" w:fill="FFFFFF"/>
             <w:tcMar>
               <w:top w:w="0" w:type="dxa"/>
+              <w:bottom w:w="0" w:type="dxa"/>
               <w:left w:w="0" w:type="dxa"/>
-              <w:bottom w:w="0" w:type="dxa"/>
               <w:right w:w="0" w:type="dxa"/>
             </w:tcMar>
+            <w:vAlign w:val="top"/>
           </w:tcPr>
           <w:p>
             <w:pPr>
+              <w:pStyle w:val="Normal"/>
+              <w:jc w:val="center"/>
               <w:pBdr>
+                <w:bottom w:val="none" w:sz="0" w:space="0" w:color="000000"/>
                 <w:top w:val="none" w:sz="0" w:space="0" w:color="000000"/>
                 <w:left w:val="none" w:sz="0" w:space="0" w:color="000000"/>
-                <w:bottom w:val="none" w:sz="0" w:space="0" w:color="000000"/>
                 <w:right w:val="none" w:sz="0" w:space="0" w:color="000000"/>
               </w:pBdr>
-              <w:spacing w:before="100" w:after="100"/>
-              <w:ind w:left="100" w:right="100"/>
-              <w:jc w:val="center"/>
-              <w:rPr>
-                <w:rFonts w:ascii="Helvetica" w:eastAsia="Helvetica" w:hAnsi="Helvetica" w:cs="Helvetica"/>
-                <w:color w:val="000000"/>
-                <w:sz w:val="22"/>
-                <w:szCs w:val="22"/>
+              <w:spacing w:after="100" w:before="100" w:line="240"/>
+              <w:ind w:left="100" w:right="100" w:firstLine="0" w:firstLineChars="0"/>
+              <w:rPr>
+                <w:rFonts w:ascii="Helvetica" w:hAnsi="Helvetica" w:eastAsia="Helvetica" w:cs="Helvetica"/>
+                <w:i w:val="false"/>
+                <w:b w:val="false"/>
+                <w:u w:val="none"/>
+                <w:strike w:val="false"/>
+                <w:sz w:val="22"/>
+                <w:szCs w:val="22"/>
+                <w:color w:val="000000"/>
               </w:rPr>
             </w:pPr>
             <w:r>
               <w:rPr>
-                <w:rFonts w:ascii="Helvetica" w:eastAsia="Helvetica" w:hAnsi="Helvetica" w:cs="Helvetica"/>
-                <w:color w:val="000000"/>
-                <w:sz w:val="22"/>
-                <w:szCs w:val="22"/>
-              </w:rPr>
-              <w:t>8,390 (18.9%)</w:t>
+                <w:rFonts w:ascii="Helvetica" w:hAnsi="Helvetica" w:eastAsia="Helvetica" w:cs="Helvetica"/>
+                <w:i w:val="false"/>
+                <w:b w:val="false"/>
+                <w:u w:val="none"/>
+                <w:strike w:val="false"/>
+                <w:sz w:val="22"/>
+                <w:szCs w:val="22"/>
+                <w:color w:val="000000"/>
+              </w:rPr>
+              <w:t xml:space="preserve">8,390 (18.9%)</w:t>
             </w:r>
           </w:p>
         </w:tc>
         <w:tc>
           <w:tcPr>
-            <w:tcW w:w="3088" w:type="dxa"/>
             <w:tcBorders>
+              <w:bottom w:val="single" w:sz="8" w:space="0" w:color="000000"/>
               <w:top w:val="none" w:sz="0" w:space="0" w:color="000000"/>
               <w:left w:val="none" w:sz="0" w:space="0" w:color="000000"/>
-              <w:bottom w:val="single" w:sz="8" w:space="0" w:color="000000"/>
               <w:right w:val="none" w:sz="0" w:space="0" w:color="000000"/>
             </w:tcBorders>
             <w:shd w:val="clear" w:color="auto" w:fill="FFFFFF"/>
             <w:tcMar>
               <w:top w:w="0" w:type="dxa"/>
+              <w:bottom w:w="0" w:type="dxa"/>
               <w:left w:w="0" w:type="dxa"/>
-              <w:bottom w:w="0" w:type="dxa"/>
               <w:right w:w="0" w:type="dxa"/>
             </w:tcMar>
+            <w:vAlign w:val="top"/>
           </w:tcPr>
           <w:p>
             <w:pPr>
+              <w:pStyle w:val="Normal"/>
+              <w:jc w:val="center"/>
               <w:pBdr>
+                <w:bottom w:val="none" w:sz="0" w:space="0" w:color="000000"/>
                 <w:top w:val="none" w:sz="0" w:space="0" w:color="000000"/>
                 <w:left w:val="none" w:sz="0" w:space="0" w:color="000000"/>
-                <w:bottom w:val="none" w:sz="0" w:space="0" w:color="000000"/>
                 <w:right w:val="none" w:sz="0" w:space="0" w:color="000000"/>
               </w:pBdr>
-              <w:spacing w:before="100" w:after="100"/>
-              <w:ind w:left="100" w:right="100"/>
-              <w:jc w:val="center"/>
-              <w:rPr>
-                <w:rFonts w:ascii="Helvetica" w:eastAsia="Helvetica" w:hAnsi="Helvetica" w:cs="Helvetica"/>
-                <w:color w:val="000000"/>
-                <w:sz w:val="22"/>
-                <w:szCs w:val="22"/>
+              <w:spacing w:after="100" w:before="100" w:line="240"/>
+              <w:ind w:left="100" w:right="100" w:firstLine="0" w:firstLineChars="0"/>
+              <w:rPr>
+                <w:rFonts w:ascii="Helvetica" w:hAnsi="Helvetica" w:eastAsia="Helvetica" w:cs="Helvetica"/>
+                <w:i w:val="false"/>
+                <w:b w:val="false"/>
+                <w:u w:val="none"/>
+                <w:strike w:val="false"/>
+                <w:sz w:val="22"/>
+                <w:szCs w:val="22"/>
+                <w:color w:val="000000"/>
               </w:rPr>
             </w:pPr>
             <w:r>
               <w:rPr>
-                <w:rFonts w:ascii="Helvetica" w:eastAsia="Helvetica" w:hAnsi="Helvetica" w:cs="Helvetica"/>
-                <w:color w:val="000000"/>
-                <w:sz w:val="22"/>
-                <w:szCs w:val="22"/>
-              </w:rPr>
-              <w:t>4,291 (16.9%)</w:t>
+                <w:rFonts w:ascii="Helvetica" w:hAnsi="Helvetica" w:eastAsia="Helvetica" w:cs="Helvetica"/>
+                <w:i w:val="false"/>
+                <w:b w:val="false"/>
+                <w:u w:val="none"/>
+                <w:strike w:val="false"/>
+                <w:sz w:val="22"/>
+                <w:szCs w:val="22"/>
+                <w:color w:val="000000"/>
+              </w:rPr>
+              <w:t xml:space="preserve">4,291 (16.9%)</w:t>
             </w:r>
           </w:p>
         </w:tc>
       </w:tr>
       <w:tr>
         <w:trPr>
-          <w:jc w:val="center"/>
+          <w:trHeight w:val="360" w:hRule="auto"/>
         </w:trPr>
         <w:tc>
           <w:tcPr>
-            <w:tcW w:w="11840" w:type="dxa"/>
             <w:gridSpan w:val="4"/>
             <w:tcBorders>
+              <w:bottom w:val="none" w:sz="0" w:space="0" w:color="FFFFFF"/>
               <w:top w:val="single" w:sz="8" w:space="0" w:color="000000"/>
               <w:left w:val="none" w:sz="0" w:space="0" w:color="FFFFFF"/>
-              <w:bottom w:val="none" w:sz="0" w:space="0" w:color="FFFFFF"/>
               <w:right w:val="none" w:sz="0" w:space="0" w:color="FFFFFF"/>
             </w:tcBorders>
             <w:shd w:val="clear" w:color="auto" w:fill="FFFFFF"/>
             <w:tcMar>
               <w:top w:w="0" w:type="dxa"/>
+              <w:bottom w:w="0" w:type="dxa"/>
               <w:left w:w="0" w:type="dxa"/>
-              <w:bottom w:w="0" w:type="dxa"/>
               <w:right w:w="0" w:type="dxa"/>
             </w:tcMar>
             <w:vAlign w:val="center"/>
           </w:tcPr>
           <w:p>
             <w:pPr>
+              <w:pStyle w:val="Normal"/>
+              <w:jc w:val="left"/>
               <w:pBdr>
+                <w:bottom w:val="none" w:sz="0" w:space="0" w:color="000000"/>
                 <w:top w:val="none" w:sz="0" w:space="0" w:color="000000"/>
                 <w:left w:val="none" w:sz="0" w:space="0" w:color="000000"/>
-                <w:bottom w:val="none" w:sz="0" w:space="0" w:color="000000"/>
                 <w:right w:val="none" w:sz="0" w:space="0" w:color="000000"/>
               </w:pBdr>
-              <w:spacing w:before="100" w:after="100"/>
-              <w:ind w:left="100" w:right="100"/>
-              <w:rPr>
-                <w:rFonts w:ascii="Helvetica" w:eastAsia="Helvetica" w:hAnsi="Helvetica" w:cs="Helvetica"/>
-                <w:color w:val="000000"/>
-                <w:sz w:val="22"/>
-                <w:szCs w:val="22"/>
+              <w:spacing w:after="100" w:before="100" w:line="240"/>
+              <w:ind w:left="100" w:right="100" w:firstLine="0" w:firstLineChars="0"/>
+              <w:rPr>
+                <w:rFonts w:ascii="Helvetica" w:hAnsi="Helvetica" w:eastAsia="Helvetica" w:cs="Helvetica"/>
+                <w:i w:val="false"/>
+                <w:b w:val="false"/>
+                <w:u w:val="none"/>
+                <w:strike w:val="false"/>
+                <w:sz w:val="22"/>
+                <w:szCs w:val="22"/>
+                <w:color w:val="000000"/>
               </w:rPr>
             </w:pPr>
             <w:r>
               <w:rPr>
-                <w:rFonts w:ascii="Helvetica" w:eastAsia="Helvetica" w:hAnsi="Helvetica" w:cs="Helvetica"/>
-                <w:color w:val="000000"/>
-                <w:sz w:val="22"/>
-                <w:szCs w:val="22"/>
+                <w:rFonts w:ascii="Helvetica" w:hAnsi="Helvetica" w:eastAsia="Helvetica" w:cs="Helvetica"/>
+                <w:i w:val="false"/>
+                <w:b w:val="false"/>
+                <w:u w:val="none"/>
+                <w:strike w:val="false"/>
                 <w:vertAlign w:val="superscript"/>
-              </w:rPr>
-              <w:t>1</w:t>
-            </w:r>
-            <w:r>
-              <w:rPr>
-                <w:rFonts w:ascii="Helvetica" w:eastAsia="Helvetica" w:hAnsi="Helvetica" w:cs="Helvetica"/>
-                <w:color w:val="000000"/>
-                <w:sz w:val="22"/>
-                <w:szCs w:val="22"/>
-              </w:rPr>
-              <w:t xml:space="preserve">n (%); Media ± DE. CPO-D: </w:t>
-            </w:r>
-            <w:proofErr w:type="spellStart"/>
-            <w:r>
-              <w:rPr>
-                <w:rFonts w:ascii="Helvetica" w:eastAsia="Helvetica" w:hAnsi="Helvetica" w:cs="Helvetica"/>
-                <w:color w:val="000000"/>
-                <w:sz w:val="22"/>
-                <w:szCs w:val="22"/>
-              </w:rPr>
-              <w:t>Cariados</w:t>
-            </w:r>
-            <w:proofErr w:type="spellEnd"/>
-            <w:r>
-              <w:rPr>
-                <w:rFonts w:ascii="Helvetica" w:eastAsia="Helvetica" w:hAnsi="Helvetica" w:cs="Helvetica"/>
-                <w:color w:val="000000"/>
-                <w:sz w:val="22"/>
-                <w:szCs w:val="22"/>
-              </w:rPr>
-              <w:t xml:space="preserve">, </w:t>
-            </w:r>
-            <w:proofErr w:type="spellStart"/>
-            <w:r>
-              <w:rPr>
-                <w:rFonts w:ascii="Helvetica" w:eastAsia="Helvetica" w:hAnsi="Helvetica" w:cs="Helvetica"/>
-                <w:color w:val="000000"/>
-                <w:sz w:val="22"/>
-                <w:szCs w:val="22"/>
-              </w:rPr>
-              <w:t>Perdidos</w:t>
-            </w:r>
-            <w:proofErr w:type="spellEnd"/>
-            <w:r>
-              <w:rPr>
-                <w:rFonts w:ascii="Helvetica" w:eastAsia="Helvetica" w:hAnsi="Helvetica" w:cs="Helvetica"/>
-                <w:color w:val="000000"/>
-                <w:sz w:val="22"/>
-                <w:szCs w:val="22"/>
-              </w:rPr>
-              <w:t xml:space="preserve">, </w:t>
-            </w:r>
-            <w:proofErr w:type="spellStart"/>
-            <w:r>
-              <w:rPr>
-                <w:rFonts w:ascii="Helvetica" w:eastAsia="Helvetica" w:hAnsi="Helvetica" w:cs="Helvetica"/>
-                <w:color w:val="000000"/>
-                <w:sz w:val="22"/>
-                <w:szCs w:val="22"/>
-              </w:rPr>
-              <w:t>Obturados</w:t>
-            </w:r>
-            <w:proofErr w:type="spellEnd"/>
-            <w:r>
-              <w:rPr>
-                <w:rFonts w:ascii="Helvetica" w:eastAsia="Helvetica" w:hAnsi="Helvetica" w:cs="Helvetica"/>
-                <w:color w:val="000000"/>
-                <w:sz w:val="22"/>
-                <w:szCs w:val="22"/>
-              </w:rPr>
-              <w:t xml:space="preserve"> - </w:t>
-            </w:r>
-            <w:proofErr w:type="spellStart"/>
-            <w:r>
-              <w:rPr>
-                <w:rFonts w:ascii="Helvetica" w:eastAsia="Helvetica" w:hAnsi="Helvetica" w:cs="Helvetica"/>
-                <w:color w:val="000000"/>
-                <w:sz w:val="22"/>
-                <w:szCs w:val="22"/>
-              </w:rPr>
-              <w:t>Dientes</w:t>
-            </w:r>
-            <w:proofErr w:type="spellEnd"/>
-            <w:r>
-              <w:rPr>
-                <w:rFonts w:ascii="Helvetica" w:eastAsia="Helvetica" w:hAnsi="Helvetica" w:cs="Helvetica"/>
-                <w:color w:val="000000"/>
-                <w:sz w:val="22"/>
-                <w:szCs w:val="22"/>
-              </w:rPr>
-              <w:t>.</w:t>
+                <w:sz w:val="22"/>
+                <w:szCs w:val="22"/>
+                <w:color w:val="000000"/>
+              </w:rPr>
+              <w:t xml:space="preserve">1</w:t>
+            </w:r>
+            <w:r>
+              <w:rPr>
+                <w:rFonts w:ascii="Helvetica" w:hAnsi="Helvetica" w:eastAsia="Helvetica" w:cs="Helvetica"/>
+                <w:i w:val="false"/>
+                <w:b w:val="false"/>
+                <w:u w:val="none"/>
+                <w:strike w:val="false"/>
+                <w:sz w:val="22"/>
+                <w:szCs w:val="22"/>
+                <w:color w:val="000000"/>
+              </w:rPr>
+              <w:t xml:space="preserve">n (%); Media ± DE. CPO-D: Cariados, Perdidos, Obturados - Dientes.</w:t>
             </w:r>
           </w:p>
         </w:tc>
       </w:tr>
     </w:tbl>
-    <w:p/>
     <w:sectPr>
+      <w:pgMar w:header="708" w:bottom="1417" w:top="1417" w:right="1417" w:left="1417" w:footer="708" w:gutter="0"/>
+      <w:pgSz w:h="16838" w:w="11906" w:orient="portrait"/>
       <w:type w:val="continuous"/>
-      <w:pgSz w:w="16838" w:h="11906" w:orient="landscape"/>
-      <w:pgMar w:top="1417" w:right="1417" w:bottom="1417" w:left="1417" w:header="708" w:footer="708" w:gutter="0"/>
-      <w:cols w:space="720"/>
-      <w:docGrid w:linePitch="326"/>
+      <w:cols/>
     </w:sectPr>
   </w:body>
 </w:document>
 </file>
 
+<file path=word/comments.xml><?xml version="1.0" encoding="utf-8"?>
+<w:comments xmlns:wpc="http://schemas.microsoft.com/office/word/2010/wordprocessingCanvas" xmlns:mo="http://schemas.microsoft.com/office/mac/office/2008/main" xmlns:mc="http://schemas.openxmlformats.org/markup-compatibility/2006" xmlns:mv="urn:schemas-microsoft-com:mac:vml" xmlns:o="urn:schemas-microsoft-com:office:office" xmlns:r="http://schemas.openxmlformats.org/officeDocument/2006/relationships" xmlns:m="http://schemas.openxmlformats.org/officeDocument/2006/math" xmlns:v="urn:schemas-microsoft-com:vml" xmlns:wp14="http://schemas.microsoft.com/office/word/2010/wordprocessingDrawing" xmlns:wp="http://schemas.openxmlformats.org/drawingml/2006/wordprocessingDrawing" xmlns:w10="urn:schemas-microsoft-com:office:word" xmlns:w="http://schemas.openxmlformats.org/wordprocessingml/2006/main" xmlns:w14="http://schemas.microsoft.com/office/word/2010/wordml" xmlns:wpg="http://schemas.microsoft.com/office/word/2010/wordprocessingGroup" xmlns:wpi="http://schemas.microsoft.com/office/word/2010/wordprocessingInk" xmlns:wne="http://schemas.microsoft.com/office/word/2006/wordml" xmlns:wps="http://schemas.microsoft.com/office/word/2010/wordprocessingShape" mc:Ignorable="w14 wp14">
+</w:comments>
+</file>
+
+<file path=word/footnotes.xml><?xml version="1.0" encoding="utf-8"?>
+<w:footnotes xmlns:wpc="http://schemas.microsoft.com/office/word/2010/wordprocessingCanvas" xmlns:mo="http://schemas.microsoft.com/office/mac/office/2008/main" xmlns:mc="http://schemas.openxmlformats.org/markup-compatibility/2006" xmlns:mv="urn:schemas-microsoft-com:mac:vml" xmlns:o="urn:schemas-microsoft-com:office:office" xmlns:r="http://schemas.openxmlformats.org/officeDocument/2006/relationships" xmlns:m="http://schemas.openxmlformats.org/officeDocument/2006/math" xmlns:v="urn:schemas-microsoft-com:vml" xmlns:wp14="http://schemas.microsoft.com/office/word/2010/wordprocessingDrawing" xmlns:wp="http://schemas.openxmlformats.org/drawingml/2006/wordprocessingDrawing" xmlns:w10="urn:schemas-microsoft-com:office:word" xmlns:w="http://schemas.openxmlformats.org/wordprocessingml/2006/main" xmlns:w14="http://schemas.microsoft.com/office/word/2010/wordml" xmlns:wpg="http://schemas.microsoft.com/office/word/2010/wordprocessingGroup" xmlns:wpi="http://schemas.microsoft.com/office/word/2010/wordprocessingInk" xmlns:wne="http://schemas.microsoft.com/office/word/2006/wordml" xmlns:wps="http://schemas.microsoft.com/office/word/2010/wordprocessingShape" mc:Ignorable="w14 wp14">
+  <w:footnote w:type="separator" w:id="-1">
+    <w:p>
+      <w:r>
+        <w:separator/>
+      </w:r>
+    </w:p>
+  </w:footnote>
+  <w:footnote w:type="continuationSeparator" w:id="0">
+    <w:p>
+      <w:r>
+        <w:continuationSeparator/>
+      </w:r>
+    </w:p>
+  </w:footnote>
+</w:footnotes>
+</file>
+
 <file path=word/numbering.xml><?xml version="1.0" encoding="utf-8"?>
-<w:numbering xmlns:wpc="http://schemas.microsoft.com/office/word/2010/wordprocessingCanvas" xmlns:cx="http://schemas.microsoft.com/office/drawing/2014/chartex" xmlns:cx1="http://schemas.microsoft.com/office/drawing/2015/9/8/chartex" xmlns:cx2="http://schemas.microsoft.com/office/drawing/2015/10/21/chartex" xmlns:cx3="http://schemas.microsoft.com/office/drawing/2016/5/9/chartex" xmlns:cx4="http://schemas.microsoft.com/office/drawing/2016/5/10/chartex" xmlns:cx5="http://schemas.microsoft.com/office/drawing/2016/5/11/chartex" xmlns:cx6="http://schemas.microsoft.com/office/drawing/2016/5/12/chartex" xmlns:cx7="http://schemas.microsoft.com/office/drawing/2016/5/13/chartex" xmlns:cx8="http://schemas.microsoft.com/office/drawing/2016/5/14/chartex" xmlns:mc="http://schemas.openxmlformats.org/markup-compatibility/2006" xmlns:aink="http://schemas.microsoft.com/office/drawing/2016/ink" xmlns:am3d="http://schemas.microsoft.com/office/drawing/2017/model3d" xmlns:o="urn:schemas-microsoft-com:office:office" xmlns:oel="http://schemas.microsoft.com/office/2019/extlst" xmlns:r="http://schemas.openxmlformats.org/officeDocument/2006/relationships" xmlns:m="http://schemas.openxmlformats.org/officeDocument/2006/math" xmlns:v="urn:schemas-microsoft-com:vml" xmlns:wp14="http://schemas.microsoft.com/office/word/2010/wordprocessingDrawing" xmlns:wp="http://schemas.openxmlformats.org/drawingml/2006/wordprocessingDrawing" xmlns:w10="urn:schemas-microsoft-com:office:word" xmlns:w="http://schemas.openxmlformats.org/wordprocessingml/2006/main" xmlns:w14="http://schemas.microsoft.com/office/word/2010/wordml" xmlns:w15="http://schemas.microsoft.com/office/word/2012/wordml" xmlns:w16cex="http://schemas.microsoft.com/office/word/2018/wordml/cex" xmlns:w16cid="http://schemas.microsoft.com/office/word/2016/wordml/cid" xmlns:w16="http://schemas.microsoft.com/office/word/2018/wordml" xmlns:w16du="http://schemas.microsoft.com/office/word/2023/wordml/word16du" xmlns:w16sdtdh="http://schemas.microsoft.com/office/word/2020/wordml/sdtdatahash" xmlns:w16sdtfl="http://schemas.microsoft.com/office/word/2024/wordml/sdtformatlock" xmlns:w16se="http://schemas.microsoft.com/office/word/2015/wordml/symex" xmlns:wpg="http://schemas.microsoft.com/office/word/2010/wordprocessingGroup" xmlns:wpi="http://schemas.microsoft.com/office/word/2010/wordprocessingInk" xmlns:wne="http://schemas.microsoft.com/office/word/2006/wordml" xmlns:wps="http://schemas.microsoft.com/office/word/2010/wordprocessingShape" mc:Ignorable="w14 w15 w16se w16cid w16 w16cex w16sdtdh w16sdtfl w16du wp14">
+<w:numbering xmlns:wpc="http://schemas.microsoft.com/office/word/2010/wordprocessingCanvas" xmlns:cx="http://schemas.microsoft.com/office/drawing/2014/chartex" xmlns:cx1="http://schemas.microsoft.com/office/drawing/2015/9/8/chartex" xmlns:cx2="http://schemas.microsoft.com/office/drawing/2015/10/21/chartex" xmlns:cx3="http://schemas.microsoft.com/office/drawing/2016/5/9/chartex" xmlns:cx4="http://schemas.microsoft.com/office/drawing/2016/5/10/chartex" xmlns:cx5="http://schemas.microsoft.com/office/drawing/2016/5/11/chartex" xmlns:cx6="http://schemas.microsoft.com/office/drawing/2016/5/12/chartex" xmlns:cx7="http://schemas.microsoft.com/office/drawing/2016/5/13/chartex" xmlns:cx8="http://schemas.microsoft.com/office/drawing/2016/5/14/chartex" xmlns:mc="http://schemas.openxmlformats.org/markup-compatibility/2006" xmlns:aink="http://schemas.microsoft.com/office/drawing/2016/ink" xmlns:am3d="http://schemas.microsoft.com/office/drawing/2017/model3d" xmlns:o="urn:schemas-microsoft-com:office:office" xmlns:r="http://schemas.openxmlformats.org/officeDocument/2006/relationships" xmlns:m="http://schemas.openxmlformats.org/officeDocument/2006/math" xmlns:v="urn:schemas-microsoft-com:vml" xmlns:wp14="http://schemas.microsoft.com/office/word/2010/wordprocessingDrawing" xmlns:wp="http://schemas.openxmlformats.org/drawingml/2006/wordprocessingDrawing" xmlns:w10="urn:schemas-microsoft-com:office:word" xmlns:w="http://schemas.openxmlformats.org/wordprocessingml/2006/main" xmlns:w14="http://schemas.microsoft.com/office/word/2010/wordml" xmlns:w15="http://schemas.microsoft.com/office/word/2012/wordml" xmlns:w16cex="http://schemas.microsoft.com/office/word/2018/wordml/cex" xmlns:w16cid="http://schemas.microsoft.com/office/word/2016/wordml/cid" xmlns:w16="http://schemas.microsoft.com/office/word/2018/wordml" xmlns:w16se="http://schemas.microsoft.com/office/word/2015/wordml/symex" xmlns:wpg="http://schemas.microsoft.com/office/word/2010/wordprocessingGroup" xmlns:wpi="http://schemas.microsoft.com/office/word/2010/wordprocessingInk" xmlns:wne="http://schemas.microsoft.com/office/word/2006/wordml" xmlns:wps="http://schemas.microsoft.com/office/word/2010/wordprocessingShape" mc:Ignorable="w14 w15 w16se w16cid w16 w16cex wp14">
   <w:abstractNum w:abstractNumId="0" w15:restartNumberingAfterBreak="0">
     <w:nsid w:val="07E925FD"/>
     <w:multiLevelType w:val="multilevel"/>
@@ -1950,7 +2133,7 @@
     <w:lvl w:ilvl="0">
       <w:start w:val="1"/>
       <w:numFmt w:val="decimal"/>
-      <w:pStyle w:val="Ttulo1"/>
+      <w:pStyle w:val="Titre1"/>
       <w:lvlText w:val="%1."/>
       <w:lvlJc w:val="left"/>
       <w:pPr>
@@ -1960,7 +2143,7 @@
     <w:lvl w:ilvl="1">
       <w:start w:val="1"/>
       <w:numFmt w:val="decimal"/>
-      <w:pStyle w:val="Ttulo2"/>
+      <w:pStyle w:val="Titre2"/>
       <w:lvlText w:val="%1.%2."/>
       <w:lvlJc w:val="left"/>
       <w:pPr>
@@ -1970,7 +2153,7 @@
     <w:lvl w:ilvl="2">
       <w:start w:val="1"/>
       <w:numFmt w:val="decimal"/>
-      <w:pStyle w:val="Ttulo3"/>
+      <w:pStyle w:val="Titre3"/>
       <w:lvlText w:val="%1.%2.%3."/>
       <w:lvlJc w:val="left"/>
       <w:pPr>
@@ -2204,20 +2387,20 @@
       </w:pPr>
     </w:lvl>
   </w:abstractNum>
-  <w:num w:numId="1" w16cid:durableId="1311595340">
+  <w:num w:numId="1">
     <w:abstractNumId w:val="1"/>
   </w:num>
-  <w:num w:numId="2" w16cid:durableId="1897623960">
+  <w:num w:numId="2">
     <w:abstractNumId w:val="2"/>
   </w:num>
-  <w:num w:numId="3" w16cid:durableId="1417282597">
+  <w:num w:numId="3">
     <w:abstractNumId w:val="0"/>
   </w:num>
 </w:numbering>
 </file>
 
 <file path=word/styles.xml><?xml version="1.0" encoding="utf-8"?>
-<w:styles xmlns:mc="http://schemas.openxmlformats.org/markup-compatibility/2006" xmlns:r="http://schemas.openxmlformats.org/officeDocument/2006/relationships" xmlns:w="http://schemas.openxmlformats.org/wordprocessingml/2006/main" xmlns:w14="http://schemas.microsoft.com/office/word/2010/wordml" xmlns:w15="http://schemas.microsoft.com/office/word/2012/wordml" xmlns:w16cex="http://schemas.microsoft.com/office/word/2018/wordml/cex" xmlns:w16cid="http://schemas.microsoft.com/office/word/2016/wordml/cid" xmlns:w16="http://schemas.microsoft.com/office/word/2018/wordml" xmlns:w16du="http://schemas.microsoft.com/office/word/2023/wordml/word16du" xmlns:w16sdtdh="http://schemas.microsoft.com/office/word/2020/wordml/sdtdatahash" xmlns:w16sdtfl="http://schemas.microsoft.com/office/word/2024/wordml/sdtformatlock" xmlns:w16se="http://schemas.microsoft.com/office/word/2015/wordml/symex" mc:Ignorable="w14 w15 w16se w16cid w16 w16cex w16sdtdh w16sdtfl w16du">
+<w:styles xmlns:mc="http://schemas.openxmlformats.org/markup-compatibility/2006" xmlns:r="http://schemas.openxmlformats.org/officeDocument/2006/relationships" xmlns:w="http://schemas.openxmlformats.org/wordprocessingml/2006/main" xmlns:w14="http://schemas.microsoft.com/office/word/2010/wordml" xmlns:w15="http://schemas.microsoft.com/office/word/2012/wordml" xmlns:w16cex="http://schemas.microsoft.com/office/word/2018/wordml/cex" xmlns:w16cid="http://schemas.microsoft.com/office/word/2016/wordml/cid" xmlns:w16="http://schemas.microsoft.com/office/word/2018/wordml" xmlns:w16se="http://schemas.microsoft.com/office/word/2015/wordml/symex" mc:Ignorable="w14 w15 w16se w16cid w16 w16cex">
   <w:docDefaults>
     <w:rPrDefault>
       <w:rPr>
@@ -2602,11 +2785,11 @@
     <w:name w:val="Normal"/>
     <w:qFormat/>
   </w:style>
-  <w:style w:type="paragraph" w:styleId="Ttulo1">
+  <w:style w:type="paragraph" w:styleId="Titre1">
     <w:name w:val="heading 1"/>
     <w:basedOn w:val="Normal"/>
     <w:next w:val="Normal"/>
-    <w:link w:val="Ttulo1Car"/>
+    <w:link w:val="Titre1Car"/>
     <w:uiPriority w:val="9"/>
     <w:qFormat/>
     <w:rsid w:val="00362E65"/>
@@ -2630,11 +2813,11 @@
       <w:szCs w:val="32"/>
     </w:rPr>
   </w:style>
-  <w:style w:type="paragraph" w:styleId="Ttulo2">
+  <w:style w:type="paragraph" w:styleId="Titre2">
     <w:name w:val="heading 2"/>
     <w:basedOn w:val="Normal"/>
     <w:next w:val="Normal"/>
-    <w:link w:val="Ttulo2Car"/>
+    <w:link w:val="Titre2Car"/>
     <w:uiPriority w:val="9"/>
     <w:semiHidden/>
     <w:unhideWhenUsed/>
@@ -2658,11 +2841,11 @@
       <w:szCs w:val="26"/>
     </w:rPr>
   </w:style>
-  <w:style w:type="paragraph" w:styleId="Ttulo3">
+  <w:style w:type="paragraph" w:styleId="Titre3">
     <w:name w:val="heading 3"/>
     <w:basedOn w:val="Normal"/>
     <w:next w:val="Normal"/>
-    <w:link w:val="Ttulo3Car"/>
+    <w:link w:val="Titre3Car"/>
     <w:uiPriority w:val="9"/>
     <w:semiHidden/>
     <w:unhideWhenUsed/>
@@ -2684,13 +2867,13 @@
       <w:bCs/>
     </w:rPr>
   </w:style>
-  <w:style w:type="character" w:default="1" w:styleId="Fuentedeprrafopredeter">
+  <w:style w:type="character" w:default="1" w:styleId="Policepardfaut">
     <w:name w:val="Default Paragraph Font"/>
     <w:uiPriority w:val="1"/>
     <w:semiHidden/>
     <w:unhideWhenUsed/>
   </w:style>
-  <w:style w:type="table" w:default="1" w:styleId="Tablanormal">
+  <w:style w:type="table" w:default="1" w:styleId="TableauNormal">
     <w:name w:val="Normal Table"/>
     <w:uiPriority w:val="99"/>
     <w:semiHidden/>
@@ -2705,15 +2888,15 @@
       </w:tblCellMar>
     </w:tblPr>
   </w:style>
-  <w:style w:type="numbering" w:default="1" w:styleId="Sinlista">
+  <w:style w:type="numbering" w:default="1" w:styleId="Aucuneliste">
     <w:name w:val="No List"/>
     <w:uiPriority w:val="99"/>
     <w:semiHidden/>
     <w:unhideWhenUsed/>
   </w:style>
-  <w:style w:type="character" w:customStyle="1" w:styleId="Textoennegrita1">
-    <w:name w:val="Texto en negrita1"/>
-    <w:basedOn w:val="Fuentedeprrafopredeter"/>
+  <w:style w:type="character" w:customStyle="1" w:styleId="strong">
+    <w:name w:val="strong"/>
+    <w:basedOn w:val="Policepardfaut"/>
     <w:uiPriority w:val="1"/>
     <w:qFormat/>
     <w:rsid w:val="007B3E96"/>
@@ -2732,7 +2915,7 @@
   </w:style>
   <w:style w:type="table" w:customStyle="1" w:styleId="tabletemplate">
     <w:name w:val="table_template"/>
-    <w:basedOn w:val="Tablanormal"/>
+    <w:basedOn w:val="TableauNormal"/>
     <w:uiPriority w:val="59"/>
     <w:rsid w:val="00F12158"/>
     <w:pPr>
@@ -2768,9 +2951,9 @@
       </w:tcPr>
     </w:tblStylePr>
   </w:style>
-  <w:style w:type="table" w:styleId="Listaclara-nfasis2">
+  <w:style w:type="table" w:styleId="Listeclaire-Accent2">
     <w:name w:val="Light List Accent 2"/>
-    <w:basedOn w:val="Tablanormal"/>
+    <w:basedOn w:val="TableauNormal"/>
     <w:uiPriority w:val="61"/>
     <w:rsid w:val="00FC557F"/>
     <w:tblPr>
@@ -2850,10 +3033,10 @@
       </w:tcPr>
     </w:tblStylePr>
   </w:style>
-  <w:style w:type="character" w:customStyle="1" w:styleId="Ttulo1Car">
-    <w:name w:val="Título 1 Car"/>
-    <w:basedOn w:val="Fuentedeprrafopredeter"/>
-    <w:link w:val="Ttulo1"/>
+  <w:style w:type="character" w:customStyle="1" w:styleId="Titre1Car">
+    <w:name w:val="Titre 1 Car"/>
+    <w:basedOn w:val="Policepardfaut"/>
+    <w:link w:val="Titre1"/>
     <w:uiPriority w:val="9"/>
     <w:rsid w:val="00362E65"/>
     <w:rPr>
@@ -2864,10 +3047,10 @@
       <w:szCs w:val="32"/>
     </w:rPr>
   </w:style>
-  <w:style w:type="character" w:customStyle="1" w:styleId="Ttulo2Car">
-    <w:name w:val="Título 2 Car"/>
-    <w:basedOn w:val="Fuentedeprrafopredeter"/>
-    <w:link w:val="Ttulo2"/>
+  <w:style w:type="character" w:customStyle="1" w:styleId="Titre2Car">
+    <w:name w:val="Titre 2 Car"/>
+    <w:basedOn w:val="Policepardfaut"/>
+    <w:link w:val="Titre2"/>
     <w:uiPriority w:val="9"/>
     <w:semiHidden/>
     <w:rsid w:val="00362E65"/>
@@ -2879,10 +3062,10 @@
       <w:szCs w:val="26"/>
     </w:rPr>
   </w:style>
-  <w:style w:type="character" w:customStyle="1" w:styleId="Ttulo3Car">
-    <w:name w:val="Título 3 Car"/>
-    <w:basedOn w:val="Fuentedeprrafopredeter"/>
-    <w:link w:val="Ttulo3"/>
+  <w:style w:type="character" w:customStyle="1" w:styleId="Titre3Car">
+    <w:name w:val="Titre 3 Car"/>
+    <w:basedOn w:val="Policepardfaut"/>
+    <w:link w:val="Titre3"/>
     <w:uiPriority w:val="9"/>
     <w:semiHidden/>
     <w:rsid w:val="00362E65"/>
@@ -2911,9 +3094,9 @@
     <w:qFormat/>
     <w:rsid w:val="00AE18EF"/>
   </w:style>
-  <w:style w:type="table" w:styleId="Tablaprofesional">
+  <w:style w:type="table" w:styleId="Tableauprofessionnel">
     <w:name w:val="Table Professional"/>
-    <w:basedOn w:val="Tablanormal"/>
+    <w:basedOn w:val="TableauNormal"/>
     <w:uiPriority w:val="99"/>
     <w:semiHidden/>
     <w:unhideWhenUsed/>
@@ -2943,7 +3126,7 @@
       </w:tcPr>
     </w:tblStylePr>
   </w:style>
-  <w:style w:type="paragraph" w:styleId="TDC1">
+  <w:style w:type="paragraph" w:styleId="TM1">
     <w:name w:val="toc 1"/>
     <w:basedOn w:val="Normal"/>
     <w:next w:val="Normal"/>
@@ -2955,7 +3138,7 @@
       <w:spacing w:after="100"/>
     </w:pPr>
   </w:style>
-  <w:style w:type="paragraph" w:styleId="TDC2">
+  <w:style w:type="paragraph" w:styleId="TM2">
     <w:name w:val="toc 2"/>
     <w:basedOn w:val="Normal"/>
     <w:next w:val="Normal"/>
@@ -2968,10 +3151,10 @@
       <w:ind w:left="240"/>
     </w:pPr>
   </w:style>
-  <w:style w:type="paragraph" w:styleId="Textodeglobo">
+  <w:style w:type="paragraph" w:styleId="Textedebulles">
     <w:name w:val="Balloon Text"/>
     <w:basedOn w:val="Normal"/>
-    <w:link w:val="TextodegloboCar"/>
+    <w:link w:val="TextedebullesCar"/>
     <w:uiPriority w:val="99"/>
     <w:semiHidden/>
     <w:unhideWhenUsed/>
@@ -2982,10 +3165,10 @@
       <w:szCs w:val="18"/>
     </w:rPr>
   </w:style>
-  <w:style w:type="character" w:customStyle="1" w:styleId="TextodegloboCar">
-    <w:name w:val="Texto de globo Car"/>
-    <w:basedOn w:val="Fuentedeprrafopredeter"/>
-    <w:link w:val="Textodeglobo"/>
+  <w:style w:type="character" w:customStyle="1" w:styleId="TextedebullesCar">
+    <w:name w:val="Texte de bulles Car"/>
+    <w:basedOn w:val="Policepardfaut"/>
+    <w:link w:val="Textedebulles"/>
     <w:uiPriority w:val="99"/>
     <w:semiHidden/>
     <w:rsid w:val="00FB63E7"/>
@@ -2997,7 +3180,7 @@
   </w:style>
   <w:style w:type="character" w:customStyle="1" w:styleId="referenceid">
     <w:name w:val="reference_id"/>
-    <w:basedOn w:val="Fuentedeprrafopredeter"/>
+    <w:basedOn w:val="Policepardfaut"/>
     <w:uiPriority w:val="1"/>
     <w:rsid w:val="00457CF1"/>
     <w:rPr>

</xml_diff>

<commit_message>
Reorganize filtering pipeline and move exploratory plots to end of script
</commit_message>
<xml_diff>
--- a/tabla_2_cpod_sexo.docx
+++ b/tabla_2_cpod_sexo.docx
@@ -999,7 +999,7 @@
                 <w:szCs w:val="22"/>
                 <w:color w:val="000000"/>
               </w:rPr>
-              <w:t xml:space="preserve">16,038 (23.0%)</w:t>
+              <w:t xml:space="preserve">1,217 (1.7%)</w:t>
             </w:r>
           </w:p>
         </w:tc>
@@ -1054,7 +1054,7 @@
                 <w:szCs w:val="22"/>
                 <w:color w:val="000000"/>
               </w:rPr>
-              <w:t xml:space="preserve">9,210 (20.7%)</w:t>
+              <w:t xml:space="preserve">646 (1.5%)</w:t>
             </w:r>
           </w:p>
         </w:tc>
@@ -1109,7 +1109,7 @@
                 <w:szCs w:val="22"/>
                 <w:color w:val="000000"/>
               </w:rPr>
-              <w:t xml:space="preserve">6,828 (26.9%)</w:t>
+              <w:t xml:space="preserve">571 (2.2%)</w:t>
             </w:r>
           </w:p>
         </w:tc>
@@ -1224,7 +1224,7 @@
                 <w:szCs w:val="22"/>
                 <w:color w:val="000000"/>
               </w:rPr>
-              <w:t xml:space="preserve">13,508 (19.3%)</w:t>
+              <w:t xml:space="preserve">4,104 (5.9%)</w:t>
             </w:r>
           </w:p>
         </w:tc>
@@ -1279,7 +1279,7 @@
                 <w:szCs w:val="22"/>
                 <w:color w:val="000000"/>
               </w:rPr>
-              <w:t xml:space="preserve">8,450 (19.0%)</w:t>
+              <w:t xml:space="preserve">2,260 (5.1%)</w:t>
             </w:r>
           </w:p>
         </w:tc>
@@ -1334,7 +1334,7 @@
                 <w:szCs w:val="22"/>
                 <w:color w:val="000000"/>
               </w:rPr>
-              <w:t xml:space="preserve">5,058 (19.9%)</w:t>
+              <w:t xml:space="preserve">1,844 (7.3%)</w:t>
             </w:r>
           </w:p>
         </w:tc>
@@ -1449,7 +1449,7 @@
                 <w:szCs w:val="22"/>
                 <w:color w:val="000000"/>
               </w:rPr>
-              <w:t xml:space="preserve">14,204 (20.3%)</w:t>
+              <w:t xml:space="preserve">22,525 (32.3%)</w:t>
             </w:r>
           </w:p>
         </w:tc>
@@ -1504,7 +1504,7 @@
                 <w:szCs w:val="22"/>
                 <w:color w:val="000000"/>
               </w:rPr>
-              <w:t xml:space="preserve">9,308 (20.9%)</w:t>
+              <w:t xml:space="preserve">13,671 (30.8%)</w:t>
             </w:r>
           </w:p>
         </w:tc>
@@ -1559,7 +1559,7 @@
                 <w:szCs w:val="22"/>
                 <w:color w:val="000000"/>
               </w:rPr>
-              <w:t xml:space="preserve">4,896 (19.3%)</w:t>
+              <w:t xml:space="preserve">8,854 (34.8%)</w:t>
             </w:r>
           </w:p>
         </w:tc>
@@ -1674,7 +1674,7 @@
                 <w:szCs w:val="22"/>
                 <w:color w:val="000000"/>
               </w:rPr>
-              <w:t xml:space="preserve">13,409 (19.2%)</w:t>
+              <w:t xml:space="preserve">22,306 (31.9%)</w:t>
             </w:r>
           </w:p>
         </w:tc>
@@ -1729,7 +1729,7 @@
                 <w:szCs w:val="22"/>
                 <w:color w:val="000000"/>
               </w:rPr>
-              <w:t xml:space="preserve">9,073 (20.4%)</w:t>
+              <w:t xml:space="preserve">14,700 (33.1%)</w:t>
             </w:r>
           </w:p>
         </w:tc>
@@ -1784,7 +1784,7 @@
                 <w:szCs w:val="22"/>
                 <w:color w:val="000000"/>
               </w:rPr>
-              <w:t xml:space="preserve">4,336 (17.1%)</w:t>
+              <w:t xml:space="preserve">7,606 (29.9%)</w:t>
             </w:r>
           </w:p>
         </w:tc>
@@ -1899,7 +1899,7 @@
                 <w:szCs w:val="22"/>
                 <w:color w:val="000000"/>
               </w:rPr>
-              <w:t xml:space="preserve">12,681 (18.2%)</w:t>
+              <w:t xml:space="preserve">19,688 (28.2%)</w:t>
             </w:r>
           </w:p>
         </w:tc>
@@ -1954,7 +1954,7 @@
                 <w:szCs w:val="22"/>
                 <w:color w:val="000000"/>
               </w:rPr>
-              <w:t xml:space="preserve">8,390 (18.9%)</w:t>
+              <w:t xml:space="preserve">13,154 (29.6%)</w:t>
             </w:r>
           </w:p>
         </w:tc>
@@ -2009,7 +2009,7 @@
                 <w:szCs w:val="22"/>
                 <w:color w:val="000000"/>
               </w:rPr>
-              <w:t xml:space="preserve">4,291 (16.9%)</w:t>
+              <w:t xml:space="preserve">6,534 (25.7%)</w:t>
             </w:r>
           </w:p>
         </w:tc>

</xml_diff>

<commit_message>
refactor: move percentile classification after data cleaning and fix section numbering
</commit_message>
<xml_diff>
--- a/tabla_2_cpod_sexo.docx
+++ b/tabla_2_cpod_sexo.docx
@@ -999,7 +999,7 @@
                 <w:szCs w:val="22"/>
                 <w:color w:val="000000"/>
               </w:rPr>
-              <w:t xml:space="preserve">1,217 (1.7%)</w:t>
+              <w:t xml:space="preserve">16,038 (23.0%)</w:t>
             </w:r>
           </w:p>
         </w:tc>
@@ -1054,7 +1054,7 @@
                 <w:szCs w:val="22"/>
                 <w:color w:val="000000"/>
               </w:rPr>
-              <w:t xml:space="preserve">646 (1.5%)</w:t>
+              <w:t xml:space="preserve">9,210 (20.7%)</w:t>
             </w:r>
           </w:p>
         </w:tc>
@@ -1109,7 +1109,7 @@
                 <w:szCs w:val="22"/>
                 <w:color w:val="000000"/>
               </w:rPr>
-              <w:t xml:space="preserve">571 (2.2%)</w:t>
+              <w:t xml:space="preserve">6,828 (26.9%)</w:t>
             </w:r>
           </w:p>
         </w:tc>
@@ -1224,7 +1224,7 @@
                 <w:szCs w:val="22"/>
                 <w:color w:val="000000"/>
               </w:rPr>
-              <w:t xml:space="preserve">4,104 (5.9%)</w:t>
+              <w:t xml:space="preserve">13,508 (19.3%)</w:t>
             </w:r>
           </w:p>
         </w:tc>
@@ -1279,7 +1279,7 @@
                 <w:szCs w:val="22"/>
                 <w:color w:val="000000"/>
               </w:rPr>
-              <w:t xml:space="preserve">2,260 (5.1%)</w:t>
+              <w:t xml:space="preserve">8,450 (19.0%)</w:t>
             </w:r>
           </w:p>
         </w:tc>
@@ -1334,7 +1334,7 @@
                 <w:szCs w:val="22"/>
                 <w:color w:val="000000"/>
               </w:rPr>
-              <w:t xml:space="preserve">1,844 (7.3%)</w:t>
+              <w:t xml:space="preserve">5,058 (19.9%)</w:t>
             </w:r>
           </w:p>
         </w:tc>
@@ -1449,7 +1449,7 @@
                 <w:szCs w:val="22"/>
                 <w:color w:val="000000"/>
               </w:rPr>
-              <w:t xml:space="preserve">22,525 (32.3%)</w:t>
+              <w:t xml:space="preserve">14,204 (20.3%)</w:t>
             </w:r>
           </w:p>
         </w:tc>
@@ -1504,7 +1504,7 @@
                 <w:szCs w:val="22"/>
                 <w:color w:val="000000"/>
               </w:rPr>
-              <w:t xml:space="preserve">13,671 (30.8%)</w:t>
+              <w:t xml:space="preserve">9,308 (20.9%)</w:t>
             </w:r>
           </w:p>
         </w:tc>
@@ -1559,7 +1559,7 @@
                 <w:szCs w:val="22"/>
                 <w:color w:val="000000"/>
               </w:rPr>
-              <w:t xml:space="preserve">8,854 (34.8%)</w:t>
+              <w:t xml:space="preserve">4,896 (19.3%)</w:t>
             </w:r>
           </w:p>
         </w:tc>
@@ -1674,7 +1674,7 @@
                 <w:szCs w:val="22"/>
                 <w:color w:val="000000"/>
               </w:rPr>
-              <w:t xml:space="preserve">22,306 (31.9%)</w:t>
+              <w:t xml:space="preserve">13,409 (19.2%)</w:t>
             </w:r>
           </w:p>
         </w:tc>
@@ -1729,7 +1729,7 @@
                 <w:szCs w:val="22"/>
                 <w:color w:val="000000"/>
               </w:rPr>
-              <w:t xml:space="preserve">14,700 (33.1%)</w:t>
+              <w:t xml:space="preserve">9,073 (20.4%)</w:t>
             </w:r>
           </w:p>
         </w:tc>
@@ -1784,7 +1784,7 @@
                 <w:szCs w:val="22"/>
                 <w:color w:val="000000"/>
               </w:rPr>
-              <w:t xml:space="preserve">7,606 (29.9%)</w:t>
+              <w:t xml:space="preserve">4,336 (17.1%)</w:t>
             </w:r>
           </w:p>
         </w:tc>
@@ -1899,7 +1899,7 @@
                 <w:szCs w:val="22"/>
                 <w:color w:val="000000"/>
               </w:rPr>
-              <w:t xml:space="preserve">19,688 (28.2%)</w:t>
+              <w:t xml:space="preserve">12,681 (18.2%)</w:t>
             </w:r>
           </w:p>
         </w:tc>
@@ -1954,7 +1954,7 @@
                 <w:szCs w:val="22"/>
                 <w:color w:val="000000"/>
               </w:rPr>
-              <w:t xml:space="preserve">13,154 (29.6%)</w:t>
+              <w:t xml:space="preserve">8,390 (18.9%)</w:t>
             </w:r>
           </w:p>
         </w:tc>
@@ -2009,7 +2009,7 @@
                 <w:szCs w:val="22"/>
                 <w:color w:val="000000"/>
               </w:rPr>
-              <w:t xml:space="preserve">6,534 (25.7%)</w:t>
+              <w:t xml:space="preserve">4,291 (16.9%)</w:t>
             </w:r>
           </w:p>
         </w:tc>

</xml_diff>